<commit_message>
Projeto, parte 1 (seções 1 a 4): ancora as afirmações em passagens conferidas dos fichamentos
Co-Authored-By: Claude Opus 5.5 <noreply@anthropic.com>
Claude-Session: https://claude.ai/code/session_01HxStpW4pQoDfJdTDYr6zEC
</commit_message>
<xml_diff>
--- a/projeto_desenvolvido/PROJETO_DE_TESE_COMPLETO_ABNT.docx
+++ b/projeto_desenvolvido/PROJETO_DE_TESE_COMPLETO_ABNT.docx
@@ -2796,7 +2796,7 @@
         <w:rPr>
           <w:lang w:val="pt-BR"/>
         </w:rPr>
-        <w:t xml:space="preserve">Esta pesquisa investiga a encenação da Política Nacional de Educação Digital (PNED), instituída pela Lei nº 14.533/2023, em seu eixo Educação Digital Escolar, pelos profissionais da educação que atuam nos anos iniciais do Ensino Fundamental, do 1º ao 5º ano, na Escola Municipal Domitila Castelo da Silva, em Pipa, distrito de Tibau do Sul, no litoral sul do Rio Grande do Norte. Interessam-nos os modos pelos quais essa política é interpretada, traduzida e recontextualizada no contexto da prática, bem como o peso que têm nesse processo as culturas profissionais, as condições materiais e institucionais da escola e as especificidades socioespaciais do lugar onde ela está. Chamamos de profissionais da educação todos os que, na escola, participam da construção da política: as professoras e os professores do 1º ao 5º ano, a coordenação pedagógica, a direção e os demais profissionais ligados aos processos pedagógicos ou à educação digital. Uma política não se faz apenas na sala de aula, e o planejamento, a organização do tempo e dos espaços, os registros e as conversas entre colegas também são lugares onde ela ganha forma.</w:t>
+        <w:t xml:space="preserve">Esta pesquisa investiga a encenação da Política Nacional de Educação Digital (PNED), instituída pela Lei nº 14.533/2023, em seu eixo Educação Digital Escolar, pelos profissionais da educação que atuam nos anos iniciais do Ensino Fundamental, do 1º ao 5º ano, na Escola Municipal Domitila Castelo da Silva, em Pipa, distrito de Tibau do Sul, no litoral sul do Rio Grande do Norte. Interessam-nos os modos pelos quais essa política é interpretada, traduzida e recontextualizada no contexto da prática, bem como o peso que têm nesse processo as culturas profissionais, as condições materiais e institucionais da escola e as especificidades socioespaciais do lugar onde ela está. Chamamos de profissionais da educação todos os que, na escola, participam da construção da política: as professoras e os professores do 1º ao 5º ano, a coordenação pedagógica, a direção e os demais profissionais ligados aos processos pedagógicos ou à educação digital. Uma política não se faz apenas na sala de aula, e o planejamento, a organização do tempo e dos espaços, os registros e as conversas entre colegas também são lugares onde ela ganha forma. Ball, Maguire e Braun (2016, p. 103) descrevem as atuações como “coletivas, criativas e limitadas”, feitas “de malabarismo instável entre as prioridades inconciliáveis, cargas de trabalho impossíveis, movimentos satisficing e entusiasmos pessoais”.</w:t>
       </w:r>
     </w:p>
     <w:p>
@@ -2812,7 +2812,7 @@
         <w:rPr>
           <w:lang w:val="pt-BR"/>
         </w:rPr>
-        <w:t>A escolha da escola e do território tem razões que vão além da delimitação do campo. Ao chegar a uma escola concreta, uma política de alcance nacional encontra uma história, um prédio, equipamentos que existem ou que faltam, profissionais com trajetórias e modos próprios de trabalhar e crianças que vêm de famílias e de ruas determinadas. Em Pipa, esse encontro tem contornos particulares. O distrito onde pousadas, restaurantes e passeios se vendem pela internet é o mesmo de onde as crianças saem, pela manhã, para salas de aula que, nos registros feitos para esta pesquisa, tinham carteiras enfileiradas, alfabeto móvel feito à mão e nenhuma tela. Conhecemos essa paisagem de perto, pois a pesquisadora convive com Pipa há cerca de duas décadas e trabalha há dezoito anos na rede municipal de Tibau do Sul. Essa proximidade exige vigilância metodológica e, ao mesmo tempo, é dela que nasce a pergunta sobre o que acontece com uma política nacional quando encontra uma escola situada, seus profissionais, suas condições e seu território.</w:t>
+        <w:t xml:space="preserve">A escolha da escola e do território tem razões que vão além da delimitação do campo. Ao chegar a uma escola concreta, uma política de alcance nacional encontra uma história, um prédio, equipamentos que existem ou que faltam, profissionais com trajetórias e modos próprios de trabalhar e crianças que vêm de famílias e de ruas determinadas. Rizvi e Kemmis, citados por Bowe, Ball e Gold, já observavam que os que participam de um programa no nível da escola o interpretam “em relação aos meios de que dispõem e às formas de trabalho que preferem” (RIZVI; KEMMIS, 1987, p. 21 apud BOWE; BALL; GOLD, 1992, p. 22, tradução nossa). Em Pipa, esse encontro tem contornos particulares. O distrito onde pousadas, restaurantes e passeios se vendem pela internet é o mesmo de onde as crianças saem, pela manhã, para salas de aula que, nos registros feitos para esta pesquisa, tinham carteiras enfileiradas, alfabeto móvel feito à mão e nenhuma tela. Conhecemos essa paisagem de perto, pois a pesquisadora convive com Pipa há cerca de duas décadas e trabalha há dezoito anos na rede municipal de Tibau do Sul. Essa proximidade exige vigilância metodológica, no sentido da reflexividade que Braun e Clarke (2019) pedem a quem analisa, e, ao mesmo tempo, é dela que nasce a pergunta sobre o que acontece com uma política nacional quando encontra uma escola situada, seus profissionais, suas condições e seu território.</w:t>
       </w:r>
     </w:p>
     <w:p>
@@ -2843,7 +2843,7 @@
         <w:rPr>
           <w:lang w:val="pt-BR"/>
         </w:rPr>
-        <w:t xml:space="preserve"> do original inglês. Os autores compreendem a política como algo que as escolas colocam em ação por meio de sujeitos que leem textos, avaliam o que é possível fazer, fazem escolhas, negociam demandas concorrentes e trabalham com as condições institucionais e materiais de que dispõem. A ideia de encenação acentua esse caráter produtivo, já que, na escola, a política toma corpo nas falas, nos registros, nos arranjos </w:t>
+        <w:t xml:space="preserve"> do original inglês. Os autores compreendem a política como algo que as escolas colocam em ação por meio de sujeitos que leem textos, avaliam o que é possível fazer, fazem escolhas, negociam demandas concorrentes e trabalham com as condições institucionais e materiais de que dispõem. Nas palavras dos autores, “a política é complexamente codificada em textos e artefatos e é decodificada (e recodificada) de forma igualmente complexa” (BALL; MAGUIRE; BRAUN, 2016, p. 14). A ideia de encenação acentua esse caráter produtivo, já que, na escola, a política toma corpo nas falas, nos registros, nos arranjos </w:t>
       </w:r>
       <w:r>
         <w:rPr>
@@ -2901,7 +2901,7 @@
         <w:rPr>
           <w:lang w:val="pt-BR"/>
         </w:rPr>
-        <w:t>Formulamos a questão de modo a manter aberto o seu resultado. Não sabemos de antemão se a PNED será acolhida, adaptada, posta de lado ou contestada pelos profissionais da escola, e pressupor qualquer uma dessas respostas comprometeria a investigação antes de ela começar. O que buscamos conhecer são as maneiras de agir diante da política e as condições que tornam algumas delas possíveis e outras pouco prováveis. A resistência, nomeada no título, entra nesse quadro como uma possibilidade de interesse da pesquisa, que poderá aparecer ou não nos dados. Se aparecer, será lida em relação às condições em que se constitui, às demandas a que responde e aos efeitos que produz no cotidiano escolar. A investigação se volta, assim, para os processos pelos quais a política adquire, no dia a dia da escola, sentidos e formas de existência diversos, o que pede uma pergunta mais ampla que a do seu cumprimento.</w:t>
+        <w:t xml:space="preserve">Formulamos a questão de modo a manter aberto o seu resultado. Não sabemos de antemão se a PNED será acolhida, adaptada, posta de lado ou contestada pelos profissionais da escola, e pressupor qualquer uma dessas respostas comprometeria a investigação antes de ela começar. O que buscamos conhecer são as maneiras de agir diante da política e as condições que tornam algumas delas possíveis e outras pouco prováveis. A teoria da atuação sustenta essa abertura, já que as políticas “raramente ditam ou determinam a prática, mas algumas mais do que outras estreitam a gama de respostas criativas” (BALL; MAGUIRE; BRAUN, 2016, p. 14). A resistência, nomeada no título, entra nesse quadro como uma possibilidade de interesse da pesquisa, que poderá aparecer ou não nos dados. Se aparecer, será lida em relação às condições em que se constitui, às demandas a que responde e aos efeitos que produz no cotidiano escolar. A investigação se volta, assim, para os processos pelos quais a política adquire, no dia a dia da escola, sentidos e formas de existência diversos, o que pede uma pergunta mais ampla que a do seu cumprimento.</w:t>
       </w:r>
     </w:p>
     <w:p>
@@ -3066,7 +3066,7 @@
         <w:rPr>
           <w:lang w:val="pt-BR"/>
         </w:rPr>
-        <w:t>Os quatro objetivos seguem o caminho que a própria política percorre até chegar às crianças. O primeiro se detém nos sujeitos e no modo como leem a política a partir do que já sabem, acreditam e praticam, e por isso dialoga com a discussão de Hargreaves (2005) sobre as culturas do trabalho docente. O segundo leva essa leitura para as condições em que ela acontece, dentro da escola e no território, e é nele que Pipa entra como dimensão do contexto da política. O terceiro reúne os dois anteriores para perguntar o que os profissionais efetivamente fazem com a PNED, sem estabelecer previamente qual forma de atuação deve prevalecer. O quarto, por fim, acompanha a política até as crianças, a quem ela se dirige e em nome de quem se justifica, e examina como as formas de encenação identificadas ampliam, limitam ou reorganizam as possibilidades de provisão, proteção e participação no ambiente digital (ONU, 2021).</w:t>
+        <w:t xml:space="preserve">Os quatro objetivos seguem o caminho que a própria política percorre até chegar às crianças. O primeiro se detém nos sujeitos e no modo como leem a política a partir do que já sabem, acreditam e praticam, e por isso dialoga com a discussão de Hargreaves (2005) sobre as culturas do trabalho docente. O segundo leva essa leitura para as condições em que ela acontece, dentro da escola e no território, e é nele que Pipa entra como dimensão do contexto da política, naquilo que Ball, Maguire e Braun (2016, p. 38) chamam de contextos situados, que incluem a localidade, as histórias escolares e as matrículas. O terceiro reúne os dois anteriores para perguntar o que os profissionais efetivamente fazem com a PNED, sem estabelecer previamente qual forma de atuação deve prevalecer. O quarto, por fim, acompanha a política até as crianças, a quem ela se dirige e em nome de quem se justifica, e examina como as formas de encenação identificadas ampliam, limitam ou reorganizam as possibilidades de provisão, proteção e participação no ambiente digital (ONU, 2021).</w:t>
       </w:r>
     </w:p>
     <w:p>
@@ -3117,7 +3117,7 @@
         <w:rPr>
           <w:lang w:val="pt-BR"/>
         </w:rPr>
-        <w:t xml:space="preserve">A pesquisa acontece, portanto, no momento em que esse conjunto de normas deixa o papel e começa a chegar às redes e às escolas. Em Tibau do Sul, como em muitos municípios de pequeno porte, essa chegada passa pela Secretaria Municipal de Educação, por formações, documentos curriculares e orientações que a escola recebe, lê e precisa transformar em trabalho com as crianças. Registrar a presença ou a ausência das orientações da PNED na Escola Municipal Domitila Castelo da Silva diria pouco sobre esse processo. Por isso, procuramos compreender como uma política pensada em escala nacional encontra uma escola de pequeno porte, situada num território com particularidades sociais, econômicas, culturais e tecnológicas, e o que resulta desse encontro. O caráter inédito da proposta pode ser descrito em três dimensões, que se apoiam umas nas outras.</w:t>
+        <w:t xml:space="preserve">A pesquisa acontece, portanto, no momento em que esse conjunto de normas deixa o papel e começa a chegar às redes e às escolas. Em Tibau do Sul, essa chegada passa pela Secretaria Municipal de Educação, por formações, documentos curriculares e orientações que a escola recebe, lê e precisa transformar em trabalho com as crianças. Registrar a presença ou a ausência das orientações da PNED na Escola Municipal Domitila Castelo da Silva diria pouco sobre esse processo, pois, no contexto da prática, “a política não é simplesmente recebida e implementada nesta arena, ao contrário, ela está sujeita à interpretação e então é ‘recriada’” (BOWE; BALL; GOLD, 1992, p. 22, tradução nossa). Por isso, procuramos compreender como uma política pensada em escala nacional encontra uma escola de pequeno porte, situada num território com particularidades sociais, econômicas, culturais e tecnológicas, e o que resulta desse encontro. O caráter inédito da proposta pode ser descrito em três dimensões, que se apoiam umas nas outras.</w:t>
       </w:r>
     </w:p>
     <w:p>
@@ -3186,7 +3186,7 @@
         <w:rPr>
           <w:lang w:val="pt-BR"/>
         </w:rPr>
-        <w:t xml:space="preserve"> realizada para esta tese, as buscas em sete bases retornaram 176 registros e resultaram num corpus de nove estudos, publicados entre 2021 e 2024. Nenhum deles se dedica especificamente à PNED, e nenhum investiga a atuação dessa política numa rede municipal de pequeno porte. A novidade da lei, por si, justificaria pouco a investigação. O que dá relevância ao estudo é a possibilidade de documentar um momento inicial de tradução de uma política nacional no interior de uma escola específica, acompanhando as mediações, as escolhas e as tensões que esse processo produz enquanto ele ainda está em curso.</w:t>
+        <w:t xml:space="preserve"> realizada para esta tese, as buscas em sete bases retornaram 176 registros e resultaram num corpus de nove estudos, publicados entre 2021 e 2024. Nenhum deles se dedica especificamente à PNED, e nenhum investiga a atuação dessa política numa rede municipal de pequeno porte. A novidade da lei, por si, justificaria pouco a investigação. O que dá relevância ao estudo é a possibilidade de documentar um momento inicial de tradução de uma política nacional no interior de uma escola específica, acompanhando as mediações, as escolhas e as tensões que esse processo produz enquanto ele ainda está em curso. Ball (2011, p. 38) lembra que a abordagem da trajetória “capta as formas pelas quais as políticas evoluem, se modificam e decaem ao longo do tempo e do espaço, assim como as suas incoerências”, e acompanhar a PNED desde a sua chegada permite registrar esse movimento na escala de uma escola.</w:t>
       </w:r>
     </w:p>
     <w:p>
@@ -3220,7 +3220,7 @@
         <w:rPr>
           <w:lang w:val="pt-BR"/>
         </w:rPr>
-        <w:t xml:space="preserve">A segunda dimensão está no lugar que o território ocupa na análise. Pipa entra nesta pesquisa como parte do contexto em que a política é encenada. O distrito, que foi vila de pescadores e se transformou, a partir dos anos 1990, em destino turístico internacional, é hoje marcado pelo turismo, pela circulação de grupos sociais muito diferentes e por experiências desiguais de acesso, de uso e de participação na cultura digital. Para ler esse território, partimos de Santos (1999, p. 19), para quem “o território não é uma categoria de análise, a categoria de análise é o território usado”, isto é, o território tomado pelas relações, pelos usos e pelos conflitos que o constituem. Em diálogo com essa perspectiva, Massey (2008) compreende o espaço como a esfera da coexistência e da multiplicidade, feita de relações e de trajetórias que se encontram sem formar uma unidade homogênea, e pensa o lugar como encontro sempre em construção.</w:t>
+        <w:t xml:space="preserve">A segunda dimensão está no lugar que o território ocupa na análise. Pipa entra nesta pesquisa como parte do contexto em que a política é encenada. O distrito, que foi vila de pescadores e se transformou, a partir dos anos 1990, em destino turístico internacional, é hoje marcado pelo turismo, pela circulação de grupos sociais muito diferentes e por experiências desiguais de acesso, de uso e de participação na cultura digital, desigualdade que acompanha a diferenciação, descrita por Santos (2006, p. 163), entre zonas servidas pelos meios de conhecimento e áreas que não dispõem deles. Para ler esse território, partimos de Santos (1999, p. 19), para quem “o território não é uma categoria de análise, a categoria de análise é o território usado”, isto é, o território tomado pelas relações, pelos usos e pelos conflitos que o constituem. Em diálogo com essa perspectiva, Massey (2008, p. 29) compreende o espaço como a esfera da coexistência e da multiplicidade, feita de relações e de trajetórias que se encontram sem formar uma unidade homogênea, e pensa o lugar como “um encontro de trajetórias” (MASSEY, 2008, p. 204), sempre em construção.</w:t>
       </w:r>
     </w:p>
     <w:p>
@@ -3236,7 +3236,7 @@
         <w:rPr>
           <w:lang w:val="pt-BR"/>
         </w:rPr>
-        <w:t>Essa leitura interessa à pesquisa porque permite olhar para a escola como um lugar onde se cruzam experiências sociais e digitais diversas. Na mesma turma podem estar a criança cuja família vive do turismo e convive com celulares, aplicativos e plataformas desde cedo, a criança recém-chegada com pais atraídos pelo setor de serviços e a criança de família nativa, ligada à pesca e às atividades tradicionais da localidade. Com Santos e Massey, perguntamos como as características do território entram nas relações pelas quais a política é interpretada e traduzida, sem atribuir ao lugar o poder de determinar o que a escola faz com ela.</w:t>
+        <w:t xml:space="preserve">Essa leitura interessa à pesquisa porque permite olhar para a escola como um lugar onde se cruzam experiências sociais e digitais diversas. Na mesma turma podem estar a criança cuja família vive do turismo e convive com celulares, aplicativos e plataformas desde cedo, a criança recém-chegada com pais atraídos pelo setor de serviços e a criança de família nativa, ligada à pesca e às atividades tradicionais da localidade. É o que Massey (2008, p. 203) chama de “esse acabar juntos, o inevitável desafio de negociar um aqui-e-agora”. Com Santos e Massey, perguntamos como as características do território entram nas relações pelas quais a política é interpretada e traduzida, sem atribuir ao lugar o poder de determinar o que a escola faz com ela.</w:t>
       </w:r>
     </w:p>
     <w:p>
@@ -3287,7 +3287,7 @@
         <w:rPr>
           <w:lang w:val="pt-BR"/>
         </w:rPr>
-        <w:t>reconhecem que os profissionais da educação interpretam as políticas e lhes dão forma, e examinam pouco as culturas profissionais que filtram essa interpretação e as condições em que ela se produz. Ao reunir esses referenciais, a pesquisa pode tratar a distância entre o que a política prescreve e o que acontece na escola como parte de uma relação política entre texto, contexto e sujeitos, evitando classificá-la de imediato como falha, incapacidade ou resistência.</w:t>
+        <w:t xml:space="preserve">reconhecem que os profissionais da educação interpretam as políticas e lhes dão forma, e examinam pouco as culturas profissionais que filtram essa interpretação e as condições em que ela se produz. Ao reunir esses referenciais, a pesquisa pode tratar a distância entre o que a política prescreve e o que acontece na escola como parte de uma relação política entre texto, contexto e sujeitos, evitando classificá-la de imediato como falha, incapacidade ou resistência, cuidado que Ball (2011, p. 36, 46) recomenda ao criticar tanto as pesquisas que localizam o problema apenas na escola e no professor quanto as que transformam os sujeitos pesquisados em heróis.</w:t>
       </w:r>
     </w:p>
     <w:p>

</xml_diff>

<commit_message>
Projeto, parte 2 (seções 5 a 8), Foucault na seção 11 e história de Pipa com Aires (2012)
Co-Authored-By: Claude Opus 5.5 <noreply@anthropic.com>
Claude-Session: https://claude.ai/code/session_01HxStpW4pQoDfJdTDYr6zEC
</commit_message>
<xml_diff>
--- a/projeto_desenvolvido/PROJETO_DE_TESE_COMPLETO_ABNT.docx
+++ b/projeto_desenvolvido/PROJETO_DE_TESE_COMPLETO_ABNT.docx
@@ -3220,7 +3220,7 @@
         <w:rPr>
           <w:lang w:val="pt-BR"/>
         </w:rPr>
-        <w:t xml:space="preserve">A segunda dimensão está no lugar que o território ocupa na análise. Pipa entra nesta pesquisa como parte do contexto em que a política é encenada. O distrito, que foi vila de pescadores e se transformou, a partir dos anos 1990, em destino turístico internacional, é hoje marcado pelo turismo, pela circulação de grupos sociais muito diferentes e por experiências desiguais de acesso, de uso e de participação na cultura digital, desigualdade que acompanha a diferenciação, descrita por Santos (2006, p. 163), entre zonas servidas pelos meios de conhecimento e áreas que não dispõem deles. Para ler esse território, partimos de Santos (1999, p. 19), para quem “o território não é uma categoria de análise, a categoria de análise é o território usado”, isto é, o território tomado pelas relações, pelos usos e pelos conflitos que o constituem. Em diálogo com essa perspectiva, Massey (2008, p. 29) compreende o espaço como a esfera da coexistência e da multiplicidade, feita de relações e de trajetórias que se encontram sem formar uma unidade homogênea, e pensa o lugar como “um encontro de trajetórias” (MASSEY, 2008, p. 204), sempre em construção.</w:t>
+        <w:t xml:space="preserve">A segunda dimensão está no lugar que o território ocupa na análise. Pipa entra nesta pesquisa como parte do contexto em que a política é encenada. O distrito, que na década de 1970 era uma comunidade agrícola e pesqueira e se tornou destino turístico internacional com a chegada dos surfistas, a partir de meados daquela década, e com a divulgação mais intensa iniciada nos anos 1990 (AIRES, 2012, p. 80-81), é hoje marcado pelo turismo, pela circulação de grupos sociais muito diferentes e por experiências desiguais de acesso, de uso e de participação na cultura digital, desigualdade que acompanha a diferenciação, descrita por Santos (2006, p. 163), entre zonas servidas pelos meios de conhecimento e áreas que não dispõem deles. Para ler esse território, partimos de Santos (1999, p. 19), para quem “o território não é uma categoria de análise, a categoria de análise é o território usado”, isto é, o território tomado pelas relações, pelos usos e pelos conflitos que o constituem. Em diálogo com essa perspectiva, Massey (2008, p. 29) compreende o espaço como a esfera da coexistência e da multiplicidade, feita de relações e de trajetórias que se encontram sem formar uma unidade homogênea, e pensa o lugar como “um encontro de trajetórias” (MASSEY, 2008, p. 204), sempre em construção.</w:t>
       </w:r>
     </w:p>
     <w:p>
@@ -3459,7 +3459,7 @@
         <w:rPr>
           <w:lang w:val="pt-BR"/>
         </w:rPr>
-        <w:t xml:space="preserve">A teoria da atuação de Ball, Maguire e Braun (2016) é o principal dispositivo analítico da pesquisa. Os autores voltam a atenção para os processos pelos quais as escolas colocam as políticas em ação e mostram que esses processos dependem das condições concretas de cada instituição. Para examiná-las, propõem quatro dimensões do contexto, que orientarão a construção da análise. A dimensão situacional reúne a história da escola, sua localização e a composição de seu público, e é por ela que o território de Pipa e a trajetória da Escola </w:t>
+        <w:t xml:space="preserve">A teoria da atuação de Ball, Maguire e Braun (2016) é o principal dispositivo analítico da pesquisa. Os autores voltam a atenção para os processos pelos quais as escolas colocam as políticas em ação e mostram que esses processos dependem das condições concretas de cada instituição. Para examiná-las, propõem quatro dimensões do contexto (BALL; MAGUIRE; BRAUN, 2016, p. 38), que orientarão a construção da análise. A dimensão situacional reúne a história da escola, sua localização e a composição de seu público, e é por ela que o território de Pipa e a trajetória da Escola </w:t>
       </w:r>
       <w:r>
         <w:rPr>
@@ -3547,7 +3547,7 @@
         <w:rPr>
           <w:lang w:val="pt-BR"/>
         </w:rPr>
-        <w:t xml:space="preserve">A performatividade será trabalhada a partir de Ball (2004), que a descreve como uma cultura de metas, comparações, indicadores e prestação de contas capaz de orientar o trabalho e a própria identidade dos profissionais da educação. Interessa-nos saber se, em Pipa, a educação digital chega à escola acompanhada de exigências de registro, demonstração, monitoramento ou responsabilização, e o que os profissionais fazem diante delas. Se a PNED produz ou não uma cultura de performatividade na escola é questão que caberá aos dados responder. Ligada a ela está a noção de fabricação, com a qual Ball (2002) nomeia as versões de uma instituição ou de uma prática produzidas para serem vistas, avaliadas e prestadas como conta. Essa noção será mobilizada quando os dados indicarem a construção de </w:t>
+        <w:t xml:space="preserve">A performatividade será trabalhada a partir de Ball (2004), que a descreve como uma cultura de metas, comparações, indicadores e prestação de contas capaz de orientar o trabalho e a própria identidade dos profissionais da educação. Em outro texto, o autor a define nestes termos: “A performatividade é uma cultura ou um sistema de ‘terror’. É um regime de prestação de contas que emprega julgamentos, comparações e exposições como meios de controle, desgaste e mudança” (BALL, 2008, p. 49, tradução nossa). Interessa-nos saber se, em Pipa, a educação digital chega à escola acompanhada de exigências de registro, demonstração, monitoramento ou responsabilização, e o que os profissionais fazem diante delas. Se a PNED produz ou não uma cultura de performatividade na escola é questão que caberá aos dados responder. Ligada a ela está a noção de fabricação, com a qual Ball (2002) nomeia as versões de uma instituição ou de uma prática produzidas para serem vistas, avaliadas e prestadas como conta. Essa noção será mobilizada quando os dados indicarem a construção de </w:t>
       </w:r>
       <w:r>
         <w:rPr>
@@ -3632,20 +3632,20 @@
         <w:rPr>
           <w:lang w:val="pt-BR"/>
         </w:rPr>
-        <w:t xml:space="preserve">, Santos (2006) compreende o espaço como conjunto indissociável de sistemas de objetos e de sistemas de ações e atribui à técnica um papel central na relação entre espaço e tempo. Os objetos técnicos instalados num lugar carregam a história do momento em que foram produzidos e condicionam as ações que ali se tornam possíveis. Como os lugares não se renovam por inteiro, formas herdadas de outros períodos continuam presentes e participam do presente. O autor dá a essas permanências o nome de rugosidades: “Chamemos rugosidade ao que fica do passado como forma, espaço construído, paisagem, o que resta do processo de supressão, acumulação, superposição, com que as coisas se substituem e acumulam em todos os lugares” (SANTOS, 2006, p. 92). Em </w:t>
+        <w:t xml:space="preserve">, Santos (2006, p. 12) compreende o espaço como conjunto indissociável de sistemas de objetos e de sistemas de ações e atribui à técnica um papel central na relação entre espaço e tempo. Os objetos técnicos instalados num lugar carregam a história do momento em que foram produzidos e condicionam as ações que ali se tornam possíveis. Nas palavras do autor, “os sistemas de objetos condicionam a forma como se dão as ações e, de outro lado, o sistema de ações leva à criação de objetos novos ou se realiza sobre objetos preexistentes” (SANTOS, 2006, p. 39). Como os lugares não se renovam por inteiro, formas herdadas de outros períodos continuam presentes e participam do presente. O autor dá a essas permanências o nome de rugosidades: “Chamemos rugosidade ao que fica do passado como forma, espaço construído, paisagem, o que resta do processo de supressão, acumulação, superposição, com que as coisas se substituem e acumulam em todos os lugares” (SANTOS, 2006, p. 92). Em Espaço e método, o autor reforça essa leitura ao afirmar que “o passado técnico da forma é uma realidade a ser levada em consideração quando se tenta analisar o espaço” (SANTOS, 2012, p. 73).</w:t>
       </w:r>
       <w:r>
         <w:rPr>
           <w:i/>
           <w:lang w:val="pt-BR"/>
         </w:rPr>
-        <w:t>Pensando o espaço do homem</w:t>
-      </w:r>
-      <w:r>
-        <w:rPr>
-          <w:lang w:val="pt-BR"/>
-        </w:rPr>
-        <w:t>, Santos (2004) reforça essa leitura ao tratar o espaço como acumulação desigual de tempos.</w:t>
+        <w:t xml:space="preserve"/>
+      </w:r>
+      <w:r>
+        <w:rPr>
+          <w:lang w:val="pt-BR"/>
+        </w:rPr>
+        <w:t xml:space="preserve"/>
       </w:r>
     </w:p>
     <w:p>
@@ -3691,7 +3691,7 @@
         <w:rPr>
           <w:lang w:val="pt-BR"/>
         </w:rPr>
-        <w:t>Massey (2008) complementa essa leitura ao compreender o espaço “como a esfera da possibilidade da existência da multiplicidade, no sentido da pluralidade contemporânea, como a esfera na qual distintas trajetórias coexistem” (MASSEY, 2008, p. 29). Para a autora, o lugar é atravessado por trajetórias diversas e permanece aberto ao encontro e à negociação. A transformação de Pipa ganha, com ela, outra nitidez. O distrito que foi vila de pescadores passou a receber, a partir dos anos 1990, o turismo ligado ao surfe, investimentos imobiliários nacionais e estrangeiros, trabalhadores atraídos pelo setor de serviços e, mais recentemente, pessoas que trabalham remotamente para empresas sediadas em outros lugares. Essas trajetórias se sobrepõem no território e chegam à escola na forma das famílias e das crianças que ela atende.</w:t>
+        <w:t xml:space="preserve">Massey (2008) complementa essa leitura ao compreender o espaço “como a esfera da possibilidade da existência da multiplicidade, no sentido da pluralidade contemporânea, como a esfera na qual distintas trajetórias coexistem” (MASSEY, 2008, p. 29). Para a autora, o lugar é atravessado por trajetórias diversas e permanece aberto ao encontro e à negociação. A transformação de Pipa ganha, com ela, outra nitidez. A comunidade agrícola e pesqueira da década de 1970, sem energia elétrica, água encanada e boas vias de acesso, já recebia veranistas de famílias da região, passou a receber surfistas a partir de meados daquela década e, com a divulgação mais intensa do lugar no início dos anos 1990, turistas de várias partes do mundo. Nesse processo, terras de nativos passaram a veranistas, surfistas e estrangeiros, e trabalhadores de municípios vizinhos chegaram atraídos pelos serviços (AIRES, 2012, p. 79-86). Aires (2012, p. 9) observa que a população nativa não foi passiva diante dessas mudanças, criando “mecanismos de reformulações materiais e simbólicas”, e que “muitas paisagens ainda revelam materialidades de tempos passados, como inscrição das práticas sociais na construção do lugar”, observação que aproxima a história do distrito da noção de rugosidade. Essas trajetórias se sobrepõem no território e chegam à escola na forma das famílias e das crianças que ela atende.</w:t>
       </w:r>
     </w:p>
     <w:p>
@@ -3808,7 +3808,7 @@
         <w:rPr>
           <w:lang w:val="pt-BR"/>
         </w:rPr>
-        <w:t xml:space="preserve"> (2021), o habitar é tomado em sentido mais amplo que o de morar ou permanecer num lugar e aproxima-se da ideia de estar presente. Ele aparece como experiência relacional, constituída pelas relações entre sujeitos, ambientes, tecnologias e redes. Essa discussão dialoga com a obra de Massimo Di Felice. Em </w:t>
+        <w:t xml:space="preserve"> (2021), o habitar é tomado em sentido mais amplo que o de morar ou permanecer num lugar e aproxima-se da ideia de estar presente. Ele aparece como experiência relacional, constituída pelas relações entre sujeitos, ambientes, tecnologias e redes. Os autores chamam de Educação OnLIFE “uma educação transubstanciada e cibricidadã, ligada, conectada (On) na vida (LIFE), a partir de problematizações que emergem do tempo presente, nessa realidade hiperconectada” (SCHLEMMER et al., 2021, p. 24). Essa discussão dialoga com a obra de Massimo Di Felice. Em </w:t>
       </w:r>
       <w:r>
         <w:rPr>
@@ -3821,21 +3821,21 @@
         <w:rPr>
           <w:lang w:val="pt-BR"/>
         </w:rPr>
-        <w:t xml:space="preserve">, Di Felice (2009) retoma a tradição filosófica do habitar, que remonta a Heidegger, e pensa o habitar como prática comunicativa, mostrando como as diferentes tecnologias transformam a relação entre o sujeito, os meios de comunicação e o território. Com as redes digitais, o autor descreve um habitar atópico, em que a experiência </w:t>
+        <w:t xml:space="preserve">, Di Felice (2009) retoma a tradição filosófica do habitar, que remonta a Heidegger, e pensa o habitar como prática comunicativa, mostrando como as diferentes tecnologias transformam a relação entre o sujeito, os meios de comunicação e o território. Com as redes digitais, o autor descreve um habitar atópico, em que a experiência habitativa passa a envolver interfaces, fluxos informativos e relações que não se reduzem ao espaço físico. Para o autor, o habitar atópico se configura “como a hibridação, transitória e fluida, de corpos, tecnologia e paisagem” (DI FELICE, 2009, p. 291).</w:t>
       </w:r>
       <w:proofErr w:type="spellStart"/>
       <w:r>
         <w:rPr>
           <w:lang w:val="pt-BR"/>
         </w:rPr>
-        <w:t>habitativa</w:t>
+        <w:t xml:space="preserve"/>
       </w:r>
       <w:proofErr w:type="spellEnd"/>
       <w:r>
         <w:rPr>
           <w:lang w:val="pt-BR"/>
         </w:rPr>
-        <w:t xml:space="preserve"> passa a envolver interfaces, fluxos informativos e relações que não se reduzem ao espaço físico. </w:t>
+        <w:t xml:space="preserve"> </w:t>
       </w:r>
       <w:proofErr w:type="spellStart"/>
       <w:r>
@@ -3924,7 +3924,7 @@
         <w:rPr>
           <w:lang w:val="pt-BR"/>
         </w:rPr>
-        <w:t xml:space="preserve">Por essa razão, habitar o digital é, nesta tese, mais do que acesso à internet ou posse de equipamentos. A expressão orienta duas perguntas. A primeira diz respeito ao território e indaga como se habita o digital quando a tecnologia está intensamente presente em certos circuitos do distrito e pouco presente nos espaços destinados à educação. A segunda diz respeito à escola e indaga que formas de participação, uso, apropriação e experiência digital se tornam possíveis, ou permanecem restritas, para as crianças nessas condições. A formulação será confrontada com os dados e poderá ser aprofundada, revista ou tensionada ao </w:t>
+        <w:t xml:space="preserve">Por essa razão, habitar o digital é, nesta tese, mais do que acesso à internet ou posse de equipamentos. Valente já advertia, no fim dos anos 1990, que “implantar computadores nas escolas sem o devido preparo de professores e da comunidade escolar não trará os benefícios que esperamos” (VALENTE, 1999, p. 83). A expressão orienta duas perguntas. A primeira diz respeito ao território e indaga como se habita o digital quando a tecnologia está intensamente presente em certos circuitos do distrito e pouco presente nos espaços destinados à educação. A segunda diz respeito à escola e indaga que formas de participação, uso, apropriação e experiência digital se tornam possíveis, ou permanecem restritas, para as crianças nessas condições. A formulação será confrontada com os dados e poderá ser aprofundada, revista ou tensionada ao </w:t>
       </w:r>
       <w:r>
         <w:rPr>
@@ -4014,7 +4014,7 @@
         <w:rPr>
           <w:lang w:val="pt-BR"/>
         </w:rPr>
-        <w:t xml:space="preserve">Em diálogo com esses documentos, organizamos a análise em três dimensões, que constituem uma organização analítica própria da tese. A provisão diz respeito às condições necessárias para que as crianças tenham acesso significativo à educação digital, como equipamentos, conectividade, tempo e profissionais formados. A proteção envolve a segurança, a privacidade, o cuidado e o enfrentamento dos riscos presentes nos ambientes digitais, e ganha peso quando se considera, com Silveira (2017), que o mercado de dados pessoais se expande justamente sobre o terreno da privacidade. A participação refere-se às possibilidades de as crianças acessarem informação, produzirem, criarem, comunicarem-se, expressarem opiniões e tomarem parte da cultura digital como sujeitos. Com essas dimensões, buscaremos compreender como as diferentes formas de encenação da PNED na Escola Municipal Domitila Castelo da Silva podem ampliar, limitar ou reorganizar as possibilidades de as crianças de Pipa habitarem o digital. Para chegar a essa compreensão, a pesquisa adota o percurso metodológico apresentado a seguir.</w:t>
+        <w:t xml:space="preserve">Em diálogo com esses documentos, organizamos a análise em três dimensões, que constituem uma organização analítica própria da tese. A provisão diz respeito às condições necessárias para que as crianças tenham acesso significativo à educação digital, como equipamentos, conectividade, tempo e profissionais formados. A proteção envolve a segurança, a privacidade, o cuidado e o enfrentamento dos riscos presentes nos ambientes digitais, e ganha peso quando se considera, com Silveira (2017), que o mercado de dados pessoais se expande justamente sobre o terreno da privacidade. A participação refere-se às possibilidades de as crianças acessarem informação, produzirem, criarem, comunicarem-se, expressarem opiniões e tomarem parte da cultura digital como sujeitos. Freire lembra que não há respeito aos educandos “se não se levam em consideração as condições em que eles vêm existindo, se não se reconhece a importância dos ‘conhecimentos de experiência feitos’ com que chegam à escola” (FREIRE, 2019, p. 62), e a participação começa por esses saberes. Com essas dimensões, buscaremos compreender como as diferentes formas de encenação da PNED na Escola Municipal Domitila Castelo da Silva podem ampliar, limitar ou reorganizar as possibilidades de as crianças de Pipa habitarem o digital. Para chegar a essa compreensão, a pesquisa adota o percurso metodológico apresentado a seguir.</w:t>
       </w:r>
     </w:p>
     <w:p>
@@ -4489,6 +4489,22 @@
           <w:lang w:val="pt-BR"/>
         </w:rPr>
         <w:t>Uma prática distante do que a norma prescreve não será, por isso, classificada de imediato como resistência. Ela pode corresponder a uma acomodação, à falta de condições para fazer o que se pede, à prioridade dada a outra demanda, a uma interpretação diferente do texto, a uma omissão, a uma adaptação ou a uma negociação, e a distinção entre essas possibilidades será construída durante a análise, com atenção às condições em que cada prática aparece e às razões que os profissionais lhe atribuem. Essa abertura permite manter a resistência como problema relevante para a tese sem transformá-la numa conclusão antecipada.</w:t>
+      </w:r>
+    </w:p>
+    <w:p>
+      <w:pPr>
+        <w:spacing w:after="0" w:line="360" w:lineRule="auto"/>
+        <w:ind w:firstLine="709"/>
+        <w:jc w:val="both"/>
+        <w:rPr>
+          <w:lang w:val="pt-BR"/>
+        </w:rPr>
+      </w:pPr>
+      <w:r>
+        <w:rPr>
+          <w:lang w:val="pt-BR"/>
+        </w:rPr>
+        <w:t xml:space="preserve">Foucault ajuda a dar a essa abertura um estatuto teórico. Ball, Maguire e Braun recorrem a ele ao tratar a política como “uma certa economia de discursos da verdade” (FOUCAULT, 1980, p. 93 apud BALL; MAGUIRE; BRAUN, 2016, p. 21), que se investe no cotidiano das escolas. Em Vigiar e punir, o próprio Foucault mostra que as relações de poder “não são unívocas; definem inúmeros pontos de luta, focos de instabilidade comportando cada um seus riscos de conflito, de lutas e de inversão pelo menos transitória da relação de forças” (FOUCAULT, [ano], p. 29). Lida com o autor, a resistência faz parte das relações de poder que a política mobiliza na escola, e por isso pode aparecer sem ser pressuposta: onde há normas, exigências e registros, há também pontos em que eles se tornam instáveis.</w:t>
       </w:r>
     </w:p>
     <w:p>
@@ -4679,20 +4695,20 @@
         <w:rPr>
           <w:lang w:val="pt-BR"/>
         </w:rPr>
-        <w:t xml:space="preserve">BALL, Stephen J. Reformar escolas/reformar professores e os terrores da performatividade. </w:t>
-      </w:r>
-      <w:r>
-        <w:rPr>
+        <w:t xml:space="preserve">AIRES, Jussara Danielle Martins. </w:t>
+      </w:r>
+      <w:r>
+        <w:rPr>
+          <w:lang w:val="pt-BR"/>
           <w:b/>
-          <w:lang w:val="pt-BR"/>
-        </w:rPr>
-        <w:t>Revista Portuguesa de Educação</w:t>
-      </w:r>
-      <w:r>
-        <w:rPr>
-          <w:lang w:val="pt-BR"/>
-        </w:rPr>
-        <w:t>, Braga, v. 15, n. 2, p. 3-23, 2002.</w:t>
+        </w:rPr>
+        <w:t xml:space="preserve">Histórias e relatos sobre Pipa</w:t>
+      </w:r>
+      <w:r>
+        <w:rPr>
+          <w:lang w:val="pt-BR"/>
+        </w:rPr>
+        <w:t xml:space="preserve">: a praia internacional do Rio Grande do Norte. 2012. 114 f. Dissertação (Mestrado em Ciências Sociais) – Programa de Pós-Graduação em Ciências Sociais, Universidade Federal do Rio Grande do Norte, Natal, 2012.</w:t>
       </w:r>
     </w:p>
     <w:p>
@@ -4716,6 +4732,43 @@
         <w:rPr>
           <w:lang w:val="pt-BR"/>
         </w:rPr>
+        <w:t xml:space="preserve">BALL, Stephen J. Reformar escolas/reformar professores e os terrores da performatividade. </w:t>
+      </w:r>
+      <w:r>
+        <w:rPr>
+          <w:b/>
+          <w:lang w:val="pt-BR"/>
+        </w:rPr>
+        <w:t>Revista Portuguesa de Educação</w:t>
+      </w:r>
+      <w:r>
+        <w:rPr>
+          <w:lang w:val="pt-BR"/>
+        </w:rPr>
+        <w:t>, Braga, v. 15, n. 2, p. 3-23, 2002.</w:t>
+      </w:r>
+    </w:p>
+    <w:p>
+      <w:pPr>
+        <w:spacing w:after="0" w:line="240" w:lineRule="auto"/>
+        <w:jc w:val="both"/>
+        <w:rPr>
+          <w:lang w:val="pt-BR"/>
+        </w:rPr>
+      </w:pPr>
+    </w:p>
+    <w:p>
+      <w:pPr>
+        <w:spacing w:after="0" w:line="240" w:lineRule="auto"/>
+        <w:jc w:val="both"/>
+        <w:rPr>
+          <w:lang w:val="pt-BR"/>
+        </w:rPr>
+      </w:pPr>
+      <w:r>
+        <w:rPr>
+          <w:lang w:val="pt-BR"/>
+        </w:rPr>
         <w:t xml:space="preserve">BALL, Stephen J. Performatividade, privatização e o pós-Estado do bem-estar. </w:t>
       </w:r>
       <w:r>
@@ -4730,6 +4783,43 @@
           <w:lang w:val="pt-BR"/>
         </w:rPr>
         <w:t>, Campinas, v. 25, n. 89, p. 1105-1126, 2004.</w:t>
+      </w:r>
+    </w:p>
+    <w:p>
+      <w:pPr>
+        <w:spacing w:after="0" w:line="240" w:lineRule="auto"/>
+        <w:jc w:val="both"/>
+        <w:rPr>
+          <w:lang w:val="pt-BR"/>
+        </w:rPr>
+      </w:pPr>
+    </w:p>
+    <w:p>
+      <w:pPr>
+        <w:spacing w:after="0" w:line="240" w:lineRule="auto"/>
+        <w:jc w:val="both"/>
+        <w:rPr>
+          <w:lang w:val="pt-BR"/>
+        </w:rPr>
+      </w:pPr>
+      <w:r>
+        <w:rPr>
+          <w:lang w:val="pt-BR"/>
+        </w:rPr>
+        <w:t xml:space="preserve">BALL, Stephen J. </w:t>
+      </w:r>
+      <w:r>
+        <w:rPr>
+          <w:lang w:val="pt-BR"/>
+          <w:b/>
+        </w:rPr>
+        <w:t xml:space="preserve">The education debate</w:t>
+      </w:r>
+      <w:r>
+        <w:rPr>
+          <w:lang w:val="pt-BR"/>
+        </w:rPr>
+        <w:t xml:space="preserve">. Bristol: The Policy Press, 2008.</w:t>
       </w:r>
     </w:p>
     <w:p>
@@ -5480,20 +5570,20 @@
         <w:rPr>
           <w:lang w:val="pt-BR"/>
         </w:rPr>
-        <w:t xml:space="preserve">FREIRE, Paulo. </w:t>
+        <w:t xml:space="preserve">FOUCAULT, Michel. </w:t>
       </w:r>
       <w:r>
         <w:rPr>
           <w:lang w:val="pt-BR"/>
           <w:b/>
         </w:rPr>
-        <w:t xml:space="preserve">Pedagogia da autonomia</w:t>
-      </w:r>
-      <w:r>
-        <w:rPr>
-          <w:lang w:val="pt-BR"/>
-        </w:rPr>
-        <w:t xml:space="preserve">: saberes necessários à prática educativa. 60. ed. Rio de Janeiro: Paz e Terra, 2019.</w:t>
+        <w:t xml:space="preserve">Vigiar e punir</w:t>
+      </w:r>
+      <w:r>
+        <w:rPr>
+          <w:lang w:val="pt-BR"/>
+        </w:rPr>
+        <w:t xml:space="preserve">: nascimento da prisão. Tradução de Raquel Ramalhete. Petrópolis: Vozes, [ano].</w:t>
       </w:r>
     </w:p>
     <w:p>
@@ -5517,108 +5607,20 @@
         <w:rPr>
           <w:lang w:val="pt-BR"/>
         </w:rPr>
-        <w:t xml:space="preserve">HARGREAVES, Andy. </w:t>
-      </w:r>
-      <w:proofErr w:type="spellStart"/>
-      <w:r>
-        <w:rPr>
+        <w:t xml:space="preserve">FREIRE, Paulo. </w:t>
+      </w:r>
+      <w:r>
+        <w:rPr>
+          <w:lang w:val="pt-BR"/>
           <w:b/>
-          <w:lang w:val="pt-BR"/>
-        </w:rPr>
-        <w:t>Profesorado</w:t>
-      </w:r>
-      <w:proofErr w:type="spellEnd"/>
-      <w:r>
-        <w:rPr>
-          <w:b/>
-          <w:lang w:val="pt-BR"/>
-        </w:rPr>
-        <w:t xml:space="preserve">, cultura y </w:t>
-      </w:r>
-      <w:proofErr w:type="spellStart"/>
-      <w:r>
-        <w:rPr>
-          <w:b/>
-          <w:lang w:val="pt-BR"/>
-        </w:rPr>
-        <w:t>postmodernidad</w:t>
-      </w:r>
-      <w:proofErr w:type="spellEnd"/>
-      <w:r>
-        <w:rPr>
-          <w:lang w:val="pt-BR"/>
-        </w:rPr>
-        <w:t xml:space="preserve">: </w:t>
-      </w:r>
-      <w:proofErr w:type="spellStart"/>
-      <w:r>
-        <w:rPr>
-          <w:lang w:val="pt-BR"/>
-        </w:rPr>
-        <w:t>cambian</w:t>
-      </w:r>
-      <w:proofErr w:type="spellEnd"/>
-      <w:r>
-        <w:rPr>
-          <w:lang w:val="pt-BR"/>
-        </w:rPr>
-        <w:t xml:space="preserve"> </w:t>
-      </w:r>
-      <w:proofErr w:type="spellStart"/>
-      <w:r>
-        <w:rPr>
-          <w:lang w:val="pt-BR"/>
-        </w:rPr>
-        <w:t>los</w:t>
-      </w:r>
-      <w:proofErr w:type="spellEnd"/>
-      <w:r>
-        <w:rPr>
-          <w:lang w:val="pt-BR"/>
-        </w:rPr>
-        <w:t xml:space="preserve"> </w:t>
-      </w:r>
-      <w:proofErr w:type="spellStart"/>
-      <w:r>
-        <w:rPr>
-          <w:lang w:val="pt-BR"/>
-        </w:rPr>
-        <w:t>tiempos</w:t>
-      </w:r>
-      <w:proofErr w:type="spellEnd"/>
-      <w:r>
-        <w:rPr>
-          <w:lang w:val="pt-BR"/>
-        </w:rPr>
-        <w:t xml:space="preserve">, cambia </w:t>
-      </w:r>
-      <w:proofErr w:type="spellStart"/>
-      <w:r>
-        <w:rPr>
-          <w:lang w:val="pt-BR"/>
-        </w:rPr>
-        <w:t>el</w:t>
-      </w:r>
-      <w:proofErr w:type="spellEnd"/>
-      <w:r>
-        <w:rPr>
-          <w:lang w:val="pt-BR"/>
-        </w:rPr>
-        <w:t xml:space="preserve"> </w:t>
-      </w:r>
-      <w:proofErr w:type="spellStart"/>
-      <w:r>
-        <w:rPr>
-          <w:lang w:val="pt-BR"/>
-        </w:rPr>
-        <w:t>profesorado</w:t>
-      </w:r>
-      <w:proofErr w:type="spellEnd"/>
-      <w:r>
-        <w:rPr>
-          <w:lang w:val="pt-BR"/>
-        </w:rPr>
-        <w:t>. 5. ed. Madrid: Morata, 2005.</w:t>
+        </w:rPr>
+        <w:t xml:space="preserve">Pedagogia da autonomia</w:t>
+      </w:r>
+      <w:r>
+        <w:rPr>
+          <w:lang w:val="pt-BR"/>
+        </w:rPr>
+        <w:t xml:space="preserve">: saberes necessários à prática educativa. 60. ed. Rio de Janeiro: Paz e Terra, 2019.</w:t>
       </w:r>
     </w:p>
     <w:p>
@@ -5642,20 +5644,108 @@
         <w:rPr>
           <w:lang w:val="pt-BR"/>
         </w:rPr>
-        <w:t xml:space="preserve">MAINARDES, Jefferson. Abordagem do ciclo de políticas: uma contribuição para a análise de políticas educacionais. </w:t>
-      </w:r>
+        <w:t xml:space="preserve">HARGREAVES, Andy. </w:t>
+      </w:r>
+      <w:proofErr w:type="spellStart"/>
       <w:r>
         <w:rPr>
           <w:b/>
           <w:lang w:val="pt-BR"/>
         </w:rPr>
-        <w:t>Educação &amp; Sociedade</w:t>
-      </w:r>
-      <w:r>
-        <w:rPr>
-          <w:lang w:val="pt-BR"/>
-        </w:rPr>
-        <w:t>, Campinas, v. 27, n. 94, p. 47-69, 2006.</w:t>
+        <w:t>Profesorado</w:t>
+      </w:r>
+      <w:proofErr w:type="spellEnd"/>
+      <w:r>
+        <w:rPr>
+          <w:b/>
+          <w:lang w:val="pt-BR"/>
+        </w:rPr>
+        <w:t xml:space="preserve">, cultura y </w:t>
+      </w:r>
+      <w:proofErr w:type="spellStart"/>
+      <w:r>
+        <w:rPr>
+          <w:b/>
+          <w:lang w:val="pt-BR"/>
+        </w:rPr>
+        <w:t>postmodernidad</w:t>
+      </w:r>
+      <w:proofErr w:type="spellEnd"/>
+      <w:r>
+        <w:rPr>
+          <w:lang w:val="pt-BR"/>
+        </w:rPr>
+        <w:t xml:space="preserve">: </w:t>
+      </w:r>
+      <w:proofErr w:type="spellStart"/>
+      <w:r>
+        <w:rPr>
+          <w:lang w:val="pt-BR"/>
+        </w:rPr>
+        <w:t>cambian</w:t>
+      </w:r>
+      <w:proofErr w:type="spellEnd"/>
+      <w:r>
+        <w:rPr>
+          <w:lang w:val="pt-BR"/>
+        </w:rPr>
+        <w:t xml:space="preserve"> </w:t>
+      </w:r>
+      <w:proofErr w:type="spellStart"/>
+      <w:r>
+        <w:rPr>
+          <w:lang w:val="pt-BR"/>
+        </w:rPr>
+        <w:t>los</w:t>
+      </w:r>
+      <w:proofErr w:type="spellEnd"/>
+      <w:r>
+        <w:rPr>
+          <w:lang w:val="pt-BR"/>
+        </w:rPr>
+        <w:t xml:space="preserve"> </w:t>
+      </w:r>
+      <w:proofErr w:type="spellStart"/>
+      <w:r>
+        <w:rPr>
+          <w:lang w:val="pt-BR"/>
+        </w:rPr>
+        <w:t>tiempos</w:t>
+      </w:r>
+      <w:proofErr w:type="spellEnd"/>
+      <w:r>
+        <w:rPr>
+          <w:lang w:val="pt-BR"/>
+        </w:rPr>
+        <w:t xml:space="preserve">, cambia </w:t>
+      </w:r>
+      <w:proofErr w:type="spellStart"/>
+      <w:r>
+        <w:rPr>
+          <w:lang w:val="pt-BR"/>
+        </w:rPr>
+        <w:t>el</w:t>
+      </w:r>
+      <w:proofErr w:type="spellEnd"/>
+      <w:r>
+        <w:rPr>
+          <w:lang w:val="pt-BR"/>
+        </w:rPr>
+        <w:t xml:space="preserve"> </w:t>
+      </w:r>
+      <w:proofErr w:type="spellStart"/>
+      <w:r>
+        <w:rPr>
+          <w:lang w:val="pt-BR"/>
+        </w:rPr>
+        <w:t>profesorado</w:t>
+      </w:r>
+      <w:proofErr w:type="spellEnd"/>
+      <w:r>
+        <w:rPr>
+          <w:lang w:val="pt-BR"/>
+        </w:rPr>
+        <w:t>. 5. ed. Madrid: Morata, 2005.</w:t>
       </w:r>
     </w:p>
     <w:p>
@@ -5679,34 +5769,20 @@
         <w:rPr>
           <w:lang w:val="pt-BR"/>
         </w:rPr>
-        <w:t xml:space="preserve">MASSEY, </w:t>
-      </w:r>
-      <w:proofErr w:type="spellStart"/>
-      <w:r>
-        <w:rPr>
-          <w:lang w:val="pt-BR"/>
-        </w:rPr>
-        <w:t>Doreen</w:t>
-      </w:r>
-      <w:proofErr w:type="spellEnd"/>
-      <w:r>
-        <w:rPr>
-          <w:lang w:val="pt-BR"/>
-        </w:rPr>
-        <w:t xml:space="preserve">. </w:t>
+        <w:t xml:space="preserve">MAINARDES, Jefferson. Abordagem do ciclo de políticas: uma contribuição para a análise de políticas educacionais. </w:t>
       </w:r>
       <w:r>
         <w:rPr>
           <w:b/>
           <w:lang w:val="pt-BR"/>
         </w:rPr>
-        <w:t>Pelo espaço</w:t>
-      </w:r>
-      <w:r>
-        <w:rPr>
-          <w:lang w:val="pt-BR"/>
-        </w:rPr>
-        <w:t xml:space="preserve">: uma nova política da espacialidade. Tradução de Hilda Pareto Maciel e Rogério Haesbaert. Rio de Janeiro: Bertrand Brasil, 2008.</w:t>
+        <w:t>Educação &amp; Sociedade</w:t>
+      </w:r>
+      <w:r>
+        <w:rPr>
+          <w:lang w:val="pt-BR"/>
+        </w:rPr>
+        <w:t>, Campinas, v. 27, n. 94, p. 47-69, 2006.</w:t>
       </w:r>
     </w:p>
     <w:p>
@@ -5730,6 +5806,57 @@
         <w:rPr>
           <w:lang w:val="pt-BR"/>
         </w:rPr>
+        <w:t xml:space="preserve">MASSEY, </w:t>
+      </w:r>
+      <w:proofErr w:type="spellStart"/>
+      <w:r>
+        <w:rPr>
+          <w:lang w:val="pt-BR"/>
+        </w:rPr>
+        <w:t>Doreen</w:t>
+      </w:r>
+      <w:proofErr w:type="spellEnd"/>
+      <w:r>
+        <w:rPr>
+          <w:lang w:val="pt-BR"/>
+        </w:rPr>
+        <w:t xml:space="preserve">. </w:t>
+      </w:r>
+      <w:r>
+        <w:rPr>
+          <w:b/>
+          <w:lang w:val="pt-BR"/>
+        </w:rPr>
+        <w:t>Pelo espaço</w:t>
+      </w:r>
+      <w:r>
+        <w:rPr>
+          <w:lang w:val="pt-BR"/>
+        </w:rPr>
+        <w:t xml:space="preserve">: uma nova política da espacialidade. Tradução de Hilda Pareto Maciel e Rogério Haesbaert. Rio de Janeiro: Bertrand Brasil, 2008.</w:t>
+      </w:r>
+    </w:p>
+    <w:p>
+      <w:pPr>
+        <w:spacing w:after="0" w:line="240" w:lineRule="auto"/>
+        <w:jc w:val="both"/>
+        <w:rPr>
+          <w:lang w:val="pt-BR"/>
+        </w:rPr>
+      </w:pPr>
+    </w:p>
+    <w:p>
+      <w:pPr>
+        <w:spacing w:after="0" w:line="240" w:lineRule="auto"/>
+        <w:jc w:val="both"/>
+        <w:rPr>
+          <w:lang w:val="pt-BR"/>
+        </w:rPr>
+      </w:pPr>
+      <w:r>
+        <w:rPr>
+          <w:lang w:val="pt-BR"/>
+        </w:rPr>
         <w:lastRenderedPageBreak/>
         <w:t xml:space="preserve">MINAYO, Maria Cecília de Souza (org.). </w:t>
       </w:r>
@@ -5849,13 +5976,27 @@
           <w:b/>
           <w:lang w:val="pt-BR"/>
         </w:rPr>
-        <w:t>Pensando o espaço do homem</w:t>
-      </w:r>
-      <w:r>
-        <w:rPr>
-          <w:lang w:val="pt-BR"/>
-        </w:rPr>
-        <w:t>. 5. ed. São Paulo: Editora da Universidade de São Paulo, 2004.</w:t>
+        <w:t>A natureza do espaço</w:t>
+      </w:r>
+      <w:r>
+        <w:rPr>
+          <w:lang w:val="pt-BR"/>
+        </w:rPr>
+        <w:t xml:space="preserve">: técnica e tempo, razão e emoção. 4. ed. 2. </w:t>
+      </w:r>
+      <w:proofErr w:type="spellStart"/>
+      <w:r>
+        <w:rPr>
+          <w:lang w:val="pt-BR"/>
+        </w:rPr>
+        <w:t>reimpr</w:t>
+      </w:r>
+      <w:proofErr w:type="spellEnd"/>
+      <w:r>
+        <w:rPr>
+          <w:lang w:val="pt-BR"/>
+        </w:rPr>
+        <w:t>. São Paulo: Editora da Universidade de São Paulo, 2006.</w:t>
       </w:r>
     </w:p>
     <w:p>
@@ -5875,6 +6016,8 @@
           <w:lang w:val="pt-BR"/>
         </w:rPr>
       </w:pPr>
+      <w:proofErr w:type="spellStart"/>
+      <w:proofErr w:type="spellEnd"/>
       <w:r>
         <w:rPr>
           <w:lang w:val="pt-BR"/>
@@ -5883,30 +6026,16 @@
       </w:r>
       <w:r>
         <w:rPr>
+          <w:lang w:val="pt-BR"/>
           <w:b/>
-          <w:lang w:val="pt-BR"/>
-        </w:rPr>
-        <w:t>A natureza do espaço</w:t>
-      </w:r>
-      <w:r>
-        <w:rPr>
-          <w:lang w:val="pt-BR"/>
-        </w:rPr>
-        <w:t xml:space="preserve">: técnica e tempo, razão e emoção. 4. ed. 2. </w:t>
-      </w:r>
-      <w:proofErr w:type="spellStart"/>
-      <w:r>
-        <w:rPr>
-          <w:lang w:val="pt-BR"/>
-        </w:rPr>
-        <w:t>reimpr</w:t>
-      </w:r>
-      <w:proofErr w:type="spellEnd"/>
-      <w:r>
-        <w:rPr>
-          <w:lang w:val="pt-BR"/>
-        </w:rPr>
-        <w:t>. São Paulo: Editora da Universidade de São Paulo, 2006.</w:t>
+        </w:rPr>
+        <w:t xml:space="preserve">Espaço e método</w:t>
+      </w:r>
+      <w:r>
+        <w:rPr>
+          <w:lang w:val="pt-BR"/>
+        </w:rPr>
+        <w:t xml:space="preserve">. 5. ed., 1. reimpr. São Paulo: Editora da Universidade de São Paulo, 2012.</w:t>
       </w:r>
     </w:p>
     <w:p>
@@ -5926,26 +6055,72 @@
           <w:lang w:val="pt-BR"/>
         </w:rPr>
       </w:pPr>
+      <w:r>
+        <w:rPr>
+          <w:lang w:val="pt-BR"/>
+        </w:rPr>
+        <w:t xml:space="preserve">SCHLEMMER, Eliane; BACKES, Luciana; BITTENCOURT, João Ricardo; PALAGI, Ana Maria (org.). </w:t>
+      </w:r>
+      <w:r>
+        <w:rPr>
+          <w:b/>
+          <w:lang w:val="pt-BR"/>
+        </w:rPr>
+        <w:t xml:space="preserve">O habitar do ensinar e do aprender </w:t>
+      </w:r>
+      <w:proofErr w:type="spellStart"/>
+      <w:r>
+        <w:rPr>
+          <w:b/>
+          <w:lang w:val="pt-BR"/>
+        </w:rPr>
+        <w:t>OnLIFE</w:t>
+      </w:r>
+      <w:proofErr w:type="spellEnd"/>
+      <w:r>
+        <w:rPr>
+          <w:lang w:val="pt-BR"/>
+        </w:rPr>
+        <w:t>: vivências na educação contemporânea. São Leopoldo: Casa Leiria, 2021.</w:t>
+      </w:r>
+    </w:p>
+    <w:p>
+      <w:pPr>
+        <w:spacing w:after="0" w:line="240" w:lineRule="auto"/>
+        <w:jc w:val="both"/>
+        <w:rPr>
+          <w:lang w:val="pt-BR"/>
+        </w:rPr>
+      </w:pPr>
+    </w:p>
+    <w:p>
+      <w:pPr>
+        <w:spacing w:after="0" w:line="240" w:lineRule="auto"/>
+        <w:jc w:val="both"/>
+        <w:rPr>
+          <w:lang w:val="pt-BR"/>
+        </w:rPr>
+      </w:pPr>
       <w:proofErr w:type="spellStart"/>
       <w:proofErr w:type="spellEnd"/>
       <w:r>
         <w:rPr>
           <w:lang w:val="pt-BR"/>
         </w:rPr>
-        <w:t xml:space="preserve">SANTOS, Milton. </w:t>
+        <w:t xml:space="preserve">SILVEIRA, Sergio Amadeu da. </w:t>
       </w:r>
       <w:r>
         <w:rPr>
           <w:lang w:val="pt-BR"/>
           <w:b/>
         </w:rPr>
-        <w:t xml:space="preserve">Espaço e método</w:t>
-      </w:r>
-      <w:r>
-        <w:rPr>
-          <w:lang w:val="pt-BR"/>
-        </w:rPr>
-        <w:t xml:space="preserve">. 5. ed., 1. reimpr. São Paulo: Editora da Universidade de São Paulo, 2012.</w:t>
+        <w:t xml:space="preserve">Tudo sobre tod@s</w:t>
+      </w:r>
+      <w:r>
+        <w:rPr>
+          <w:lang w:val="pt-BR"/>
+        </w:rPr>
+        <w:t xml:space="preserve">: redes digitais, privacidade e venda de dados pessoais. São Paulo: Edições Sesc São Paulo, 2017. E-book.</w:t>
       </w:r>
     </w:p>
     <w:p>
@@ -5965,33 +6140,26 @@
           <w:lang w:val="pt-BR"/>
         </w:rPr>
       </w:pPr>
-      <w:r>
-        <w:rPr>
-          <w:lang w:val="pt-BR"/>
-        </w:rPr>
-        <w:t xml:space="preserve">SCHLEMMER, Eliane; BACKES, Luciana; BITTENCOURT, João Ricardo; PALAGI, Ana Maria (org.). </w:t>
-      </w:r>
-      <w:r>
-        <w:rPr>
+      <w:proofErr w:type="spellStart"/>
+      <w:proofErr w:type="spellEnd"/>
+      <w:r>
+        <w:rPr>
+          <w:lang w:val="pt-BR"/>
+        </w:rPr>
+        <w:t xml:space="preserve">TIBAU DO SUL. Secretaria de Educação. </w:t>
+      </w:r>
+      <w:r>
+        <w:rPr>
+          <w:lang w:val="pt-BR"/>
           <w:b/>
-          <w:lang w:val="pt-BR"/>
-        </w:rPr>
-        <w:t xml:space="preserve">O habitar do ensinar e do aprender </w:t>
-      </w:r>
-      <w:proofErr w:type="spellStart"/>
-      <w:r>
-        <w:rPr>
-          <w:b/>
-          <w:lang w:val="pt-BR"/>
-        </w:rPr>
-        <w:t>OnLIFE</w:t>
-      </w:r>
-      <w:proofErr w:type="spellEnd"/>
-      <w:r>
-        <w:rPr>
-          <w:lang w:val="pt-BR"/>
-        </w:rPr>
-        <w:t>: vivências na educação contemporânea. São Leopoldo: Casa Leiria, 2021.</w:t>
+        </w:rPr>
+        <w:t xml:space="preserve">Relatório sintético de turmas</w:t>
+      </w:r>
+      <w:r>
+        <w:rPr>
+          <w:lang w:val="pt-BR"/>
+        </w:rPr>
+        <w:t xml:space="preserve">: EM Domitila Castelo da Silva, Ensino Fundamental – anos iniciais, ano 2026. Tibau do Sul: Portal SIGEduc, 2026.</w:t>
       </w:r>
     </w:p>
     <w:p>
@@ -6017,59 +6185,20 @@
         <w:rPr>
           <w:lang w:val="pt-BR"/>
         </w:rPr>
-        <w:t xml:space="preserve">SILVEIRA, Sergio Amadeu da. </w:t>
+        <w:t xml:space="preserve">VALENTE, José Armando (org.). </w:t>
       </w:r>
       <w:r>
         <w:rPr>
           <w:lang w:val="pt-BR"/>
           <w:b/>
         </w:rPr>
-        <w:t xml:space="preserve">Tudo sobre tod@s</w:t>
-      </w:r>
-      <w:r>
-        <w:rPr>
-          <w:lang w:val="pt-BR"/>
-        </w:rPr>
-        <w:t xml:space="preserve">: redes digitais, privacidade e venda de dados pessoais. São Paulo: Edições Sesc São Paulo, 2017. E-book.</w:t>
-      </w:r>
-    </w:p>
-    <w:p>
-      <w:pPr>
-        <w:spacing w:after="0" w:line="240" w:lineRule="auto"/>
-        <w:jc w:val="both"/>
-        <w:rPr>
-          <w:lang w:val="pt-BR"/>
-        </w:rPr>
-      </w:pPr>
-    </w:p>
-    <w:p>
-      <w:pPr>
-        <w:spacing w:after="0" w:line="240" w:lineRule="auto"/>
-        <w:jc w:val="both"/>
-        <w:rPr>
-          <w:lang w:val="pt-BR"/>
-        </w:rPr>
-      </w:pPr>
-      <w:proofErr w:type="spellStart"/>
-      <w:proofErr w:type="spellEnd"/>
-      <w:r>
-        <w:rPr>
-          <w:lang w:val="pt-BR"/>
-        </w:rPr>
-        <w:t xml:space="preserve">TIBAU DO SUL. Secretaria de Educação. </w:t>
-      </w:r>
-      <w:r>
-        <w:rPr>
-          <w:lang w:val="pt-BR"/>
-          <w:b/>
-        </w:rPr>
-        <w:t xml:space="preserve">Relatório sintético de turmas</w:t>
-      </w:r>
-      <w:r>
-        <w:rPr>
-          <w:lang w:val="pt-BR"/>
-        </w:rPr>
-        <w:t xml:space="preserve">: EM Domitila Castelo da Silva, Ensino Fundamental – anos iniciais, ano 2026. Tibau do Sul: Portal SIGEduc, 2026.</w:t>
+        <w:t xml:space="preserve">O computador na sociedade do conhecimento</w:t>
+      </w:r>
+      <w:r>
+        <w:rPr>
+          <w:lang w:val="pt-BR"/>
+        </w:rPr>
+        <w:t xml:space="preserve">. Campinas: Unicamp/NIED, 1999.</w:t>
       </w:r>
     </w:p>
     <w:p>

</xml_diff>

<commit_message>
Projeto: confere Foucault (Vozes, 20. ed., 1999) e Schlemmer, Backes e Palagi (2021) nas obras originais
Co-Authored-By: Claude Opus 5.5 <noreply@anthropic.com>
Claude-Session: https://claude.ai/code/session_01HxStpW4pQoDfJdTDYr6zEC
</commit_message>
<xml_diff>
--- a/projeto_desenvolvido/PROJETO_DE_TESE_COMPLETO_ABNT.docx
+++ b/projeto_desenvolvido/PROJETO_DE_TESE_COMPLETO_ABNT.docx
@@ -3781,34 +3781,34 @@
         <w:rPr>
           <w:lang w:val="pt-BR"/>
         </w:rPr>
-        <w:t xml:space="preserve">, obra organizada por </w:t>
+        <w:t xml:space="preserve">, obra organizada por Schlemmer et al. (2021), o capítulo de abertura, assinado por Schlemmer, Backes e Palagi, lembra que habitar “tem o significado de estar presente” e que o habitar, “além de estar acompanhado do movimento, tem uma natureza relacional” (SCHLEMMER; BACKES; PALAGI, 2021, p. 15). Ele aparece como experiência constituída pelas relações entre sujeitos, ambientes, tecnologias e redes. As autoras chamam de Educação OnLIFE</w:t>
       </w:r>
       <w:proofErr w:type="spellStart"/>
       <w:r>
         <w:rPr>
           <w:lang w:val="pt-BR"/>
         </w:rPr>
-        <w:t>Schlemmer</w:t>
+        <w:t xml:space="preserve"/>
       </w:r>
       <w:proofErr w:type="spellEnd"/>
       <w:r>
         <w:rPr>
           <w:lang w:val="pt-BR"/>
         </w:rPr>
-        <w:t xml:space="preserve"> </w:t>
+        <w:t xml:space="preserve"/>
       </w:r>
       <w:r>
         <w:rPr>
           <w:i/>
           <w:lang w:val="pt-BR"/>
         </w:rPr>
-        <w:t>et al.</w:t>
-      </w:r>
-      <w:r>
-        <w:rPr>
-          <w:lang w:val="pt-BR"/>
-        </w:rPr>
-        <w:t xml:space="preserve"> (2021), o habitar é tomado em sentido mais amplo que o de morar ou permanecer num lugar e aproxima-se da ideia de estar presente. Ele aparece como experiência relacional, constituída pelas relações entre sujeitos, ambientes, tecnologias e redes. Os autores chamam de Educação OnLIFE “uma educação transubstanciada e cibricidadã, ligada, conectada (On) na vida (LIFE), a partir de problematizações que emergem do tempo presente, nessa realidade hiperconectada” (SCHLEMMER et al., 2021, p. 24). Essa discussão dialoga com a obra de Massimo Di Felice. Em </w:t>
+        <w:t xml:space="preserve"/>
+      </w:r>
+      <w:r>
+        <w:rPr>
+          <w:lang w:val="pt-BR"/>
+        </w:rPr>
+        <w:t xml:space="preserve"> “uma educação transubstanciada e cibricidadã, ligada, conectada (On) na vida (LIFE), a partir de problematizações que emergem do tempo presente, nessa realidade hiperconectada” (SCHLEMMER; BACKES; PALAGI, 2021, p. 24). Essa discussão dialoga com a obra de Massimo Di Felice. Em </w:t>
       </w:r>
       <w:r>
         <w:rPr>
@@ -4504,7 +4504,7 @@
         <w:rPr>
           <w:lang w:val="pt-BR"/>
         </w:rPr>
-        <w:t xml:space="preserve">Foucault ajuda a dar a essa abertura um estatuto teórico. Ball, Maguire e Braun recorrem a ele ao tratar a política como “uma certa economia de discursos da verdade” (FOUCAULT, 1980, p. 93 apud BALL; MAGUIRE; BRAUN, 2016, p. 21), que se investe no cotidiano das escolas. Em Vigiar e punir, o próprio Foucault mostra que as relações de poder “não são unívocas; definem inúmeros pontos de luta, focos de instabilidade comportando cada um seus riscos de conflito, de lutas e de inversão pelo menos transitória da relação de forças” (FOUCAULT, [ano], p. 29). Lida com o autor, a resistência faz parte das relações de poder que a política mobiliza na escola, e por isso pode aparecer sem ser pressuposta: onde há normas, exigências e registros, há também pontos em que eles se tornam instáveis.</w:t>
+        <w:t xml:space="preserve">Foucault ajuda a dar a essa abertura um estatuto teórico. Ball, Maguire e Braun recorrem a ele ao tratar a política como “uma certa economia de discursos da verdade” (FOUCAULT, 1980, p. 93 apud BALL; MAGUIRE; BRAUN, 2016, p. 21), que se investe no cotidiano das escolas. Em Vigiar e punir, o próprio Foucault mostra que as relações de poder “não são unívocas; definem inúmeros pontos de luta, focos de instabilidade comportando cada um seus riscos de conflito, de lutas e de inversão pelo menos transitória da relação de forças” (FOUCAULT, 1999, p. 29). Lida com o autor, a resistência faz parte das relações de poder que a política mobiliza na escola, e por isso pode aparecer sem ser pressuposta: onde há normas, exigências e registros, há também pontos em que eles se tornam instáveis.</w:t>
       </w:r>
     </w:p>
     <w:p>
@@ -5583,7 +5583,7 @@
         <w:rPr>
           <w:lang w:val="pt-BR"/>
         </w:rPr>
-        <w:t xml:space="preserve">: nascimento da prisão. Tradução de Raquel Ramalhete. Petrópolis: Vozes, [ano].</w:t>
+        <w:t xml:space="preserve">: nascimento da prisão. Tradução de Raquel Ramalhete. 20. ed. Petrópolis: Vozes, 1999.</w:t>
       </w:r>
     </w:p>
     <w:p>
@@ -6059,7 +6059,7 @@
         <w:rPr>
           <w:lang w:val="pt-BR"/>
         </w:rPr>
-        <w:t xml:space="preserve">SCHLEMMER, Eliane; BACKES, Luciana; BITTENCOURT, João Ricardo; PALAGI, Ana Maria (org.). </w:t>
+        <w:t xml:space="preserve">SCHLEMMER, Eliane; BACKES, Luciana; BITTENCOURT, João Ricardo; PALAGI, Ana Maria Marques (org.). </w:t>
       </w:r>
       <w:r>
         <w:rPr>
@@ -6082,6 +6082,45 @@
           <w:lang w:val="pt-BR"/>
         </w:rPr>
         <w:t>: vivências na educação contemporânea. São Leopoldo: Casa Leiria, 2021.</w:t>
+      </w:r>
+    </w:p>
+    <w:p>
+      <w:pPr>
+        <w:spacing w:after="0" w:line="240" w:lineRule="auto"/>
+        <w:jc w:val="both"/>
+        <w:rPr>
+          <w:lang w:val="pt-BR"/>
+        </w:rPr>
+      </w:pPr>
+    </w:p>
+    <w:p>
+      <w:pPr>
+        <w:spacing w:after="0" w:line="240" w:lineRule="auto"/>
+        <w:jc w:val="both"/>
+        <w:rPr>
+          <w:lang w:val="pt-BR"/>
+        </w:rPr>
+      </w:pPr>
+      <w:proofErr w:type="spellStart"/>
+      <w:proofErr w:type="spellEnd"/>
+      <w:r>
+        <w:rPr>
+          <w:lang w:val="pt-BR"/>
+        </w:rPr>
+        <w:t xml:space="preserve">SCHLEMMER, Eliane; BACKES, Luciana; PALAGI, Ana Maria Marques. O habitar do ensinar e do aprender OnLIFE: vivências na educação contemporânea. In: SCHLEMMER, Eliane; BACKES, Luciana; BITTENCOURT, João Ricardo; PALAGI, Ana Maria Marques (org.). </w:t>
+      </w:r>
+      <w:r>
+        <w:rPr>
+          <w:lang w:val="pt-BR"/>
+          <w:b/>
+        </w:rPr>
+        <w:t xml:space="preserve">O habitar do ensinar e do aprender OnLIFE</w:t>
+      </w:r>
+      <w:r>
+        <w:rPr>
+          <w:lang w:val="pt-BR"/>
+        </w:rPr>
+        <w:t xml:space="preserve">: vivências na educação contemporânea. São Leopoldo: Casa Leiria, 2021. p. 15-34.</w:t>
       </w:r>
     </w:p>
     <w:p>

</xml_diff>

<commit_message>
Projeto: Di Felice com passagem conferida (p. 102) e habitar atópico via resenha de Marchesi
Co-Authored-By: Claude Opus 5.5 <noreply@anthropic.com>
Claude-Session: https://claude.ai/code/session_01HxStpW4pQoDfJdTDYr6zEC
</commit_message>
<xml_diff>
--- a/projeto_desenvolvido/PROJETO_DE_TESE_COMPLETO_ABNT.docx
+++ b/projeto_desenvolvido/PROJETO_DE_TESE_COMPLETO_ABNT.docx
@@ -3821,7 +3821,7 @@
         <w:rPr>
           <w:lang w:val="pt-BR"/>
         </w:rPr>
-        <w:t xml:space="preserve">, Di Felice (2009) retoma a tradição filosófica do habitar, que remonta a Heidegger, e pensa o habitar como prática comunicativa, mostrando como as diferentes tecnologias transformam a relação entre o sujeito, os meios de comunicação e o território. Com as redes digitais, o autor descreve um habitar atópico, em que a experiência habitativa passa a envolver interfaces, fluxos informativos e relações que não se reduzem ao espaço físico. Para o autor, o habitar atópico se configura “como a hibridação, transitória e fluida, de corpos, tecnologia e paisagem” (DI FELICE, 2009, p. 291).</w:t>
+        <w:t xml:space="preserve">, Di Felice (2009) retoma a tradição filosófica do habitar, que remonta a Heidegger, e pensa o habitar como prática comunicativa, mostrando como as diferentes tecnologias transformam a relação entre o sujeito, os meios de comunicação e o território. Ao tratar da imprensa, por exemplo, afirma que “a invenção da escrita artificial coincide, de fato, com o surgimento de uma espacialidade artificial que marcará sobremaneira a Renascença e inaugurará um novo modo de habitar” (DI FELICE, 2009, p. 102). Com as redes digitais, o autor descreve um habitar atópico, em que a experiência habitativa passa a envolver interfaces, fluxos informativos e relações que não se reduzem ao espaço físico. Esse habitar só se realiza por meio de interações com interfaces e constitui ecossistemas informativos, “ambientes atravessáveis somente mediante formas de interações técnicas” (DI FELICE, 2009, p. 20 apud MARCHESI, 2010), nos quais sujeito e território se relacionam em rede (MARCHESI, 2010).</w:t>
       </w:r>
       <w:proofErr w:type="spellStart"/>
       <w:r>
@@ -5783,6 +5783,45 @@
           <w:lang w:val="pt-BR"/>
         </w:rPr>
         <w:t>, Campinas, v. 27, n. 94, p. 47-69, 2006.</w:t>
+      </w:r>
+    </w:p>
+    <w:p>
+      <w:pPr>
+        <w:spacing w:after="0" w:line="240" w:lineRule="auto"/>
+        <w:jc w:val="both"/>
+        <w:rPr>
+          <w:lang w:val="pt-BR"/>
+        </w:rPr>
+      </w:pPr>
+    </w:p>
+    <w:p>
+      <w:pPr>
+        <w:spacing w:after="0" w:line="240" w:lineRule="auto"/>
+        <w:jc w:val="both"/>
+        <w:rPr>
+          <w:lang w:val="pt-BR"/>
+        </w:rPr>
+      </w:pPr>
+      <w:proofErr w:type="spellStart"/>
+      <w:proofErr w:type="spellEnd"/>
+      <w:r>
+        <w:rPr>
+          <w:lang w:val="pt-BR"/>
+        </w:rPr>
+        <w:t xml:space="preserve">MARCHESI, Mariana. Ambiente, mídia e técnica: um passeio pelas paisagens pós-urbanas de Massimo Di Felice. </w:t>
+      </w:r>
+      <w:r>
+        <w:rPr>
+          <w:lang w:val="pt-BR"/>
+          <w:b/>
+        </w:rPr>
+        <w:t xml:space="preserve">Rumores</w:t>
+      </w:r>
+      <w:r>
+        <w:rPr>
+          <w:lang w:val="pt-BR"/>
+        </w:rPr>
+        <w:t xml:space="preserve">, São Paulo, n. 8, [2010]. Resenha de: DI FELICE, Massimo. Paisagens pós-urbanas: o fim da experiência urbana e as formas comunicativas do habitar. São Paulo: Annablume, 2009.</w:t>
       </w:r>
     </w:p>
     <w:p>

</xml_diff>

<commit_message>
Projeto: habitar atópico de Di Felice como citação indireta (p. 20)
Co-Authored-By: Claude Opus 5.5 <noreply@anthropic.com>
Claude-Session: https://claude.ai/code/session_01HxStpW4pQoDfJdTDYr6zEC
</commit_message>
<xml_diff>
--- a/projeto_desenvolvido/PROJETO_DE_TESE_COMPLETO_ABNT.docx
+++ b/projeto_desenvolvido/PROJETO_DE_TESE_COMPLETO_ABNT.docx
@@ -3821,7 +3821,7 @@
         <w:rPr>
           <w:lang w:val="pt-BR"/>
         </w:rPr>
-        <w:t xml:space="preserve">, Di Felice (2009) retoma a tradição filosófica do habitar, que remonta a Heidegger, e pensa o habitar como prática comunicativa, mostrando como as diferentes tecnologias transformam a relação entre o sujeito, os meios de comunicação e o território. Ao tratar da imprensa, por exemplo, afirma que “a invenção da escrita artificial coincide, de fato, com o surgimento de uma espacialidade artificial que marcará sobremaneira a Renascença e inaugurará um novo modo de habitar” (DI FELICE, 2009, p. 102). Com as redes digitais, o autor descreve um habitar atópico, em que a experiência habitativa passa a envolver interfaces, fluxos informativos e relações que não se reduzem ao espaço físico. Esse habitar só se realiza por meio de interações com interfaces e constitui ecossistemas informativos, “ambientes atravessáveis somente mediante formas de interações técnicas” (DI FELICE, 2009, p. 20 apud MARCHESI, [2010]), nos quais sujeito e território se relacionam em rede (MARCHESI, [2010]).</w:t>
+        <w:t xml:space="preserve">, Di Felice (2009) retoma a tradição filosófica do habitar, que remonta a Heidegger, e pensa o habitar como prática comunicativa, mostrando como as diferentes tecnologias transformam a relação entre o sujeito, os meios de comunicação e o território. Ao tratar da imprensa, por exemplo, afirma que “a invenção da escrita artificial coincide, de fato, com o surgimento de uma espacialidade artificial que marcará sobremaneira a Renascença e inaugurará um novo modo de habitar” (DI FELICE, 2009, p. 102). Com as redes digitais, o autor descreve um habitar atópico, em que a experiência habitativa passa a envolver interfaces, fluxos informativos e relações que não se reduzem ao espaço físico. Esse habitar só se realiza por meio de interações com interfaces e constitui ecossistemas informativos, ambientes que só podem ser atravessados mediante interações técnicas e nos quais sujeito e território se relacionam em rede (DI FELICE, 2009, p. 20).</w:t>
       </w:r>
       <w:proofErr w:type="spellStart"/>
       <w:r>
@@ -5783,45 +5783,6 @@
           <w:lang w:val="pt-BR"/>
         </w:rPr>
         <w:t>, Campinas, v. 27, n. 94, p. 47-69, 2006.</w:t>
-      </w:r>
-    </w:p>
-    <w:p>
-      <w:pPr>
-        <w:spacing w:after="0" w:line="240" w:lineRule="auto"/>
-        <w:jc w:val="both"/>
-        <w:rPr>
-          <w:lang w:val="pt-BR"/>
-        </w:rPr>
-      </w:pPr>
-    </w:p>
-    <w:p>
-      <w:pPr>
-        <w:spacing w:after="0" w:line="240" w:lineRule="auto"/>
-        <w:jc w:val="both"/>
-        <w:rPr>
-          <w:lang w:val="pt-BR"/>
-        </w:rPr>
-      </w:pPr>
-      <w:proofErr w:type="spellStart"/>
-      <w:proofErr w:type="spellEnd"/>
-      <w:r>
-        <w:rPr>
-          <w:lang w:val="pt-BR"/>
-        </w:rPr>
-        <w:t xml:space="preserve">MARCHESI, Mariana. Ambiente, mídia e técnica: um passeio pelas paisagens pós-urbanas de Massimo Di Felice. </w:t>
-      </w:r>
-      <w:r>
-        <w:rPr>
-          <w:lang w:val="pt-BR"/>
-          <w:b/>
-        </w:rPr>
-        <w:t xml:space="preserve">Rumores</w:t>
-      </w:r>
-      <w:r>
-        <w:rPr>
-          <w:lang w:val="pt-BR"/>
-        </w:rPr>
-        <w:t xml:space="preserve">, São Paulo, n. 8, [2010]. Resenha de: DI FELICE, Massimo. Paisagens pós-urbanas: o fim da experiência urbana e as formas comunicativas do habitar. São Paulo: Annablume, 2009.</w:t>
       </w:r>
     </w:p>
     <w:p>

</xml_diff>

<commit_message>
Projeto: revisão estilística completa, transições suavizadas e Di Felice via Schlemmer (p. 17)
Co-Authored-By: Claude Opus 5.5 <noreply@anthropic.com>
Claude-Session: https://claude.ai/code/session_01HxStpW4pQoDfJdTDYr6zEC
</commit_message>
<xml_diff>
--- a/projeto_desenvolvido/PROJETO_DE_TESE_COMPLETO_ABNT.docx
+++ b/projeto_desenvolvido/PROJETO_DE_TESE_COMPLETO_ABNT.docx
@@ -2796,7 +2796,7 @@
         <w:rPr>
           <w:lang w:val="pt-BR"/>
         </w:rPr>
-        <w:t xml:space="preserve">Esta pesquisa investiga a encenação da Política Nacional de Educação Digital (PNED), instituída pela Lei nº 14.533/2023, em seu eixo Educação Digital Escolar, pelos profissionais da educação que atuam nos anos iniciais do Ensino Fundamental, do 1º ao 5º ano, na Escola Municipal Domitila Castelo da Silva, em Pipa, distrito de Tibau do Sul, no litoral sul do Rio Grande do Norte. Interessam-nos os modos pelos quais essa política é interpretada, traduzida e recontextualizada no contexto da prática, bem como o peso que têm nesse processo as culturas profissionais, as condições materiais e institucionais da escola e as especificidades socioespaciais do lugar onde ela está. Chamamos de profissionais da educação todos os que, na escola, participam da construção da política: as professoras e os professores do 1º ao 5º ano, a coordenação pedagógica, a direção e os demais profissionais ligados aos processos pedagógicos ou à educação digital. Uma política não se faz apenas na sala de aula, e o planejamento, a organização do tempo e dos espaços, os registros e as conversas entre colegas também são lugares onde ela ganha forma. Ball, Maguire e Braun (2016, p. 103) descrevem as atuações como “coletivas, criativas e limitadas”, feitas “de malabarismo instável entre as prioridades inconciliáveis, cargas de trabalho impossíveis, movimentos satisficing e entusiasmos pessoais”.</w:t>
+        <w:t xml:space="preserve">A Política Nacional de Educação Digital (PNED), instituída pela Lei nº 14.533/2023, chega às escolas por meio do eixo Educação Digital Escolar, e é desse eixo que trata esta tese. Investigamos como os profissionais da educação que atuam nos anos iniciais do Ensino Fundamental, do 1º ao 5º ano, na Escola Municipal Domitila Castelo da Silva, em Pipa, distrito de Tibau do Sul, no litoral sul do Rio Grande do Norte, interpretam, traduzem e recontextualizam essa política no contexto da prática, e que peso têm nesse processo as culturas profissionais, as condições materiais e institucionais da escola e as especificidades socioespaciais do lugar onde ela está. Chamamos de profissionais da educação todos os que, na escola, participam da construção da política: as professoras e os professores do 1º ao 5º ano, a coordenação pedagógica, a direção e os demais profissionais ligados aos processos pedagógicos ou à educação digital. A sala de aula é um dos lugares em que a política ganha forma, ao lado do planejamento, da organização do tempo e dos espaços, dos registros e das conversas entre colegas. Ball, Maguire e Braun (2016, p. 103) descrevem as atuações como “coletivas, criativas e limitadas”, feitas “de malabarismo instável entre as prioridades inconciliáveis, cargas de trabalho impossíveis, movimentos satisficing e entusiasmos pessoais”.</w:t>
       </w:r>
     </w:p>
     <w:p>
@@ -2812,7 +2812,7 @@
         <w:rPr>
           <w:lang w:val="pt-BR"/>
         </w:rPr>
-        <w:t xml:space="preserve">A escolha da escola e do território tem razões que vão além da delimitação do campo. Ao chegar a uma escola concreta, uma política de alcance nacional encontra uma história, um prédio, equipamentos que existem ou que faltam, profissionais com trajetórias e modos próprios de trabalhar e crianças que vêm de famílias e de ruas determinadas. Rizvi e Kemmis, citados por Bowe, Ball e Gold, já observavam que os que participam de um programa no nível da escola o interpretam “em relação aos meios de que dispõem e às formas de trabalho que preferem” (RIZVI; KEMMIS, 1987, p. 21 apud BOWE; BALL; GOLD, 1992, p. 22, tradução nossa). Em Pipa, esse encontro tem contornos particulares. O distrito onde pousadas, restaurantes e passeios se vendem pela internet é o mesmo de onde as crianças saem, pela manhã, para salas de aula que, nos registros feitos para esta pesquisa, tinham carteiras enfileiradas, alfabeto móvel feito à mão e nenhuma tela. Conhecemos essa paisagem de perto, pois a pesquisadora convive com Pipa há cerca de duas décadas e trabalha há dezoito anos na rede municipal de Tibau do Sul. Essa proximidade exige vigilância metodológica, no sentido da reflexividade que Braun e Clarke (2019) pedem a quem analisa, e, ao mesmo tempo, é dela que nasce a pergunta sobre o que acontece com uma política nacional quando encontra uma escola situada, seus profissionais, suas condições e seu território.</w:t>
+        <w:t xml:space="preserve">A escolha da escola e do território responde a razões que ultrapassam a delimitação do campo. Uma política de alcance nacional, ao chegar a uma escola concreta, encontra uma história, um prédio, equipamentos que existem ou que faltam, profissionais com trajetórias e modos próprios de trabalhar e crianças que vêm de famílias e de ruas determinadas. Rizvi e Kemmis, citados por Bowe, Ball e Gold, já observavam que os que participam de um programa no nível da escola o interpretam “em relação aos meios de que dispõem e às formas de trabalho que preferem” (RIZVI; KEMMIS, 1987, p. 21 apud BOWE; BALL; GOLD, 1992, p. 22, tradução nossa). Em Pipa, esse encontro tem contornos particulares. O distrito onde pousadas, restaurantes e passeios se vendem pela internet é o mesmo de onde as crianças saem, pela manhã, para salas de aula que, nos registros feitos para esta pesquisa, tinham carteiras enfileiradas, alfabeto móvel feito à mão e nenhuma tela. A pesquisadora convive com Pipa há cerca de duas décadas, trabalha há dezoito anos na rede municipal de Tibau do Sul e conhece essa paisagem de perto. A proximidade exige vigilância metodológica, no sentido da reflexividade que Braun e Clarke (2019) pedem a quem analisa, e foi dela que nasceu a pergunta sobre o que acontece com uma política nacional quando encontra uma escola situada, seus profissionais, suas condições e seu território.</w:t>
       </w:r>
     </w:p>
     <w:p>
@@ -2824,33 +2824,26 @@
           <w:lang w:val="pt-BR"/>
         </w:rPr>
       </w:pPr>
+      <w:proofErr w:type="spellStart"/>
+      <w:proofErr w:type="spellEnd"/>
       <w:r>
         <w:rPr>
           <w:lang w:val="pt-BR"/>
         </w:rPr>
         <w:t xml:space="preserve">Para ler esse encontro, recorremos à teoria da atuação de Ball, Maguire e Braun (2016), que traduzimos também por encenação, termo com que os estudos brasileiros têm vertido a palavra </w:t>
       </w:r>
-      <w:proofErr w:type="spellStart"/>
-      <w:r>
-        <w:rPr>
+      <w:r>
+        <w:rPr>
+          <w:lang w:val="pt-BR"/>
           <w:i/>
-          <w:lang w:val="pt-BR"/>
-        </w:rPr>
-        <w:t>enactment</w:t>
-      </w:r>
-      <w:proofErr w:type="spellEnd"/>
-      <w:r>
-        <w:rPr>
-          <w:lang w:val="pt-BR"/>
-        </w:rPr>
-        <w:t xml:space="preserve"> do original inglês. Os autores compreendem a política como algo que as escolas colocam em ação por meio de sujeitos que leem textos, avaliam o que é possível fazer, fazem escolhas, negociam demandas concorrentes e trabalham com as condições institucionais e materiais de que dispõem. Nas palavras dos autores, “a política é complexamente codificada em textos e artefatos e é decodificada (e recodificada) de forma igualmente complexa” (BALL; MAGUIRE; BRAUN, 2016, p. 14). A ideia de encenação acentua esse caráter produtivo, já que, na escola, a política toma corpo nas falas, nos registros, nos arranjos </w:t>
-      </w:r>
-      <w:r>
-        <w:rPr>
-          <w:lang w:val="pt-BR"/>
-        </w:rPr>
-        <w:lastRenderedPageBreak/>
-        <w:t>de tempo e espaço e nas práticas de quem a recebe e precisa dar conta dela. É com esse entendimento que formulamos a questão que orienta a investigação.</w:t>
+        </w:rPr>
+        <w:t xml:space="preserve">enactment</w:t>
+      </w:r>
+      <w:r>
+        <w:rPr>
+          <w:lang w:val="pt-BR"/>
+        </w:rPr>
+        <w:t xml:space="preserve"> do original inglês. Os autores compreendem a política como algo que as escolas colocam em ação por meio de sujeitos que leem textos, avaliam o que é possível fazer, fazem escolhas, negociam demandas concorrentes e trabalham com as condições institucionais e materiais de que dispõem. Nas palavras dos autores, “a política é complexamente codificada em textos e artefatos e é decodificada (e recodificada) de forma igualmente complexa” (BALL; MAGUIRE; BRAUN, 2016, p. 14). A palavra encenação acentua esse caráter produtivo, porque a política toma corpo, na escola, nas falas, nos registros, nos arranjos de tempo e espaço e nas práticas de quem a recebe e precisa dar conta dela.</w:t>
       </w:r>
     </w:p>
     <w:p>
@@ -2901,8 +2894,44 @@
         <w:rPr>
           <w:lang w:val="pt-BR"/>
         </w:rPr>
-        <w:t xml:space="preserve">Formulamos a questão de modo a manter aberto o seu resultado. Não sabemos de antemão se a PNED será acolhida, adaptada, posta de lado ou contestada pelos profissionais da escola, e pressupor qualquer uma dessas respostas comprometeria a investigação antes de ela começar. O que buscamos conhecer são as maneiras de agir diante da política e as condições que tornam algumas delas possíveis e outras pouco prováveis. A teoria da atuação sustenta essa abertura, já que as políticas “raramente ditam ou determinam a prática, mas algumas mais do que outras estreitam a gama de respostas criativas” (BALL; MAGUIRE; BRAUN, 2016, p. 14). A resistência, nomeada no título, entra nesse quadro como uma possibilidade de interesse da pesquisa, que poderá aparecer ou não nos dados. Se aparecer, será lida em relação às condições em que se constitui, às demandas a que responde e aos efeitos que produz no cotidiano escolar. A investigação se volta, assim, para os processos pelos quais a política adquire, no dia a dia da escola, sentidos e formas de existência diversos, o que pede uma pergunta mais ampla que a do seu cumprimento.</w:t>
-      </w:r>
+        <w:t xml:space="preserve">Formulamos a questão de modo a manter aberto o seu resultado. Ainda não sabemos se a PNED será acolhida, adaptada, posta de lado ou contestada pelos profissionais da escola, e pressupor qualquer uma dessas respostas comprometeria a investigação antes de ela começar. Buscamos conhecer as maneiras de agir diante da política e as condições que tornam algumas delas possíveis e outras pouco prováveis. A teoria da atuação sustenta essa abertura, já que as políticas “raramente ditam ou determinam a prática, mas algumas mais do que outras estreitam a gama de respostas criativas” (BALL; MAGUIRE; BRAUN, 2016, p. 14). A resistência, nomeada no título, entra nesse quadro como possibilidade de interesse da pesquisa, que poderá aparecer ou não nos dados. Se aparecer, será lida em relação às condições em que se constitui, às demandas a que responde e aos efeitos que produz no cotidiano escolar. A pergunta se estende, por isso, aos processos pelos quais a política adquire, no dia a dia da escola, sentidos e formas de existência diversos, para além da verificação de seu cumprimento.</w:t>
+      </w:r>
+    </w:p>
+    <w:p>
+      <w:pPr>
+        <w:pStyle w:val="Ttulo1"/>
+        <w:pageBreakBefore/>
+        <w:spacing w:after="0"/>
+        <w:rPr>
+          <w:lang w:val="pt-BR"/>
+        </w:rPr>
+      </w:pPr>
+      <w:bookmarkStart w:id="2" w:name="_Toc241917922"/>
+      <w:r>
+        <w:rPr>
+          <w:lang w:val="pt-BR"/>
+        </w:rPr>
+        <w:lastRenderedPageBreak/>
+        <w:t>3 OBJETIVOS</w:t>
+      </w:r>
+      <w:bookmarkEnd w:id="2"/>
+    </w:p>
+    <w:p>
+      <w:pPr>
+        <w:pStyle w:val="Ttulo2"/>
+        <w:spacing w:before="0" w:after="0"/>
+        <w:rPr>
+          <w:lang w:val="pt-BR"/>
+        </w:rPr>
+      </w:pPr>
+      <w:bookmarkStart w:id="3" w:name="_Toc241917923"/>
+      <w:r>
+        <w:rPr>
+          <w:lang w:val="pt-BR"/>
+        </w:rPr>
+        <w:t>3.1 OBJETIVO GERAL</w:t>
+      </w:r>
+      <w:bookmarkEnd w:id="3"/>
     </w:p>
     <w:p>
       <w:pPr>
@@ -2917,7 +2946,104 @@
         <w:rPr>
           <w:lang w:val="pt-BR"/>
         </w:rPr>
-        <w:t>Dessa questão decorrem o objetivo geral e os objetivos específicos que organizam o percurso da pesquisa.</w:t>
+        <w:t xml:space="preserve">Analisar como os profissionais da educação encenam e recontextualizam a Política Nacional de Educação Digital no contexto da prática da Escola Municipal Domitila Castelo da Silva, em Pipa (RN), considerando as relações entre a política, as culturas profissionais, as condições materiais e institucionais da escola e as especificidades socioespaciais do território.</w:t>
+      </w:r>
+    </w:p>
+    <w:p>
+      <w:pPr>
+        <w:pStyle w:val="Ttulo2"/>
+        <w:spacing w:before="0" w:after="0"/>
+        <w:rPr>
+          <w:lang w:val="pt-BR"/>
+        </w:rPr>
+      </w:pPr>
+      <w:bookmarkStart w:id="4" w:name="_Toc241917924"/>
+      <w:r>
+        <w:rPr>
+          <w:lang w:val="pt-BR"/>
+        </w:rPr>
+        <w:t>3.2 OBJETIVOS ESPECÍFICOS</w:t>
+      </w:r>
+      <w:bookmarkEnd w:id="4"/>
+    </w:p>
+    <w:p>
+      <w:pPr>
+        <w:spacing w:after="0" w:line="360" w:lineRule="auto"/>
+        <w:ind w:left="1049" w:hanging="340"/>
+        <w:jc w:val="both"/>
+        <w:rPr>
+          <w:lang w:val="pt-BR"/>
+        </w:rPr>
+      </w:pPr>
+      <w:r>
+        <w:rPr>
+          <w:lang w:val="pt-BR"/>
+        </w:rPr>
+        <w:t>a) compreender como os diferentes profissionais da educação interpretam os textos da PNED e os discursos sobre educação digital, considerando suas experiências, crenças, valores e formas de organização do trabalho;</w:t>
+      </w:r>
+    </w:p>
+    <w:p>
+      <w:pPr>
+        <w:spacing w:after="0" w:line="360" w:lineRule="auto"/>
+        <w:ind w:left="1049" w:hanging="340"/>
+        <w:jc w:val="both"/>
+        <w:rPr>
+          <w:lang w:val="pt-BR"/>
+        </w:rPr>
+      </w:pPr>
+      <w:r>
+        <w:rPr>
+          <w:lang w:val="pt-BR"/>
+        </w:rPr>
+        <w:t>b) analisar como as condições materiais e institucionais da escola, articuladas às especificidades socioespaciais do território, atravessam os processos de tradução e recontextualização da PNED em ações, escolhas e práticas cotidianas;</w:t>
+      </w:r>
+    </w:p>
+    <w:p>
+      <w:pPr>
+        <w:spacing w:after="0" w:line="360" w:lineRule="auto"/>
+        <w:ind w:left="1049" w:hanging="340"/>
+        <w:jc w:val="both"/>
+        <w:rPr>
+          <w:lang w:val="pt-BR"/>
+        </w:rPr>
+      </w:pPr>
+      <w:r>
+        <w:rPr>
+          <w:lang w:val="pt-BR"/>
+        </w:rPr>
+        <w:t>c) identificar as diferentes formas de atuação produzidas diante da política, com atenção às situações em que emergem adesão, acomodação, adaptação, omissão seletiva, negociação, ressignificação ou resistência;</w:t>
+      </w:r>
+    </w:p>
+    <w:p>
+      <w:pPr>
+        <w:spacing w:after="0" w:line="360" w:lineRule="auto"/>
+        <w:ind w:left="1049" w:hanging="340"/>
+        <w:jc w:val="both"/>
+        <w:rPr>
+          <w:lang w:val="pt-BR"/>
+        </w:rPr>
+      </w:pPr>
+      <w:r>
+        <w:rPr>
+          <w:lang w:val="pt-BR"/>
+        </w:rPr>
+        <w:t>d) discutir as implicações das diferentes formas de encenação da PNED para a educação digital das crianças, considerando as possibilidades de provisão, proteção e participação no ambiente digital.</w:t>
+      </w:r>
+    </w:p>
+    <w:p>
+      <w:pPr>
+        <w:spacing w:after="0" w:line="360" w:lineRule="auto"/>
+        <w:ind w:firstLine="709"/>
+        <w:jc w:val="both"/>
+        <w:rPr>
+          <w:lang w:val="pt-BR"/>
+        </w:rPr>
+      </w:pPr>
+      <w:r>
+        <w:rPr>
+          <w:lang w:val="pt-BR"/>
+        </w:rPr>
+        <w:t xml:space="preserve">Os quatro objetivos acompanham o caminho que a política percorre até chegar às crianças. O primeiro se detém nos sujeitos e no modo como leem a política a partir do que já sabem, acreditam e praticam, e por isso dialoga com a discussão de Hargreaves (2005) sobre as culturas do trabalho docente. O segundo leva essa leitura para as condições em que ela acontece, dentro da escola e no território, e é nele que Pipa entra como dimensão do contexto da política, naquilo que Ball, Maguire e Braun (2016, p. 38) chamam de contextos situados, que incluem a localidade, as histórias escolares e as matrículas. O terceiro reúne os dois anteriores para perguntar o que os profissionais efetivamente fazem com a PNED, sem estabelecer previamente qual forma de atuação deve prevalecer. O quarto acompanha a política até as crianças, a quem ela se dirige e em nome de quem se justifica, e examina como as formas de encenação identificadas ampliam, limitam ou reorganizam as possibilidades de provisão, proteção e participação no ambiente digital (ONU, 2021).</w:t>
       </w:r>
     </w:p>
     <w:p>
@@ -2929,32 +3055,15 @@
           <w:lang w:val="pt-BR"/>
         </w:rPr>
       </w:pPr>
-      <w:bookmarkStart w:id="2" w:name="_Toc241917922"/>
+      <w:bookmarkStart w:id="5" w:name="_Toc241917925"/>
       <w:r>
         <w:rPr>
           <w:lang w:val="pt-BR"/>
         </w:rPr>
         <w:lastRenderedPageBreak/>
-        <w:t>3 OBJETIVOS</w:t>
-      </w:r>
-      <w:bookmarkEnd w:id="2"/>
-    </w:p>
-    <w:p>
-      <w:pPr>
-        <w:pStyle w:val="Ttulo2"/>
-        <w:spacing w:before="0" w:after="0"/>
-        <w:rPr>
-          <w:lang w:val="pt-BR"/>
-        </w:rPr>
-      </w:pPr>
-      <w:bookmarkStart w:id="3" w:name="_Toc241917923"/>
-      <w:r>
-        <w:rPr>
-          <w:lang w:val="pt-BR"/>
-        </w:rPr>
-        <w:t>3.1 OBJETIVO GERAL</w:t>
-      </w:r>
-      <w:bookmarkEnd w:id="3"/>
+        <w:t>4 RELEVÂNCIA E INEDITISMO</w:t>
+      </w:r>
+      <w:bookmarkEnd w:id="5"/>
     </w:p>
     <w:p>
       <w:pPr>
@@ -2969,88 +3078,7 @@
         <w:rPr>
           <w:lang w:val="pt-BR"/>
         </w:rPr>
-        <w:t xml:space="preserve">Analisar como os profissionais da educação encenam e recontextualizam a Política Nacional de Educação Digital no contexto da prática da Escola Municipal Domitila Castelo da Silva, em Pipa (RN), considerando as relações entre a política, as culturas profissionais, as condições materiais e institucionais da escola e as especificidades socioespaciais do território.</w:t>
-      </w:r>
-    </w:p>
-    <w:p>
-      <w:pPr>
-        <w:pStyle w:val="Ttulo2"/>
-        <w:spacing w:before="0" w:after="0"/>
-        <w:rPr>
-          <w:lang w:val="pt-BR"/>
-        </w:rPr>
-      </w:pPr>
-      <w:bookmarkStart w:id="4" w:name="_Toc241917924"/>
-      <w:r>
-        <w:rPr>
-          <w:lang w:val="pt-BR"/>
-        </w:rPr>
-        <w:t>3.2 OBJETIVOS ESPECÍFICOS</w:t>
-      </w:r>
-      <w:bookmarkEnd w:id="4"/>
-    </w:p>
-    <w:p>
-      <w:pPr>
-        <w:spacing w:after="0" w:line="360" w:lineRule="auto"/>
-        <w:ind w:left="1049" w:hanging="340"/>
-        <w:jc w:val="both"/>
-        <w:rPr>
-          <w:lang w:val="pt-BR"/>
-        </w:rPr>
-      </w:pPr>
-      <w:r>
-        <w:rPr>
-          <w:lang w:val="pt-BR"/>
-        </w:rPr>
-        <w:t>a) compreender como os diferentes profissionais da educação interpretam os textos da PNED e os discursos sobre educação digital, considerando suas experiências, crenças, valores e formas de organização do trabalho;</w:t>
-      </w:r>
-    </w:p>
-    <w:p>
-      <w:pPr>
-        <w:spacing w:after="0" w:line="360" w:lineRule="auto"/>
-        <w:ind w:left="1049" w:hanging="340"/>
-        <w:jc w:val="both"/>
-        <w:rPr>
-          <w:lang w:val="pt-BR"/>
-        </w:rPr>
-      </w:pPr>
-      <w:r>
-        <w:rPr>
-          <w:lang w:val="pt-BR"/>
-        </w:rPr>
-        <w:t>b) analisar como as condições materiais e institucionais da escola, articuladas às especificidades socioespaciais do território, atravessam os processos de tradução e recontextualização da PNED em ações, escolhas e práticas cotidianas;</w:t>
-      </w:r>
-    </w:p>
-    <w:p>
-      <w:pPr>
-        <w:spacing w:after="0" w:line="360" w:lineRule="auto"/>
-        <w:ind w:left="1049" w:hanging="340"/>
-        <w:jc w:val="both"/>
-        <w:rPr>
-          <w:lang w:val="pt-BR"/>
-        </w:rPr>
-      </w:pPr>
-      <w:r>
-        <w:rPr>
-          <w:lang w:val="pt-BR"/>
-        </w:rPr>
-        <w:t>c) identificar as diferentes formas de atuação produzidas diante da política, com atenção às situações em que emergem adesão, acomodação, adaptação, omissão seletiva, negociação, ressignificação ou resistência;</w:t>
-      </w:r>
-    </w:p>
-    <w:p>
-      <w:pPr>
-        <w:spacing w:after="0" w:line="360" w:lineRule="auto"/>
-        <w:ind w:left="1049" w:hanging="340"/>
-        <w:jc w:val="both"/>
-        <w:rPr>
-          <w:lang w:val="pt-BR"/>
-        </w:rPr>
-      </w:pPr>
-      <w:r>
-        <w:rPr>
-          <w:lang w:val="pt-BR"/>
-        </w:rPr>
-        <w:t>d) discutir as implicações das diferentes formas de encenação da PNED para a educação digital das crianças, considerando as possibilidades de provisão, proteção e participação no ambiente digital.</w:t>
+        <w:t>A educação digital passou a ocupar lugar central nas políticas educacionais brasileiras. A Lei nº 14.533/2023 instituiu a PNED com quatro eixos estruturantes, a Inclusão Digital, a Educação Digital Escolar, a Capacitação e Especialização Digital e a Pesquisa e Desenvolvimento em Tecnologias da Informação e Comunicação, e determinou sua articulação com outras políticas nacionais, estaduais, distritais e municipais de educação digital, de formação e de infraestrutura (BRASIL, 2023). Dois anos depois, a Resolução CNE/CEB nº 2, de 21 de março de 2025, instituiu as Diretrizes Operacionais Nacionais sobre o uso de dispositivos digitais em espaços escolares e a integração curricular da educação digital e midiática, aplicáveis a todas as etapas da Educação Básica, e previu a adequação dos currículos das redes com implementação até 2026 (BRASIL, 2025a).</w:t>
       </w:r>
     </w:p>
     <w:p>
@@ -3066,7 +3094,139 @@
         <w:rPr>
           <w:lang w:val="pt-BR"/>
         </w:rPr>
-        <w:t xml:space="preserve">Os quatro objetivos seguem o caminho que a própria política percorre até chegar às crianças. O primeiro se detém nos sujeitos e no modo como leem a política a partir do que já sabem, acreditam e praticam, e por isso dialoga com a discussão de Hargreaves (2005) sobre as culturas do trabalho docente. O segundo leva essa leitura para as condições em que ela acontece, dentro da escola e no território, e é nele que Pipa entra como dimensão do contexto da política, naquilo que Ball, Maguire e Braun (2016, p. 38) chamam de contextos situados, que incluem a localidade, as histórias escolares e as matrículas. O terceiro reúne os dois anteriores para perguntar o que os profissionais efetivamente fazem com a PNED, sem estabelecer previamente qual forma de atuação deve prevalecer. O quarto, por fim, acompanha a política até as crianças, a quem ela se dirige e em nome de quem se justifica, e examina como as formas de encenação identificadas ampliam, limitam ou reorganizam as possibilidades de provisão, proteção e participação no ambiente digital (ONU, 2021).</w:t>
+        <w:t xml:space="preserve">A pesquisa acontece no momento em que esse conjunto de normas começa a chegar às redes e às escolas. Em Tibau do Sul, essa chegada passa pela Secretaria Municipal de Educação, por formações, documentos curriculares e orientações que a escola recebe, lê e precisa transformar em trabalho com as crianças. Registrar a presença ou a ausência das orientações da PNED na Escola Municipal Domitila Castelo da Silva diria pouco sobre esse processo, pois, no contexto da prática, “a política não é simplesmente recebida e implementada nesta arena, ao contrário, ela está sujeita à interpretação e então é ‘recriada’” (BOWE; BALL; GOLD, 1992, p. 22, tradução nossa). Interessa-nos compreender como uma política pensada em escala nacional encontra uma escola de pequeno porte, situada num território com particularidades sociais, econômicas, culturais e tecnológicas, e o que resulta desse encontro. O ineditismo da proposta se mostra em três planos que se apoiam mutuamente: o tempo e o objeto da pesquisa, o lugar do território na análise e a articulação teórica que a sustenta.</w:t>
+      </w:r>
+    </w:p>
+    <w:p>
+      <w:pPr>
+        <w:pStyle w:val="Ttulo2"/>
+        <w:spacing w:before="0" w:after="0"/>
+        <w:rPr>
+          <w:lang w:val="pt-BR"/>
+        </w:rPr>
+      </w:pPr>
+      <w:bookmarkStart w:id="6" w:name="_Toc241917926"/>
+      <w:r>
+        <w:rPr>
+          <w:lang w:val="pt-BR"/>
+        </w:rPr>
+        <w:t>4.1 INEDITISMO EMPÍRICO-TEMPORAL</w:t>
+      </w:r>
+      <w:bookmarkEnd w:id="6"/>
+    </w:p>
+    <w:p>
+      <w:pPr>
+        <w:spacing w:after="0" w:line="360" w:lineRule="auto"/>
+        <w:ind w:firstLine="709"/>
+        <w:jc w:val="both"/>
+        <w:rPr>
+          <w:lang w:val="pt-BR"/>
+        </w:rPr>
+      </w:pPr>
+      <w:r>
+        <w:rPr>
+          <w:lang w:val="pt-BR"/>
+        </w:rPr>
+        <w:t xml:space="preserve">A pesquisa acompanha a chegada da PNED ao cotidiano escolar no período em que a educação digital e midiática começa a ser incorporada aos currículos de modo mais sistemático. Na Revisão Sistemática de Literatura (RSL) realizada para esta tese, as buscas em sete bases retornaram 176 registros e resultaram num corpus de nove estudos, publicados entre 2021 e 2024. Nenhum deles se dedica especificamente à PNED, e nenhum investiga a atuação dessa política numa rede municipal de pequeno porte. A relevância do estudo está na possibilidade de documentar um momento inicial de tradução de uma política nacional no interior de uma escola específica, acompanhando as mediações, as escolhas e as tensões que esse processo produz enquanto ele ainda está em curso. Ball (2011, p. 38) lembra que a abordagem da trajetória “capta as formas pelas quais as políticas evoluem, se modificam e decaem ao longo do tempo e do espaço, assim como as suas incoerências”, e acompanhar a PNED desde a sua chegada permite registrar esse movimento na escala de uma escola.</w:t>
+      </w:r>
+    </w:p>
+    <w:p>
+      <w:pPr>
+        <w:pStyle w:val="Ttulo2"/>
+        <w:spacing w:before="0" w:after="0"/>
+        <w:rPr>
+          <w:lang w:val="pt-BR"/>
+        </w:rPr>
+      </w:pPr>
+      <w:bookmarkStart w:id="7" w:name="_Toc241917927"/>
+      <w:r>
+        <w:rPr>
+          <w:lang w:val="pt-BR"/>
+        </w:rPr>
+        <w:lastRenderedPageBreak/>
+        <w:t>4.2 INEDITISMO ANALÍTICO-ESPACIAL</w:t>
+      </w:r>
+      <w:bookmarkEnd w:id="7"/>
+    </w:p>
+    <w:p>
+      <w:pPr>
+        <w:spacing w:after="0" w:line="360" w:lineRule="auto"/>
+        <w:ind w:firstLine="709"/>
+        <w:jc w:val="both"/>
+        <w:rPr>
+          <w:lang w:val="pt-BR"/>
+        </w:rPr>
+      </w:pPr>
+      <w:r>
+        <w:rPr>
+          <w:lang w:val="pt-BR"/>
+        </w:rPr>
+        <w:t xml:space="preserve">Pipa entra nesta pesquisa como parte do contexto em que a política é encenada. O distrito, que na década de 1970 era uma comunidade agrícola e pesqueira e se tornou destino turístico internacional com a chegada dos surfistas, a partir de meados daquela década, e com a divulgação mais intensa iniciada nos anos 1990 (AIRES, 2012, p. 80-81), é hoje marcado pelo turismo, pela circulação de grupos sociais muito diferentes e por experiências desiguais de acesso, de uso e de participação na cultura digital, desigualdade que acompanha a diferenciação, descrita por Santos (2006, p. 163), entre zonas servidas pelos meios de conhecimento e áreas que não dispõem deles. Para ler esse território, partimos de Santos (1999, p. 19), para quem “o território não é uma categoria de análise, a categoria de análise é o território usado”, isto é, o território tomado pelas relações, pelos usos e pelos conflitos que o constituem. Em diálogo com essa perspectiva, Massey (2008, p. 29) compreende o espaço como a esfera da coexistência e da multiplicidade, feita de relações e de trajetórias que se encontram sem formar uma unidade homogênea, e pensa o lugar como “um encontro de trajetórias” (MASSEY, 2008, p. 204), sempre em construção.</w:t>
+      </w:r>
+    </w:p>
+    <w:p>
+      <w:pPr>
+        <w:spacing w:after="0" w:line="360" w:lineRule="auto"/>
+        <w:ind w:firstLine="709"/>
+        <w:jc w:val="both"/>
+        <w:rPr>
+          <w:lang w:val="pt-BR"/>
+        </w:rPr>
+      </w:pPr>
+      <w:r>
+        <w:rPr>
+          <w:lang w:val="pt-BR"/>
+        </w:rPr>
+        <w:t xml:space="preserve">Com essa leitura, a escola aparece como lugar onde se cruzam experiências sociais e digitais diversas. Na mesma turma podem estar a criança cuja família vive do turismo e convive com celulares, aplicativos e plataformas desde cedo, a criança recém-chegada com pais atraídos pelo setor de serviços e a criança de família nativa, ligada à pesca e às atividades tradicionais da localidade. É o que Massey (2008, p. 203) chama de “esse acabar juntos, o inevitável desafio de negociar um aqui-e-agora”. Com Santos e Massey, perguntamos como as características do território entram nas relações pelas quais a política é interpretada e traduzida, sem atribuir ao lugar o poder de determinar o que a escola faz com ela.</w:t>
+      </w:r>
+    </w:p>
+    <w:p>
+      <w:pPr>
+        <w:pStyle w:val="Ttulo2"/>
+        <w:spacing w:before="0" w:after="0"/>
+        <w:rPr>
+          <w:lang w:val="pt-BR"/>
+        </w:rPr>
+      </w:pPr>
+      <w:bookmarkStart w:id="8" w:name="_Toc241917928"/>
+      <w:r>
+        <w:rPr>
+          <w:lang w:val="pt-BR"/>
+        </w:rPr>
+        <w:t>4.3 INEDITISMO TEÓRICO-CONCEITUAL</w:t>
+      </w:r>
+      <w:bookmarkEnd w:id="8"/>
+    </w:p>
+    <w:p>
+      <w:pPr>
+        <w:spacing w:after="0" w:line="360" w:lineRule="auto"/>
+        <w:ind w:firstLine="709"/>
+        <w:jc w:val="both"/>
+        <w:rPr>
+          <w:lang w:val="pt-BR"/>
+        </w:rPr>
+      </w:pPr>
+      <w:r>
+        <w:rPr>
+          <w:lang w:val="pt-BR"/>
+        </w:rPr>
+        <w:t xml:space="preserve">No plano teórico-conceitual, a proposta articula a teoria da atuação, a discussão sobre culturas profissionais, a atenção à dimensão material da escola e a leitura do território para compreender uma política de educação digital. Os estudos reunidos na RSL reconhecem que os profissionais da educação interpretam as políticas e lhes dão forma, e examinam pouco as culturas profissionais que filtram essa interpretação e as condições em que ela se produz. Ao reunir esses referenciais, a pesquisa pode tratar a distância entre o que a política prescreve e o que acontece na escola como parte de uma relação política entre texto, contexto e sujeitos, evitando classificá-la de imediato como falha, incapacidade ou resistência, cuidado que Ball (2011, p. 36, 46) recomenda ao criticar tanto as pesquisas que localizam o problema apenas na escola e no professor quanto as que transformam os sujeitos pesquisados em heróis.</w:t>
+      </w:r>
+    </w:p>
+    <w:p>
+      <w:pPr>
+        <w:spacing w:after="0" w:line="360" w:lineRule="auto"/>
+        <w:ind w:firstLine="709"/>
+        <w:jc w:val="both"/>
+        <w:rPr>
+          <w:lang w:val="pt-BR"/>
+        </w:rPr>
+      </w:pPr>
+      <w:r>
+        <w:rPr>
+          <w:lang w:val="pt-BR"/>
+        </w:rPr>
+        <w:t xml:space="preserve">É nessa distância que procuraremos compreender o surgimento de diferentes formas de atuação, inclusive das resistências, que entendemos como possibilidade produzida diante de exigências, condições, valores, limites ou conflitos específicos, sem lhes atribuir de antemão um sentido negativo. Do mesmo diálogo entre referenciais nasce a formulação “habitar o digital”, que a tese propõe como possibilidade analítica para nomear as maneiras pelas quais as tecnologias digitais atravessam os espaços, as relações e as práticas cotidianas de um território, produzindo possibilidades desiguais de acesso, participação e apropriação. Sua construção se apoia na tradição do habitar e nas leituras de Santos e Massey discutidas nas seções 6 e 7.</w:t>
       </w:r>
     </w:p>
     <w:p>
@@ -3078,15 +3238,15 @@
           <w:lang w:val="pt-BR"/>
         </w:rPr>
       </w:pPr>
-      <w:bookmarkStart w:id="5" w:name="_Toc241917925"/>
+      <w:bookmarkStart w:id="9" w:name="_Toc241917929"/>
       <w:r>
         <w:rPr>
           <w:lang w:val="pt-BR"/>
         </w:rPr>
         <w:lastRenderedPageBreak/>
-        <w:t>4 RELEVÂNCIA E INEDITISMO</w:t>
-      </w:r>
-      <w:bookmarkEnd w:id="5"/>
+        <w:t>5 REFERENCIAL TEÓRICO-METODOLÓGICO</w:t>
+      </w:r>
+      <w:bookmarkEnd w:id="9"/>
     </w:p>
     <w:p>
       <w:pPr>
@@ -3101,7 +3261,30 @@
         <w:rPr>
           <w:lang w:val="pt-BR"/>
         </w:rPr>
-        <w:t>A educação digital passou a ocupar lugar central nas políticas educacionais brasileiras. A Lei nº 14.533/2023 instituiu a PNED com quatro eixos estruturantes, a Inclusão Digital, a Educação Digital Escolar, a Capacitação e Especialização Digital e a Pesquisa e Desenvolvimento em Tecnologias da Informação e Comunicação, e determinou sua articulação com outras políticas nacionais, estaduais, distritais e municipais de educação digital, de formação e de infraestrutura (BRASIL, 2023). Dois anos depois, a Resolução CNE/CEB nº 2, de 21 de março de 2025, instituiu as Diretrizes Operacionais Nacionais sobre o uso de dispositivos digitais em espaços escolares e a integração curricular da educação digital e midiática, aplicáveis a todas as etapas da Educação Básica, e previu a adequação dos currículos das redes com implementação até 2026 (BRASIL, 2025a).</w:t>
+        <w:t xml:space="preserve">O referencial acompanha a política no caminho que a questão descreve, dos textos que a instituem até a escola, os profissionais, o território e as crianças. A Abordagem do Ciclo de Políticas (ACP) oferece a matriz para compreender a trajetória da PNED, e a teoria da atuação, o dispositivo para analisar como a escola a coloca em ação. A discussão sobre culturas profissionais e performatividade ajuda a compreender o que filtra essa atuação e o que a pressiona, e as leituras de território, técnica e lugar, apresentadas na seção 6, permitem inscrever Pipa na análise.</w:t>
+      </w:r>
+    </w:p>
+    <w:p>
+      <w:pPr>
+        <w:pStyle w:val="Ttulo2"/>
+        <w:spacing w:before="0" w:after="0"/>
+        <w:rPr>
+          <w:lang w:val="pt-BR"/>
+        </w:rPr>
+      </w:pPr>
+      <w:bookmarkStart w:id="10" w:name="_Toc241917930"/>
+      <w:r>
+        <w:rPr>
+          <w:lang w:val="pt-BR"/>
+        </w:rPr>
+        <w:t>5.1 A ABORDAGEM DO CICLO DE POLÍTICAS</w:t>
+      </w:r>
+      <w:bookmarkEnd w:id="10"/>
+      <w:r>
+        <w:rPr>
+          <w:lang w:val="pt-BR"/>
+        </w:rPr>
+        <w:t xml:space="preserve"> (ACP)</w:t>
       </w:r>
     </w:p>
     <w:p>
@@ -3117,25 +3300,22 @@
         <w:rPr>
           <w:lang w:val="pt-BR"/>
         </w:rPr>
-        <w:t xml:space="preserve">A pesquisa acontece, portanto, no momento em que esse conjunto de normas deixa o papel e começa a chegar às redes e às escolas. Em Tibau do Sul, essa chegada passa pela Secretaria Municipal de Educação, por formações, documentos curriculares e orientações que a escola recebe, lê e precisa transformar em trabalho com as crianças. Registrar a presença ou a ausência das orientações da PNED na Escola Municipal Domitila Castelo da Silva diria pouco sobre esse processo, pois, no contexto da prática, “a política não é simplesmente recebida e implementada nesta arena, ao contrário, ela está sujeita à interpretação e então é ‘recriada’” (BOWE; BALL; GOLD, 1992, p. 22, tradução nossa). Por isso, procuramos compreender como uma política pensada em escala nacional encontra uma escola de pequeno porte, situada num território com particularidades sociais, econômicas, culturais e tecnológicas, e o que resulta desse encontro. O caráter inédito da proposta pode ser descrito em três dimensões, que se apoiam umas nas outras.</w:t>
-      </w:r>
-    </w:p>
-    <w:p>
-      <w:pPr>
-        <w:pStyle w:val="Ttulo2"/>
-        <w:spacing w:before="0" w:after="0"/>
-        <w:rPr>
-          <w:lang w:val="pt-BR"/>
-        </w:rPr>
-      </w:pPr>
-      <w:bookmarkStart w:id="6" w:name="_Toc241917926"/>
-      <w:r>
-        <w:rPr>
-          <w:lang w:val="pt-BR"/>
-        </w:rPr>
-        <w:t>4.1 INEDITISMO EMPÍRICO-TEMPORAL</w:t>
-      </w:r>
-      <w:bookmarkEnd w:id="6"/>
+        <w:t xml:space="preserve">A Abordagem do Ciclo de Políticas (ACP) constitui a matriz epistemológica a partir da qual compreendemos a trajetória da PNED. Na formulação inicial de </w:t>
+      </w:r>
+      <w:proofErr w:type="spellStart"/>
+      <w:r>
+        <w:rPr>
+          <w:lang w:val="pt-BR"/>
+        </w:rPr>
+        <w:t>Bowe</w:t>
+      </w:r>
+      <w:proofErr w:type="spellEnd"/>
+      <w:r>
+        <w:rPr>
+          <w:lang w:val="pt-BR"/>
+        </w:rPr>
+        <w:t>, Ball e Gold (1992), a política é lida como processo contínuo, em que a formulação e a prática se influenciam mutuamente, sem a sequência linear em que um texto elaborado no centro seria executado nas pontas. Mainardes (2006), ao sistematizar a abordagem para o campo das políticas educacionais no Brasil, destaca a articulação entre o contexto de influência, em que se disputam as finalidades e os discursos da política, o contexto da produção do texto, em que essas disputas ganham forma em leis e documentos, e o contexto da prática, em que os textos são recebidos e reinterpretados. O autor registra também a ampliação posterior proposta por Ball, com os contextos dos resultados e da estratégia política.</w:t>
+      </w:r>
     </w:p>
     <w:p>
       <w:pPr>
@@ -3150,43 +3330,7 @@
         <w:rPr>
           <w:lang w:val="pt-BR"/>
         </w:rPr>
-        <w:t xml:space="preserve">A primeira dimensão diz respeito ao objeto e ao tempo em que ele é estudado. A pesquisa acompanha a chegada da PNED ao cotidiano escolar no período em que a educação digital e midiática começa a ser incorporada aos currículos de modo mais sistemático. Na </w:t>
-      </w:r>
-      <w:r>
-        <w:rPr>
-          <w:lang w:val="pt-BR"/>
-        </w:rPr>
-        <w:t>R</w:t>
-      </w:r>
-      <w:r>
-        <w:rPr>
-          <w:lang w:val="pt-BR"/>
-        </w:rPr>
-        <w:t xml:space="preserve">evisão </w:t>
-      </w:r>
-      <w:r>
-        <w:rPr>
-          <w:lang w:val="pt-BR"/>
-        </w:rPr>
-        <w:t>S</w:t>
-      </w:r>
-      <w:r>
-        <w:rPr>
-          <w:lang w:val="pt-BR"/>
-        </w:rPr>
-        <w:t>istemática</w:t>
-      </w:r>
-      <w:r>
-        <w:rPr>
-          <w:lang w:val="pt-BR"/>
-        </w:rPr>
-        <w:t xml:space="preserve"> de Literatura (RSL)</w:t>
-      </w:r>
-      <w:r>
-        <w:rPr>
-          <w:lang w:val="pt-BR"/>
-        </w:rPr>
-        <w:t xml:space="preserve"> realizada para esta tese, as buscas em sete bases retornaram 176 registros e resultaram num corpus de nove estudos, publicados entre 2021 e 2024. Nenhum deles se dedica especificamente à PNED, e nenhum investiga a atuação dessa política numa rede municipal de pequeno porte. A novidade da lei, por si, justificaria pouco a investigação. O que dá relevância ao estudo é a possibilidade de documentar um momento inicial de tradução de uma política nacional no interior de uma escola específica, acompanhando as mediações, as escolhas e as tensões que esse processo produz enquanto ele ainda está em curso. Ball (2011, p. 38) lembra que a abordagem da trajetória “capta as formas pelas quais as políticas evoluem, se modificam e decaem ao longo do tempo e do espaço, assim como as suas incoerências”, e acompanhar a PNED desde a sua chegada permite registrar esse movimento na escala de uma escola.</w:t>
+        <w:t xml:space="preserve">Nesta pesquisa, o contexto da prática ocupa posição privilegiada. Tomamos a Escola Municipal Domitila Castelo da Silva como um espaço em que os textos da PNED são lidos, interpretados, traduzidos e recriados por quem trabalha nela, e com isso tratamos a política como algo em movimento, cuja forma final só se conhece quando ela encontra as pessoas e as condições de um lugar. Os contextos de influência e de produção do texto entram na análise como referência para essa leitura, pois é em relação ao que a lei pede, e aos meios que oferece, que os profissionais produzem sentidos. Bowe, Ball e Gold (1992, p. 22, tradução nossa) formulam essa premissa ao afirmar que os profissionais que atuam no contexto da prática “não se deparam com os textos das políticas como leitores ingênuos; eles chegam a eles com suas próprias histórias, experiências, valores e propósitos, e têm interesses próprios implicados no significado da política”.</w:t>
       </w:r>
     </w:p>
     <w:p>
@@ -3197,15 +3341,14 @@
           <w:lang w:val="pt-BR"/>
         </w:rPr>
       </w:pPr>
-      <w:bookmarkStart w:id="7" w:name="_Toc241917927"/>
-      <w:r>
-        <w:rPr>
-          <w:lang w:val="pt-BR"/>
-        </w:rPr>
-        <w:lastRenderedPageBreak/>
-        <w:t>4.2 INEDITISMO ANALÍTICO-ESPACIAL</w:t>
-      </w:r>
-      <w:bookmarkEnd w:id="7"/>
+      <w:bookmarkStart w:id="11" w:name="_Toc241917931"/>
+      <w:r>
+        <w:rPr>
+          <w:lang w:val="pt-BR"/>
+        </w:rPr>
+        <w:t>5.2 A TEORIA DA ATUAÇÃO OU ENCENAÇÃO</w:t>
+      </w:r>
+      <w:bookmarkEnd w:id="11"/>
     </w:p>
     <w:p>
       <w:pPr>
@@ -3220,7 +3363,14 @@
         <w:rPr>
           <w:lang w:val="pt-BR"/>
         </w:rPr>
-        <w:t xml:space="preserve">A segunda dimensão está no lugar que o território ocupa na análise. Pipa entra nesta pesquisa como parte do contexto em que a política é encenada. O distrito, que na década de 1970 era uma comunidade agrícola e pesqueira e se tornou destino turístico internacional com a chegada dos surfistas, a partir de meados daquela década, e com a divulgação mais intensa iniciada nos anos 1990 (AIRES, 2012, p. 80-81), é hoje marcado pelo turismo, pela circulação de grupos sociais muito diferentes e por experiências desiguais de acesso, de uso e de participação na cultura digital, desigualdade que acompanha a diferenciação, descrita por Santos (2006, p. 163), entre zonas servidas pelos meios de conhecimento e áreas que não dispõem deles. Para ler esse território, partimos de Santos (1999, p. 19), para quem “o território não é uma categoria de análise, a categoria de análise é o território usado”, isto é, o território tomado pelas relações, pelos usos e pelos conflitos que o constituem. Em diálogo com essa perspectiva, Massey (2008, p. 29) compreende o espaço como a esfera da coexistência e da multiplicidade, feita de relações e de trajetórias que se encontram sem formar uma unidade homogênea, e pensa o lugar como “um encontro de trajetórias” (MASSEY, 2008, p. 204), sempre em construção.</w:t>
+        <w:t xml:space="preserve">A teoria da atuação de Ball, Maguire e Braun (2016) é o principal dispositivo analítico da pesquisa. Os autores voltam a atenção para os processos pelos quais as escolas colocam as políticas em ação e mostram que esses processos dependem das condições concretas de cada instituição. Para examiná-las, propõem quatro dimensões do contexto (BALL; MAGUIRE; BRAUN, 2016, p. 38), que orientarão a construção da análise. A dimensão situacional reúne a história da escola, sua localização e a composição de seu público, e é por ela que o território de Pipa e a trajetória da Escola </w:t>
+      </w:r>
+      <w:r>
+        <w:rPr>
+          <w:lang w:val="pt-BR"/>
+        </w:rPr>
+        <w:lastRenderedPageBreak/>
+        <w:t xml:space="preserve">Municipal Domitila Castelo da Silva entram no estudo. A dimensão das culturas profissionais diz respeito aos valores, compromissos, hábitos e experiências dos profissionais e às formas de relação entre eles. A dimensão material compreende a infraestrutura, os espaços, os equipamentos, a conectividade e os demais recursos que participam do que a escola consegue fazer. A dimensão externa abrange as pressões e os apoios vindos de fora, como as orientações da rede, as avaliações e as relações com outras instâncias de governo.</w:t>
       </w:r>
     </w:p>
     <w:p>
@@ -3236,25 +3386,8 @@
         <w:rPr>
           <w:lang w:val="pt-BR"/>
         </w:rPr>
-        <w:t xml:space="preserve">Essa leitura interessa à pesquisa porque permite olhar para a escola como um lugar onde se cruzam experiências sociais e digitais diversas. Na mesma turma podem estar a criança cuja família vive do turismo e convive com celulares, aplicativos e plataformas desde cedo, a criança recém-chegada com pais atraídos pelo setor de serviços e a criança de família nativa, ligada à pesca e às atividades tradicionais da localidade. É o que Massey (2008, p. 203) chama de “esse acabar juntos, o inevitável desafio de negociar um aqui-e-agora”. Com Santos e Massey, perguntamos como as características do território entram nas relações pelas quais a política é interpretada e traduzida, sem atribuir ao lugar o poder de determinar o que a escola faz com ela.</w:t>
-      </w:r>
-    </w:p>
-    <w:p>
-      <w:pPr>
-        <w:pStyle w:val="Ttulo2"/>
-        <w:spacing w:before="0" w:after="0"/>
-        <w:rPr>
-          <w:lang w:val="pt-BR"/>
-        </w:rPr>
-      </w:pPr>
-      <w:bookmarkStart w:id="8" w:name="_Toc241917928"/>
-      <w:r>
-        <w:rPr>
-          <w:lang w:val="pt-BR"/>
-        </w:rPr>
-        <w:t>4.3 INEDITISMO TEÓRICO-CONCEITUAL</w:t>
-      </w:r>
-      <w:bookmarkEnd w:id="8"/>
+        <w:t xml:space="preserve">Os autores insistem que essas dimensões participam do que a política se torna em cada escola. Para eles, “o contexto é uma força ‘ativa’, não é apenas um pano de fundo com os quais as escolas têm de operar” (BALL; MAGUIRE; BRAUN, 2016, p. 42), e o contexto material “refere-se aos aspectos ‘físicos’ de uma escola: edifícios e orçamentos, mas também aos funcionários, às tecnologias de informação e à infraestrutura” (BALL; MAGUIRE; BRAUN, 2016, p. 48). Lidos assim, o território de Pipa e as condições materiais da escola integram o próprio processo de atuação da política.</w:t>
+      </w:r>
     </w:p>
     <w:p>
       <w:pPr>
@@ -3269,26 +3402,25 @@
         <w:rPr>
           <w:lang w:val="pt-BR"/>
         </w:rPr>
-        <w:t xml:space="preserve">A terceira dimensão está na articulação entre a teoria da atuação, a discussão sobre culturas profissionais, a atenção à dimensão material da escola e a leitura do território para compreender uma política de educação digital. Os estudos reunidos na </w:t>
-      </w:r>
-      <w:r>
-        <w:rPr>
-          <w:lang w:val="pt-BR"/>
-        </w:rPr>
-        <w:t>RSL</w:t>
-      </w:r>
-      <w:r>
-        <w:rPr>
-          <w:lang w:val="pt-BR"/>
-        </w:rPr>
-        <w:t xml:space="preserve"> </w:t>
-      </w:r>
-      <w:r>
-        <w:rPr>
-          <w:lang w:val="pt-BR"/>
-        </w:rPr>
-        <w:t xml:space="preserve">reconhecem que os profissionais da educação interpretam as políticas e lhes dão forma, e examinam pouco as culturas profissionais que filtram essa interpretação e as condições em que ela se produz. Ao reunir esses referenciais, a pesquisa pode tratar a distância entre o que a política prescreve e o que acontece na escola como parte de uma relação política entre texto, contexto e sujeitos, evitando classificá-la de imediato como falha, incapacidade ou resistência, cuidado que Ball (2011, p. 36, 46) recomenda ao criticar tanto as pesquisas que localizam o problema apenas na escola e no professor quanto as que transformam os sujeitos pesquisados em heróis.</w:t>
-      </w:r>
+        <w:t>É pela dimensão externa que se justifica a participação de um técnico da Secretaria Municipal de Educação. Em Tibau do Sul, as orientações nacionais chegam à escola depois de passar pela gestão municipal, que as recebe, interpreta e encaminha às unidades. Ouvir quem acompanha a educação digital na Secretaria permitirá compreender essa mediação e o que dela chega à escola. A participação do técnico terá função complementar, e o centro do estudo de caso permanece na escola, onde a política é encenada no trabalho com as crianças.</w:t>
+      </w:r>
+    </w:p>
+    <w:p>
+      <w:pPr>
+        <w:pStyle w:val="Ttulo2"/>
+        <w:spacing w:before="0" w:after="0"/>
+        <w:rPr>
+          <w:lang w:val="pt-BR"/>
+        </w:rPr>
+      </w:pPr>
+      <w:bookmarkStart w:id="12" w:name="_Toc241917932"/>
+      <w:r>
+        <w:rPr>
+          <w:lang w:val="pt-BR"/>
+        </w:rPr>
+        <w:t>5.3 CULTURAS PROFISSIONAIS E PERFORMATIVIDADE</w:t>
+      </w:r>
+      <w:bookmarkEnd w:id="12"/>
     </w:p>
     <w:p>
       <w:pPr>
@@ -3303,14 +3435,46 @@
         <w:rPr>
           <w:lang w:val="pt-BR"/>
         </w:rPr>
-        <w:t xml:space="preserve">É nessa distância que procuraremos compreender o surgimento de diferentes formas de atuação, inclusive das resistências, entendidas como possibilidade produzida diante de exigências, condições, valores, limites ou conflitos específicos, e nunca como comportamento negativo previamente atribuído aos profissionais. É também desse diálogo entre referenciais que nasce a formulação “habitar o digital”, que a tese propõe como possibilidade analítica </w:t>
+        <w:t>A discussão sobre culturas profissionais será orientada por Hargreaves (2005), para quem “as culturas do ensino compreendem crenças, valores, hábitos e formas de fazer as coisas assumidas pelas comunidades de professores que têm de enfrentar exigências e limitações semelhantes ao longo de muitos anos” (HARGREAVES, 2005, p. 189, tradução nossa). O autor distingue o conteúdo dessas culturas, feito dos pressupostos, valores, atitudes e crenças compartilhados, de sua forma, que corresponde aos padrões de relação e de interação entre os profissionais, e descreve formas como o individualismo, a colaboração, a colegialidade artificial e a balcanização (HARGREAVES, 2005, p. 189-191). Essa distinção interessa à pesquisa porque os profissionais da escola leem a PNED a partir de suas histórias profissionais, de suas experiências, das relações com os colegas e dos modos próprios de organizar o trabalho. O que uma equipe considera um bom trabalho, o que costuma acolher e o que costuma deixar de lado entram, assim, no modo como a política é interpretada.</w:t>
+      </w:r>
+    </w:p>
+    <w:p>
+      <w:pPr>
+        <w:spacing w:after="0" w:line="360" w:lineRule="auto"/>
+        <w:ind w:firstLine="709"/>
+        <w:jc w:val="both"/>
+        <w:rPr>
+          <w:lang w:val="pt-BR"/>
+        </w:rPr>
+      </w:pPr>
+      <w:r>
+        <w:rPr>
+          <w:lang w:val="pt-BR"/>
+        </w:rPr>
+        <w:t xml:space="preserve">A performatividade será trabalhada a partir de Ball (2004), que a descreve como uma cultura de metas, comparações, indicadores e prestação de contas capaz de orientar o trabalho e a própria identidade dos profissionais da educação. Em outro texto, o autor a define nestes termos: “A performatividade é uma cultura ou um sistema de ‘terror’. É um regime de prestação de contas que emprega julgamentos, comparações e exposições como meios de controle, desgaste e mudança” (BALL, 2008, p. 49, tradução nossa). Interessa-nos saber se, em Pipa, a educação digital chega à escola acompanhada de exigências de registro, demonstração, monitoramento ou responsabilização, e o que os profissionais fazem diante delas. Se a PNED produz ou não uma cultura de performatividade na escola é questão que caberá aos dados responder. Ligada a ela está a noção de fabricação, com a qual Ball (2002) nomeia as versões de uma instituição ou de uma prática produzidas para serem vistas, avaliadas e prestadas como conta. Essa noção será mobilizada quando os dados indicarem a construção de </w:t>
       </w:r>
       <w:r>
         <w:rPr>
           <w:lang w:val="pt-BR"/>
         </w:rPr>
         <w:lastRenderedPageBreak/>
-        <w:t>para nomear as maneiras pelas quais as tecnologias digitais atravessam os espaços, as relações e as práticas cotidianas de um território, produzindo possibilidades desiguais de acesso, participação e apropriação. Sua construção, a partir da tradição do habitar e das leituras de Santos e Massey, é apresentada adiante, depois do referencial teórico-metodológico que sustenta a investigação.</w:t>
+        <w:t>determinadas imagens da escola ou de seu trabalho para responder a expectativas de avaliação, de registro ou de apresentação institucional.</w:t>
+      </w:r>
+    </w:p>
+    <w:p>
+      <w:pPr>
+        <w:spacing w:after="0" w:line="360" w:lineRule="auto"/>
+        <w:ind w:firstLine="709"/>
+        <w:jc w:val="both"/>
+        <w:rPr>
+          <w:lang w:val="pt-BR"/>
+        </w:rPr>
+      </w:pPr>
+      <w:r>
+        <w:rPr>
+          <w:lang w:val="pt-BR"/>
+        </w:rPr>
+        <w:t xml:space="preserve">Essas noções funcionarão como lentes de leitura, capazes de orientar o olhar sobre os dados sem antecipar o que será encontrado, e poderão ser ajustadas quando o material empírico pedir. O mesmo vale para a leitura do território, onde todas essas dimensões se encontram.</w:t>
       </w:r>
     </w:p>
     <w:p>
@@ -3322,15 +3486,15 @@
           <w:lang w:val="pt-BR"/>
         </w:rPr>
       </w:pPr>
-      <w:bookmarkStart w:id="9" w:name="_Toc241917929"/>
+      <w:bookmarkStart w:id="13" w:name="_Toc241917933"/>
       <w:r>
         <w:rPr>
           <w:lang w:val="pt-BR"/>
         </w:rPr>
         <w:lastRenderedPageBreak/>
-        <w:t>5 REFERENCIAL TEÓRICO-METODOLÓGICO</w:t>
-      </w:r>
-      <w:bookmarkEnd w:id="9"/>
+        <w:t>6 TERRITÓRIO, TÉCNICA E A PRODUÇÃO DO LUGAR</w:t>
+      </w:r>
+      <w:bookmarkEnd w:id="13"/>
     </w:p>
     <w:p>
       <w:pPr>
@@ -3341,46 +3505,39 @@
           <w:lang w:val="pt-BR"/>
         </w:rPr>
       </w:pPr>
-      <w:r>
-        <w:rPr>
-          <w:lang w:val="pt-BR"/>
-        </w:rPr>
-        <w:t>O referencial da pesquisa foi composto para acompanhar a política no caminho que a questão descreve, desde os textos que a instituem até a escola, os profissionais, o território e as crianças. Cada autor responde a uma parte desse caminho. A Abordagem do Ciclo de Políticas</w:t>
-      </w:r>
-      <w:r>
-        <w:rPr>
-          <w:lang w:val="pt-BR"/>
-        </w:rPr>
-        <w:t xml:space="preserve"> (ACP)</w:t>
-      </w:r>
-      <w:r>
-        <w:rPr>
-          <w:lang w:val="pt-BR"/>
-        </w:rPr>
-        <w:t xml:space="preserve"> oferece a matriz para compreender a trajetória da PNED; a teoria da atuação, o dispositivo para analisar como a escola a coloca em ação; a discussão sobre culturas profissionais e performatividade, os meios para compreender o que filtra essa atuação e o que a pressiona; e as leituras de território, técnica e lugar, apresentadas na seção 6, a forma de inscrever Pipa na análise.</w:t>
-      </w:r>
-    </w:p>
-    <w:p>
-      <w:pPr>
-        <w:pStyle w:val="Ttulo2"/>
-        <w:spacing w:before="0" w:after="0"/>
-        <w:rPr>
-          <w:lang w:val="pt-BR"/>
-        </w:rPr>
-      </w:pPr>
-      <w:bookmarkStart w:id="10" w:name="_Toc241917930"/>
-      <w:r>
-        <w:rPr>
-          <w:lang w:val="pt-BR"/>
-        </w:rPr>
-        <w:t>5.1 A ABORDAGEM DO CICLO DE POLÍTICAS</w:t>
-      </w:r>
-      <w:bookmarkEnd w:id="10"/>
-      <w:r>
-        <w:rPr>
-          <w:lang w:val="pt-BR"/>
-        </w:rPr>
-        <w:t xml:space="preserve"> (ACP)</w:t>
+      <w:proofErr w:type="spellStart"/>
+      <w:proofErr w:type="spellEnd"/>
+      <w:r>
+        <w:rPr>
+          <w:lang w:val="pt-BR"/>
+        </w:rPr>
+        <w:t xml:space="preserve">Para inscrever Pipa na análise, recorremos a Milton Santos e a Doreen Massey. Em </w:t>
+      </w:r>
+      <w:r>
+        <w:rPr>
+          <w:lang w:val="pt-BR"/>
+          <w:i/>
+        </w:rPr>
+        <w:t xml:space="preserve">A natureza do espaço</w:t>
+      </w:r>
+      <w:r>
+        <w:rPr>
+          <w:lang w:val="pt-BR"/>
+        </w:rPr>
+        <w:t xml:space="preserve">, Santos (2006, p. 12) compreende o espaço como conjunto indissociável de sistemas de objetos e de sistemas de ações e atribui à técnica um papel central na relação entre espaço e tempo. Os objetos técnicos instalados num lugar carregam a história do momento em que foram produzidos e condicionam as ações que ali se tornam possíveis. Nas palavras do autor, “os sistemas de objetos condicionam a forma como se dão as ações e, de outro lado, o sistema de ações leva à criação de objetos novos ou se realiza sobre objetos preexistentes” (SANTOS, 2006, p. 39). Como os lugares não se renovam por inteiro, formas herdadas de outros períodos continuam presentes e participam do presente. O autor dá a essas permanências o nome de rugosidades: “Chamemos rugosidade ao que fica do passado como forma, espaço construído, paisagem, o que resta do processo de supressão, acumulação, superposição, com que as coisas se substituem e acumulam em todos os lugares” (SANTOS, 2006, p. 92). Em </w:t>
+      </w:r>
+      <w:r>
+        <w:rPr>
+          <w:lang w:val="pt-BR"/>
+          <w:i/>
+        </w:rPr>
+        <w:t xml:space="preserve">Espaço e método</w:t>
+      </w:r>
+      <w:r>
+        <w:rPr>
+          <w:lang w:val="pt-BR"/>
+        </w:rPr>
+        <w:t xml:space="preserve">, o autor reforça essa leitura ao afirmar que “o passado técnico da forma é uma realidade a ser levada em consideração quando se tenta analisar o espaço” (SANTOS, 2012, p. 73).</w:t>
       </w:r>
     </w:p>
     <w:p>
@@ -3392,25 +3549,13 @@
           <w:lang w:val="pt-BR"/>
         </w:rPr>
       </w:pPr>
-      <w:r>
-        <w:rPr>
-          <w:lang w:val="pt-BR"/>
-        </w:rPr>
-        <w:t xml:space="preserve">A Abordagem do Ciclo de Políticas (ACP) constitui a matriz epistemológica a partir da qual compreendemos a trajetória da PNED. Na formulação inicial de </w:t>
-      </w:r>
       <w:proofErr w:type="spellStart"/>
-      <w:r>
-        <w:rPr>
-          <w:lang w:val="pt-BR"/>
-        </w:rPr>
-        <w:t>Bowe</w:t>
-      </w:r>
       <w:proofErr w:type="spellEnd"/>
       <w:r>
         <w:rPr>
           <w:lang w:val="pt-BR"/>
         </w:rPr>
-        <w:t>, Ball e Gold (1992), a política é lida como processo contínuo, em que a formulação e a prática se influenciam mutuamente, sem a sequência linear em que um texto elaborado no centro seria executado nas pontas. Mainardes (2006), ao sistematizar a abordagem para o campo das políticas educacionais no Brasil, destaca a articulação entre o contexto de influência, em que se disputam as finalidades e os discursos da política, o contexto da produção do texto, em que essas disputas ganham forma em leis e documentos, e o contexto da prática, em que os textos são recebidos e reinterpretados. O autor registra também a ampliação posterior proposta por Ball, com os contextos dos resultados e da estratégia política.</w:t>
+        <w:t xml:space="preserve">A Escola Municipal Domitila Castelo da Silva está num território onde convivem temporalidades tecnológicas diferentes e recebe a PNED com uma infraestrutura, objetos técnicos, espaços, formas de organização e uma história determinados. Segundo informações preliminares, ainda a confirmar nos documentos da rede, os computadores de seu laboratório de informática foram adquiridos pela Prefeitura em 2022, pouco antes da promulgação da lei. A política nacional encontra, assim, equipamentos de uma iniciativa anterior a ela e lhes atribui uma nova função. Santos descreve esse movimento ao observar que, uma vez criada e usada na função que lhe foi designada, a forma “freqüentemente permanece aguardando o próximo movimento dinâmico da sociedade, quando terá toda a probabilidade de ser chamada a cumprir uma nova função” (SANTOS, 2012, p. 74-75). Nos capítulos já escritos da tese, chamamos essa situação de rugosidade tecnológica. Com Santos, perguntaremos que condições técnicas já existiam na escola quando a política chegou, quais permaneceram, que novos objetos foram incorporados e o que essas condições permitem ou limitam no trabalho dos profissionais e na experiência das crianças.</w:t>
       </w:r>
     </w:p>
     <w:p>
@@ -3426,25 +3571,8 @@
         <w:rPr>
           <w:lang w:val="pt-BR"/>
         </w:rPr>
-        <w:t xml:space="preserve">Nesta pesquisa, o contexto da prática ocupa posição privilegiada. Tomamos a Escola Municipal Domitila Castelo da Silva como um espaço em que os textos da PNED são lidos, interpretados, traduzidos e recriados por quem trabalha nela, e com isso tratamos a política como algo em movimento, cuja forma final só se conhece quando ela encontra as pessoas e as condições de um lugar. Os contextos de influência e de produção do texto entram na análise como referência para essa leitura, pois é em relação ao que a lei pede, e aos meios que oferece, que os profissionais produzem sentidos. Bowe, Ball e Gold (1992, p. 22, tradução nossa) formulam essa premissa ao afirmar que os profissionais que atuam no contexto da prática “não se deparam com os textos das políticas como leitores ingênuos; eles chegam a eles com suas próprias histórias, experiências, valores e propósitos, e têm interesses próprios implicados no significado da política”.</w:t>
-      </w:r>
-    </w:p>
-    <w:p>
-      <w:pPr>
-        <w:pStyle w:val="Ttulo2"/>
-        <w:spacing w:before="0" w:after="0"/>
-        <w:rPr>
-          <w:lang w:val="pt-BR"/>
-        </w:rPr>
-      </w:pPr>
-      <w:bookmarkStart w:id="11" w:name="_Toc241917931"/>
-      <w:r>
-        <w:rPr>
-          <w:lang w:val="pt-BR"/>
-        </w:rPr>
-        <w:t>5.2 A TEORIA DA ATUAÇÃO OU ENCENAÇÃO</w:t>
-      </w:r>
-      <w:bookmarkEnd w:id="11"/>
+        <w:t xml:space="preserve">Massey (2008) complementa essa leitura ao compreender o espaço “como a esfera da possibilidade da existência da multiplicidade, no sentido da pluralidade contemporânea, como a esfera na qual distintas trajetórias coexistem” (MASSEY, 2008, p. 29). Para a autora, o lugar é atravessado por trajetórias diversas e permanece aberto ao encontro e à negociação. A transformação de Pipa ganha, com ela, outra nitidez. A comunidade agrícola e pesqueira da década de 1970, sem energia elétrica, água encanada e boas vias de acesso, já recebia veranistas de famílias da região, passou a receber surfistas a partir de meados daquela década e, com a divulgação mais intensa do lugar no início dos anos 1990, turistas de várias partes do mundo. Nesse processo, terras de nativos passaram a veranistas, surfistas e estrangeiros, e trabalhadores de municípios vizinhos chegaram atraídos pelos serviços (AIRES, 2012, p. 79-86). Aires (2012, p. 9) observa que a população nativa não foi passiva diante dessas mudanças, criando “mecanismos de reformulações materiais e simbólicas”, e que “muitas paisagens ainda revelam materialidades de tempos passados, como inscrição das práticas sociais na construção do lugar”, observação que aproxima a história do distrito da noção de rugosidade. Essas trajetórias se sobrepõem no território e chegam à escola na forma das famílias e das crianças que ela atende.</w:t>
+      </w:r>
     </w:p>
     <w:p>
       <w:pPr>
@@ -3459,15 +3587,28 @@
         <w:rPr>
           <w:lang w:val="pt-BR"/>
         </w:rPr>
-        <w:t xml:space="preserve">A teoria da atuação de Ball, Maguire e Braun (2016) é o principal dispositivo analítico da pesquisa. Os autores voltam a atenção para os processos pelos quais as escolas colocam as políticas em ação e mostram que esses processos dependem das condições concretas de cada instituição. Para examiná-las, propõem quatro dimensões do contexto (BALL; MAGUIRE; BRAUN, 2016, p. 38), que orientarão a construção da análise. A dimensão situacional reúne a história da escola, sua localização e a composição de seu público, e é por ela que o território de Pipa e a trajetória da Escola </w:t>
-      </w:r>
-      <w:r>
-        <w:rPr>
-          <w:lang w:val="pt-BR"/>
-        </w:rPr>
         <w:lastRenderedPageBreak/>
-        <w:t xml:space="preserve">Municipal Domitila Castelo da Silva entram no estudo. A dimensão das culturas profissionais diz respeito aos valores, compromissos, hábitos e experiências dos profissionais e às formas de relação entre eles. A dimensão material compreende a infraestrutura, os espaços, os equipamentos, a conectividade e os demais recursos que participam do que a escola consegue fazer. A dimensão externa abrange as pressões e os apoios vindos de fora, como as orientações da rede, as avaliações e as relações com outras instâncias de governo.</w:t>
-      </w:r>
+        <w:t xml:space="preserve">Com Santos e Massey, Pipa pode ser compreendida ao mesmo tempo como território produzido por tempos e relações diferentes e como lugar de encontro de trajetórias diversas, leitura que, somada à discussão sobre o habitar, sustenta a formulação que a tese propõe para a relação entre o território e as tecnologias digitais.</w:t>
+      </w:r>
+    </w:p>
+    <w:p>
+      <w:pPr>
+        <w:pStyle w:val="Ttulo1"/>
+        <w:pageBreakBefore/>
+        <w:spacing w:after="0"/>
+        <w:rPr>
+          <w:lang w:val="pt-BR"/>
+        </w:rPr>
+      </w:pPr>
+      <w:bookmarkStart w:id="14" w:name="_Toc241917934"/>
+      <w:r>
+        <w:rPr>
+          <w:lang w:val="pt-BR"/>
+        </w:rPr>
+        <w:lastRenderedPageBreak/>
+        <w:t>7 DA IDEIA DE HABITAR AO “HABITAR O DIGITAL”</w:t>
+      </w:r>
+      <w:bookmarkEnd w:id="14"/>
     </w:p>
     <w:p>
       <w:pPr>
@@ -3478,11 +3619,60 @@
           <w:lang w:val="pt-BR"/>
         </w:rPr>
       </w:pPr>
-      <w:r>
-        <w:rPr>
-          <w:lang w:val="pt-BR"/>
-        </w:rPr>
-        <w:t xml:space="preserve">Os autores insistem que essas dimensões participam do que a política se torna em cada escola. Para eles, “o contexto é uma força ‘ativa’, não é apenas um pano de fundo com os quais as escolas têm de operar” (BALL; MAGUIRE; BRAUN, 2016, p. 42), e o contexto material “refere-se aos aspectos ‘físicos’ de uma escola: edifícios e orçamentos, mas também aos funcionários, às tecnologias de informação e à infraestrutura” (BALL; MAGUIRE; BRAUN, 2016, p. 48). Essa compreensão permite tratar o território de Pipa e as condições materiais da escola como parte do processo de atuação da política.</w:t>
+      <w:proofErr w:type="spellStart"/>
+      <w:proofErr w:type="spellEnd"/>
+      <w:proofErr w:type="spellStart"/>
+      <w:proofErr w:type="spellEnd"/>
+      <w:proofErr w:type="spellStart"/>
+      <w:proofErr w:type="spellEnd"/>
+      <w:proofErr w:type="spellStart"/>
+      <w:proofErr w:type="spellEnd"/>
+      <w:proofErr w:type="spellStart"/>
+      <w:proofErr w:type="spellEnd"/>
+      <w:r>
+        <w:rPr>
+          <w:lang w:val="pt-BR"/>
+        </w:rPr>
+        <w:t xml:space="preserve">“Habitar o digital” é uma formulação desta tese, construída a partir de contribuições que articulamos ao caso estudado e que começam pela própria noção de habitar. Em </w:t>
+      </w:r>
+      <w:r>
+        <w:rPr>
+          <w:lang w:val="pt-BR"/>
+          <w:i/>
+        </w:rPr>
+        <w:t xml:space="preserve">O habitar do ensinar e do aprender OnLIFE</w:t>
+      </w:r>
+      <w:r>
+        <w:rPr>
+          <w:lang w:val="pt-BR"/>
+        </w:rPr>
+        <w:t xml:space="preserve">, obra organizada por Schlemmer </w:t>
+      </w:r>
+      <w:r>
+        <w:rPr>
+          <w:lang w:val="pt-BR"/>
+          <w:i/>
+        </w:rPr>
+        <w:t xml:space="preserve">et al.</w:t>
+      </w:r>
+      <w:r>
+        <w:rPr>
+          <w:lang w:val="pt-BR"/>
+        </w:rPr>
+        <w:t xml:space="preserve"> (2021), o capítulo de abertura, assinado por Schlemmer, Backes e Palagi, lembra que habitar “tem o significado de estar presente” e que o habitar, “além de estar acompanhado do movimento, tem uma natureza relacional” (SCHLEMMER; BACKES; PALAGI, 2021, p. 15). As autoras chamam de Educação OnLIFE “uma educação transubstanciada e cibricidadã, ligada, conectada (On) na vida (LIFE), a partir de problematizações que emergem do tempo presente, nessa realidade hiperconectada” (SCHLEMMER; BACKES; PALAGI, 2021, p. 24), e recorrem a Massimo Di Felice para compreender o habitar “enquanto prática comunicativa” (SCHLEMMER; BACKES; PALAGI, 2021, p. 17). Em </w:t>
+      </w:r>
+      <w:r>
+        <w:rPr>
+          <w:lang w:val="pt-BR"/>
+          <w:i/>
+        </w:rPr>
+        <w:t xml:space="preserve">Paisagens pós-urbanas</w:t>
+      </w:r>
+      <w:r>
+        <w:rPr>
+          <w:lang w:val="pt-BR"/>
+        </w:rPr>
+        <w:t xml:space="preserve">, Di Felice (2009) retoma a tradição filosófica do habitar, que remonta a Heidegger, e mostra como as diferentes tecnologias comunicativas transformam a relação entre o sujeito, os meios de comunicação e o território. Ao tratar da imprensa, afirma que “a invenção da escrita artificial coincide, de fato, com o surgimento de uma espacialidade artificial que marcará sobremaneira a Renascença e inaugurará um novo modo de habitar” (DI FELICE, 2009, p. 102). Com as redes digitais, o autor descreve um habitar atópico, que só se realiza por meio de interações com interfaces e envolve fluxos informativos e relações irredutíveis ao espaço físico. Constituem-se, aí, ecossistemas informativos, ambientes que só podem ser atravessados mediante interações técnicas e nos quais sujeito e território se relacionam em rede (DI FELICE, 2009, p. 20).</w:t>
       </w:r>
     </w:p>
     <w:p>
@@ -3498,25 +3688,8 @@
         <w:rPr>
           <w:lang w:val="pt-BR"/>
         </w:rPr>
-        <w:t>É pela dimensão externa que se justifica a participação de um técnico da Secretaria Municipal de Educação. Em Tibau do Sul, as orientações nacionais chegam à escola depois de passar pela gestão municipal, que as recebe, interpreta e encaminha às unidades. Ouvir quem acompanha a educação digital na Secretaria permitirá compreender essa mediação e o que dela chega à escola. A participação do técnico terá função complementar, e o centro do estudo de caso permanece na escola, onde a política é encenada no trabalho com as crianças.</w:t>
-      </w:r>
-    </w:p>
-    <w:p>
-      <w:pPr>
-        <w:pStyle w:val="Ttulo2"/>
-        <w:spacing w:before="0" w:after="0"/>
-        <w:rPr>
-          <w:lang w:val="pt-BR"/>
-        </w:rPr>
-      </w:pPr>
-      <w:bookmarkStart w:id="12" w:name="_Toc241917932"/>
-      <w:r>
-        <w:rPr>
-          <w:lang w:val="pt-BR"/>
-        </w:rPr>
-        <w:t>5.3 CULTURAS PROFISSIONAIS E PERFORMATIVIDADE</w:t>
-      </w:r>
-      <w:bookmarkEnd w:id="12"/>
+        <w:t xml:space="preserve">Desse diálogo e das leituras de território da seção anterior resulta a definição que adotamos. Habitar o digital designa, nesta pesquisa, as maneiras pelas quais as tecnologias digitais atravessam os espaços, as relações e as práticas cotidianas de um território, produzindo possibilidades desiguais de acesso, participação e apropriação. Em Pipa, a expressão nomeia uma tensão específica, a coexistência de uma elevada densidade tecnológica nos circuitos econômicos e turísticos do distrito com uma disponibilidade muito mais limitada de tecnologias nos espaços pedagógicos da escola. A formulação dialoga com Santos (2006), porque os objetos técnicos se distribuem de forma desigual no espaço e carregam idades, funções e possibilidades de uso diferentes, e dialoga com Massey (2008), porque as experiências digitais acontecem dentro do espaço social e participam das relações, das trajetórias e das desigualdades que constituem o lugar.</w:t>
+      </w:r>
     </w:p>
     <w:p>
       <w:pPr>
@@ -3531,7 +3704,7 @@
         <w:rPr>
           <w:lang w:val="pt-BR"/>
         </w:rPr>
-        <w:t>A discussão sobre culturas profissionais será orientada por Hargreaves (2005), para quem “as culturas do ensino compreendem crenças, valores, hábitos e formas de fazer as coisas assumidas pelas comunidades de professores que têm de enfrentar exigências e limitações semelhantes ao longo de muitos anos” (HARGREAVES, 2005, p. 189, tradução nossa). O autor distingue o conteúdo dessas culturas, feito dos pressupostos, valores, atitudes e crenças compartilhados, de sua forma, que corresponde aos padrões de relação e de interação entre os profissionais, e descreve formas como o individualismo, a colaboração, a colegialidade artificial e a balcanização (HARGREAVES, 2005, p. 189-191). Essa distinção interessa à pesquisa porque os profissionais da escola leem a PNED a partir de suas histórias profissionais, de suas experiências, das relações com os colegas e dos modos próprios de organizar o trabalho. O que uma equipe considera um bom trabalho, o que costuma acolher e o que costuma deixar de lado entram, assim, no modo como a política é interpretada.</w:t>
+        <w:t xml:space="preserve">Santos (2006, p. 163) observa que, com a difusão do meio técnico-científico-informacional, “distinguem-se zonas servidas pelos meios de conhecimento e áreas desprovidas dessa vantagem”, e em Pipa essa distinção atravessa o próprio distrito. Em texto anterior, o autor dá nome a uma tensão que reencontramos em Pipa, a “dissonância entre os usos econômicos e os usos sociais dos mesmos recursos” (SANTOS, 1999, p. 20-21). Massey, por sua vez, impede que a distância entre a escola e os circuitos turísticos seja lida como atraso, ao criticar a operação que “transforma a geografia em história, o espaço em tempo” e “reduz coexistências simultâneas a um lugar na fila da história” (MASSEY, 2008, p. 24). Escola e polo turístico são contemporâneos, separados por relações que a análise precisará explicar.</w:t>
       </w:r>
     </w:p>
     <w:p>
@@ -3547,15 +3720,27 @@
         <w:rPr>
           <w:lang w:val="pt-BR"/>
         </w:rPr>
-        <w:t xml:space="preserve">A performatividade será trabalhada a partir de Ball (2004), que a descreve como uma cultura de metas, comparações, indicadores e prestação de contas capaz de orientar o trabalho e a própria identidade dos profissionais da educação. Em outro texto, o autor a define nestes termos: “A performatividade é uma cultura ou um sistema de ‘terror’. É um regime de prestação de contas que emprega julgamentos, comparações e exposições como meios de controle, desgaste e mudança” (BALL, 2008, p. 49, tradução nossa). Interessa-nos saber se, em Pipa, a educação digital chega à escola acompanhada de exigências de registro, demonstração, monitoramento ou responsabilização, e o que os profissionais fazem diante delas. Se a PNED produz ou não uma cultura de performatividade na escola é questão que caberá aos dados responder. Ligada a ela está a noção de fabricação, com a qual Ball (2002) nomeia as versões de uma instituição ou de uma prática produzidas para serem vistas, avaliadas e prestadas como conta. Essa noção será mobilizada quando os dados indicarem a construção de </w:t>
-      </w:r>
+        <w:t xml:space="preserve">Por essa razão, habitar o digital é, nesta tese, mais do que acesso à internet ou posse de equipamentos. Valente já advertia, no fim dos anos 1990, que “implantar computadores nas escolas sem o devido preparo de professores e da comunidade escolar não trará os benefícios que esperamos” (VALENTE, 1999, p. 83). A expressão orienta duas perguntas, uma voltada ao território e outra à escola. Como se habita o digital quando a tecnologia está intensamente presente em certos circuitos do distrito e pouco presente nos espaços destinados à educação? Que formas de participação, uso, apropriação e experiência digital se tornam possíveis, ou permanecem restritas, para as crianças nessas condições? A formulação será confrontada com os dados e poderá ser aprofundada, revista ou tensionada ao longo da investigação, e a segunda pergunta conduz aos direitos das crianças no ambiente digital.</w:t>
+      </w:r>
+    </w:p>
+    <w:p>
+      <w:pPr>
+        <w:pStyle w:val="Ttulo1"/>
+        <w:pageBreakBefore/>
+        <w:spacing w:after="0"/>
+        <w:rPr>
+          <w:lang w:val="pt-BR"/>
+        </w:rPr>
+      </w:pPr>
+      <w:bookmarkStart w:id="15" w:name="_Toc241917935"/>
       <w:r>
         <w:rPr>
           <w:lang w:val="pt-BR"/>
         </w:rPr>
         <w:lastRenderedPageBreak/>
-        <w:t>determinadas imagens da escola ou de seu trabalho para responder a expectativas de avaliação, de registro ou de apresentação institucional.</w:t>
-      </w:r>
+        <w:t>8 EDUCAÇÃO DIGITAL E DIREITOS DAS CRIANÇAS</w:t>
+      </w:r>
+      <w:bookmarkEnd w:id="15"/>
     </w:p>
     <w:p>
       <w:pPr>
@@ -3570,7 +3755,55 @@
         <w:rPr>
           <w:lang w:val="pt-BR"/>
         </w:rPr>
-        <w:t>As noções reunidas neste referencial funcionarão como lentes de leitura. Elas orientam o olhar sobre os dados sem antecipar o que será encontrado, e poderão ser ajustadas quando os dados pedirem. Isso vale também para a leitura do território, que trata do lugar onde todas essas dimensões se encontram.</w:t>
+        <w:t xml:space="preserve">As crianças estão no fim do caminho que a política percorre, e é em nome delas que a PNED se justifica, razão pela qual o objetivo específico (d) se volta para os seus direitos no ambiente digital. Como a pesquisa ouve os profissionais da educação, o que se poderá dizer sobre as crianças virá das condições documentadas e das compreensões desses profissionais, sem que se pressuponham efeitos sobre elas.</w:t>
+      </w:r>
+    </w:p>
+    <w:p>
+      <w:pPr>
+        <w:spacing w:after="0" w:line="360" w:lineRule="auto"/>
+        <w:ind w:firstLine="709"/>
+        <w:jc w:val="both"/>
+        <w:rPr>
+          <w:lang w:val="pt-BR"/>
+        </w:rPr>
+      </w:pPr>
+      <w:r>
+        <w:rPr>
+          <w:lang w:val="pt-BR"/>
+        </w:rPr>
+        <w:t>O Comentário Geral nº 25, do Comitê dos Direitos da Criança das Nações Unidas, reconhece a importância crescente do ambiente digital na vida das crianças e orienta os Estados a garantir-lhes acesso equitativo a recursos digitais, à educação e à participação, assegurando ao mesmo tempo proteção, privacidade e segurança (ONU, 2021). O documento atribui aos sistemas educacionais a responsabilidade por infraestrutura adequada, pela formação dos profissionais e por condições para uma educação digital que envolva criação, colaboração, participação, cidadania e compreensão crítica do ambiente digital. No Brasil, o debate ganhou nova densidade com a Lei nº 15.211/2025, o Estatuto Digital da Criança e do Adolescente, que dispõe sobre a proteção de crianças e adolescentes em ambientes digitais e entrou em vigor em 17 de março de 2026 (BRASIL, 2025b).</w:t>
+      </w:r>
+    </w:p>
+    <w:p>
+      <w:pPr>
+        <w:spacing w:after="0" w:line="360" w:lineRule="auto"/>
+        <w:ind w:firstLine="709"/>
+        <w:jc w:val="both"/>
+        <w:rPr>
+          <w:lang w:val="pt-BR"/>
+        </w:rPr>
+      </w:pPr>
+      <w:r>
+        <w:rPr>
+          <w:lang w:val="pt-BR"/>
+        </w:rPr>
+        <w:t xml:space="preserve">A atenção às crianças pede, também, cautela diante de duas imagens frequentes no debate público. Buckingham (2006, p. 39) lembra que “as crianças não sabem ‘naturalmente’ como usar computadores: como os adultos, muitas vezes elas experimentam confusão, tédio e frustração”, e conclui que nem a visão da criança vulnerável nem a da criança naturalmente competente oferece “uma base realista para a elaboração de políticas culturais, sociais e educacionais que possam de fato habilitar todas as crianças a lidar com as realidades culturais em mudança nas quais nasceram” (BUCKINGHAM, 2006, p. 40). Se a familiaridade com os aparelhos não se converte, por si, em compreensão do ambiente digital, essa compreensão precisa ser ensinada, e é essa tarefa que a PNED atribui à escola.</w:t>
+      </w:r>
+    </w:p>
+    <w:p>
+      <w:pPr>
+        <w:spacing w:after="0" w:line="360" w:lineRule="auto"/>
+        <w:ind w:firstLine="709"/>
+        <w:jc w:val="both"/>
+        <w:rPr>
+          <w:lang w:val="pt-BR"/>
+        </w:rPr>
+      </w:pPr>
+      <w:r>
+        <w:rPr>
+          <w:lang w:val="pt-BR"/>
+        </w:rPr>
+        <w:t xml:space="preserve">Em diálogo com esses documentos, organizamos a análise em três dimensões. A provisão diz respeito às condições necessárias para que as crianças tenham acesso significativo à educação digital, como equipamentos, conectividade, tempo e profissionais formados. A proteção envolve a segurança, a privacidade, o cuidado e o enfrentamento dos riscos presentes nos ambientes digitais, e ganha peso quando se considera, com Silveira (2017), que o mercado de dados pessoais se expande justamente sobre o terreno da privacidade. A participação refere-se às possibilidades de as crianças acessarem informação, produzirem, criarem, comunicarem-se, expressarem opiniões e tomarem parte da cultura digital como sujeitos. Freire lembra que não há respeito aos educandos “se não se levam em consideração as condições em que eles vêm existindo, se não se reconhece a importância dos ‘conhecimentos de experiência feitos’ com que chegam à escola” (FREIRE, 2019, p. 62), e a participação começa por esses saberes. Com essas dimensões, buscaremos compreender como as diferentes formas de encenação da PNED na Escola Municipal Domitila Castelo da Silva podem ampliar, limitar ou reorganizar as possibilidades de as crianças de Pipa habitarem o digital.</w:t>
       </w:r>
     </w:p>
     <w:p>
@@ -3582,15 +3815,32 @@
           <w:lang w:val="pt-BR"/>
         </w:rPr>
       </w:pPr>
-      <w:bookmarkStart w:id="13" w:name="_Toc241917933"/>
+      <w:bookmarkStart w:id="16" w:name="_Toc241917936"/>
       <w:r>
         <w:rPr>
           <w:lang w:val="pt-BR"/>
         </w:rPr>
         <w:lastRenderedPageBreak/>
-        <w:t>6 TERRITÓRIO, TÉCNICA E A PRODUÇÃO DO LUGAR</w:t>
-      </w:r>
-      <w:bookmarkEnd w:id="13"/>
+        <w:t>9 METODOLOGIA</w:t>
+      </w:r>
+      <w:bookmarkEnd w:id="16"/>
+    </w:p>
+    <w:p>
+      <w:pPr>
+        <w:pStyle w:val="Ttulo2"/>
+        <w:spacing w:before="0" w:after="0"/>
+        <w:rPr>
+          <w:lang w:val="pt-BR"/>
+        </w:rPr>
+      </w:pPr>
+      <w:bookmarkStart w:id="17" w:name="_Toc241917937"/>
+      <w:r>
+        <w:rPr>
+          <w:lang w:val="pt-BR"/>
+        </w:rPr>
+        <w:t>9.1 ABORDAGEM E DESENHO DA PESQUISA</w:t>
+      </w:r>
+      <w:bookmarkEnd w:id="17"/>
     </w:p>
     <w:p>
       <w:pPr>
@@ -3605,47 +3855,7 @@
         <w:rPr>
           <w:lang w:val="pt-BR"/>
         </w:rPr>
-        <w:t xml:space="preserve">Para inscrever Pipa na análise, recorremos a Milton Santos e a </w:t>
-      </w:r>
-      <w:proofErr w:type="spellStart"/>
-      <w:r>
-        <w:rPr>
-          <w:lang w:val="pt-BR"/>
-        </w:rPr>
-        <w:t>Doreen</w:t>
-      </w:r>
-      <w:proofErr w:type="spellEnd"/>
-      <w:r>
-        <w:rPr>
-          <w:lang w:val="pt-BR"/>
-        </w:rPr>
-        <w:t xml:space="preserve"> Massey. Em </w:t>
-      </w:r>
-      <w:r>
-        <w:rPr>
-          <w:i/>
-          <w:lang w:val="pt-BR"/>
-        </w:rPr>
-        <w:t>A natureza do espaço</w:t>
-      </w:r>
-      <w:r>
-        <w:rPr>
-          <w:lang w:val="pt-BR"/>
-        </w:rPr>
-        <w:t xml:space="preserve">, Santos (2006, p. 12) compreende o espaço como conjunto indissociável de sistemas de objetos e de sistemas de ações e atribui à técnica um papel central na relação entre espaço e tempo. Os objetos técnicos instalados num lugar carregam a história do momento em que foram produzidos e condicionam as ações que ali se tornam possíveis. Nas palavras do autor, “os sistemas de objetos condicionam a forma como se dão as ações e, de outro lado, o sistema de ações leva à criação de objetos novos ou se realiza sobre objetos preexistentes” (SANTOS, 2006, p. 39). Como os lugares não se renovam por inteiro, formas herdadas de outros períodos continuam presentes e participam do presente. O autor dá a essas permanências o nome de rugosidades: “Chamemos rugosidade ao que fica do passado como forma, espaço construído, paisagem, o que resta do processo de supressão, acumulação, superposição, com que as coisas se substituem e acumulam em todos os lugares” (SANTOS, 2006, p. 92). Em Espaço e método, o autor reforça essa leitura ao afirmar que “o passado técnico da forma é uma realidade a ser levada em consideração quando se tenta analisar o espaço” (SANTOS, 2012, p. 73).</w:t>
-      </w:r>
-      <w:r>
-        <w:rPr>
-          <w:i/>
-          <w:lang w:val="pt-BR"/>
-        </w:rPr>
-        <w:t xml:space="preserve"/>
-      </w:r>
-      <w:r>
-        <w:rPr>
-          <w:lang w:val="pt-BR"/>
-        </w:rPr>
-        <w:t xml:space="preserve"/>
+        <w:t xml:space="preserve">A pesquisa adota abordagem qualitativa, de caráter interpretativo, por trabalhar com os sentidos, as experiências, os valores, as crenças e as interpretações que os sujeitos produzem num contexto social determinado (MINAYO, 2009). Organiza-se como estudo de caso, cuja unidade central é a encenação da PNED no contexto da prática da Escola Municipal Domitila Castelo da Silva, em Pipa. Yin (2001) recomenda esse desenho para investigar um fenômeno contemporâneo em seu contexto real quando os limites entre um e outro não estão claramente definidos, situação que corresponde à de uma política cuja forma depende das condições da escola e do território que a recebem. A Secretaria Municipal de Educação participa da investigação como dimensão complementar do contexto externo, sem constituir um segundo caso.</w:t>
       </w:r>
     </w:p>
     <w:p>
@@ -3661,21 +3871,7 @@
         <w:rPr>
           <w:lang w:val="pt-BR"/>
         </w:rPr>
-        <w:t xml:space="preserve">Essa perspectiva é especialmente produtiva para pensar uma escola situada num território onde convivem temporalidades tecnológicas diferentes. A Escola Municipal Domitila Castelo da Silva recebe a PNED com uma infraestrutura, objetos técnicos, espaços, formas de organização e uma história determinados. Segundo informações preliminares, ainda a confirmar nos documentos da rede, os computadores de seu laboratório de informática foram adquiridos pela Prefeitura em 2022, pouco antes da promulgação da lei. A política nacional encontra, assim, equipamentos de uma iniciativa anterior a ela e lhes atribui uma nova função. Santos descreve esse movimento ao observar que, uma vez criada e usada na função que lhe foi designada, a forma “freqüentemente permanece aguardando o próximo movimento dinâmico da sociedade, quando terá toda a probabilidade de ser chamada a cumprir uma nova função” (SANTOS, 2012, p. 74-75). Nos capítulos já escritos da tese, chamamos essa situação de rugosidade tecnológica. Com Santos, perguntaremos que condições técnicas já existiam na escola quando a política chegou, </w:t>
-      </w:r>
-      <w:proofErr w:type="spellStart"/>
-      <w:r>
-        <w:rPr>
-          <w:lang w:val="pt-BR"/>
-        </w:rPr>
-        <w:t>quais</w:t>
-      </w:r>
-      <w:proofErr w:type="spellEnd"/>
-      <w:r>
-        <w:rPr>
-          <w:lang w:val="pt-BR"/>
-        </w:rPr>
-        <w:t xml:space="preserve"> permaneceram, que novos objetos foram incorporados e o que essas condições permitem ou limitam no trabalho dos profissionais e na experiência das crianças.</w:t>
+        <w:t xml:space="preserve">O cotidiano escolar será conhecido por meio dos relatos dos profissionais, dos documentos institucionais, dos registros produzidos pela escola, do registro iconográfico e das informações sobre as condições materiais e institucionais. A pesquisa não realizará observação direta de sala de aula, e essa delimitação estará explícita na análise, para que o que foi narrado, registrado ou documentado não seja tomado pelo que foi observado. Ball, Maguire e Braun (2016, p. 49) adotaram a mesma delimitação no estudo que deu origem à teoria da atuação: “a prática de sala de aula não era foco do estudo [...] nós temos de confiar nos relatos dos professores nessas questões”. O trabalho de campo começará somente depois da aprovação do projeto pelo Comitê de Ética em Pesquisa, com a assinatura do Termo de Consentimento Livre e Esclarecido, e seguirá as Resoluções nº 466/2012 e nº 510/2016 do Conselho Nacional de Saúde, esta última específica para as Ciências Humanas e Sociais (BRASIL, 2012, 2016). Os nomes dos participantes serão substituídos por pseudônimos, escolhidos por cada um ao assinar o termo, em todas as transcrições, relatórios e publicações.</w:t>
       </w:r>
     </w:p>
     <w:p>
@@ -3691,8 +3887,25 @@
         <w:rPr>
           <w:lang w:val="pt-BR"/>
         </w:rPr>
-        <w:t xml:space="preserve">Massey (2008) complementa essa leitura ao compreender o espaço “como a esfera da possibilidade da existência da multiplicidade, no sentido da pluralidade contemporânea, como a esfera na qual distintas trajetórias coexistem” (MASSEY, 2008, p. 29). Para a autora, o lugar é atravessado por trajetórias diversas e permanece aberto ao encontro e à negociação. A transformação de Pipa ganha, com ela, outra nitidez. A comunidade agrícola e pesqueira da década de 1970, sem energia elétrica, água encanada e boas vias de acesso, já recebia veranistas de famílias da região, passou a receber surfistas a partir de meados daquela década e, com a divulgação mais intensa do lugar no início dos anos 1990, turistas de várias partes do mundo. Nesse processo, terras de nativos passaram a veranistas, surfistas e estrangeiros, e trabalhadores de municípios vizinhos chegaram atraídos pelos serviços (AIRES, 2012, p. 79-86). Aires (2012, p. 9) observa que a população nativa não foi passiva diante dessas mudanças, criando “mecanismos de reformulações materiais e simbólicas”, e que “muitas paisagens ainda revelam materialidades de tempos passados, como inscrição das práticas sociais na construção do lugar”, observação que aproxima a história do distrito da noção de rugosidade. Essas trajetórias se sobrepõem no território e chegam à escola na forma das famílias e das crianças que ela atende.</w:t>
-      </w:r>
+        <w:t>A proximidade da pesquisadora com a rede municipal, onde trabalha há dezoito anos, pede cuidados próprios. Diante de alguém conhecido, os profissionais podem responder de modo defensivo ou evitar críticas à gestão. Para reduzir esse risco, a pesquisa confrontará sistematicamente as fontes documentais e orais, devolverá a cada participante uma síntese do próprio depoimento e manterá um diário de campo em que serão registrados os aspectos do contexto e as decisões tomadas na condução do estudo.</w:t>
+      </w:r>
+    </w:p>
+    <w:p>
+      <w:pPr>
+        <w:pStyle w:val="Ttulo2"/>
+        <w:spacing w:before="0" w:after="0"/>
+        <w:rPr>
+          <w:lang w:val="pt-BR"/>
+        </w:rPr>
+      </w:pPr>
+      <w:bookmarkStart w:id="18" w:name="_Toc241917938"/>
+      <w:r>
+        <w:rPr>
+          <w:lang w:val="pt-BR"/>
+        </w:rPr>
+        <w:t>9.2 PARTICIPANTES</w:t>
+      </w:r>
+      <w:bookmarkEnd w:id="18"/>
     </w:p>
     <w:p>
       <w:pPr>
@@ -3707,8 +3920,53 @@
         <w:rPr>
           <w:lang w:val="pt-BR"/>
         </w:rPr>
+        <w:t xml:space="preserve">Participarão da pesquisa os profissionais da educação dos anos iniciais da Escola Municipal Domitila Castelo da Silva que aceitarem o convite, entre eles os que atuam nas turmas do 1º ao 5º ano, a equipe gestora e os profissionais ligados aos processos pedagógicos ou à educação digital da escola. A escuta de todas essas funções decorre da compreensão de que a </w:t>
+      </w:r>
+      <w:r>
+        <w:rPr>
+          <w:lang w:val="pt-BR"/>
+        </w:rPr>
         <w:lastRenderedPageBreak/>
-        <w:t>Articuladas, as contribuições de Santos e de Massey permitem compreender Pipa ao mesmo tempo como território produzido por tempos e relações diferentes e como lugar de encontro de trajetórias diversas. É dessa leitura, somada à discussão sobre o habitar, que nasce a formulação que a tese propõe para nomear a relação entre o território e as tecnologias digitais.</w:t>
+        <w:t xml:space="preserve">política se constrói em diferentes lugares da escola, do planejamento e da coordenação ao trabalho com as crianças. Ball, Maguire e Braun (2016, p. 74-75) observaram, nas escolas que estudaram, que “os atores nas escolas são posicionados de forma diferente e assumem posições diversas em relação à política”, e é essa diversidade de posições que a escuta procura alcançar. Segundo o relatório de turmas da Secretaria de Educação de Tibau do Sul, a escola tem, em 2026, quinze turmas nos anos iniciais, três em cada ano de escolaridade, com 351 crianças matriculadas (TIBAU DO SUL, 2026). O grupo de profissionais que poderá participar reúne 24 pessoas: o diretor, a vice-diretora, a coordenadora pedagógica, quatro profissionais do apoio pedagógico e dezessete professoras e professores, dos quais quinze são regentes, um para cada turma, e dois atuam no apoio à recomposição de aula.</w:t>
+      </w:r>
+      <w:r>
+        <w:rPr>
+          <w:color w:val="EE0000"/>
+          <w:lang w:val="pt-BR"/>
+        </w:rPr>
+        <w:t xml:space="preserve"/>
+      </w:r>
+      <w:proofErr w:type="spellStart"/>
+      <w:r>
+        <w:rPr>
+          <w:color w:val="EE0000"/>
+          <w:lang w:val="pt-BR"/>
+        </w:rPr>
+        <w:t xml:space="preserve"/>
+      </w:r>
+      <w:proofErr w:type="spellEnd"/>
+      <w:r>
+        <w:rPr>
+          <w:color w:val="EE0000"/>
+          <w:lang w:val="pt-BR"/>
+        </w:rPr>
+        <w:t xml:space="preserve"/>
+      </w:r>
+    </w:p>
+    <w:p>
+      <w:pPr>
+        <w:spacing w:after="0" w:line="360" w:lineRule="auto"/>
+        <w:ind w:firstLine="709"/>
+        <w:jc w:val="both"/>
+        <w:rPr>
+          <w:lang w:val="pt-BR"/>
+        </w:rPr>
+      </w:pPr>
+      <w:r>
+        <w:rPr>
+          <w:lang w:val="pt-BR"/>
+        </w:rPr>
+        <w:t xml:space="preserve">Participará também um técnico da Secretaria Municipal de Educação, o coordenador de políticas públicas e programas educacionais do município, a quem cabe acompanhar os programas e as orientações que chegam às escolas da rede. Sua participação ajudará a compreender como a política é recebida e traduzida no âmbito municipal antes de chegar ao cotidiano da escola, aproximando o contexto externo do contexto da prática sem deslocar da escola o centro da investigação.</w:t>
       </w:r>
     </w:p>
     <w:p>
@@ -3720,15 +3978,15 @@
           <w:lang w:val="pt-BR"/>
         </w:rPr>
       </w:pPr>
-      <w:bookmarkStart w:id="14" w:name="_Toc241917934"/>
+      <w:bookmarkStart w:id="19" w:name="_Toc241917939"/>
       <w:r>
         <w:rPr>
           <w:lang w:val="pt-BR"/>
         </w:rPr>
         <w:lastRenderedPageBreak/>
-        <w:t>7 DA IDEIA DE HABITAR AO “HABITAR O DIGITAL”</w:t>
-      </w:r>
-      <w:bookmarkEnd w:id="14"/>
+        <w:t>10 CONSTRUÇÃO DOS DADOS</w:t>
+      </w:r>
+      <w:bookmarkEnd w:id="19"/>
     </w:p>
     <w:p>
       <w:pPr>
@@ -3743,8 +4001,25 @@
         <w:rPr>
           <w:lang w:val="pt-BR"/>
         </w:rPr>
-        <w:t>A expressão “habitar o digital” é uma formulação própria desta tese. Ela resulta de um percurso teórico que reúne contribuições anteriores e as articula ao caso estudado, e por isso convém apresentar esse percurso e situar o que cada autor oferece.</w:t>
-      </w:r>
+        <w:t xml:space="preserve">Os dados serão construídos em cinco movimentos articulados, cada um acrescentando uma fonte ao estudo. O confronto entre elas, feito no último, permite ler a encenação da política em mais de um plano.</w:t>
+      </w:r>
+    </w:p>
+    <w:p>
+      <w:pPr>
+        <w:pStyle w:val="Ttulo2"/>
+        <w:spacing w:before="0" w:after="0"/>
+        <w:rPr>
+          <w:lang w:val="pt-BR"/>
+        </w:rPr>
+      </w:pPr>
+      <w:bookmarkStart w:id="20" w:name="_Toc241917940"/>
+      <w:r>
+        <w:rPr>
+          <w:lang w:val="pt-BR"/>
+        </w:rPr>
+        <w:t>10.1 PRIMEIRO MOVIMENTO: ANÁLISE DOCUMENTAL</w:t>
+      </w:r>
+      <w:bookmarkEnd w:id="20"/>
     </w:p>
     <w:p>
       <w:pPr>
@@ -3759,125 +4034,25 @@
         <w:rPr>
           <w:lang w:val="pt-BR"/>
         </w:rPr>
-        <w:t xml:space="preserve">O ponto de partida está na própria noção de habitar. Em </w:t>
-      </w:r>
-      <w:r>
-        <w:rPr>
-          <w:i/>
-          <w:lang w:val="pt-BR"/>
-        </w:rPr>
-        <w:t xml:space="preserve">O habitar do ensinar e do aprender </w:t>
-      </w:r>
-      <w:proofErr w:type="spellStart"/>
-      <w:r>
-        <w:rPr>
-          <w:i/>
-          <w:lang w:val="pt-BR"/>
-        </w:rPr>
-        <w:t>OnLIFE</w:t>
-      </w:r>
-      <w:proofErr w:type="spellEnd"/>
-      <w:r>
-        <w:rPr>
-          <w:lang w:val="pt-BR"/>
-        </w:rPr>
-        <w:t xml:space="preserve">, obra organizada por Schlemmer et al. (2021), o capítulo de abertura, assinado por Schlemmer, Backes e Palagi, lembra que habitar “tem o significado de estar presente” e que o habitar, “além de estar acompanhado do movimento, tem uma natureza relacional” (SCHLEMMER; BACKES; PALAGI, 2021, p. 15). Ele aparece como experiência constituída pelas relações entre sujeitos, ambientes, tecnologias e redes. As autoras chamam de Educação OnLIFE</w:t>
-      </w:r>
-      <w:proofErr w:type="spellStart"/>
-      <w:r>
-        <w:rPr>
-          <w:lang w:val="pt-BR"/>
-        </w:rPr>
-        <w:t xml:space="preserve"/>
-      </w:r>
-      <w:proofErr w:type="spellEnd"/>
-      <w:r>
-        <w:rPr>
-          <w:lang w:val="pt-BR"/>
-        </w:rPr>
-        <w:t xml:space="preserve"/>
-      </w:r>
-      <w:r>
-        <w:rPr>
-          <w:i/>
-          <w:lang w:val="pt-BR"/>
-        </w:rPr>
-        <w:t xml:space="preserve"/>
-      </w:r>
-      <w:r>
-        <w:rPr>
-          <w:lang w:val="pt-BR"/>
-        </w:rPr>
-        <w:t xml:space="preserve"> “uma educação transubstanciada e cibricidadã, ligada, conectada (On) na vida (LIFE), a partir de problematizações que emergem do tempo presente, nessa realidade hiperconectada” (SCHLEMMER; BACKES; PALAGI, 2021, p. 24). Essa discussão dialoga com a obra de Massimo Di Felice. Em </w:t>
-      </w:r>
-      <w:r>
-        <w:rPr>
-          <w:i/>
-          <w:lang w:val="pt-BR"/>
-        </w:rPr>
-        <w:t>Paisagens pós-urbanas</w:t>
-      </w:r>
-      <w:r>
-        <w:rPr>
-          <w:lang w:val="pt-BR"/>
-        </w:rPr>
-        <w:t xml:space="preserve">, Di Felice (2009) retoma a tradição filosófica do habitar, que remonta a Heidegger, e pensa o habitar como prática comunicativa, mostrando como as diferentes tecnologias transformam a relação entre o sujeito, os meios de comunicação e o território. Ao tratar da imprensa, por exemplo, afirma que “a invenção da escrita artificial coincide, de fato, com o surgimento de uma espacialidade artificial que marcará sobremaneira a Renascença e inaugurará um novo modo de habitar” (DI FELICE, 2009, p. 102). Com as redes digitais, o autor descreve um habitar atópico, em que a experiência habitativa passa a envolver interfaces, fluxos informativos e relações que não se reduzem ao espaço físico. Esse habitar só se realiza por meio de interações com interfaces e constitui ecossistemas informativos, ambientes que só podem ser atravessados mediante interações técnicas e nos quais sujeito e território se relacionam em rede (DI FELICE, 2009, p. 20).</w:t>
-      </w:r>
-      <w:proofErr w:type="spellStart"/>
-      <w:r>
-        <w:rPr>
-          <w:lang w:val="pt-BR"/>
-        </w:rPr>
-        <w:t xml:space="preserve"/>
-      </w:r>
-      <w:proofErr w:type="spellEnd"/>
-      <w:r>
-        <w:rPr>
-          <w:lang w:val="pt-BR"/>
-        </w:rPr>
-        <w:t xml:space="preserve"> </w:t>
-      </w:r>
-      <w:proofErr w:type="spellStart"/>
-      <w:r>
-        <w:rPr>
-          <w:lang w:val="pt-BR"/>
-        </w:rPr>
-        <w:t>Schlemmer</w:t>
-      </w:r>
-      <w:proofErr w:type="spellEnd"/>
-      <w:r>
-        <w:rPr>
-          <w:lang w:val="pt-BR"/>
-        </w:rPr>
-        <w:t xml:space="preserve"> </w:t>
-      </w:r>
-      <w:r>
-        <w:rPr>
-          <w:i/>
-          <w:lang w:val="pt-BR"/>
-        </w:rPr>
-        <w:t>et al.</w:t>
-      </w:r>
-      <w:r>
-        <w:rPr>
-          <w:lang w:val="pt-BR"/>
-        </w:rPr>
-        <w:t xml:space="preserve"> (2021) levam essa discussão para o campo educacional ao pensar o ensinar e o aprender numa realidade marcada pela </w:t>
-      </w:r>
-      <w:proofErr w:type="spellStart"/>
-      <w:r>
-        <w:rPr>
-          <w:lang w:val="pt-BR"/>
-        </w:rPr>
-        <w:t>digitalidade</w:t>
-      </w:r>
-      <w:proofErr w:type="spellEnd"/>
-      <w:r>
-        <w:rPr>
-          <w:lang w:val="pt-BR"/>
-        </w:rPr>
-        <w:t xml:space="preserve"> e pela conectividade.</w:t>
-      </w:r>
+        <w:t xml:space="preserve">Os documentos que acompanham a PNED em sua chegada à escola compõem o primeiro conjunto de fontes. No plano nacional, serão analisados a Lei nº 14.533/2023, a Resolução CNE/CEB nº 2/2025 e os documentos curriculares que orientam a educação digital. No plano municipal e escolar, entram os documentos produzidos pela Secretaria Municipal de Educação sobre a política, os registros relativos à Política de Inovação Educação Conectada (PIEC), o Projeto Político-Pedagógico, os planos de aula, as atas de reuniões pedagógicas, os registros de formação e os demais registros institucionais relacionados à educação digital. A leitura será feita em diálogo com a ACP, para identificar discursos, expectativas, responsabilidades e orientações e acompanhar como eles se traduzem de um contexto da política para outro (MAINARDES, 2006). No Projeto Político-Pedagógico (PPP), por exemplo, procuraremos a concepção da escola sobre as tecnologias digitais, lida como tradução local da política, e os planos de aula permitirão confrontar as narrativas dos profissionais com o planejamento formal do ensino.</w:t>
+      </w:r>
+    </w:p>
+    <w:p>
+      <w:pPr>
+        <w:pStyle w:val="Ttulo2"/>
+        <w:spacing w:before="0" w:after="0"/>
+        <w:rPr>
+          <w:lang w:val="pt-BR"/>
+        </w:rPr>
+      </w:pPr>
+      <w:bookmarkStart w:id="21" w:name="_Toc241917941"/>
+      <w:r>
+        <w:rPr>
+          <w:lang w:val="pt-BR"/>
+        </w:rPr>
+        <w:t>10.2 SEGUNDO MOVIMENTO: REGISTRO ICONOGRÁFICO E LEITURA DO TERRITÓRIO</w:t>
+      </w:r>
+      <w:bookmarkEnd w:id="21"/>
     </w:p>
     <w:p>
       <w:pPr>
@@ -3892,8 +4067,26 @@
         <w:rPr>
           <w:lang w:val="pt-BR"/>
         </w:rPr>
-        <w:t>É a partir desse diálogo, e das leituras de território apresentadas na seção anterior, que formulamos a expressão. Habitar o digital designa, nesta pesquisa, as maneiras pelas quais as tecnologias digitais atravessam os espaços, as relações e as práticas cotidianas de um território, produzindo possibilidades desiguais de acesso, participação e apropriação. Em Pipa, a expressão nomeia uma tensão específica, a coexistência de uma elevada densidade tecnológica nos circuitos econômicos e turísticos do distrito com uma disponibilidade muito mais limitada de tecnologias nos espaços pedagógicos da escola. A formulação dialoga com Santos (2006), porque os objetos técnicos se distribuem de forma desigual no espaço e carregam idades, funções e possibilidades de uso diferentes, e dialoga com Massey (2008), porque as experiências digitais acontecem dentro do espaço social e participam das relações, das trajetórias e das desigualdades que constituem o lugar.</w:t>
-      </w:r>
+        <w:t xml:space="preserve">O registro iconográfico parte de um conjunto de 38 imagens já reunidas a partir da escola e do acervo do Museu Digital de Pipa. As imagens serão analisadas como possibilidade de leitura das relações entre território, memória, materialidade, usos do espaço e coexistência de temporalidades, e cada uma informa sobre uma etapa material da produção do distrito e da escola. A noção de rugosidade (SANTOS, 2006) orientará a leitura das formas e dos objetos herdados de outros momentos que continuam a participar das condições atuais do lugar, e Massey (2008) ajudará a ler as imagens e o território como parte de uma espacialidade feita de trajetórias que coexistem e se encontram, sem fixá-los num passado congelado. Serão registradas também as condições de conectividade, os espaços destinados ao uso das tecnologias e os equipamentos disponíveis na escola. Cada imagem será tratada como evidência da configuração material visível no momento do registro, sem valor de prova sobre as práticas ou as intenções dos profissionais. Rostos identificáveis de crianças não serão expostos.</w:t>
+      </w:r>
+    </w:p>
+    <w:p>
+      <w:pPr>
+        <w:pStyle w:val="Ttulo2"/>
+        <w:spacing w:before="0" w:after="0"/>
+        <w:rPr>
+          <w:lang w:val="pt-BR"/>
+        </w:rPr>
+      </w:pPr>
+      <w:bookmarkStart w:id="22" w:name="_Toc241917942"/>
+      <w:r>
+        <w:rPr>
+          <w:lang w:val="pt-BR"/>
+        </w:rPr>
+        <w:lastRenderedPageBreak/>
+        <w:t>10.3 TERCEIRO MOVIMENTO: QUESTIONÁRIO DE PERFIL E PERCEPÇÕES</w:t>
+      </w:r>
+      <w:bookmarkEnd w:id="22"/>
     </w:p>
     <w:p>
       <w:pPr>
@@ -3904,12 +4097,31 @@
           <w:lang w:val="pt-BR"/>
         </w:rPr>
       </w:pPr>
-      <w:r>
-        <w:rPr>
-          <w:lang w:val="pt-BR"/>
-        </w:rPr>
-        <w:t xml:space="preserve">Duas passagens ajudam a precisar a formulação. Santos (2006, p. 163) observa que, com a difusão do meio técnico-científico-informacional, “distinguem-se zonas servidas pelos meios de conhecimento e áreas desprovidas dessa vantagem”, e em Pipa essa distinção atravessa o próprio distrito. Em texto anterior, o autor nomeia a questão que interessa a esta pesquisa, a “dissonância entre os usos econômicos e os usos sociais dos mesmos recursos” (SANTOS, 1999, p. 20-21). Massey, por sua vez, impede que a distância entre a escola e os circuitos turísticos seja lida como atraso, ao criticar a operação que “transforma a geografia em história, o espaço em tempo” e “reduz coexistências simultâneas a um lugar na fila da história” (MASSEY, 2008, p. 24). A escola e o polo turístico são contemporâneos, e o que os separa são relações que a análise precisa explicar.</w:t>
-      </w:r>
+      <w:proofErr w:type="spellStart"/>
+      <w:proofErr w:type="spellEnd"/>
+      <w:r>
+        <w:rPr>
+          <w:lang w:val="pt-BR"/>
+        </w:rPr>
+        <w:t xml:space="preserve">O questionário, aplicado presencialmente e respondido em formulário digital, tem função descritiva e contextualizadora. O instrumento reúne informações sobre a formação e a experiência profissional dos participantes, sua relação com as tecnologias digitais e com a formação em educação digital, as condições de trabalho e as condições materiais da escola, o conhecimento das orientações curriculares e as primeiras percepções sobre a PNED. Com ele, caracterizamos o grupo e reunimos elementos que ajudem a compreender as entrevistas, sem pretensão de generalização estatística.</w:t>
+      </w:r>
+    </w:p>
+    <w:p>
+      <w:pPr>
+        <w:pStyle w:val="Ttulo2"/>
+        <w:spacing w:before="0" w:after="0"/>
+        <w:rPr>
+          <w:lang w:val="pt-BR"/>
+        </w:rPr>
+      </w:pPr>
+      <w:bookmarkStart w:id="23" w:name="_Toc241917943"/>
+      <w:r>
+        <w:rPr>
+          <w:lang w:val="pt-BR"/>
+        </w:rPr>
+        <w:t>10.4 QUARTO MOVIMENTO: ENTREVISTAS SEMIESTRUTURADAS</w:t>
+      </w:r>
+      <w:bookmarkEnd w:id="23"/>
     </w:p>
     <w:p>
       <w:pPr>
@@ -3924,14 +4136,73 @@
         <w:rPr>
           <w:lang w:val="pt-BR"/>
         </w:rPr>
-        <w:t xml:space="preserve">Por essa razão, habitar o digital é, nesta tese, mais do que acesso à internet ou posse de equipamentos. Valente já advertia, no fim dos anos 1990, que “implantar computadores nas escolas sem o devido preparo de professores e da comunidade escolar não trará os benefícios que esperamos” (VALENTE, 1999, p. 83). A expressão orienta duas perguntas. A primeira diz respeito ao território e indaga como se habita o digital quando a tecnologia está intensamente presente em certos circuitos do distrito e pouco presente nos espaços destinados à educação. A segunda diz respeito à escola e indaga que formas de participação, uso, apropriação e experiência digital se tornam possíveis, ou permanecem restritas, para as crianças nessas condições. A formulação será confrontada com os dados e poderá ser aprofundada, revista ou tensionada ao </w:t>
-      </w:r>
+        <w:t xml:space="preserve">As entrevistas, individuais e semiestruturadas, terão duração aproximada de 60 a 90 minutos e serão realizadas em espaço reservado, gravadas com o consentimento dos participantes e depois transcritas. Com os profissionais da escola, tratarão de suas trajetórias, da compreensão que têm da PNED, das condições de trabalho e das relações profissionais, das possibilidades de tradução da política, das demandas institucionais e da educação digital e das experiências das crianças com as tecnologias. Com o técnico da Secretaria, o roteiro abordará a compreensão municipal da PNED, as orientações repassadas às escolas, as ações realizadas, os processos de formação, as formas de acompanhamento, as condições oferecidas às unidades escolares e as dificuldades e possibilidades percebidas na implementação.</w:t>
+      </w:r>
+    </w:p>
+    <w:p>
+      <w:pPr>
+        <w:spacing w:after="0" w:line="360" w:lineRule="auto"/>
+        <w:ind w:firstLine="709"/>
+        <w:jc w:val="both"/>
+        <w:rPr>
+          <w:lang w:val="pt-BR"/>
+        </w:rPr>
+      </w:pPr>
+      <w:r>
+        <w:rPr>
+          <w:lang w:val="pt-BR"/>
+        </w:rPr>
+        <w:t>As noções de resistência, performatividade e fabricação não serão apresentadas nominalmente aos participantes. Queremos que eles descrevam suas experiências nos próprios termos, e a interpretação teórica virá depois, no trabalho de análise. Os roteiros foram construídos para que cada forma de atuação tenha onde aparecer sem que a pergunta a produza.</w:t>
+      </w:r>
+    </w:p>
+    <w:p>
+      <w:pPr>
+        <w:pStyle w:val="Ttulo2"/>
+        <w:spacing w:before="0" w:after="0"/>
+        <w:rPr>
+          <w:lang w:val="pt-BR"/>
+        </w:rPr>
+      </w:pPr>
+      <w:bookmarkStart w:id="24" w:name="_Toc241917944"/>
+      <w:r>
+        <w:rPr>
+          <w:lang w:val="pt-BR"/>
+        </w:rPr>
+        <w:t>10.5 QUINTO MOVIMENTO: ANÁLISE E DEVOLUTIVA</w:t>
+      </w:r>
+      <w:bookmarkEnd w:id="24"/>
+    </w:p>
+    <w:p>
+      <w:pPr>
+        <w:spacing w:after="0" w:line="360" w:lineRule="auto"/>
+        <w:ind w:firstLine="709"/>
+        <w:jc w:val="both"/>
+        <w:rPr>
+          <w:lang w:val="pt-BR"/>
+        </w:rPr>
+      </w:pPr>
+      <w:r>
+        <w:rPr>
+          <w:lang w:val="pt-BR"/>
+        </w:rPr>
+        <w:t xml:space="preserve">A análise reúne as fontes. Os relatos orais e as respostas abertas do questionário serão examinados pela análise temática reflexiva (BRAUN; CLARKE, 2006, 2019), cujas fases reunimos, nesta pesquisa, em três etapas: a familiarização com o material, a codificação e a construção dos temas e a interpretação crítica com triangulação. As dimensões do contexto propostas por Ball, Maguire e Braun (2016), as culturas profissionais lidas em seu conteúdo e em sua forma (HARGREAVES, 2005) e as noções de performatividade, fabricação e território funcionarão como lentes sensibilizadoras, sem se converter em categorias fechadas às quais os dados devam caber. Os documentos serão lidos com uma matriz orientada pelos objetivos da pesquisa.</w:t>
+      </w:r>
+    </w:p>
+    <w:p>
+      <w:pPr>
+        <w:spacing w:after="0" w:line="360" w:lineRule="auto"/>
+        <w:ind w:firstLine="709"/>
+        <w:jc w:val="both"/>
+        <w:rPr>
+          <w:lang w:val="pt-BR"/>
+        </w:rPr>
+      </w:pPr>
       <w:r>
         <w:rPr>
           <w:lang w:val="pt-BR"/>
         </w:rPr>
         <w:lastRenderedPageBreak/>
-        <w:t>longo da investigação. A segunda pergunta leva diretamente aos direitos das crianças no ambiente digital.</w:t>
+        <w:t>Na interpretação, começaremos por cada participante, relacionando, quando fizer sentido, o questionário e a entrevista aos documentos e aos registros de seu local de trabalho. Quando a fala e o documento não coincidirem, a discrepância será lida como indício das tensões do trabalho escolar. Braun e Clarke (2019) lembram que, na abordagem reflexiva, a subjetividade de quem analisa é recurso da análise e precisa ser explicitada, e que um tema vale pelo que ajuda a compreender o problema, mais do que pela frequência com que aparece. Concluída a análise, os resultados serão apresentados à escola e à Secretaria Municipal de Educação, como devolutiva aos que tornaram a pesquisa possível.</w:t>
       </w:r>
     </w:p>
     <w:p>
@@ -3943,15 +4214,15 @@
           <w:lang w:val="pt-BR"/>
         </w:rPr>
       </w:pPr>
-      <w:bookmarkStart w:id="15" w:name="_Toc241917935"/>
+      <w:bookmarkStart w:id="25" w:name="_Toc241917945"/>
       <w:r>
         <w:rPr>
           <w:lang w:val="pt-BR"/>
         </w:rPr>
         <w:lastRenderedPageBreak/>
-        <w:t>8 EDUCAÇÃO DIGITAL E DIREITOS DAS CRIANÇAS</w:t>
-      </w:r>
-      <w:bookmarkEnd w:id="15"/>
+        <w:t>11 A RESISTÊNCIA COMO PROBLEMA ANALÍTICO</w:t>
+      </w:r>
+      <w:bookmarkEnd w:id="25"/>
     </w:p>
     <w:p>
       <w:pPr>
@@ -3966,7 +4237,7 @@
         <w:rPr>
           <w:lang w:val="pt-BR"/>
         </w:rPr>
-        <w:t>A discussão sobre os direitos das crianças no ambiente digital é um desdobramento da análise e responde ao objetivo específico (d). As crianças estão no fim do caminho que a política percorre, e é em nome delas que a PNED se justifica. Esta pesquisa ouve os profissionais da educação, e por isso o que se poderá dizer sobre as crianças virá das condições documentadas e das compreensões desses profissionais, sem que se pressuponham efeitos sobre elas.</w:t>
+        <w:t xml:space="preserve">A palavra “resistências” está no título da tese por escolha deliberada e expressa uma preocupação teórica da pesquisa, a de compreender o que acontece quando os profissionais encontram exigências normativas que precisam ser traduzidas dentro de determinadas condições de trabalho. A escolha pede cuidado, porque a resistência será tratada como forma de atuação possível, sem o sentido de oposição automática à política. Ela poderá ser reconhecida quando os sujeitos recusarem, desviarem, adiarem, limitarem, reordenarem ou ressignificarem determinadas demandas, desde que essas formas possam ser sustentadas pelos dados.</w:t>
       </w:r>
     </w:p>
     <w:p>
@@ -3982,7 +4253,7 @@
         <w:rPr>
           <w:lang w:val="pt-BR"/>
         </w:rPr>
-        <w:t>O Comentário Geral nº 25, do Comitê dos Direitos da Criança das Nações Unidas, reconhece a importância crescente do ambiente digital na vida das crianças e orienta os Estados a garantir-lhes acesso equitativo a recursos digitais, à educação e à participação, assegurando ao mesmo tempo proteção, privacidade e segurança (ONU, 2021). O documento atribui aos sistemas educacionais a responsabilidade por infraestrutura adequada, pela formação dos profissionais e por condições para uma educação digital que envolva criação, colaboração, participação, cidadania e compreensão crítica do ambiente digital. No Brasil, o debate ganhou nova densidade com a Lei nº 15.211/2025, o Estatuto Digital da Criança e do Adolescente, que dispõe sobre a proteção de crianças e adolescentes em ambientes digitais e entrou em vigor em 17 de março de 2026 (BRASIL, 2025b).</w:t>
+        <w:t xml:space="preserve">Uma prática distante do que a norma prescreve não será, por isso, classificada de imediato como resistência. Ela pode corresponder a uma acomodação, à falta de condições para fazer o que se pede, à prioridade dada a outra demanda, a uma interpretação diferente do texto, a uma omissão, a uma adaptação ou a uma negociação, e a distinção entre essas possibilidades será construída durante a análise, com atenção às condições em que cada prática aparece e às razões que os profissionais lhe atribuem.</w:t>
       </w:r>
     </w:p>
     <w:p>
@@ -3998,7 +4269,20 @@
         <w:rPr>
           <w:lang w:val="pt-BR"/>
         </w:rPr>
-        <w:t xml:space="preserve">A atenção às crianças pede, também, cautela diante de duas imagens frequentes no debate público. Buckingham (2006, p. 39) lembra que “as crianças não sabem ‘naturalmente’ como usar computadores: como os adultos, muitas vezes elas experimentam confusão, tédio e frustração”, e conclui que nem a visão da criança vulnerável nem a da criança naturalmente competente oferece “uma base realista para a elaboração de políticas culturais, sociais e educacionais que possam de fato habilitar todas as crianças a lidar com as realidades culturais em mudança nas quais nasceram” (BUCKINGHAM, 2006, p. 40). Se a familiaridade com os aparelhos não se converte, por si, em compreensão do ambiente digital, essa compreensão precisa ser ensinada, e é essa tarefa que a PNED atribui à escola.</w:t>
+        <w:t xml:space="preserve">Foucault ajuda a dar a essa abertura um estatuto teórico. Ball, Maguire e Braun recorrem a ele ao tratar a política como “uma certa economia de discursos da verdade” (FOUCAULT, 1980, p. 93 apud BALL; MAGUIRE; BRAUN, 2016, p. 21), que se investe no cotidiano das escolas. Em </w:t>
+      </w:r>
+      <w:r>
+        <w:rPr>
+          <w:lang w:val="pt-BR"/>
+          <w:i/>
+        </w:rPr>
+        <w:t xml:space="preserve">Vigiar e punir</w:t>
+      </w:r>
+      <w:r>
+        <w:rPr>
+          <w:lang w:val="pt-BR"/>
+        </w:rPr>
+        <w:t xml:space="preserve">, o próprio Foucault mostra que as relações de poder “não são unívocas; definem inúmeros pontos de luta, focos de instabilidade comportando cada um seus riscos de conflito, de lutas e de inversão pelo menos transitória da relação de forças” (FOUCAULT, 1999, p. 29). Lida com o autor, a resistência faz parte das relações de poder que a política mobiliza na escola e pode, por isso, aparecer sem ser pressuposta: onde há normas, exigências e registros, há também pontos em que eles se tornam instáveis.</w:t>
       </w:r>
     </w:p>
     <w:p>
@@ -4014,7 +4298,7 @@
         <w:rPr>
           <w:lang w:val="pt-BR"/>
         </w:rPr>
-        <w:t xml:space="preserve">Em diálogo com esses documentos, organizamos a análise em três dimensões, que constituem uma organização analítica própria da tese. A provisão diz respeito às condições necessárias para que as crianças tenham acesso significativo à educação digital, como equipamentos, conectividade, tempo e profissionais formados. A proteção envolve a segurança, a privacidade, o cuidado e o enfrentamento dos riscos presentes nos ambientes digitais, e ganha peso quando se considera, com Silveira (2017), que o mercado de dados pessoais se expande justamente sobre o terreno da privacidade. A participação refere-se às possibilidades de as crianças acessarem informação, produzirem, criarem, comunicarem-se, expressarem opiniões e tomarem parte da cultura digital como sujeitos. Freire lembra que não há respeito aos educandos “se não se levam em consideração as condições em que eles vêm existindo, se não se reconhece a importância dos ‘conhecimentos de experiência feitos’ com que chegam à escola” (FREIRE, 2019, p. 62), e a participação começa por esses saberes. Com essas dimensões, buscaremos compreender como as diferentes formas de encenação da PNED na Escola Municipal Domitila Castelo da Silva podem ampliar, limitar ou reorganizar as possibilidades de as crianças de Pipa habitarem o digital. Para chegar a essa compreensão, a pesquisa adota o percurso metodológico apresentado a seguir.</w:t>
+        <w:t xml:space="preserve">Ball (2011) ajuda a sustentar esse cuidado em duas direções. De um lado, critica as pesquisas em que “o problema está ‘na’ escola ou ‘no’ professor, mas nunca ‘nas’ políticas” (BALL, 2011, p. 36) e lembra que as políticas “criam circunstâncias nas quais o espectro de opções disponíveis sobre o que fazer é reduzido ou modificado”, de modo que “uma resposta ainda precisa ser construída no contexto” (BALL, 2011, p. 45-46). De outro, adverte contra os estudos em que os sujeitos “emergem, resistentes e românticos, heróis althusserianos lutando contra a opressão” (BALL, 2011, p. 46). Freire oferece contrapeso semelhante ao lembrar que o professor “precisa de condições favoráveis, higiênicas, espaciais, estéticas, sem as quais se move menos eficazmente no espaço pedagógico” e que, “às vezes, as condições são de tal maneira perversas que nem se move” (FREIRE, 2019, p. 64-65). Entre culpar os profissionais e celebrá-los, a análise descreverá o que eles fazem e as condições que tornam necessárias as suas escolhas.</w:t>
       </w:r>
     </w:p>
     <w:p>
@@ -4026,32 +4310,15 @@
           <w:lang w:val="pt-BR"/>
         </w:rPr>
       </w:pPr>
-      <w:bookmarkStart w:id="16" w:name="_Toc241917936"/>
+      <w:bookmarkStart w:id="26" w:name="_Toc241917946"/>
       <w:r>
         <w:rPr>
           <w:lang w:val="pt-BR"/>
         </w:rPr>
         <w:lastRenderedPageBreak/>
-        <w:t>9 METODOLOGIA</w:t>
-      </w:r>
-      <w:bookmarkEnd w:id="16"/>
-    </w:p>
-    <w:p>
-      <w:pPr>
-        <w:pStyle w:val="Ttulo2"/>
-        <w:spacing w:before="0" w:after="0"/>
-        <w:rPr>
-          <w:lang w:val="pt-BR"/>
-        </w:rPr>
-      </w:pPr>
-      <w:bookmarkStart w:id="17" w:name="_Toc241917937"/>
-      <w:r>
-        <w:rPr>
-          <w:lang w:val="pt-BR"/>
-        </w:rPr>
-        <w:t>9.1 ABORDAGEM E DESENHO DA PESQUISA</w:t>
-      </w:r>
-      <w:bookmarkEnd w:id="17"/>
+        <w:t>12 TESE DE PARTIDA</w:t>
+      </w:r>
+      <w:bookmarkEnd w:id="26"/>
     </w:p>
     <w:p>
       <w:pPr>
@@ -4066,7 +4333,7 @@
         <w:rPr>
           <w:lang w:val="pt-BR"/>
         </w:rPr>
-        <w:t xml:space="preserve">A pesquisa adota abordagem qualitativa, de caráter interpretativo, por trabalhar com os sentidos, as experiências, os valores, as crenças e as interpretações que os sujeitos produzem num contexto social determinado (MINAYO, 2009). Organiza-se como estudo de caso, cuja unidade central é a encenação da PNED no contexto da prática da Escola Municipal Domitila Castelo da Silva, em Pipa. Yin (2001) recomenda esse desenho para investigar um fenômeno contemporâneo em seu contexto real quando os limites entre um e outro não estão claramente definidos, situação que corresponde à de uma política cuja forma depende das condições da escola e do território que a recebem. A Secretaria Municipal de Educação participa da investigação como dimensão complementar do contexto externo e não constitui um segundo caso.</w:t>
+        <w:t xml:space="preserve">Partimos da compreensão de que a PNED chega à escola como um conjunto de orientações que precisa ser lido e interpretado por quem trabalha nela. Ao encontrar uma escola situada, com seus profissionais, sua história, suas condições materiais, suas relações institucionais e seu território, a política passa por processos de interpretação, tradução e recontextualização (BOWE; BALL; GOLD, 1992; MAINARDES, 2006; BALL; MAGUIRE; BRAUN, 2016). A hipótese interpretativa que orienta o estudo é a de que a forma assumida pela política no cotidiano escolar resulta da relação entre o que ela prescreve e as condições sob as quais os profissionais precisam atuar. Dessa relação podem surgir adesão, acomodação, adaptação, omissão seletiva, negociação, ressignificação e resistência, e esta última, embora seja uma possibilidade analítica particularmente importante, permanece como hipótese a ser examinada nos dados.</w:t>
       </w:r>
     </w:p>
     <w:p>
@@ -4082,8 +4349,27 @@
         <w:rPr>
           <w:lang w:val="pt-BR"/>
         </w:rPr>
-        <w:t xml:space="preserve">O cotidiano escolar será conhecido por meio dos relatos dos profissionais, dos documentos institucionais, dos registros produzidos pela escola, do registro iconográfico e das informações sobre as condições materiais e institucionais. A pesquisa não realizará observação direta de sala de aula, e essa delimitação estará explícita na análise, para que o que foi narrado, registrado ou documentado não seja tomado pelo que foi observado. Ball, Maguire e Braun (2016, p. 49) adotaram a mesma delimitação no estudo que deu origem à teoria da atuação: “a prática de sala de aula não era foco do estudo [...] nós temos de confiar nos relatos dos professores nessas questões”. O trabalho de campo começará somente depois da aprovação do projeto pelo Comitê de Ética em Pesquisa, com a assinatura do Termo de Consentimento Livre e Esclarecido, e seguirá as Resoluções nº 466/2012 e nº 510/2016 do Conselho Nacional de Saúde, esta última específica para as Ciências Humanas e Sociais (BRASIL, 2012, 2016). Os nomes dos participantes serão substituídos por pseudônimos, escolhidos por cada um ao assinar o termo, em todas as transcrições, relatórios e publicações.</w:t>
-      </w:r>
+        <w:t xml:space="preserve">Partimos também da compreensão de que as condições materiais fazem parte da política. A própria ACP reconhece, desde a sua formulação, que as políticas “são intervenções textuais, mas carregam também restrições e possibilidades materiais” (BOWE; BALL; GOLD, 1992, p. 21, tradução nossa). A existência ou a ausência de equipamentos, de conectividade, de espaços adequados, de formação e de tempo de planejamento participa daquilo que os profissionais conseguem fazer com o que a lei pede, e por isso a pergunta que move a pesquisa vai além da verificação da implementação. Ela indaga o que acontece com uma política de educação digital quando encontra uma escola com uma história, condições materiais e culturas profissionais determinadas, inserida num território específico. Nesse encontro a política adquire suas formas, e nele se pode perguntar quem consegue “habitar o digital”, em que condições e com quais possibilidades de participação.</w:t>
+      </w:r>
+    </w:p>
+    <w:p>
+      <w:pPr>
+        <w:pStyle w:val="Ttulo1"/>
+        <w:pageBreakBefore/>
+        <w:spacing w:after="0"/>
+        <w:rPr>
+          <w:lang w:val="pt-BR"/>
+        </w:rPr>
+      </w:pPr>
+      <w:bookmarkStart w:id="27" w:name="_Toc241917947"/>
+      <w:r>
+        <w:rPr>
+          <w:lang w:val="pt-BR"/>
+        </w:rPr>
+        <w:lastRenderedPageBreak/>
+        <w:t>13 CONTRIBUIÇÕES ESPERADAS</w:t>
+      </w:r>
+      <w:bookmarkEnd w:id="27"/>
     </w:p>
     <w:p>
       <w:pPr>
@@ -4098,25 +4384,8 @@
         <w:rPr>
           <w:lang w:val="pt-BR"/>
         </w:rPr>
-        <w:t>A proximidade da pesquisadora com a rede municipal, onde trabalha há dezoito anos, pede cuidados próprios. Diante de alguém conhecido, os profissionais podem responder de modo defensivo ou evitar críticas à gestão. Para reduzir esse risco, a pesquisa confrontará sistematicamente as fontes documentais e orais, devolverá a cada participante uma síntese do próprio depoimento e manterá um diário de campo em que serão registrados os aspectos do contexto e as decisões tomadas na condução do estudo.</w:t>
-      </w:r>
-    </w:p>
-    <w:p>
-      <w:pPr>
-        <w:pStyle w:val="Ttulo2"/>
-        <w:spacing w:before="0" w:after="0"/>
-        <w:rPr>
-          <w:lang w:val="pt-BR"/>
-        </w:rPr>
-      </w:pPr>
-      <w:bookmarkStart w:id="18" w:name="_Toc241917938"/>
-      <w:r>
-        <w:rPr>
-          <w:lang w:val="pt-BR"/>
-        </w:rPr>
-        <w:t>9.2 PARTICIPANTES</w:t>
-      </w:r>
-      <w:bookmarkEnd w:id="18"/>
+        <w:t>A pesquisa pretende contribuir para três campos que se articulam. Para os estudos sobre políticas educacionais, oferece uma análise da PNED a partir do contexto da prática, atenta aos processos de atuação, tradução e recontextualização pelos quais a política ganha forma numa escola. Para os estudos sobre educação digital, propõe discutir a política para além da presença ou da ausência de equipamentos e de conectividade, examinando como sujeitos e territórios vivem e produzem formas diferentes de habitar o digital. Para o debate sobre os direitos das crianças no ambiente digital, analisa as implicações das condições encontradas na escola para as possibilidades de provisão, proteção e participação.</w:t>
+      </w:r>
     </w:p>
     <w:p>
       <w:pPr>
@@ -4127,540 +4396,13 @@
           <w:lang w:val="pt-BR"/>
         </w:rPr>
       </w:pPr>
-      <w:r>
-        <w:rPr>
-          <w:lang w:val="pt-BR"/>
-        </w:rPr>
-        <w:t xml:space="preserve">Participarão da pesquisa os profissionais da educação dos anos iniciais da Escola Municipal Domitila Castelo da Silva que aceitarem o convite, entre eles os que atuam nas turmas do 1º ao 5º ano, a equipe gestora e os profissionais ligados aos processos pedagógicos ou à educação digital da escola. A escuta de todas essas funções decorre da compreensão de que a </w:t>
-      </w:r>
-      <w:r>
-        <w:rPr>
-          <w:lang w:val="pt-BR"/>
-        </w:rPr>
-        <w:lastRenderedPageBreak/>
-        <w:t xml:space="preserve">política se constrói em diferentes lugares da escola, do planejamento e da coordenação ao trabalho com as crianças. Ball, Maguire e Braun (2016, p. 74-75) observaram, nas escolas que estudaram, que “os atores nas escolas são posicionados de forma diferente e assumem posições diversas em relação à política”, e é essa diversidade de posições que a escuta procura alcançar. Segundo o relatório de turmas da Secretaria de Educação de Tibau do Sul, a escola tem, em 2026, quinze turmas nos anos iniciais, três em cada ano de escolaridade, com 351 crianças matriculadas (TIBAU DO SUL, 2026). O grupo de profissionais que poderá participar reúne 24 pessoas: o diretor, a vice-diretora, a coordenadora pedagógica, quatro profissionais do apoio pedagógico e dezessete professoras e professores, dos quais quinze são regentes, um para cada turma, e dois atuam no apoio à recomposição de aula.</w:t>
-      </w:r>
-      <w:r>
-        <w:rPr>
-          <w:color w:val="EE0000"/>
-          <w:lang w:val="pt-BR"/>
-        </w:rPr>
-        <w:t xml:space="preserve"/>
-      </w:r>
       <w:proofErr w:type="spellStart"/>
-      <w:r>
-        <w:rPr>
-          <w:color w:val="EE0000"/>
-          <w:lang w:val="pt-BR"/>
-        </w:rPr>
-        <w:t xml:space="preserve"/>
-      </w:r>
       <w:proofErr w:type="spellEnd"/>
       <w:r>
         <w:rPr>
-          <w:color w:val="EE0000"/>
-          <w:lang w:val="pt-BR"/>
-        </w:rPr>
-        <w:t xml:space="preserve"/>
-      </w:r>
-    </w:p>
-    <w:p>
-      <w:pPr>
-        <w:spacing w:after="0" w:line="360" w:lineRule="auto"/>
-        <w:ind w:firstLine="709"/>
-        <w:jc w:val="both"/>
-        <w:rPr>
-          <w:lang w:val="pt-BR"/>
-        </w:rPr>
-      </w:pPr>
-      <w:r>
-        <w:rPr>
-          <w:lang w:val="pt-BR"/>
-        </w:rPr>
-        <w:t xml:space="preserve">Participará também um técnico da Secretaria Municipal de Educação, o coordenador de políticas públicas e programas educacionais do município, a quem cabe acompanhar os programas e as orientações que chegam às escolas da rede. Sua participação ajudará a compreender como a política é recebida e traduzida no âmbito municipal antes de chegar ao cotidiano da escola, aproximando o contexto externo do contexto da prática sem deslocar da escola o centro da investigação.</w:t>
-      </w:r>
-    </w:p>
-    <w:p>
-      <w:pPr>
-        <w:pStyle w:val="Ttulo1"/>
-        <w:pageBreakBefore/>
-        <w:spacing w:after="0"/>
-        <w:rPr>
-          <w:lang w:val="pt-BR"/>
-        </w:rPr>
-      </w:pPr>
-      <w:bookmarkStart w:id="19" w:name="_Toc241917939"/>
-      <w:r>
-        <w:rPr>
-          <w:lang w:val="pt-BR"/>
-        </w:rPr>
-        <w:lastRenderedPageBreak/>
-        <w:t>10 CONSTRUÇÃO DOS DADOS</w:t>
-      </w:r>
-      <w:bookmarkEnd w:id="19"/>
-    </w:p>
-    <w:p>
-      <w:pPr>
-        <w:spacing w:after="0" w:line="360" w:lineRule="auto"/>
-        <w:ind w:firstLine="709"/>
-        <w:jc w:val="both"/>
-        <w:rPr>
-          <w:lang w:val="pt-BR"/>
-        </w:rPr>
-      </w:pPr>
-      <w:r>
-        <w:rPr>
-          <w:lang w:val="pt-BR"/>
-        </w:rPr>
-        <w:t>Os dados serão construídos em cinco movimentos articulados. Cada movimento acrescenta uma fonte ao estudo, e o confronto entre elas, feito no último, permite ler a encenação da política em mais de um plano.</w:t>
-      </w:r>
-    </w:p>
-    <w:p>
-      <w:pPr>
-        <w:pStyle w:val="Ttulo2"/>
-        <w:spacing w:before="0" w:after="0"/>
-        <w:rPr>
-          <w:lang w:val="pt-BR"/>
-        </w:rPr>
-      </w:pPr>
-      <w:bookmarkStart w:id="20" w:name="_Toc241917940"/>
-      <w:r>
-        <w:rPr>
-          <w:lang w:val="pt-BR"/>
-        </w:rPr>
-        <w:t>10.1 PRIMEIRO MOVIMENTO: ANÁLISE DOCUMENTAL</w:t>
-      </w:r>
-      <w:bookmarkEnd w:id="20"/>
-    </w:p>
-    <w:p>
-      <w:pPr>
-        <w:spacing w:after="0" w:line="360" w:lineRule="auto"/>
-        <w:ind w:firstLine="709"/>
-        <w:jc w:val="both"/>
-        <w:rPr>
-          <w:lang w:val="pt-BR"/>
-        </w:rPr>
-      </w:pPr>
-      <w:r>
-        <w:rPr>
-          <w:lang w:val="pt-BR"/>
-        </w:rPr>
-        <w:t>O primeiro movimento reúne os documentos que acompanham a PNED em sua chegada à escola. No plano nacional, serão analisados a Lei nº 14.533/2023, a Resolução CNE/CEB nº 2/2025 e os documentos curriculares que orientam a educação digital. No plano municipal e escolar, entram os documentos produzidos pela Secretaria Municipal de Educação sobre a política, os registros relativos à Política de Inovação Educação Conectada (PIEC), o Projeto Político-Pedagógico, os planos de aula, as atas de reuniões pedagógicas, os registros de formação e os demais registros institucionais relacionados à educação digital. A leitura será feita em diálogo com a ACP, para identificar discursos, expectativas, responsabilidades e orientações e acompanhar como eles se traduzem de um contexto da política para outro (MAINARDES, 2006). No Projeto Político-Pedagógico</w:t>
-      </w:r>
-      <w:r>
-        <w:rPr>
-          <w:lang w:val="pt-BR"/>
-        </w:rPr>
-        <w:t xml:space="preserve"> (PPP)</w:t>
-      </w:r>
-      <w:r>
-        <w:rPr>
-          <w:lang w:val="pt-BR"/>
-        </w:rPr>
-        <w:t>, por exemplo, procuraremos a concepção da escola sobre as tecnologias digitais, lida como tradução local da política, e os planos de aula permitirão confrontar as narrativas dos profissionais com o planejamento formal do ensino.</w:t>
-      </w:r>
-    </w:p>
-    <w:p>
-      <w:pPr>
-        <w:pStyle w:val="Ttulo2"/>
-        <w:spacing w:before="0" w:after="0"/>
-        <w:rPr>
-          <w:lang w:val="pt-BR"/>
-        </w:rPr>
-      </w:pPr>
-      <w:bookmarkStart w:id="21" w:name="_Toc241917941"/>
-      <w:r>
-        <w:rPr>
-          <w:lang w:val="pt-BR"/>
-        </w:rPr>
-        <w:t>10.2 SEGUNDO MOVIMENTO: REGISTRO ICONOGRÁFICO E LEITURA DO TERRITÓRIO</w:t>
-      </w:r>
-      <w:bookmarkEnd w:id="21"/>
-    </w:p>
-    <w:p>
-      <w:pPr>
-        <w:spacing w:after="0" w:line="360" w:lineRule="auto"/>
-        <w:ind w:firstLine="709"/>
-        <w:jc w:val="both"/>
-        <w:rPr>
-          <w:lang w:val="pt-BR"/>
-        </w:rPr>
-      </w:pPr>
-      <w:r>
-        <w:rPr>
-          <w:lang w:val="pt-BR"/>
-        </w:rPr>
-        <w:t>O segundo movimento incorpora o conjunto de 38 imagens já reunidas a partir da escola e do acervo do Museu Digital de Pipa. As imagens serão analisadas como possibilidade de leitura das relações entre território, memória, materialidade, usos do espaço e coexistência de temporalidades, e cada uma informa sobre uma etapa material da produção do distrito e da escola. A noção de rugosidade (SANTOS, 2006) orientará a leitura das formas e dos objetos herdados de outros momentos que continuam a participar das condições atuais do lugar, e Massey (2008) ajudará a ler as imagens e o território como parte de uma espacialidade feita de trajetórias que coexistem e se encontram, sem fixá-los num passado congelado. Serão registradas também as condições de conectividade, os espaços destinados ao uso das tecnologias e os equipamentos disponíveis na escola. Cada imagem será tratada como evidência da configuração material visível no momento do registro, sem valor de prova sobre as práticas ou as intenções dos profissionais. Rostos identificáveis de crianças não serão expostos.</w:t>
-      </w:r>
-    </w:p>
-    <w:p>
-      <w:pPr>
-        <w:pStyle w:val="Ttulo2"/>
-        <w:spacing w:before="0" w:after="0"/>
-        <w:rPr>
-          <w:lang w:val="pt-BR"/>
-        </w:rPr>
-      </w:pPr>
-      <w:bookmarkStart w:id="22" w:name="_Toc241917942"/>
-      <w:r>
-        <w:rPr>
-          <w:lang w:val="pt-BR"/>
-        </w:rPr>
-        <w:lastRenderedPageBreak/>
-        <w:t>10.3 TERCEIRO MOVIMENTO: QUESTIONÁRIO DE PERFIL E PERCEPÇÕES</w:t>
-      </w:r>
-      <w:bookmarkEnd w:id="22"/>
-    </w:p>
-    <w:p>
-      <w:pPr>
-        <w:spacing w:after="0" w:line="360" w:lineRule="auto"/>
-        <w:ind w:firstLine="709"/>
-        <w:jc w:val="both"/>
-        <w:rPr>
-          <w:lang w:val="pt-BR"/>
-        </w:rPr>
-      </w:pPr>
-      <w:r>
-        <w:rPr>
-          <w:lang w:val="pt-BR"/>
-        </w:rPr>
-        <w:t xml:space="preserve">O terceiro movimento é um questionário presencial, respondido em formulário digital, com função descritiva e </w:t>
-      </w:r>
-      <w:proofErr w:type="spellStart"/>
-      <w:r>
-        <w:rPr>
-          <w:lang w:val="pt-BR"/>
-        </w:rPr>
-        <w:t>contextualizadora</w:t>
-      </w:r>
-      <w:proofErr w:type="spellEnd"/>
-      <w:r>
-        <w:rPr>
-          <w:lang w:val="pt-BR"/>
-        </w:rPr>
-        <w:t>. O instrumento reúne informações sobre a formação e a experiência profissional dos participantes, sua relação com as tecnologias digitais e com a formação em educação digital, as condições de trabalho e as condições materiais da escola, o conhecimento das orientações curriculares e as primeiras percepções sobre a PNED. O questionário não se presta a generalizações estatísticas. Sua função é caracterizar o grupo e oferecer elementos que ajudem a compreender as entrevistas.</w:t>
-      </w:r>
-    </w:p>
-    <w:p>
-      <w:pPr>
-        <w:pStyle w:val="Ttulo2"/>
-        <w:spacing w:before="0" w:after="0"/>
-        <w:rPr>
-          <w:lang w:val="pt-BR"/>
-        </w:rPr>
-      </w:pPr>
-      <w:bookmarkStart w:id="23" w:name="_Toc241917943"/>
-      <w:r>
-        <w:rPr>
-          <w:lang w:val="pt-BR"/>
-        </w:rPr>
-        <w:t>10.4 QUARTO MOVIMENTO: ENTREVISTAS SEMIESTRUTURADAS</w:t>
-      </w:r>
-      <w:bookmarkEnd w:id="23"/>
-    </w:p>
-    <w:p>
-      <w:pPr>
-        <w:spacing w:after="0" w:line="360" w:lineRule="auto"/>
-        <w:ind w:firstLine="709"/>
-        <w:jc w:val="both"/>
-        <w:rPr>
-          <w:lang w:val="pt-BR"/>
-        </w:rPr>
-      </w:pPr>
-      <w:r>
-        <w:rPr>
-          <w:lang w:val="pt-BR"/>
-        </w:rPr>
-        <w:t>O quarto movimento consiste em entrevistas individuais semiestruturadas, com duração aproximada de 60 a 90 minutos, realizadas em espaço reservado, gravadas com o consentimento dos participantes e depois transcritas. Com os profissionais da escola, as entrevistas tratarão de suas trajetórias, da compreensão que têm da PNED, das condições de trabalho e das relações profissionais, das possibilidades de tradução da política, das demandas institucionais e da educação digital e das experiências das crianças com as tecnologias. Com o técnico da Secretaria, o roteiro abordará a compreensão municipal da PNED, as orientações repassadas às escolas, as ações realizadas, os processos de formação, as formas de acompanhamento, as condições oferecidas às unidades escolares e as dificuldades e possibilidades percebidas na implementação.</w:t>
-      </w:r>
-    </w:p>
-    <w:p>
-      <w:pPr>
-        <w:spacing w:after="0" w:line="360" w:lineRule="auto"/>
-        <w:ind w:firstLine="709"/>
-        <w:jc w:val="both"/>
-        <w:rPr>
-          <w:lang w:val="pt-BR"/>
-        </w:rPr>
-      </w:pPr>
-      <w:r>
-        <w:rPr>
-          <w:lang w:val="pt-BR"/>
-        </w:rPr>
-        <w:t>As noções de resistência, performatividade e fabricação não serão apresentadas nominalmente aos participantes. Queremos que eles descrevam suas experiências nos próprios termos, e a interpretação teórica virá depois, no trabalho de análise. Os roteiros foram construídos para que cada forma de atuação tenha onde aparecer sem que a pergunta a produza.</w:t>
-      </w:r>
-    </w:p>
-    <w:p>
-      <w:pPr>
-        <w:pStyle w:val="Ttulo2"/>
-        <w:spacing w:before="0" w:after="0"/>
-        <w:rPr>
-          <w:lang w:val="pt-BR"/>
-        </w:rPr>
-      </w:pPr>
-      <w:bookmarkStart w:id="24" w:name="_Toc241917944"/>
-      <w:r>
-        <w:rPr>
-          <w:lang w:val="pt-BR"/>
-        </w:rPr>
-        <w:t>10.5 QUINTO MOVIMENTO: ANÁLISE E DEVOLUTIVA</w:t>
-      </w:r>
-      <w:bookmarkEnd w:id="24"/>
-    </w:p>
-    <w:p>
-      <w:pPr>
-        <w:spacing w:after="0" w:line="360" w:lineRule="auto"/>
-        <w:ind w:firstLine="709"/>
-        <w:jc w:val="both"/>
-        <w:rPr>
-          <w:lang w:val="pt-BR"/>
-        </w:rPr>
-      </w:pPr>
-      <w:r>
-        <w:rPr>
-          <w:lang w:val="pt-BR"/>
-        </w:rPr>
-        <w:t>O quinto movimento reúne as fontes. Os relatos orais e as respostas abertas do questionário serão examinados pela análise temática reflexiva (BRAUN; CLARKE, 2006, 2019), em três etapas: a familiarização com o material, a codificação e a construção dos temas e a interpretação crítica com triangulação. As dimensões do contexto propostas por Ball, Maguire e Braun (2016), as culturas profissionais lidas em seu conteúdo e em sua forma (HARGREAVES, 2005) e as noções de performatividade, fabricação e território funcionarão como lentes sensibilizadoras, sem se converter em categorias fechadas às quais os dados devam caber. Os documentos serão lidos com uma matriz orientada pelos objetivos da pesquisa.</w:t>
-      </w:r>
-    </w:p>
-    <w:p>
-      <w:pPr>
-        <w:spacing w:after="0" w:line="360" w:lineRule="auto"/>
-        <w:ind w:firstLine="709"/>
-        <w:jc w:val="both"/>
-        <w:rPr>
-          <w:lang w:val="pt-BR"/>
-        </w:rPr>
-      </w:pPr>
-      <w:r>
-        <w:rPr>
-          <w:lang w:val="pt-BR"/>
-        </w:rPr>
-        <w:lastRenderedPageBreak/>
-        <w:t>Na interpretação, começaremos por cada participante, relacionando, quando fizer sentido, o questionário e a entrevista aos documentos e aos registros de seu local de trabalho. Quando a fala e o documento não coincidirem, a discrepância será lida como indício das tensões do trabalho escolar. Braun e Clarke (2019) lembram que, na abordagem reflexiva, a subjetividade de quem analisa é recurso da análise e precisa ser explicitada, e que um tema vale pelo que ajuda a compreender o problema, mais do que pela frequência com que aparece. Concluída a análise, os resultados serão apresentados à escola e à Secretaria Municipal de Educação, como devolutiva aos que tornaram a pesquisa possível.</w:t>
-      </w:r>
-    </w:p>
-    <w:p>
-      <w:pPr>
-        <w:pStyle w:val="Ttulo1"/>
-        <w:pageBreakBefore/>
-        <w:spacing w:after="0"/>
-        <w:rPr>
-          <w:lang w:val="pt-BR"/>
-        </w:rPr>
-      </w:pPr>
-      <w:bookmarkStart w:id="25" w:name="_Toc241917945"/>
-      <w:r>
-        <w:rPr>
-          <w:lang w:val="pt-BR"/>
-        </w:rPr>
-        <w:lastRenderedPageBreak/>
-        <w:t>11 A RESISTÊNCIA COMO PROBLEMA ANALÍTICO</w:t>
-      </w:r>
-      <w:bookmarkEnd w:id="25"/>
-    </w:p>
-    <w:p>
-      <w:pPr>
-        <w:spacing w:after="0" w:line="360" w:lineRule="auto"/>
-        <w:ind w:firstLine="709"/>
-        <w:jc w:val="both"/>
-        <w:rPr>
-          <w:lang w:val="pt-BR"/>
-        </w:rPr>
-      </w:pPr>
-      <w:r>
-        <w:rPr>
-          <w:lang w:val="pt-BR"/>
-        </w:rPr>
-        <w:t>A palavra “resistências” está no título da tese por uma escolha deliberada. Ela expressa uma preocupação teórica da pesquisa, a de compreender o que acontece quando os profissionais encontram exigências normativas que precisam ser traduzidas dentro de determinadas condições de trabalho. Essa escolha pede cuidado, porque a resistência será tratada como uma forma de atuação possível, sem o sentido de oposição automática à política. Ela poderá ser reconhecida quando os sujeitos recusarem, desviarem, adiarem, limitarem, reordenarem ou ressignificarem determinadas demandas, desde que essas formas possam ser sustentadas pelos dados.</w:t>
-      </w:r>
-    </w:p>
-    <w:p>
-      <w:pPr>
-        <w:spacing w:after="0" w:line="360" w:lineRule="auto"/>
-        <w:ind w:firstLine="709"/>
-        <w:jc w:val="both"/>
-        <w:rPr>
-          <w:lang w:val="pt-BR"/>
-        </w:rPr>
-      </w:pPr>
-      <w:r>
-        <w:rPr>
-          <w:lang w:val="pt-BR"/>
-        </w:rPr>
-        <w:t>Uma prática distante do que a norma prescreve não será, por isso, classificada de imediato como resistência. Ela pode corresponder a uma acomodação, à falta de condições para fazer o que se pede, à prioridade dada a outra demanda, a uma interpretação diferente do texto, a uma omissão, a uma adaptação ou a uma negociação, e a distinção entre essas possibilidades será construída durante a análise, com atenção às condições em que cada prática aparece e às razões que os profissionais lhe atribuem. Essa abertura permite manter a resistência como problema relevante para a tese sem transformá-la numa conclusão antecipada.</w:t>
-      </w:r>
-    </w:p>
-    <w:p>
-      <w:pPr>
-        <w:spacing w:after="0" w:line="360" w:lineRule="auto"/>
-        <w:ind w:firstLine="709"/>
-        <w:jc w:val="both"/>
-        <w:rPr>
-          <w:lang w:val="pt-BR"/>
-        </w:rPr>
-      </w:pPr>
-      <w:r>
-        <w:rPr>
-          <w:lang w:val="pt-BR"/>
-        </w:rPr>
-        <w:t xml:space="preserve">Foucault ajuda a dar a essa abertura um estatuto teórico. Ball, Maguire e Braun recorrem a ele ao tratar a política como “uma certa economia de discursos da verdade” (FOUCAULT, 1980, p. 93 apud BALL; MAGUIRE; BRAUN, 2016, p. 21), que se investe no cotidiano das escolas. Em Vigiar e punir, o próprio Foucault mostra que as relações de poder “não são unívocas; definem inúmeros pontos de luta, focos de instabilidade comportando cada um seus riscos de conflito, de lutas e de inversão pelo menos transitória da relação de forças” (FOUCAULT, 1999, p. 29). Lida com o autor, a resistência faz parte das relações de poder que a política mobiliza na escola, e por isso pode aparecer sem ser pressuposta: onde há normas, exigências e registros, há também pontos em que eles se tornam instáveis.</w:t>
-      </w:r>
-    </w:p>
-    <w:p>
-      <w:pPr>
-        <w:spacing w:after="0" w:line="360" w:lineRule="auto"/>
-        <w:ind w:firstLine="709"/>
-        <w:jc w:val="both"/>
-        <w:rPr>
-          <w:lang w:val="pt-BR"/>
-        </w:rPr>
-      </w:pPr>
-      <w:r>
-        <w:rPr>
-          <w:lang w:val="pt-BR"/>
-        </w:rPr>
-        <w:t xml:space="preserve">Ball (2011) ajuda a sustentar esse cuidado em duas direções. De um lado, critica as pesquisas em que “o problema está ‘na’ escola ou ‘no’ professor, mas nunca ‘nas’ políticas” (BALL, 2011, p. 36) e lembra que as políticas “criam circunstâncias nas quais o espectro de opções disponíveis sobre o que fazer é reduzido ou modificado”, de modo que “uma resposta ainda precisa ser construída no contexto” (BALL, 2011, p. 45-46). De outro, adverte contra os estudos em que os sujeitos “emergem, resistentes e românticos, heróis althusserianos lutando contra a opressão” (BALL, 2011, p. 46). Freire oferece contrapeso semelhante ao lembrar que o professor “precisa de condições favoráveis, higiênicas, espaciais, estéticas, sem as quais se move menos eficazmente no espaço pedagógico” e que, “às vezes, as condições são de tal maneira perversas que nem se move” (FREIRE, 2019, p. 64-65). Entre culpar os profissionais e celebrá-los, a análise descreverá o que eles fazem e as condições que tornam necessárias as suas escolhas.</w:t>
-      </w:r>
-    </w:p>
-    <w:p>
-      <w:pPr>
-        <w:pStyle w:val="Ttulo1"/>
-        <w:pageBreakBefore/>
-        <w:spacing w:after="0"/>
-        <w:rPr>
-          <w:lang w:val="pt-BR"/>
-        </w:rPr>
-      </w:pPr>
-      <w:bookmarkStart w:id="26" w:name="_Toc241917946"/>
-      <w:r>
-        <w:rPr>
-          <w:lang w:val="pt-BR"/>
-        </w:rPr>
-        <w:lastRenderedPageBreak/>
-        <w:t>12 TESE DE PARTIDA</w:t>
-      </w:r>
-      <w:bookmarkEnd w:id="26"/>
-    </w:p>
-    <w:p>
-      <w:pPr>
-        <w:spacing w:after="0" w:line="360" w:lineRule="auto"/>
-        <w:ind w:firstLine="709"/>
-        <w:jc w:val="both"/>
-        <w:rPr>
-          <w:lang w:val="pt-BR"/>
-        </w:rPr>
-      </w:pPr>
-      <w:r>
-        <w:rPr>
-          <w:lang w:val="pt-BR"/>
-        </w:rPr>
-        <w:t>A pesquisa parte da compreensão de que a PNED chega à escola como um conjunto de orientações que precisa ser lido e interpretado por quem trabalha nela. Ao encontrar uma escola situada, com seus profissionais, sua história, suas condições materiais, suas relações institucionais e seu território, a política passa por processos de interpretação, tradução e recontextualização (BOWE; BALL; GOLD, 1992; MAINARDES, 2006; BALL; MAGUIRE; BRAUN, 2016). A hipótese interpretativa que orienta o estudo é a de que a forma assumida pela política no cotidiano escolar resulta da relação entre o que ela prescreve e as condições sob as quais os profissionais precisam atuar. Dessa relação podem surgir formas de adesão, acomodação, adaptação, omissão seletiva, negociação, ressignificação e resistência, e a resistência, embora seja uma possibilidade analítica particularmente importante, permanece como possibilidade a ser verificada.</w:t>
-      </w:r>
-    </w:p>
-    <w:p>
-      <w:pPr>
-        <w:spacing w:after="0" w:line="360" w:lineRule="auto"/>
-        <w:ind w:firstLine="709"/>
-        <w:jc w:val="both"/>
-        <w:rPr>
-          <w:lang w:val="pt-BR"/>
-        </w:rPr>
-      </w:pPr>
-      <w:r>
-        <w:rPr>
-          <w:lang w:val="pt-BR"/>
-        </w:rPr>
-        <w:t xml:space="preserve">Partimos também da compreensão de que as condições materiais fazem parte da política. A própria ACP reconhece, desde a sua formulação, que as políticas “são intervenções textuais, mas carregam também restrições e possibilidades materiais” (BOWE; BALL; GOLD, 1992, p. 21, tradução nossa). A existência ou a ausência de equipamentos, de conectividade, de espaços adequados, de formação e de tempo de planejamento participa daquilo que os profissionais conseguem fazer com o que a lei pede. Por isso, perguntar se a PNED foi implementada diz pouco sobre o que se passa em Pipa. A pergunta que interessa é mais incômoda e diz respeito ao que acontece com uma política de educação digital quando ela encontra uma escola com uma história, condições materiais e culturas profissionais determinadas, inserida num território específico. É nesse encontro que a política adquire suas formas, e é nele também que se torna possível perguntar quem consegue </w:t>
-      </w:r>
-      <w:r>
-        <w:rPr>
-          <w:lang w:val="pt-BR"/>
-        </w:rPr>
-        <w:t>“</w:t>
-      </w:r>
-      <w:r>
-        <w:rPr>
-          <w:lang w:val="pt-BR"/>
-        </w:rPr>
-        <w:t>habitar o digital</w:t>
-      </w:r>
-      <w:r>
-        <w:rPr>
-          <w:lang w:val="pt-BR"/>
-        </w:rPr>
-        <w:t>”</w:t>
-      </w:r>
-      <w:r>
-        <w:rPr>
-          <w:lang w:val="pt-BR"/>
-        </w:rPr>
-        <w:t>, em que condições e com quais possibilidades de participação.</w:t>
-      </w:r>
-    </w:p>
-    <w:p>
-      <w:pPr>
-        <w:pStyle w:val="Ttulo1"/>
-        <w:pageBreakBefore/>
-        <w:spacing w:after="0"/>
-        <w:rPr>
-          <w:lang w:val="pt-BR"/>
-        </w:rPr>
-      </w:pPr>
-      <w:bookmarkStart w:id="27" w:name="_Toc241917947"/>
-      <w:r>
-        <w:rPr>
-          <w:lang w:val="pt-BR"/>
-        </w:rPr>
-        <w:lastRenderedPageBreak/>
-        <w:t>13 CONTRIBUIÇÕES ESPERADAS</w:t>
-      </w:r>
-      <w:bookmarkEnd w:id="27"/>
-    </w:p>
-    <w:p>
-      <w:pPr>
-        <w:spacing w:after="0" w:line="360" w:lineRule="auto"/>
-        <w:ind w:firstLine="709"/>
-        <w:jc w:val="both"/>
-        <w:rPr>
-          <w:lang w:val="pt-BR"/>
-        </w:rPr>
-      </w:pPr>
-      <w:r>
-        <w:rPr>
-          <w:lang w:val="pt-BR"/>
-        </w:rPr>
-        <w:t>A pesquisa pretende contribuir para três campos que se articulam. Para os estudos sobre políticas educacionais, oferece uma análise da PNED a partir do contexto da prática, atenta aos processos de atuação, tradução e recontextualização pelos quais a política ganha forma numa escola. Para os estudos sobre educação digital, propõe discutir a política para além da presença ou da ausência de equipamentos e de conectividade, examinando como sujeitos e territórios vivem e produzem formas diferentes de habitar o digital. Para o debate sobre os direitos das crianças no ambiente digital, analisa as implicações das condições encontradas na escola para as possibilidades de provisão, proteção e participação.</w:t>
-      </w:r>
-    </w:p>
-    <w:p>
-      <w:pPr>
-        <w:spacing w:after="0" w:line="360" w:lineRule="auto"/>
-        <w:ind w:firstLine="709"/>
-        <w:jc w:val="both"/>
-        <w:rPr>
-          <w:lang w:val="pt-BR"/>
-        </w:rPr>
-      </w:pPr>
-      <w:r>
-        <w:rPr>
-          <w:lang w:val="pt-BR"/>
-        </w:rPr>
-        <w:t xml:space="preserve">A contribuição conceitual própria da tese está na formulação “habitar o digital”, construída no diálogo entre a tradição do habitar, as discussões contemporâneas sobre </w:t>
-      </w:r>
-      <w:proofErr w:type="spellStart"/>
-      <w:r>
-        <w:rPr>
-          <w:lang w:val="pt-BR"/>
-        </w:rPr>
-        <w:t>digitalidade</w:t>
-      </w:r>
-      <w:proofErr w:type="spellEnd"/>
-      <w:r>
-        <w:rPr>
-          <w:lang w:val="pt-BR"/>
-        </w:rPr>
-        <w:t xml:space="preserve"> e conectividade e as leituras de território, técnica, espaço e lugar de Santos e Massey. Essa formulação será confrontada com os dados empíricos e poderá ser aprofundada, revista ou tensionada ao longo da investigação, de modo que o que se aprender em Pipa possa voltar à teoria e ajudar a compreender outras escolas onde a mesma política chega em condições igualmente desiguais.</w:t>
+          <w:lang w:val="pt-BR"/>
+        </w:rPr>
+        <w:t xml:space="preserve">A contribuição conceitual própria da tese está na formulação “habitar o digital”, construída no diálogo entre a tradição do habitar, as discussões contemporâneas sobre digitalidade e conectividade e as leituras de território, técnica, espaço e lugar de Santos e Massey. O que se aprender com ela em Pipa poderá voltar à teoria e ajudar a compreender outras escolas a que a mesma política chega em condições desiguais.</w:t>
       </w:r>
     </w:p>
     <w:p>

</xml_diff>

<commit_message>
Projeto em ABNT: folha de rosto, referências alinhadas à esquerda e sumário com páginas
Co-Authored-By: Claude Opus 5.5 <noreply@anthropic.com>
Claude-Session: https://claude.ai/code/session_01HxStpW4pQoDfJdTDYr6zEC
</commit_message>
<xml_diff>
--- a/projeto_desenvolvido/PROJETO_DE_TESE_COMPLETO_ABNT.docx
+++ b/projeto_desenvolvido/PROJETO_DE_TESE_COMPLETO_ABNT.docx
@@ -410,6 +410,311 @@
     </w:p>
     <w:p>
       <w:pPr>
+        <w:pageBreakBefore/>
+        <w:spacing w:after="0" w:line="360" w:lineRule="auto"/>
+        <w:jc w:val="center"/>
+        <w:rPr>
+          <w:lang w:val="pt-BR"/>
+        </w:rPr>
+      </w:pPr>
+      <w:r>
+        <w:rPr>
+          <w:lang w:val="pt-BR"/>
+        </w:rPr>
+        <w:t xml:space="preserve">YZYNYA SILVA REZENDE MACHADO</w:t>
+      </w:r>
+    </w:p>
+    <w:p>
+      <w:pPr>
+        <w:spacing w:after="0" w:line="360" w:lineRule="auto"/>
+        <w:jc w:val="both"/>
+        <w:rPr>
+          <w:lang w:val="pt-BR"/>
+        </w:rPr>
+      </w:pPr>
+    </w:p>
+    <w:p>
+      <w:pPr>
+        <w:spacing w:after="0" w:line="360" w:lineRule="auto"/>
+        <w:jc w:val="both"/>
+        <w:rPr>
+          <w:lang w:val="pt-BR"/>
+        </w:rPr>
+      </w:pPr>
+    </w:p>
+    <w:p>
+      <w:pPr>
+        <w:spacing w:after="0" w:line="360" w:lineRule="auto"/>
+        <w:jc w:val="both"/>
+        <w:rPr>
+          <w:lang w:val="pt-BR"/>
+        </w:rPr>
+      </w:pPr>
+    </w:p>
+    <w:p>
+      <w:pPr>
+        <w:spacing w:after="0" w:line="360" w:lineRule="auto"/>
+        <w:jc w:val="both"/>
+        <w:rPr>
+          <w:lang w:val="pt-BR"/>
+        </w:rPr>
+      </w:pPr>
+    </w:p>
+    <w:p>
+      <w:pPr>
+        <w:spacing w:after="0" w:line="360" w:lineRule="auto"/>
+        <w:jc w:val="both"/>
+        <w:rPr>
+          <w:lang w:val="pt-BR"/>
+        </w:rPr>
+      </w:pPr>
+    </w:p>
+    <w:p>
+      <w:pPr>
+        <w:spacing w:after="0" w:line="360" w:lineRule="auto"/>
+        <w:jc w:val="both"/>
+        <w:rPr>
+          <w:lang w:val="pt-BR"/>
+        </w:rPr>
+      </w:pPr>
+    </w:p>
+    <w:p>
+      <w:pPr>
+        <w:spacing w:after="0" w:line="360" w:lineRule="auto"/>
+        <w:jc w:val="both"/>
+        <w:rPr>
+          <w:lang w:val="pt-BR"/>
+        </w:rPr>
+      </w:pPr>
+    </w:p>
+    <w:p>
+      <w:pPr>
+        <w:spacing w:after="0" w:line="360" w:lineRule="auto"/>
+        <w:jc w:val="center"/>
+        <w:rPr>
+          <w:lang w:val="pt-BR"/>
+        </w:rPr>
+      </w:pPr>
+      <w:r>
+        <w:rPr>
+          <w:b/>
+          <w:lang w:val="pt-BR"/>
+        </w:rPr>
+        <w:t>A ENCENAÇÃO DA POLÍTICA NACIONAL DE EDUCAÇÃO DIGITAL (PNED) EM PIPA/RN: CULTURAS PROFISSIONAIS, TERRITÓRIO E RESISTÊNCIAS NO CONTEXTO DA PRÁTICA</w:t>
+      </w:r>
+    </w:p>
+    <w:p>
+      <w:pPr>
+        <w:spacing w:after="0" w:line="360" w:lineRule="auto"/>
+        <w:jc w:val="both"/>
+        <w:rPr>
+          <w:lang w:val="pt-BR"/>
+        </w:rPr>
+      </w:pPr>
+    </w:p>
+    <w:p>
+      <w:pPr>
+        <w:spacing w:after="0" w:line="360" w:lineRule="auto"/>
+        <w:jc w:val="both"/>
+        <w:rPr>
+          <w:lang w:val="pt-BR"/>
+        </w:rPr>
+      </w:pPr>
+    </w:p>
+    <w:p>
+      <w:pPr>
+        <w:spacing w:after="0" w:line="360" w:lineRule="auto"/>
+        <w:jc w:val="both"/>
+        <w:rPr>
+          <w:lang w:val="pt-BR"/>
+        </w:rPr>
+      </w:pPr>
+    </w:p>
+    <w:p>
+      <w:pPr>
+        <w:spacing w:after="0" w:line="240" w:lineRule="auto"/>
+        <w:ind w:left="4535" w:firstLine="0"/>
+        <w:jc w:val="both"/>
+        <w:rPr>
+          <w:lang w:val="pt-BR"/>
+        </w:rPr>
+      </w:pPr>
+      <w:r>
+        <w:rPr>
+          <w:b w:val="0"/>
+          <w:lang w:val="pt-BR"/>
+        </w:rPr>
+        <w:t xml:space="preserve">Projeto de tese apresentado ao Programa de Pós-Graduação em Educação da Universidade Federal do Rio Grande do Norte, como requisito para o exame de qualificação no Curso de Doutorado em Educação.</w:t>
+      </w:r>
+    </w:p>
+    <w:p>
+      <w:pPr>
+        <w:spacing w:after="0" w:line="240" w:lineRule="auto"/>
+        <w:ind w:left="4535" w:firstLine="0"/>
+        <w:jc w:val="both"/>
+        <w:rPr>
+          <w:lang w:val="pt-BR"/>
+        </w:rPr>
+      </w:pPr>
+    </w:p>
+    <w:p>
+      <w:pPr>
+        <w:spacing w:after="0" w:line="240" w:lineRule="auto"/>
+        <w:ind w:left="4535" w:firstLine="0"/>
+        <w:jc w:val="left"/>
+        <w:rPr>
+          <w:lang w:val="pt-BR"/>
+        </w:rPr>
+      </w:pPr>
+      <w:r>
+        <w:rPr>
+          <w:b w:val="0"/>
+          <w:lang w:val="pt-BR"/>
+        </w:rPr>
+        <w:t xml:space="preserve">Orientadora: Profa. Dra. Maria Cristina Leandro de Paiva.</w:t>
+      </w:r>
+    </w:p>
+    <w:p>
+      <w:pPr>
+        <w:spacing w:after="0" w:line="240" w:lineRule="auto"/>
+        <w:ind w:left="4535" w:firstLine="0"/>
+        <w:jc w:val="both"/>
+        <w:rPr>
+          <w:lang w:val="pt-BR"/>
+        </w:rPr>
+      </w:pPr>
+    </w:p>
+    <w:p>
+      <w:pPr>
+        <w:spacing w:after="0" w:line="360" w:lineRule="auto"/>
+        <w:jc w:val="both"/>
+        <w:rPr>
+          <w:lang w:val="pt-BR"/>
+        </w:rPr>
+      </w:pPr>
+    </w:p>
+    <w:p>
+      <w:pPr>
+        <w:spacing w:after="0" w:line="360" w:lineRule="auto"/>
+        <w:jc w:val="both"/>
+        <w:rPr>
+          <w:lang w:val="pt-BR"/>
+        </w:rPr>
+      </w:pPr>
+    </w:p>
+    <w:p>
+      <w:pPr>
+        <w:spacing w:after="0" w:line="360" w:lineRule="auto"/>
+        <w:jc w:val="both"/>
+        <w:rPr>
+          <w:lang w:val="pt-BR"/>
+        </w:rPr>
+      </w:pPr>
+    </w:p>
+    <w:p>
+      <w:pPr>
+        <w:spacing w:after="0" w:line="360" w:lineRule="auto"/>
+        <w:jc w:val="both"/>
+        <w:rPr>
+          <w:lang w:val="pt-BR"/>
+        </w:rPr>
+      </w:pPr>
+    </w:p>
+    <w:p>
+      <w:pPr>
+        <w:spacing w:after="0" w:line="360" w:lineRule="auto"/>
+        <w:jc w:val="both"/>
+        <w:rPr>
+          <w:lang w:val="pt-BR"/>
+        </w:rPr>
+      </w:pPr>
+    </w:p>
+    <w:p>
+      <w:pPr>
+        <w:spacing w:after="0" w:line="360" w:lineRule="auto"/>
+        <w:jc w:val="both"/>
+        <w:rPr>
+          <w:lang w:val="pt-BR"/>
+        </w:rPr>
+      </w:pPr>
+    </w:p>
+    <w:p>
+      <w:pPr>
+        <w:spacing w:after="0" w:line="360" w:lineRule="auto"/>
+        <w:jc w:val="both"/>
+        <w:rPr>
+          <w:lang w:val="pt-BR"/>
+        </w:rPr>
+      </w:pPr>
+    </w:p>
+    <w:p>
+      <w:pPr>
+        <w:spacing w:after="0" w:line="360" w:lineRule="auto"/>
+        <w:jc w:val="both"/>
+        <w:rPr>
+          <w:lang w:val="pt-BR"/>
+        </w:rPr>
+      </w:pPr>
+    </w:p>
+    <w:p>
+      <w:pPr>
+        <w:spacing w:after="0" w:line="360" w:lineRule="auto"/>
+        <w:jc w:val="both"/>
+        <w:rPr>
+          <w:lang w:val="pt-BR"/>
+        </w:rPr>
+      </w:pPr>
+    </w:p>
+    <w:p>
+      <w:pPr>
+        <w:spacing w:after="0" w:line="360" w:lineRule="auto"/>
+        <w:jc w:val="both"/>
+        <w:rPr>
+          <w:lang w:val="pt-BR"/>
+        </w:rPr>
+      </w:pPr>
+    </w:p>
+    <w:p>
+      <w:pPr>
+        <w:spacing w:after="0" w:line="360" w:lineRule="auto"/>
+        <w:jc w:val="both"/>
+        <w:rPr>
+          <w:lang w:val="pt-BR"/>
+        </w:rPr>
+      </w:pPr>
+    </w:p>
+    <w:p>
+      <w:pPr>
+        <w:spacing w:after="0" w:line="360" w:lineRule="auto"/>
+        <w:jc w:val="center"/>
+        <w:rPr>
+          <w:lang w:val="pt-BR"/>
+        </w:rPr>
+      </w:pPr>
+      <w:r>
+        <w:rPr>
+          <w:lang w:val="pt-BR"/>
+        </w:rPr>
+        <w:t>NATAL</w:t>
+      </w:r>
+    </w:p>
+    <w:p>
+      <w:pPr>
+        <w:spacing w:after="0" w:line="360" w:lineRule="auto"/>
+        <w:jc w:val="center"/>
+        <w:rPr>
+          <w:lang w:val="pt-BR"/>
+        </w:rPr>
+      </w:pPr>
+      <w:r>
+        <w:rPr>
+          <w:lang w:val="pt-BR"/>
+        </w:rPr>
+        <w:t>2026</w:t>
+      </w:r>
+    </w:p>
+    <w:p>
+      <w:pPr>
         <w:spacing w:after="0"/>
         <w:rPr>
           <w:b/>
@@ -601,7 +906,7 @@
             <w:webHidden/>
             <w:lang w:val="pt-BR"/>
           </w:rPr>
-          <w:t>3</w:t>
+          <w:t>5</w:t>
         </w:r>
         <w:r>
           <w:rPr>
@@ -679,7 +984,7 @@
             <w:webHidden/>
             <w:lang w:val="pt-BR"/>
           </w:rPr>
-          <w:t>3</w:t>
+          <w:t>6</w:t>
         </w:r>
         <w:r>
           <w:rPr>
@@ -757,7 +1062,7 @@
             <w:webHidden/>
             <w:lang w:val="pt-BR"/>
           </w:rPr>
-          <w:t>3</w:t>
+          <w:t>6</w:t>
         </w:r>
         <w:r>
           <w:rPr>
@@ -835,7 +1140,7 @@
             <w:webHidden/>
             <w:lang w:val="pt-BR"/>
           </w:rPr>
-          <w:t>3</w:t>
+          <w:t>6</w:t>
         </w:r>
         <w:r>
           <w:rPr>
@@ -913,7 +1218,7 @@
             <w:webHidden/>
             <w:lang w:val="pt-BR"/>
           </w:rPr>
-          <w:t>3</w:t>
+          <w:t>7</w:t>
         </w:r>
         <w:r>
           <w:rPr>
@@ -991,7 +1296,7 @@
             <w:webHidden/>
             <w:lang w:val="pt-BR"/>
           </w:rPr>
-          <w:t>3</w:t>
+          <w:t>7</w:t>
         </w:r>
         <w:r>
           <w:rPr>
@@ -1069,7 +1374,7 @@
             <w:webHidden/>
             <w:lang w:val="pt-BR"/>
           </w:rPr>
-          <w:t>3</w:t>
+          <w:t>8</w:t>
         </w:r>
         <w:r>
           <w:rPr>
@@ -1147,7 +1452,7 @@
             <w:webHidden/>
             <w:lang w:val="pt-BR"/>
           </w:rPr>
-          <w:t>3</w:t>
+          <w:t>8</w:t>
         </w:r>
         <w:r>
           <w:rPr>
@@ -1241,7 +1546,7 @@
             <w:webHidden/>
             <w:lang w:val="pt-BR"/>
           </w:rPr>
-          <w:t>3</w:t>
+          <w:t>10</w:t>
         </w:r>
         <w:r>
           <w:rPr>
@@ -1272,7 +1577,7 @@
             <w:noProof/>
             <w:lang w:val="pt-BR"/>
           </w:rPr>
-          <w:t>5.1 A ABORDAGEM DO CICLO DE POLÍTICAS</w:t>
+          <w:t>5.1 A ABORDAGEM DO CICLO DE POLÍTICAS (ACP)</w:t>
         </w:r>
         <w:r>
           <w:rPr>
@@ -1319,7 +1624,7 @@
             <w:webHidden/>
             <w:lang w:val="pt-BR"/>
           </w:rPr>
-          <w:t>3</w:t>
+          <w:t>10</w:t>
         </w:r>
         <w:r>
           <w:rPr>
@@ -1397,7 +1702,7 @@
             <w:webHidden/>
             <w:lang w:val="pt-BR"/>
           </w:rPr>
-          <w:t>3</w:t>
+          <w:t>10</w:t>
         </w:r>
         <w:r>
           <w:rPr>
@@ -1475,7 +1780,7 @@
             <w:webHidden/>
             <w:lang w:val="pt-BR"/>
           </w:rPr>
-          <w:t>3</w:t>
+          <w:t>11</w:t>
         </w:r>
         <w:r>
           <w:rPr>
@@ -1553,7 +1858,7 @@
             <w:webHidden/>
             <w:lang w:val="pt-BR"/>
           </w:rPr>
-          <w:t>3</w:t>
+          <w:t>13</w:t>
         </w:r>
         <w:r>
           <w:rPr>
@@ -1631,7 +1936,7 @@
             <w:webHidden/>
             <w:lang w:val="pt-BR"/>
           </w:rPr>
-          <w:t>3</w:t>
+          <w:t>15</w:t>
         </w:r>
         <w:r>
           <w:rPr>
@@ -1709,7 +2014,7 @@
             <w:webHidden/>
             <w:lang w:val="pt-BR"/>
           </w:rPr>
-          <w:t>3</w:t>
+          <w:t>17</w:t>
         </w:r>
         <w:r>
           <w:rPr>
@@ -1787,7 +2092,7 @@
             <w:webHidden/>
             <w:lang w:val="pt-BR"/>
           </w:rPr>
-          <w:t>3</w:t>
+          <w:t>19</w:t>
         </w:r>
         <w:r>
           <w:rPr>
@@ -1865,7 +2170,7 @@
             <w:webHidden/>
             <w:lang w:val="pt-BR"/>
           </w:rPr>
-          <w:t>3</w:t>
+          <w:t>19</w:t>
         </w:r>
         <w:r>
           <w:rPr>
@@ -1943,7 +2248,7 @@
             <w:webHidden/>
             <w:lang w:val="pt-BR"/>
           </w:rPr>
-          <w:t>3</w:t>
+          <w:t>19</w:t>
         </w:r>
         <w:r>
           <w:rPr>
@@ -2021,7 +2326,7 @@
             <w:webHidden/>
             <w:lang w:val="pt-BR"/>
           </w:rPr>
-          <w:t>3</w:t>
+          <w:t>21</w:t>
         </w:r>
         <w:r>
           <w:rPr>
@@ -2099,7 +2404,7 @@
             <w:webHidden/>
             <w:lang w:val="pt-BR"/>
           </w:rPr>
-          <w:t>3</w:t>
+          <w:t>21</w:t>
         </w:r>
         <w:r>
           <w:rPr>
@@ -2177,7 +2482,7 @@
             <w:webHidden/>
             <w:lang w:val="pt-BR"/>
           </w:rPr>
-          <w:t>3</w:t>
+          <w:t>21</w:t>
         </w:r>
         <w:r>
           <w:rPr>
@@ -2255,7 +2560,7 @@
             <w:webHidden/>
             <w:lang w:val="pt-BR"/>
           </w:rPr>
-          <w:t>3</w:t>
+          <w:t>22</w:t>
         </w:r>
         <w:r>
           <w:rPr>
@@ -2333,7 +2638,7 @@
             <w:webHidden/>
             <w:lang w:val="pt-BR"/>
           </w:rPr>
-          <w:t>3</w:t>
+          <w:t>22</w:t>
         </w:r>
         <w:r>
           <w:rPr>
@@ -2411,7 +2716,7 @@
             <w:webHidden/>
             <w:lang w:val="pt-BR"/>
           </w:rPr>
-          <w:t>3</w:t>
+          <w:t>22</w:t>
         </w:r>
         <w:r>
           <w:rPr>
@@ -2489,7 +2794,7 @@
             <w:webHidden/>
             <w:lang w:val="pt-BR"/>
           </w:rPr>
-          <w:t>3</w:t>
+          <w:t>24</w:t>
         </w:r>
         <w:r>
           <w:rPr>
@@ -2567,7 +2872,7 @@
             <w:webHidden/>
             <w:lang w:val="pt-BR"/>
           </w:rPr>
-          <w:t>3</w:t>
+          <w:t>26</w:t>
         </w:r>
         <w:r>
           <w:rPr>
@@ -2645,7 +2950,7 @@
             <w:webHidden/>
             <w:lang w:val="pt-BR"/>
           </w:rPr>
-          <w:t>3</w:t>
+          <w:t>27</w:t>
         </w:r>
         <w:r>
           <w:rPr>
@@ -2723,7 +3028,7 @@
             <w:webHidden/>
             <w:lang w:val="pt-BR"/>
           </w:rPr>
-          <w:t>3</w:t>
+          <w:t>28</w:t>
         </w:r>
         <w:r>
           <w:rPr>
@@ -4428,7 +4733,7 @@
     <w:p>
       <w:pPr>
         <w:spacing w:after="0" w:line="240" w:lineRule="auto"/>
-        <w:jc w:val="both"/>
+        <w:jc w:val="left"/>
         <w:rPr>
           <w:lang w:val="pt-BR"/>
         </w:rPr>
@@ -4456,7 +4761,7 @@
     <w:p>
       <w:pPr>
         <w:spacing w:after="0" w:line="240" w:lineRule="auto"/>
-        <w:jc w:val="both"/>
+        <w:jc w:val="left"/>
         <w:rPr>
           <w:lang w:val="pt-BR"/>
         </w:rPr>
@@ -4465,7 +4770,7 @@
     <w:p>
       <w:pPr>
         <w:spacing w:after="0" w:line="240" w:lineRule="auto"/>
-        <w:jc w:val="both"/>
+        <w:jc w:val="left"/>
         <w:rPr>
           <w:lang w:val="pt-BR"/>
         </w:rPr>
@@ -4493,7 +4798,7 @@
     <w:p>
       <w:pPr>
         <w:spacing w:after="0" w:line="240" w:lineRule="auto"/>
-        <w:jc w:val="both"/>
+        <w:jc w:val="left"/>
         <w:rPr>
           <w:lang w:val="pt-BR"/>
         </w:rPr>
@@ -4502,7 +4807,7 @@
     <w:p>
       <w:pPr>
         <w:spacing w:after="0" w:line="240" w:lineRule="auto"/>
-        <w:jc w:val="both"/>
+        <w:jc w:val="left"/>
         <w:rPr>
           <w:lang w:val="pt-BR"/>
         </w:rPr>
@@ -4530,7 +4835,7 @@
     <w:p>
       <w:pPr>
         <w:spacing w:after="0" w:line="240" w:lineRule="auto"/>
-        <w:jc w:val="both"/>
+        <w:jc w:val="left"/>
         <w:rPr>
           <w:lang w:val="pt-BR"/>
         </w:rPr>
@@ -4539,7 +4844,7 @@
     <w:p>
       <w:pPr>
         <w:spacing w:after="0" w:line="240" w:lineRule="auto"/>
-        <w:jc w:val="both"/>
+        <w:jc w:val="left"/>
         <w:rPr>
           <w:lang w:val="pt-BR"/>
         </w:rPr>
@@ -4567,7 +4872,7 @@
     <w:p>
       <w:pPr>
         <w:spacing w:after="0" w:line="240" w:lineRule="auto"/>
-        <w:jc w:val="both"/>
+        <w:jc w:val="left"/>
         <w:rPr>
           <w:lang w:val="pt-BR"/>
         </w:rPr>
@@ -4576,7 +4881,7 @@
     <w:p>
       <w:pPr>
         <w:spacing w:after="0" w:line="240" w:lineRule="auto"/>
-        <w:jc w:val="both"/>
+        <w:jc w:val="left"/>
         <w:rPr>
           <w:lang w:val="pt-BR"/>
         </w:rPr>
@@ -4604,7 +4909,7 @@
     <w:p>
       <w:pPr>
         <w:spacing w:after="0" w:line="240" w:lineRule="auto"/>
-        <w:jc w:val="both"/>
+        <w:jc w:val="left"/>
         <w:rPr>
           <w:lang w:val="pt-BR"/>
         </w:rPr>
@@ -4613,7 +4918,7 @@
     <w:p>
       <w:pPr>
         <w:spacing w:after="0" w:line="240" w:lineRule="auto"/>
-        <w:jc w:val="both"/>
+        <w:jc w:val="left"/>
         <w:rPr>
           <w:lang w:val="pt-BR"/>
         </w:rPr>
@@ -4641,7 +4946,7 @@
     <w:p>
       <w:pPr>
         <w:spacing w:after="0" w:line="240" w:lineRule="auto"/>
-        <w:jc w:val="both"/>
+        <w:jc w:val="left"/>
         <w:rPr>
           <w:lang w:val="pt-BR"/>
         </w:rPr>
@@ -4650,7 +4955,7 @@
     <w:p>
       <w:pPr>
         <w:spacing w:after="0" w:line="240" w:lineRule="auto"/>
-        <w:jc w:val="both"/>
+        <w:jc w:val="left"/>
         <w:rPr>
           <w:lang w:val="pt-BR"/>
         </w:rPr>
@@ -4800,7 +5105,7 @@
     <w:p>
       <w:pPr>
         <w:spacing w:after="0" w:line="240" w:lineRule="auto"/>
-        <w:jc w:val="both"/>
+        <w:jc w:val="left"/>
         <w:rPr>
           <w:lang w:val="pt-BR"/>
         </w:rPr>
@@ -4809,7 +5114,7 @@
     <w:p>
       <w:pPr>
         <w:spacing w:after="0" w:line="240" w:lineRule="auto"/>
-        <w:jc w:val="both"/>
+        <w:jc w:val="left"/>
         <w:rPr>
           <w:lang w:val="pt-BR"/>
         </w:rPr>
@@ -4824,7 +5129,7 @@
     <w:p>
       <w:pPr>
         <w:spacing w:after="0" w:line="240" w:lineRule="auto"/>
-        <w:jc w:val="both"/>
+        <w:jc w:val="left"/>
         <w:rPr>
           <w:lang w:val="pt-BR"/>
         </w:rPr>
@@ -4833,7 +5138,7 @@
     <w:p>
       <w:pPr>
         <w:spacing w:after="0" w:line="240" w:lineRule="auto"/>
-        <w:jc w:val="both"/>
+        <w:jc w:val="left"/>
         <w:rPr>
           <w:lang w:val="pt-BR"/>
         </w:rPr>
@@ -4848,7 +5153,7 @@
     <w:p>
       <w:pPr>
         <w:spacing w:after="0" w:line="240" w:lineRule="auto"/>
-        <w:jc w:val="both"/>
+        <w:jc w:val="left"/>
         <w:rPr>
           <w:lang w:val="pt-BR"/>
         </w:rPr>
@@ -4863,7 +5168,7 @@
     <w:p>
       <w:pPr>
         <w:spacing w:after="0" w:line="240" w:lineRule="auto"/>
-        <w:jc w:val="both"/>
+        <w:jc w:val="left"/>
         <w:rPr>
           <w:lang w:val="pt-BR"/>
         </w:rPr>
@@ -4872,7 +5177,7 @@
     <w:p>
       <w:pPr>
         <w:spacing w:after="0" w:line="240" w:lineRule="auto"/>
-        <w:jc w:val="both"/>
+        <w:jc w:val="left"/>
         <w:rPr>
           <w:lang w:val="pt-BR"/>
         </w:rPr>
@@ -4887,7 +5192,7 @@
     <w:p>
       <w:pPr>
         <w:spacing w:after="0" w:line="240" w:lineRule="auto"/>
-        <w:jc w:val="both"/>
+        <w:jc w:val="left"/>
         <w:rPr>
           <w:lang w:val="pt-BR"/>
         </w:rPr>
@@ -4896,7 +5201,7 @@
     <w:p>
       <w:pPr>
         <w:spacing w:after="0" w:line="240" w:lineRule="auto"/>
-        <w:jc w:val="both"/>
+        <w:jc w:val="left"/>
         <w:rPr>
           <w:lang w:val="pt-BR"/>
         </w:rPr>
@@ -4911,7 +5216,7 @@
     <w:p>
       <w:pPr>
         <w:spacing w:after="0" w:line="240" w:lineRule="auto"/>
-        <w:jc w:val="both"/>
+        <w:jc w:val="left"/>
         <w:rPr>
           <w:lang w:val="pt-BR"/>
         </w:rPr>
@@ -4920,7 +5225,7 @@
     <w:p>
       <w:pPr>
         <w:spacing w:after="0" w:line="240" w:lineRule="auto"/>
-        <w:jc w:val="both"/>
+        <w:jc w:val="left"/>
         <w:rPr>
           <w:lang w:val="pt-BR"/>
         </w:rPr>
@@ -5038,7 +5343,7 @@
     <w:p>
       <w:pPr>
         <w:spacing w:after="0" w:line="240" w:lineRule="auto"/>
-        <w:jc w:val="both"/>
+        <w:jc w:val="left"/>
         <w:rPr>
           <w:lang w:val="pt-BR"/>
         </w:rPr>
@@ -5047,7 +5352,7 @@
     <w:p>
       <w:pPr>
         <w:spacing w:after="0" w:line="240" w:lineRule="auto"/>
-        <w:jc w:val="both"/>
+        <w:jc w:val="left"/>
         <w:rPr>
           <w:lang w:val="pt-BR"/>
         </w:rPr>
@@ -5202,7 +5507,7 @@
     <w:p>
       <w:pPr>
         <w:spacing w:after="0" w:line="240" w:lineRule="auto"/>
-        <w:jc w:val="both"/>
+        <w:jc w:val="left"/>
         <w:rPr>
           <w:lang w:val="pt-BR"/>
         </w:rPr>
@@ -5211,7 +5516,7 @@
     <w:p>
       <w:pPr>
         <w:spacing w:after="0" w:line="240" w:lineRule="auto"/>
-        <w:jc w:val="both"/>
+        <w:jc w:val="left"/>
         <w:rPr>
           <w:lang w:val="pt-BR"/>
         </w:rPr>
@@ -5257,7 +5562,7 @@
     <w:p>
       <w:pPr>
         <w:spacing w:after="0" w:line="240" w:lineRule="auto"/>
-        <w:jc w:val="both"/>
+        <w:jc w:val="left"/>
         <w:rPr>
           <w:lang w:val="pt-BR"/>
         </w:rPr>
@@ -5266,7 +5571,7 @@
     <w:p>
       <w:pPr>
         <w:spacing w:after="0" w:line="240" w:lineRule="auto"/>
-        <w:jc w:val="both"/>
+        <w:jc w:val="left"/>
         <w:rPr>
           <w:lang w:val="pt-BR"/>
         </w:rPr>
@@ -5294,7 +5599,7 @@
     <w:p>
       <w:pPr>
         <w:spacing w:after="0" w:line="240" w:lineRule="auto"/>
-        <w:jc w:val="both"/>
+        <w:jc w:val="left"/>
         <w:rPr>
           <w:lang w:val="pt-BR"/>
         </w:rPr>
@@ -5303,7 +5608,7 @@
     <w:p>
       <w:pPr>
         <w:spacing w:after="0" w:line="240" w:lineRule="auto"/>
-        <w:jc w:val="both"/>
+        <w:jc w:val="left"/>
         <w:rPr>
           <w:lang w:val="pt-BR"/>
         </w:rPr>
@@ -5331,7 +5636,7 @@
     <w:p>
       <w:pPr>
         <w:spacing w:after="0" w:line="240" w:lineRule="auto"/>
-        <w:jc w:val="both"/>
+        <w:jc w:val="left"/>
         <w:rPr>
           <w:lang w:val="pt-BR"/>
         </w:rPr>
@@ -5340,7 +5645,7 @@
     <w:p>
       <w:pPr>
         <w:spacing w:after="0" w:line="240" w:lineRule="auto"/>
-        <w:jc w:val="both"/>
+        <w:jc w:val="left"/>
         <w:rPr>
           <w:lang w:val="pt-BR"/>
         </w:rPr>
@@ -5368,7 +5673,7 @@
     <w:p>
       <w:pPr>
         <w:spacing w:after="0" w:line="240" w:lineRule="auto"/>
-        <w:jc w:val="both"/>
+        <w:jc w:val="left"/>
         <w:rPr>
           <w:lang w:val="pt-BR"/>
         </w:rPr>
@@ -5377,7 +5682,7 @@
     <w:p>
       <w:pPr>
         <w:spacing w:after="0" w:line="240" w:lineRule="auto"/>
-        <w:jc w:val="both"/>
+        <w:jc w:val="left"/>
         <w:rPr>
           <w:lang w:val="pt-BR"/>
         </w:rPr>
@@ -5493,7 +5798,7 @@
     <w:p>
       <w:pPr>
         <w:spacing w:after="0" w:line="240" w:lineRule="auto"/>
-        <w:jc w:val="both"/>
+        <w:jc w:val="left"/>
         <w:rPr>
           <w:lang w:val="pt-BR"/>
         </w:rPr>
@@ -5502,7 +5807,7 @@
     <w:p>
       <w:pPr>
         <w:spacing w:after="0" w:line="240" w:lineRule="auto"/>
-        <w:jc w:val="both"/>
+        <w:jc w:val="left"/>
         <w:rPr>
           <w:lang w:val="pt-BR"/>
         </w:rPr>
@@ -5530,7 +5835,7 @@
     <w:p>
       <w:pPr>
         <w:spacing w:after="0" w:line="240" w:lineRule="auto"/>
-        <w:jc w:val="both"/>
+        <w:jc w:val="left"/>
         <w:rPr>
           <w:lang w:val="pt-BR"/>
         </w:rPr>
@@ -5539,7 +5844,7 @@
     <w:p>
       <w:pPr>
         <w:spacing w:after="0" w:line="240" w:lineRule="auto"/>
-        <w:jc w:val="both"/>
+        <w:jc w:val="left"/>
         <w:rPr>
           <w:lang w:val="pt-BR"/>
         </w:rPr>
@@ -5581,7 +5886,7 @@
     <w:p>
       <w:pPr>
         <w:spacing w:after="0" w:line="240" w:lineRule="auto"/>
-        <w:jc w:val="both"/>
+        <w:jc w:val="left"/>
         <w:rPr>
           <w:lang w:val="pt-BR"/>
         </w:rPr>
@@ -5590,7 +5895,7 @@
     <w:p>
       <w:pPr>
         <w:spacing w:after="0" w:line="240" w:lineRule="auto"/>
-        <w:jc w:val="both"/>
+        <w:jc w:val="left"/>
         <w:rPr>
           <w:lang w:val="pt-BR"/>
         </w:rPr>
@@ -5619,7 +5924,7 @@
     <w:p>
       <w:pPr>
         <w:spacing w:after="0" w:line="240" w:lineRule="auto"/>
-        <w:jc w:val="both"/>
+        <w:jc w:val="left"/>
         <w:rPr>
           <w:lang w:val="pt-BR"/>
         </w:rPr>
@@ -5628,7 +5933,7 @@
     <w:p>
       <w:pPr>
         <w:spacing w:after="0" w:line="240" w:lineRule="auto"/>
-        <w:jc w:val="both"/>
+        <w:jc w:val="left"/>
         <w:rPr>
           <w:lang w:val="pt-BR"/>
         </w:rPr>
@@ -5656,7 +5961,7 @@
     <w:p>
       <w:pPr>
         <w:spacing w:after="0" w:line="240" w:lineRule="auto"/>
-        <w:jc w:val="both"/>
+        <w:jc w:val="left"/>
         <w:rPr>
           <w:lang w:val="pt-BR"/>
         </w:rPr>
@@ -5665,7 +5970,7 @@
     <w:p>
       <w:pPr>
         <w:spacing w:after="0" w:line="240" w:lineRule="auto"/>
-        <w:jc w:val="both"/>
+        <w:jc w:val="left"/>
         <w:rPr>
           <w:lang w:val="pt-BR"/>
         </w:rPr>
@@ -5693,7 +5998,7 @@
     <w:p>
       <w:pPr>
         <w:spacing w:after="0" w:line="240" w:lineRule="auto"/>
-        <w:jc w:val="both"/>
+        <w:jc w:val="left"/>
         <w:rPr>
           <w:lang w:val="pt-BR"/>
         </w:rPr>
@@ -5702,7 +6007,7 @@
     <w:p>
       <w:pPr>
         <w:spacing w:after="0" w:line="240" w:lineRule="auto"/>
-        <w:jc w:val="both"/>
+        <w:jc w:val="left"/>
         <w:rPr>
           <w:lang w:val="pt-BR"/>
         </w:rPr>
@@ -5744,7 +6049,7 @@
     <w:p>
       <w:pPr>
         <w:spacing w:after="0" w:line="240" w:lineRule="auto"/>
-        <w:jc w:val="both"/>
+        <w:jc w:val="left"/>
         <w:rPr>
           <w:lang w:val="pt-BR"/>
         </w:rPr>
@@ -5753,7 +6058,7 @@
     <w:p>
       <w:pPr>
         <w:spacing w:after="0" w:line="240" w:lineRule="auto"/>
-        <w:jc w:val="both"/>
+        <w:jc w:val="left"/>
         <w:rPr>
           <w:lang w:val="pt-BR"/>
         </w:rPr>
@@ -5783,7 +6088,7 @@
     <w:p>
       <w:pPr>
         <w:spacing w:after="0" w:line="240" w:lineRule="auto"/>
-        <w:jc w:val="both"/>
+        <w:jc w:val="left"/>
         <w:rPr>
           <w:lang w:val="pt-BR"/>
         </w:rPr>
@@ -5792,7 +6097,7 @@
     <w:p>
       <w:pPr>
         <w:spacing w:after="0" w:line="240" w:lineRule="auto"/>
-        <w:jc w:val="both"/>
+        <w:jc w:val="left"/>
         <w:rPr>
           <w:lang w:val="pt-BR"/>
         </w:rPr>
@@ -5829,7 +6134,7 @@
     <w:p>
       <w:pPr>
         <w:spacing w:after="0" w:line="240" w:lineRule="auto"/>
-        <w:jc w:val="both"/>
+        <w:jc w:val="left"/>
         <w:rPr>
           <w:lang w:val="pt-BR"/>
         </w:rPr>
@@ -5838,7 +6143,7 @@
     <w:p>
       <w:pPr>
         <w:spacing w:after="0" w:line="240" w:lineRule="auto"/>
-        <w:jc w:val="both"/>
+        <w:jc w:val="left"/>
         <w:rPr>
           <w:lang w:val="pt-BR"/>
         </w:rPr>
@@ -5868,7 +6173,7 @@
     <w:p>
       <w:pPr>
         <w:spacing w:after="0" w:line="240" w:lineRule="auto"/>
-        <w:jc w:val="both"/>
+        <w:jc w:val="left"/>
         <w:rPr>
           <w:lang w:val="pt-BR"/>
         </w:rPr>
@@ -5877,7 +6182,7 @@
     <w:p>
       <w:pPr>
         <w:spacing w:after="0" w:line="240" w:lineRule="auto"/>
-        <w:jc w:val="both"/>
+        <w:jc w:val="left"/>
         <w:rPr>
           <w:lang w:val="pt-BR"/>
         </w:rPr>
@@ -5907,7 +6212,7 @@
     <w:p>
       <w:pPr>
         <w:spacing w:after="0" w:line="240" w:lineRule="auto"/>
-        <w:jc w:val="both"/>
+        <w:jc w:val="left"/>
         <w:rPr>
           <w:lang w:val="pt-BR"/>
         </w:rPr>
@@ -5916,7 +6221,7 @@
     <w:p>
       <w:pPr>
         <w:spacing w:after="0" w:line="240" w:lineRule="auto"/>
-        <w:jc w:val="both"/>
+        <w:jc w:val="left"/>
         <w:rPr>
           <w:lang w:val="pt-BR"/>
         </w:rPr>
@@ -5946,7 +6251,7 @@
     <w:p>
       <w:pPr>
         <w:spacing w:after="0" w:line="240" w:lineRule="auto"/>
-        <w:jc w:val="both"/>
+        <w:jc w:val="left"/>
         <w:rPr>
           <w:lang w:val="pt-BR"/>
         </w:rPr>
@@ -5955,7 +6260,7 @@
     <w:p>
       <w:pPr>
         <w:spacing w:after="0" w:line="240" w:lineRule="auto"/>
-        <w:jc w:val="both"/>
+        <w:jc w:val="left"/>
         <w:rPr>
           <w:lang w:val="pt-BR"/>
         </w:rPr>
@@ -5985,7 +6290,7 @@
     <w:p>
       <w:pPr>
         <w:spacing w:after="0" w:line="240" w:lineRule="auto"/>
-        <w:jc w:val="both"/>
+        <w:jc w:val="left"/>
         <w:rPr>
           <w:lang w:val="pt-BR"/>
         </w:rPr>
@@ -5994,7 +6299,7 @@
     <w:p>
       <w:pPr>
         <w:spacing w:after="0" w:line="240" w:lineRule="auto"/>
-        <w:jc w:val="both"/>
+        <w:jc w:val="left"/>
         <w:rPr>
           <w:lang w:val="pt-BR"/>
         </w:rPr>

</xml_diff>

<commit_message>
Revisa o projeto de tese no desenho em funil, da Secretaria à escola
Novo título, objeto, questão e quatro objetivos com um verbo cada; dados
municipais com marcação do que falta conferir; técnico da SME como
participante; movimentos de coleta da rede à escola; novas referências
(LAI, Res. CNE/CEB 8/2012, Censos IBGE, PME); sumário atualizado.

Co-Authored-By: Claude Opus 5.5 <noreply@anthropic.com>
Claude-Session: https://claude.ai/code/session_01HxStpW4pQoDfJdTDYr6zEC
</commit_message>
<xml_diff>
--- a/projeto_desenvolvido/PROJETO_DE_TESE_COMPLETO_ABNT.docx
+++ b/projeto_desenvolvido/PROJETO_DE_TESE_COMPLETO_ABNT.docx
@@ -294,7 +294,7 @@
           <w:b/>
           <w:lang w:val="pt-BR"/>
         </w:rPr>
-        <w:t>A ENCENAÇÃO DA POLÍTICA NACIONAL DE EDUCAÇÃO DIGITAL (PNED) EM PIPA/RN: CULTURAS PROFISSIONAIS, TERRITÓRIO E RESISTÊNCIAS NO CONTEXTO DA PRÁTICA</w:t>
+        <w:t>A ENCENAÇÃO DA POLÍTICA NACIONAL DE EDUCAÇÃO DIGITAL EM TIBAU DO SUL/RN: DA SECRETARIA MUNICIPAL DE EDUCAÇÃO À ESCOLA DE PIPA, ENTRE CULTURAS PROFISSIONAIS, TERRITÓRIO E RESISTÊNCIAS</w:t>
       </w:r>
     </w:p>
     <w:p>
@@ -500,7 +500,7 @@
           <w:b/>
           <w:lang w:val="pt-BR"/>
         </w:rPr>
-        <w:t>A ENCENAÇÃO DA POLÍTICA NACIONAL DE EDUCAÇÃO DIGITAL (PNED) EM PIPA/RN: CULTURAS PROFISSIONAIS, TERRITÓRIO E RESISTÊNCIAS NO CONTEXTO DA PRÁTICA</w:t>
+        <w:t>A ENCENAÇÃO DA POLÍTICA NACIONAL DE EDUCAÇÃO DIGITAL EM TIBAU DO SUL/RN: DA SECRETARIA MUNICIPAL DE EDUCAÇÃO À ESCOLA DE PIPA, ENTRE CULTURAS PROFISSIONAIS, TERRITÓRIO E RESISTÊNCIAS</w:t>
       </w:r>
     </w:p>
     <w:p>
@@ -1218,7 +1218,7 @@
             <w:webHidden/>
             <w:lang w:val="pt-BR"/>
           </w:rPr>
-          <w:t>7</w:t>
+          <w:t>8</w:t>
         </w:r>
         <w:r>
           <w:rPr>
@@ -1296,7 +1296,7 @@
             <w:webHidden/>
             <w:lang w:val="pt-BR"/>
           </w:rPr>
-          <w:t>7</w:t>
+          <w:t>8</w:t>
         </w:r>
         <w:r>
           <w:rPr>
@@ -1374,7 +1374,7 @@
             <w:webHidden/>
             <w:lang w:val="pt-BR"/>
           </w:rPr>
-          <w:t>8</w:t>
+          <w:t>9</w:t>
         </w:r>
         <w:r>
           <w:rPr>
@@ -1452,7 +1452,7 @@
             <w:webHidden/>
             <w:lang w:val="pt-BR"/>
           </w:rPr>
-          <w:t>8</w:t>
+          <w:t>10</w:t>
         </w:r>
         <w:r>
           <w:rPr>
@@ -1546,7 +1546,7 @@
             <w:webHidden/>
             <w:lang w:val="pt-BR"/>
           </w:rPr>
-          <w:t>10</w:t>
+          <w:t>11</w:t>
         </w:r>
         <w:r>
           <w:rPr>
@@ -1624,7 +1624,7 @@
             <w:webHidden/>
             <w:lang w:val="pt-BR"/>
           </w:rPr>
-          <w:t>10</w:t>
+          <w:t>11</w:t>
         </w:r>
         <w:r>
           <w:rPr>
@@ -1702,7 +1702,7 @@
             <w:webHidden/>
             <w:lang w:val="pt-BR"/>
           </w:rPr>
-          <w:t>10</w:t>
+          <w:t>12</w:t>
         </w:r>
         <w:r>
           <w:rPr>
@@ -1780,7 +1780,7 @@
             <w:webHidden/>
             <w:lang w:val="pt-BR"/>
           </w:rPr>
-          <w:t>11</w:t>
+          <w:t>12</w:t>
         </w:r>
         <w:r>
           <w:rPr>
@@ -1858,7 +1858,7 @@
             <w:webHidden/>
             <w:lang w:val="pt-BR"/>
           </w:rPr>
-          <w:t>13</w:t>
+          <w:t>14</w:t>
         </w:r>
         <w:r>
           <w:rPr>
@@ -1936,7 +1936,7 @@
             <w:webHidden/>
             <w:lang w:val="pt-BR"/>
           </w:rPr>
-          <w:t>15</w:t>
+          <w:t>16</w:t>
         </w:r>
         <w:r>
           <w:rPr>
@@ -2014,7 +2014,7 @@
             <w:webHidden/>
             <w:lang w:val="pt-BR"/>
           </w:rPr>
-          <w:t>17</w:t>
+          <w:t>18</w:t>
         </w:r>
         <w:r>
           <w:rPr>
@@ -2092,7 +2092,7 @@
             <w:webHidden/>
             <w:lang w:val="pt-BR"/>
           </w:rPr>
-          <w:t>19</w:t>
+          <w:t>20</w:t>
         </w:r>
         <w:r>
           <w:rPr>
@@ -2170,7 +2170,7 @@
             <w:webHidden/>
             <w:lang w:val="pt-BR"/>
           </w:rPr>
-          <w:t>19</w:t>
+          <w:t>20</w:t>
         </w:r>
         <w:r>
           <w:rPr>
@@ -2248,7 +2248,7 @@
             <w:webHidden/>
             <w:lang w:val="pt-BR"/>
           </w:rPr>
-          <w:t>19</w:t>
+          <w:t>21</w:t>
         </w:r>
         <w:r>
           <w:rPr>
@@ -2326,7 +2326,7 @@
             <w:webHidden/>
             <w:lang w:val="pt-BR"/>
           </w:rPr>
-          <w:t>21</w:t>
+          <w:t>22</w:t>
         </w:r>
         <w:r>
           <w:rPr>
@@ -2357,7 +2357,7 @@
             <w:noProof/>
             <w:lang w:val="pt-BR"/>
           </w:rPr>
-          <w:t>10.1 PRIMEIRO MOVIMENTO: ANÁLISE DOCUMENTAL</w:t>
+          <w:t>10.1 PRIMEIRO MOVIMENTO: ANÁLISE DOCUMENTAL, DA REDE À ESCOLA</w:t>
         </w:r>
         <w:r>
           <w:rPr>
@@ -2404,7 +2404,7 @@
             <w:webHidden/>
             <w:lang w:val="pt-BR"/>
           </w:rPr>
-          <w:t>21</w:t>
+          <w:t>22</w:t>
         </w:r>
         <w:r>
           <w:rPr>
@@ -2435,7 +2435,7 @@
             <w:noProof/>
             <w:lang w:val="pt-BR"/>
           </w:rPr>
-          <w:t>10.2 SEGUNDO MOVIMENTO: REGISTRO ICONOGRÁFICO E LEITURA DO TERRITÓRIO</w:t>
+          <w:t>10.2 SEGUNDO MOVIMENTO: LEITURA DO TERRITÓRIO MUNICIPAL E REGISTRO ICONOGRÁFICO</w:t>
         </w:r>
         <w:r>
           <w:rPr>
@@ -2482,7 +2482,7 @@
             <w:webHidden/>
             <w:lang w:val="pt-BR"/>
           </w:rPr>
-          <w:t>21</w:t>
+          <w:t>22</w:t>
         </w:r>
         <w:r>
           <w:rPr>
@@ -2560,7 +2560,7 @@
             <w:webHidden/>
             <w:lang w:val="pt-BR"/>
           </w:rPr>
-          <w:t>22</w:t>
+          <w:t>23</w:t>
         </w:r>
         <w:r>
           <w:rPr>
@@ -2591,7 +2591,7 @@
             <w:noProof/>
             <w:lang w:val="pt-BR"/>
           </w:rPr>
-          <w:t>10.4 QUARTO MOVIMENTO: ENTREVISTAS SEMIESTRUTURADAS</w:t>
+          <w:t>10.4 QUARTO MOVIMENTO: ENTREVISTAS, DA SECRETARIA À ESCOLA</w:t>
         </w:r>
         <w:r>
           <w:rPr>
@@ -2638,7 +2638,7 @@
             <w:webHidden/>
             <w:lang w:val="pt-BR"/>
           </w:rPr>
-          <w:t>22</w:t>
+          <w:t>23</w:t>
         </w:r>
         <w:r>
           <w:rPr>
@@ -2716,7 +2716,7 @@
             <w:webHidden/>
             <w:lang w:val="pt-BR"/>
           </w:rPr>
-          <w:t>22</w:t>
+          <w:t>24</w:t>
         </w:r>
         <w:r>
           <w:rPr>
@@ -2794,7 +2794,7 @@
             <w:webHidden/>
             <w:lang w:val="pt-BR"/>
           </w:rPr>
-          <w:t>24</w:t>
+          <w:t>25</w:t>
         </w:r>
         <w:r>
           <w:rPr>
@@ -2872,7 +2872,7 @@
             <w:webHidden/>
             <w:lang w:val="pt-BR"/>
           </w:rPr>
-          <w:t>26</w:t>
+          <w:t>27</w:t>
         </w:r>
         <w:r>
           <w:rPr>
@@ -2950,7 +2950,7 @@
             <w:webHidden/>
             <w:lang w:val="pt-BR"/>
           </w:rPr>
-          <w:t>27</w:t>
+          <w:t>28</w:t>
         </w:r>
         <w:r>
           <w:rPr>
@@ -3028,7 +3028,7 @@
             <w:webHidden/>
             <w:lang w:val="pt-BR"/>
           </w:rPr>
-          <w:t>28</w:t>
+          <w:t>29</w:t>
         </w:r>
         <w:r>
           <w:rPr>
@@ -3101,7 +3101,7 @@
         <w:rPr>
           <w:lang w:val="pt-BR"/>
         </w:rPr>
-        <w:t xml:space="preserve">A Política Nacional de Educação Digital (PNED), instituída pela Lei nº 14.533/2023, chega às escolas por meio do eixo Educação Digital Escolar, e é desse eixo que trata esta tese. Investigamos como os profissionais da educação que atuam nos anos iniciais do Ensino Fundamental, do 1º ao 5º ano, na Escola Municipal Domitila Castelo da Silva, em Pipa, distrito de Tibau do Sul, no litoral sul do Rio Grande do Norte, interpretam, traduzem e recontextualizam essa política no contexto da prática, e que peso têm nesse processo as culturas profissionais, as condições materiais e institucionais da escola e as especificidades socioespaciais do lugar onde ela está. Chamamos de profissionais da educação todos os que, na escola, participam da construção da política: as professoras e os professores do 1º ao 5º ano, a coordenação pedagógica, a direção e os demais profissionais ligados aos processos pedagógicos ou à educação digital. A sala de aula é um dos lugares em que a política ganha forma, ao lado do planejamento, da organização do tempo e dos espaços, dos registros e das conversas entre colegas. Ball, Maguire e Braun (2016, p. 103) descrevem as atuações como “coletivas, criativas e limitadas”, feitas “de malabarismo instável entre as prioridades inconciliáveis, cargas de trabalho impossíveis, movimentos satisficing e entusiasmos pessoais”.</w:t>
+        <w:t>A Política Nacional de Educação Digital (PNED), instituída pela Lei nº 14.533/2023, chega às redes de ensino por meio do eixo Educação Digital Escolar, e é desse eixo que trata esta tese. Investigamos o percurso dessa política no município de Tibau do Sul, no litoral sul do Rio Grande do Norte, da Secretaria Municipal de Educação até a Escola Municipal Domitila Castelo da Silva, em Pipa. O percurso tem a forma de um funil. Começa na rede municipal, onde a política nacional é recebida, interpretada e convertida em planos, formações e orientações para escolas situadas em realidades muito diferentes, e chega à escola, onde os profissionais da educação que atuam nos anos iniciais do Ensino Fundamental, do 1º ao 5º ano, a interpretam, traduzem e recontextualizam no contexto da prática. Interessa-nos saber se e como a Secretaria considera a diversidade do território municipal ao traduzir a política e que peso têm, na escola, as culturas profissionais, as condições materiais e institucionais e as especificidades do lugar. Chamamos de profissionais da educação todos os que, na escola, participam da construção da política: as professoras e os professores do 1º ao 5º ano, a coordenação pedagógica, a direção e os demais profissionais ligados aos processos pedagógicos ou à educação digital. A sala de aula é um dos lugares em que a política ganha forma, ao lado do planejamento, da organização do tempo e dos espaços, dos registros e das conversas entre colegas. Ball, Maguire e Braun (2016, p. 103) descrevem as atuações como “coletivas, criativas e limitadas”, feitas “de malabarismo instável entre as prioridades inconciliáveis, cargas de trabalho impossíveis, movimentos satisficing e entusiasmos pessoais”.</w:t>
       </w:r>
     </w:p>
     <w:p>
@@ -3117,7 +3117,7 @@
         <w:rPr>
           <w:lang w:val="pt-BR"/>
         </w:rPr>
-        <w:t xml:space="preserve">A escolha da escola e do território responde a razões que ultrapassam a delimitação do campo. Uma política de alcance nacional, ao chegar a uma escola concreta, encontra uma história, um prédio, equipamentos que existem ou que faltam, profissionais com trajetórias e modos próprios de trabalhar e crianças que vêm de famílias e de ruas determinadas. Rizvi e Kemmis, citados por Bowe, Ball e Gold, já observavam que os que participam de um programa no nível da escola o interpretam “em relação aos meios de que dispõem e às formas de trabalho que preferem” (RIZVI; KEMMIS, 1987, p. 21 apud BOWE; BALL; GOLD, 1992, p. 22, tradução nossa). Em Pipa, esse encontro tem contornos particulares. O distrito onde pousadas, restaurantes e passeios se vendem pela internet é o mesmo de onde as crianças saem, pela manhã, para salas de aula que, nos registros feitos para esta pesquisa, tinham carteiras enfileiradas, alfabeto móvel feito à mão e nenhuma tela. A pesquisadora convive com Pipa há cerca de duas décadas, trabalha há dezoito anos na rede municipal de Tibau do Sul e conhece essa paisagem de perto. A proximidade exige vigilância metodológica, no sentido da reflexividade que Braun e Clarke (2019) pedem a quem analisa, e foi dela que nasceu a pergunta sobre o que acontece com uma política nacional quando encontra uma escola situada, seus profissionais, suas condições e seu território.</w:t>
+        <w:t>A escolha do município e da escola responde a razões que ultrapassam a delimitação do campo. Tibau do Sul reúne a sede, a praia turística de Pipa, a comunidade quilombola de Sibaúma e povoados de feição rural, com realidades muito distintas de um lugar para outro. Uma política de alcance nacional, ao chegar a uma rede assim, precisa ser traduzida para escolas que não partilham as mesmas condições, e é na Secretaria Municipal de Educação que essa tradução começa. Ao chegar a uma escola concreta, a política encontra uma história, um prédio, equipamentos que existem ou que faltam, profissionais com trajetórias e modos próprios de trabalhar e crianças que vêm de famílias e de ruas determinadas. Rizvi e Kemmis, citados por Bowe, Ball e Gold, já observavam que os que participam de um programa no nível da escola o interpretam “em relação aos meios de que dispõem e às formas de trabalho que preferem” (RIZVI; KEMMIS, 1987, p. 21 apud BOWE; BALL; GOLD, 1992, p. 22, tradução nossa). Em Pipa, esse encontro tem contornos particulares. A localidade onde pousadas, restaurantes e passeios se vendem pela internet é a mesma de onde as crianças saem, pela manhã, para salas de aula que, nos registros feitos para esta pesquisa, tinham carteiras enfileiradas, alfabeto móvel feito à mão e nenhuma tela. A pesquisadora convive com Pipa há cerca de duas décadas, trabalha há dezoito anos na rede municipal de Tibau do Sul e conhece essa paisagem de perto. A proximidade exige vigilância metodológica, no sentido da reflexividade que Braun e Clarke (2019) pedem a quem analisa, e foi dela que nasceu a pergunta sobre o que acontece com uma política nacional quando passa por uma rede municipal diversa e encontra uma escola situada, seus profissionais, suas condições e seu território.</w:t>
       </w:r>
     </w:p>
     <w:p>
@@ -3183,7 +3183,7 @@
         <w:rPr>
           <w:lang w:val="pt-BR"/>
         </w:rPr>
-        <w:t xml:space="preserve">A pergunta central da pesquisa é a seguinte: como os profissionais da educação encenam e recontextualizam a Política Nacional de Educação Digital no contexto da prática da Escola Municipal Domitila Castelo da Silva, em Pipa (RN), e como as culturas profissionais, as condições materiais e institucionais da escola e as especificidades socioespaciais do território atravessam esse processo, produzindo diferentes formas de atuação, entre as quais podem emergir acomodações, negociações, ressignificações e resistências?</w:t>
+        <w:t>A pergunta central da pesquisa é a seguinte: como a Política Nacional de Educação Digital é recontextualizada pela Secretaria Municipal de Educação de Tibau do Sul (RN), num território municipal que reúne áreas urbanas e rurais, povoados com realidades distintas e uma comunidade quilombola, e como essa recontextualização chega à Escola Municipal Domitila Castelo da Silva, em Pipa, onde os profissionais da educação a encenam, atravessados pelas culturas profissionais, pelas condições materiais e institucionais da escola e pelas especificidades do lugar, produzindo diferentes formas de atuação, entre as quais podem emergir acomodações, negociações, ressignificações e resistências?</w:t>
       </w:r>
     </w:p>
     <w:p>
@@ -3199,7 +3199,7 @@
         <w:rPr>
           <w:lang w:val="pt-BR"/>
         </w:rPr>
-        <w:t xml:space="preserve">Formulamos a questão de modo a manter aberto o seu resultado. Ainda não sabemos se a PNED será acolhida, adaptada, posta de lado ou contestada pelos profissionais da escola, e pressupor qualquer uma dessas respostas comprometeria a investigação antes de ela começar. Buscamos conhecer as maneiras de agir diante da política e as condições que tornam algumas delas possíveis e outras pouco prováveis. A teoria da atuação sustenta essa abertura, já que as políticas “raramente ditam ou determinam a prática, mas algumas mais do que outras estreitam a gama de respostas criativas” (BALL; MAGUIRE; BRAUN, 2016, p. 14). A resistência, nomeada no título, entra nesse quadro como possibilidade de interesse da pesquisa, que poderá aparecer ou não nos dados. Se aparecer, será lida em relação às condições em que se constitui, às demandas a que responde e aos efeitos que produz no cotidiano escolar. A pergunta se estende, por isso, aos processos pelos quais a política adquire, no dia a dia da escola, sentidos e formas de existência diversos, para além da verificação de seu cumprimento.</w:t>
+        <w:t>Formulamos a questão de modo a manter aberto o seu resultado. Ainda não sabemos se a PNED será acolhida, adaptada, posta de lado ou contestada pela Secretaria e pelos profissionais da escola, e pressupor qualquer uma dessas respostas comprometeria a investigação antes de ela começar. Buscamos conhecer as maneiras de agir diante da política e as condições que tornam algumas delas possíveis e outras pouco prováveis. A teoria da atuação sustenta essa abertura, já que as políticas “raramente ditam ou determinam a prática, mas algumas mais do que outras estreitam a gama de respostas criativas” (BALL; MAGUIRE; BRAUN, 2016, p. 14). A resistência, nomeada no título, entra nesse quadro como possibilidade de interesse da pesquisa, que poderá aparecer ou não nos dados. Se aparecer, será lida em relação às condições em que se constitui, às demandas a que responde e aos efeitos que produz no cotidiano escolar. A pergunta se estende, por isso, aos processos pelos quais a política adquire, no dia a dia da escola, sentidos e formas de existência diversos, para além da verificação de seu cumprimento.</w:t>
       </w:r>
     </w:p>
     <w:p>
@@ -3251,7 +3251,7 @@
         <w:rPr>
           <w:lang w:val="pt-BR"/>
         </w:rPr>
-        <w:t xml:space="preserve">Analisar como os profissionais da educação encenam e recontextualizam a Política Nacional de Educação Digital no contexto da prática da Escola Municipal Domitila Castelo da Silva, em Pipa (RN), considerando as relações entre a política, as culturas profissionais, as condições materiais e institucionais da escola e as especificidades socioespaciais do território.</w:t>
+        <w:t>Analisar a recontextualização da Política Nacional de Educação Digital da Secretaria Municipal de Educação de Tibau do Sul até o contexto da prática da Escola Municipal Domitila Castelo da Silva, em Pipa, considerando a diversidade socioespacial do território municipal, as culturas profissionais e as condições materiais e institucionais da rede e da escola.</w:t>
       </w:r>
     </w:p>
     <w:p>
@@ -3284,7 +3284,7 @@
         <w:rPr>
           <w:lang w:val="pt-BR"/>
         </w:rPr>
-        <w:t>a) compreender como os diferentes profissionais da educação interpretam os textos da PNED e os discursos sobre educação digital, considerando suas experiências, crenças, valores e formas de organização do trabalho;</w:t>
+        <w:t>a) analisar a recontextualização da PNED pela Secretaria Municipal de Educação em planos, currículos, formações e orientações para a rede, considerando as especificidades das localidades do município, entre elas as áreas rurais e a comunidade quilombola de Sibaúma;</w:t>
       </w:r>
     </w:p>
     <w:p>
@@ -3300,7 +3300,7 @@
         <w:rPr>
           <w:lang w:val="pt-BR"/>
         </w:rPr>
-        <w:t>b) analisar como as condições materiais e institucionais da escola, articuladas às especificidades socioespaciais do território, atravessam os processos de tradução e recontextualização da PNED em ações, escolhas e práticas cotidianas;</w:t>
+        <w:t>b) compreender a interpretação da PNED e das orientações municipais pelos profissionais da escola, à luz de suas experiências, crenças, valores e formas de organização do trabalho;</w:t>
       </w:r>
     </w:p>
     <w:p>
@@ -3316,7 +3316,7 @@
         <w:rPr>
           <w:lang w:val="pt-BR"/>
         </w:rPr>
-        <w:t>c) identificar as diferentes formas de atuação produzidas diante da política, com atenção às situações em que emergem adesão, acomodação, adaptação, omissão seletiva, negociação, ressignificação ou resistência;</w:t>
+        <w:t>c) examinar a relação entre as condições materiais e institucionais da escola, articuladas às especificidades de Pipa no território municipal, e a tradução da política em ações, escolhas e práticas cotidianas;</w:t>
       </w:r>
     </w:p>
     <w:p>
@@ -3332,7 +3332,7 @@
         <w:rPr>
           <w:lang w:val="pt-BR"/>
         </w:rPr>
-        <w:t>d) discutir as implicações das diferentes formas de encenação da PNED para a educação digital das crianças, considerando as possibilidades de provisão, proteção e participação no ambiente digital.</w:t>
+        <w:t>d) identificar as formas de atuação produzidas diante da política e das orientações municipais, da adesão à resistência, e suas implicações para a provisão, a proteção e a participação das crianças no ambiente digital.</w:t>
       </w:r>
     </w:p>
     <w:p>
@@ -3348,7 +3348,7 @@
         <w:rPr>
           <w:lang w:val="pt-BR"/>
         </w:rPr>
-        <w:t xml:space="preserve">Os quatro objetivos acompanham o caminho que a política percorre até chegar às crianças. O primeiro se detém nos sujeitos e no modo como leem a política a partir do que já sabem, acreditam e praticam, e por isso dialoga com a discussão de Hargreaves (2005) sobre as culturas do trabalho docente. O segundo leva essa leitura para as condições em que ela acontece, dentro da escola e no território, e é nele que Pipa entra como dimensão do contexto da política, naquilo que Ball, Maguire e Braun (2016, p. 38) chamam de contextos situados, que incluem a localidade, as histórias escolares e as matrículas. O terceiro reúne os dois anteriores para perguntar o que os profissionais efetivamente fazem com a PNED, sem estabelecer previamente qual forma de atuação deve prevalecer. O quarto acompanha a política até as crianças, a quem ela se dirige e em nome de quem se justifica, e examina como as formas de encenação identificadas ampliam, limitam ou reorganizam as possibilidades de provisão, proteção e participação no ambiente digital (ONU, 2021).</w:t>
+        <w:t>Os quatro objetivos acompanham, em forma de funil, o caminho que a política percorre até chegar às crianças. O primeiro se detém na rede municipal e pergunta como a Secretaria converte a PNED em planos, formações e orientações e se esses materiais consideram as diferenças entre as localidades do município, das áreas rurais à comunidade quilombola de Sibaúma; é nele que a dimensão externa do contexto ganha fonte própria. O segundo chega aos sujeitos da escola e ao modo como leem a política e as orientações municipais a partir do que já sabem, acreditam e praticam, e por isso dialoga com a discussão de Hargreaves (2005) sobre as culturas do trabalho docente. O terceiro leva essa leitura às condições em que ela acontece, dentro da escola e em Pipa, naquilo que Ball, Maguire e Braun (2016, p. 38) chamam de contextos situados, que incluem a localidade, as histórias escolares e as matrículas. O quarto reúne os anteriores para perguntar o que os profissionais efetivamente fazem com a PNED, sem estabelecer previamente qual forma de atuação deve prevalecer, e acompanha a política até as crianças, a quem ela se dirige e em nome de quem se justifica, examinando como essas formas de atuação ampliam, limitam ou reorganizam as possibilidades de provisão, proteção e participação no ambiente digital (ONU, 2021).</w:t>
       </w:r>
     </w:p>
     <w:p>
@@ -3399,7 +3399,7 @@
         <w:rPr>
           <w:lang w:val="pt-BR"/>
         </w:rPr>
-        <w:t xml:space="preserve">A pesquisa acontece no momento em que esse conjunto de normas começa a chegar às redes e às escolas. Em Tibau do Sul, essa chegada passa pela Secretaria Municipal de Educação, por formações, documentos curriculares e orientações que a escola recebe, lê e precisa transformar em trabalho com as crianças. Registrar a presença ou a ausência das orientações da PNED na Escola Municipal Domitila Castelo da Silva diria pouco sobre esse processo, pois, no contexto da prática, “a política não é simplesmente recebida e implementada nesta arena, ao contrário, ela está sujeita à interpretação e então é ‘recriada’” (BOWE; BALL; GOLD, 1992, p. 22, tradução nossa). Interessa-nos compreender como uma política pensada em escala nacional encontra uma escola de pequeno porte, situada num território com particularidades sociais, econômicas, culturais e tecnológicas, e o que resulta desse encontro. O ineditismo da proposta se mostra em três planos que se apoiam mutuamente: o tempo e o objeto da pesquisa, o lugar do território na análise e a articulação teórica que a sustenta.</w:t>
+        <w:t>A pesquisa acontece no momento em que esse conjunto de normas começa a chegar às redes e às escolas. Em Tibau do Sul, essa chegada passa pela Secretaria Municipal de Educação, que recebe a política, elabora planos e orientações para a rede e organiza as formações, e só depois alcança as escolas, que leem esse material e precisam transformá-lo em trabalho com as crianças. Registrar a presença ou a ausência das orientações da PNED na rede ou na escola diria pouco sobre esse processo, pois, no contexto da prática, “a política não é simplesmente recebida e implementada nesta arena, ao contrário, ela está sujeita à interpretação e então é ‘recriada’” (BOWE; BALL; GOLD, 1992, p. 22, tradução nossa). Interessa-nos compreender como uma política pensada em escala nacional é traduzida por uma rede municipal de pequeno porte, num território com particularidades sociais, econômicas, culturais e tecnológicas que variam de uma localidade para outra, e o que resulta desse percurso quando ele chega a uma escola. O ineditismo da proposta se mostra em três planos que se apoiam mutuamente: o tempo e o objeto da pesquisa, o lugar do território na análise e a articulação teórica que a sustenta.</w:t>
       </w:r>
     </w:p>
     <w:p>
@@ -3432,7 +3432,7 @@
         <w:rPr>
           <w:lang w:val="pt-BR"/>
         </w:rPr>
-        <w:t xml:space="preserve">A pesquisa acompanha a chegada da PNED ao cotidiano escolar no período em que a educação digital e midiática começa a ser incorporada aos currículos de modo mais sistemático. Na Revisão Sistemática de Literatura (RSL) realizada para esta tese, as buscas em sete bases retornaram 176 registros e resultaram num corpus de nove estudos, publicados entre 2021 e 2024. Nenhum deles se dedica especificamente à PNED, e nenhum investiga a atuação dessa política numa rede municipal de pequeno porte. A relevância do estudo está na possibilidade de documentar um momento inicial de tradução de uma política nacional no interior de uma escola específica, acompanhando as mediações, as escolhas e as tensões que esse processo produz enquanto ele ainda está em curso. Ball (2011, p. 38) lembra que a abordagem da trajetória “capta as formas pelas quais as políticas evoluem, se modificam e decaem ao longo do tempo e do espaço, assim como as suas incoerências”, e acompanhar a PNED desde a sua chegada permite registrar esse movimento na escala de uma escola.</w:t>
+        <w:t>A pesquisa acompanha a chegada da PNED ao cotidiano escolar no período em que a educação digital e midiática começa a ser incorporada aos currículos de modo mais sistemático. Na Revisão Sistemática de Literatura (RSL) realizada para esta tese, as buscas em sete bases retornaram 176 registros e resultaram num corpus de nove estudos, publicados entre 2021 e 2024. Nenhum deles se dedica especificamente à PNED, e nenhum investiga a atuação dessa política numa rede municipal de pequeno porte. A relevância do estudo está na possibilidade de documentar um momento inicial de tradução de uma política nacional por uma rede municipal e no interior de uma de suas escolas, acompanhando as mediações, as escolhas e as tensões que esse processo produz enquanto ele ainda está em curso. Ball (2011, p. 38) lembra que a abordagem da trajetória “capta as formas pelas quais as políticas evoluem, se modificam e decaem ao longo do tempo e do espaço, assim como as suas incoerências”, e acompanhar a PNED desde a sua chegada permite registrar esse movimento na escala de uma rede e de uma escola.</w:t>
       </w:r>
     </w:p>
     <w:p>
@@ -3466,7 +3466,7 @@
         <w:rPr>
           <w:lang w:val="pt-BR"/>
         </w:rPr>
-        <w:t xml:space="preserve">Pipa entra nesta pesquisa como parte do contexto em que a política é encenada. O distrito, que na década de 1970 era uma comunidade agrícola e pesqueira e se tornou destino turístico internacional com a chegada dos surfistas, a partir de meados daquela década, e com a divulgação mais intensa iniciada nos anos 1990 (AIRES, 2012, p. 81-82), é hoje marcado pelo turismo, pela circulação de grupos sociais muito diferentes e por experiências desiguais de acesso, de uso e de participação na cultura digital, desigualdade que acompanha a diferenciação, descrita por Santos (2006, p. 163), entre zonas servidas pelos meios de conhecimento e áreas que não dispõem deles. Para ler esse território, partimos de Santos (1999, p. 19), para quem “o território não é uma categoria de análise, a categoria de análise é o território usado”, isto é, o território tomado pelas relações, pelos usos e pelos conflitos que o constituem. Em diálogo com essa perspectiva, Massey (2008, p. 29) compreende o espaço como a esfera da coexistência e da multiplicidade, feita de relações e de trajetórias que se encontram sem formar uma unidade homogênea, e pensa o lugar como “um encontro de trajetórias” (MASSEY, 2008, p. 204), sempre em construção.</w:t>
+        <w:t>Tibau do Sul entra nesta pesquisa como parte do contexto em que a política é encenada, e Pipa, como o lugar onde esse percurso chega à escola. O município tinha 16.929 habitantes no Censo de 2022 (IBGE, 2023) e 11.385 em 2010, quando cerca de 40% da população vivia em área rural (IBGE, 2011) [conferir na tabela do Censo 2010]. Pelo IBGE, é constituído apenas pelo distrito sede, mas o cotidiano se organiza em localidades com feições próprias: a sede, Pipa, Sibaúma, Piau e povoados como Umari, Bela Vista, Manimbu, Munim, Cabeceiras e Pernambuquinho [indicar a fonte da relação de localidades]. Sibaúma é certificada como comunidade remanescente de quilombo pela Fundação Cultural Palmares desde 2005 (Portaria nº 26/2005) [conferir no Diário Oficial da União e indicar a referência], e o Censo de 2022 registrou 903 pessoas quilombolas no município [conferir no Censo 2022]. Pipa, que na década de 1970 era uma comunidade agrícola e pesqueira e se tornou destino turístico internacional com a chegada dos surfistas, a partir de meados daquela década, e com a divulgação mais intensa iniciada nos anos 1990 (AIRES, 2012, p. 81-82), é hoje marcada pelo turismo, pela circulação de grupos sociais muito diferentes e por experiências desiguais de acesso, de uso e de participação na cultura digital. Essas diferenças acompanham a distinção, descrita por Santos (2006, p. 163), entre zonas servidas pelos meios de conhecimento e áreas que não dispõem deles, e atravessam o próprio município.</w:t>
       </w:r>
     </w:p>
     <w:p>
@@ -3482,25 +3482,8 @@
         <w:rPr>
           <w:lang w:val="pt-BR"/>
         </w:rPr>
-        <w:t xml:space="preserve">Com essa leitura, a escola aparece como lugar onde se cruzam experiências sociais e digitais diversas. Na mesma turma podem estar a criança cuja família vive do turismo e convive com celulares, aplicativos e plataformas desde cedo, a criança recém-chegada com pais atraídos pelo setor de serviços e a criança de família nativa, ligada à pesca e às atividades tradicionais da localidade. É o que Massey (2008, p. 203) chama de “esse acabar juntos, o inevitável desafio de negociar um aqui-e-agora”. Com Santos e Massey, perguntamos como as características do território entram nas relações pelas quais a política é interpretada e traduzida, sem atribuir ao lugar o poder de determinar o que a escola faz com ela.</w:t>
-      </w:r>
-    </w:p>
-    <w:p>
-      <w:pPr>
-        <w:pStyle w:val="Ttulo2"/>
-        <w:spacing w:before="0" w:after="0"/>
-        <w:rPr>
-          <w:lang w:val="pt-BR"/>
-        </w:rPr>
-      </w:pPr>
-      <w:bookmarkStart w:id="8" w:name="_Toc241917928"/>
-      <w:r>
-        <w:rPr>
-          <w:lang w:val="pt-BR"/>
-        </w:rPr>
-        <w:t>4.3 INEDITISMO TEÓRICO-CONCEITUAL</w:t>
-      </w:r>
-      <w:bookmarkEnd w:id="8"/>
+        <w:t>Para ler esse território, partimos de Santos (1999, p. 19), para quem “o território não é uma categoria de análise, a categoria de análise é o território usado”, isto é, o território tomado pelas relações, pelos usos e pelos conflitos que o constituem. Em diálogo com essa perspectiva, Massey (2008, p. 29) compreende o espaço como a esfera da coexistência e da multiplicidade, feita de relações e de trajetórias que se encontram sem formar uma unidade homogênea, e pensa o lugar como “um encontro de trajetórias” (MASSEY, 2008, p. 204), sempre em construção.</w:t>
+      </w:r>
     </w:p>
     <w:p>
       <w:pPr>
@@ -3515,8 +3498,25 @@
         <w:rPr>
           <w:lang w:val="pt-BR"/>
         </w:rPr>
-        <w:t xml:space="preserve">No plano teórico-conceitual, a proposta articula a teoria da atuação, a discussão sobre culturas profissionais, a atenção à dimensão material da escola e a leitura do território para compreender uma política de educação digital. Os estudos reunidos na RSL reconhecem que os profissionais da educação interpretam as políticas e lhes dão forma, e examinam pouco as culturas profissionais que filtram essa interpretação e as condições em que ela se produz. Ao reunir esses referenciais, a pesquisa pode tratar a distância entre o que a política prescreve e o que acontece na escola como parte de uma relação política entre texto, contexto e sujeitos, evitando classificá-la de imediato como falha, incapacidade ou resistência, cuidado que Ball (2011, p. 36, 46) recomenda ao criticar tanto as pesquisas que localizam o problema apenas na escola e no professor quanto as que transformam os sujeitos pesquisados em heróis.</w:t>
-      </w:r>
+        <w:t>Com essa leitura, a rede municipal aparece como um conjunto de escolas situadas em lugares que não vivem a mesma relação com as tecnologias, e a escola de Pipa, como lugar onde se cruzam experiências sociais e digitais diversas. Na mesma turma podem estar a criança cuja família vive do turismo e convive com celulares, aplicativos e plataformas desde cedo, a criança recém-chegada com pais atraídos pelo setor de serviços e a criança de família nativa, ligada à pesca e às atividades tradicionais da localidade. É o que Massey (2008, p. 203) chama de “esse acabar juntos, o inevitável desafio de negociar um aqui-e-agora”. Com Santos e Massey, perguntamos se e como a Secretaria considera essas diferenças ao traduzir a política e como as características do território entram nas relações pelas quais ela é interpretada na escola, sem atribuir ao lugar o poder de determinar o que a rede e a escola fazem com ela.</w:t>
+      </w:r>
+    </w:p>
+    <w:p>
+      <w:pPr>
+        <w:pStyle w:val="Ttulo2"/>
+        <w:spacing w:before="0" w:after="0"/>
+        <w:rPr>
+          <w:lang w:val="pt-BR"/>
+        </w:rPr>
+      </w:pPr>
+      <w:bookmarkStart w:id="8" w:name="_Toc241917928"/>
+      <w:r>
+        <w:rPr>
+          <w:lang w:val="pt-BR"/>
+        </w:rPr>
+        <w:t>4.3 INEDITISMO TEÓRICO-CONCEITUAL</w:t>
+      </w:r>
+      <w:bookmarkEnd w:id="8"/>
     </w:p>
     <w:p>
       <w:pPr>
@@ -3531,6 +3531,22 @@
         <w:rPr>
           <w:lang w:val="pt-BR"/>
         </w:rPr>
+        <w:t xml:space="preserve">No plano teórico-conceitual, a proposta articula a teoria da atuação, a discussão sobre culturas profissionais, a atenção à dimensão material da escola e a leitura do território para compreender uma política de educação digital. Os estudos reunidos na RSL reconhecem que os profissionais da educação interpretam as políticas e lhes dão forma, e examinam pouco as culturas profissionais que filtram essa interpretação e as condições em que ela se produz. Ao reunir esses referenciais, a pesquisa pode tratar a distância entre o que a política prescreve e o que acontece na escola como parte de uma relação política entre texto, contexto e sujeitos, evitando classificá-la de imediato como falha, incapacidade ou resistência, cuidado que Ball (2011, p. 36, 46) recomenda ao criticar tanto as pesquisas que localizam o problema apenas na escola e no professor quanto as que transformam os sujeitos pesquisados em heróis.</w:t>
+      </w:r>
+    </w:p>
+    <w:p>
+      <w:pPr>
+        <w:spacing w:after="0" w:line="360" w:lineRule="auto"/>
+        <w:ind w:firstLine="709"/>
+        <w:jc w:val="both"/>
+        <w:rPr>
+          <w:lang w:val="pt-BR"/>
+        </w:rPr>
+      </w:pPr>
+      <w:r>
+        <w:rPr>
+          <w:lang w:val="pt-BR"/>
+        </w:rPr>
         <w:t xml:space="preserve">É nessa distância que procuraremos compreender o surgimento de diferentes formas de atuação, inclusive das resistências, que entendemos como possibilidade produzida diante de exigências, condições, valores, limites ou conflitos específicos, sem lhes atribuir de antemão um sentido negativo. Do mesmo diálogo entre referenciais nasce a formulação “habitar o digital”, que a tese propõe como possibilidade analítica para nomear as maneiras pelas quais as tecnologias digitais atravessam os espaços, as relações e as práticas cotidianas de um território, produzindo possibilidades desiguais de acesso, participação e apropriação. Sua construção se apoia na tradição do habitar e nas leituras de Santos e Massey discutidas nas seções 6 e 7.</w:t>
       </w:r>
     </w:p>
@@ -3566,7 +3582,7 @@
         <w:rPr>
           <w:lang w:val="pt-BR"/>
         </w:rPr>
-        <w:t xml:space="preserve">O referencial acompanha a política no caminho que a questão descreve, dos textos que a instituem até a escola, os profissionais, o território e as crianças. A Abordagem do Ciclo de Políticas (ACP) oferece a matriz para compreender a trajetória da PNED, e a teoria da atuação, o dispositivo para analisar como a escola a coloca em ação. A discussão sobre culturas profissionais e performatividade ajuda a compreender o que filtra essa atuação e o que a pressiona, e as leituras de território, técnica e lugar, apresentadas na seção 6, permitem inscrever Pipa na análise.</w:t>
+        <w:t>O referencial acompanha a política no caminho que a questão descreve, dos textos que a instituem à rede municipal e desta à escola, aos profissionais, ao território e às crianças. A Abordagem do Ciclo de Políticas (ACP) oferece a matriz para compreender a trajetória da PNED, e a teoria da atuação, o dispositivo para analisar como a rede e a escola a colocam em ação. A discussão sobre culturas profissionais e performatividade ajuda a compreender o que filtra essa atuação e o que a pressiona, e as leituras de território, técnica e lugar, apresentadas na seção 6, permitem inscrever Tibau do Sul e Pipa na análise.</w:t>
       </w:r>
     </w:p>
     <w:p>
@@ -3635,7 +3651,7 @@
         <w:rPr>
           <w:lang w:val="pt-BR"/>
         </w:rPr>
-        <w:t xml:space="preserve">Nesta pesquisa, o contexto da prática ocupa posição privilegiada. Tomamos a Escola Municipal Domitila Castelo da Silva como um espaço em que os textos da PNED são lidos, interpretados, traduzidos e recriados por quem trabalha nela, e com isso tratamos a política como algo em movimento, cuja forma final só se conhece quando ela encontra as pessoas e as condições de um lugar. Os contextos de influência e de produção do texto entram na análise como referência para essa leitura, pois é em relação ao que a lei pede, e aos meios que oferece, que os profissionais produzem sentidos. Bowe, Ball e Gold (1992, p. 22, tradução nossa) formulam essa premissa ao afirmar que os profissionais que atuam no contexto da prática “não se deparam com os textos das políticas como leitores ingênuos; eles chegam a eles com suas próprias histórias, experiências, valores e propósitos, e têm interesses próprios implicados no significado da política”.</w:t>
+        <w:t>Nesta pesquisa, o contexto da prática ocupa posição privilegiada, e o tomamos em duas escalas encadeadas. A primeira é a rede municipal: a Secretaria Municipal de Educação recebe os textos da PNED, os lê e os converte em planos, formações e orientações, e com isso produz, ela mesma, uma tradução da política, que pode considerar ou deixar de lado as diferenças entre as localidades do município. A segunda é a Escola Municipal Domitila Castelo da Silva, onde esses textos, nacionais e municipais, são lidos, interpretados, traduzidos e recriados por quem trabalha nela. Tratamos assim a política como algo em movimento, cuja forma final só se conhece quando ela encontra as pessoas e as condições de um lugar. Os contextos de influência e de produção do texto entram na análise como referência para essa leitura, pois é em relação ao que a lei pede, e aos meios que oferece, que a rede e os profissionais produzem sentidos. Bowe, Ball e Gold (1992, p. 22, tradução nossa) formulam essa premissa ao afirmar que os profissionais que atuam no contexto da prática “não se deparam com os textos das políticas como leitores ingênuos; eles chegam a eles com suas próprias histórias, experiências, valores e propósitos, e têm interesses próprios implicados no significado da política”.</w:t>
       </w:r>
     </w:p>
     <w:p>
@@ -3668,7 +3684,7 @@
         <w:rPr>
           <w:lang w:val="pt-BR"/>
         </w:rPr>
-        <w:t xml:space="preserve">A teoria da atuação de Ball, Maguire e Braun (2016) é o principal dispositivo analítico da pesquisa. Os autores voltam a atenção para os processos pelos quais as escolas colocam as políticas em ação e mostram que esses processos dependem das condições concretas de cada instituição. Para examiná-las, propõem quatro dimensões do contexto (BALL; MAGUIRE; BRAUN, 2016, p. 38), que orientarão a construção da análise. A dimensão situacional reúne a história da escola, sua localização e a composição de seu público, e é por ela que o território de Pipa e a trajetória da Escola </w:t>
+        <w:t xml:space="preserve">A teoria da atuação de Ball, Maguire e Braun (2016) é o principal dispositivo analítico da pesquisa. Os autores voltam a atenção para os processos pelos quais as escolas colocam as políticas em ação e mostram que esses processos dependem das condições concretas de cada instituição. Para examiná-las, propõem quatro dimensões do contexto (BALL; MAGUIRE; BRAUN, 2016, p. 38), que orientarão a construção da análise. A dimensão situacional reúne a história da escola, sua localização e a composição de seu público, e é por ela que o território municipal, Pipa e a trajetória da Escola </w:t>
       </w:r>
       <w:r>
         <w:rPr>
@@ -3707,7 +3723,7 @@
         <w:rPr>
           <w:lang w:val="pt-BR"/>
         </w:rPr>
-        <w:t>É pela dimensão externa que se justifica a participação de um técnico da Secretaria Municipal de Educação. Em Tibau do Sul, as orientações nacionais chegam à escola depois de passar pela gestão municipal, que as recebe, interpreta e encaminha às unidades. Ouvir quem acompanha a educação digital na Secretaria permitirá compreender essa mediação e o que dela chega à escola. A participação do técnico terá função complementar, e o centro do estudo de caso permanece na escola, onde a política é encenada no trabalho com as crianças.</w:t>
+        <w:t>É pela dimensão externa que a Secretaria Municipal de Educação entra no estudo, e nesta pesquisa ela ganha lugar próprio. Em Tibau do Sul, as orientações nacionais chegam à escola depois de passar pela gestão municipal, que as recebe, interpreta e encaminha às unidades. Segundo o técnico da Secretaria, existe um plano elaborado para a rede como um todo [indicar nome, data e instância de aprovação do documento], e é a partir dele, das formações e das orientações municipais que a análise acompanhará a chegada da política à escola. Ouvir quem acompanha a educação digital na Secretaria permitirá compreender essa mediação, saber se e como ela considera a diversidade das localidades do município e identificar o que dela chega à escola de Pipa.</w:t>
       </w:r>
     </w:p>
     <w:p>
@@ -3816,7 +3832,7 @@
         <w:rPr>
           <w:lang w:val="pt-BR"/>
         </w:rPr>
-        <w:t xml:space="preserve">Para inscrever Pipa na análise, recorremos a Milton Santos e a Doreen Massey. Em </w:t>
+        <w:t xml:space="preserve">Para inscrever Tibau do Sul e Pipa na análise, recorremos a Milton Santos e a Doreen Massey. Em </w:t>
       </w:r>
       <w:r>
         <w:rPr>
@@ -3876,7 +3892,7 @@
         <w:rPr>
           <w:lang w:val="pt-BR"/>
         </w:rPr>
-        <w:t xml:space="preserve">Massey (2008) complementa essa leitura ao compreender o espaço “como a esfera da possibilidade da existência da multiplicidade, no sentido da pluralidade contemporânea, como a esfera na qual distintas trajetórias coexistem” (MASSEY, 2008, p. 29). Para a autora, o lugar é atravessado por trajetórias diversas e permanece aberto ao encontro e à negociação. A transformação de Pipa ganha, com ela, outra nitidez. A comunidade agrícola e pesqueira da década de 1970, sem energia elétrica, água encanada e boas vias de acesso, já recebia veranistas de famílias da região, passou a receber surfistas a partir de meados daquela década e, com a divulgação mais intensa do lugar no início dos anos 1990, turistas de várias partes do mundo (AIRES, 2012, p. 80-82). Nesse processo, casas e terrenos de nativos foram vendidos, trocados ou alugados a veranistas, surfistas e estrangeiros (AIRES, 2012, p. 79-80, 84), e os relatos reunidos pela autora incluem trabalhadoras vindas de localidades vizinhas para os serviços ligados ao turismo (AIRES, 2012, p. 16, 87). Aires (2012, p. 10) observa que a população nativa não foi passiva diante dessas mudanças, criando “mecanismos de reformulações materiais e simbólicas”, e que “muitas paisagens ainda revelam materialidades de tempos passados, como inscrição das práticas sociais na construção do lugar”, observação que aproxima a história do distrito da noção de rugosidade. Essas trajetórias se sobrepõem no território e chegam à escola na forma das famílias e das crianças que ela atende.</w:t>
+        <w:t>Massey (2008) complementa essa leitura ao compreender o espaço “como a esfera da possibilidade da existência da multiplicidade, no sentido da pluralidade contemporânea, como a esfera na qual distintas trajetórias coexistem” (MASSEY, 2008, p. 29). Para a autora, o lugar é atravessado por trajetórias diversas e permanece aberto ao encontro e à negociação. A transformação de Pipa ganha, com ela, outra nitidez. A comunidade agrícola e pesqueira da década de 1970, sem energia elétrica, água encanada e boas vias de acesso, já recebia veranistas de famílias da região, passou a receber surfistas a partir de meados daquela década e, com a divulgação mais intensa do lugar no início dos anos 1990, turistas de várias partes do mundo (AIRES, 2012, p. 80-82). Nesse processo, casas e terrenos de nativos foram vendidos, trocados ou alugados a veranistas, surfistas e estrangeiros (AIRES, 2012, p. 79-80, 84), e os relatos reunidos pela autora incluem trabalhadoras vindas de localidades vizinhas para os serviços ligados ao turismo (AIRES, 2012, p. 16, 87). Aires (2012, p. 10) observa que a população nativa não foi passiva diante dessas mudanças, criando “mecanismos de reformulações materiais e simbólicas”, e que “muitas paisagens ainda revelam materialidades de tempos passados, como inscrição das práticas sociais na construção do lugar”, observação que aproxima a história da localidade da noção de rugosidade. Essas trajetórias se sobrepõem no território e chegam à escola na forma das famílias e das crianças que ela atende.</w:t>
       </w:r>
     </w:p>
     <w:p>
@@ -3892,8 +3908,7 @@
         <w:rPr>
           <w:lang w:val="pt-BR"/>
         </w:rPr>
-        <w:lastRenderedPageBreak/>
-        <w:t xml:space="preserve">Com Santos e Massey, Pipa pode ser compreendida ao mesmo tempo como território produzido por tempos e relações diferentes e como lugar de encontro de trajetórias diversas, leitura que, somada à discussão sobre o habitar, sustenta a formulação que a tese propõe para a relação entre o território e as tecnologias digitais.</w:t>
+        <w:t>Com Santos e Massey, Tibau do Sul pode ser compreendido ao mesmo tempo como território produzido por tempos e relações diferentes e como conjunto de lugares onde se encontram trajetórias diversas, da sede às localidades rurais, de Sibaúma a Pipa. Essa leitura pede que a rede municipal seja olhada também pelo modo como distribui seus meios entre esses lugares. A presença de uma comunidade quilombola acrescenta a essa pergunta um marco normativo próprio, as Diretrizes Curriculares Nacionais para a Educação Escolar Quilombola, que orientam o trabalho das escolas situadas em comunidades quilombolas e das que recebem estudantes vindos desses territórios (BRASIL, 2012b) [conferir o alcance no texto da resolução]. Perguntaremos se os planos e as orientações da Secretaria para a educação digital consideram essas especificidades. Essa leitura, somada à discussão sobre o habitar, sustenta a formulação que a tese propõe para a relação entre o território e as tecnologias digitais.</w:t>
       </w:r>
     </w:p>
     <w:p>
@@ -3993,7 +4008,7 @@
         <w:rPr>
           <w:lang w:val="pt-BR"/>
         </w:rPr>
-        <w:t xml:space="preserve">Desse diálogo e das leituras de território da seção anterior resulta a definição que adotamos. Habitar o digital designa, nesta pesquisa, as maneiras pelas quais as tecnologias digitais atravessam os espaços, as relações e as práticas cotidianas de um território, produzindo possibilidades desiguais de acesso, participação e apropriação. Em Pipa, a expressão nomeia uma tensão específica, a coexistência de uma elevada densidade tecnológica nos circuitos econômicos e turísticos do distrito com uma disponibilidade muito mais limitada de tecnologias nos espaços pedagógicos da escola. A formulação dialoga com Santos (2006), porque os objetos técnicos se distribuem de forma desigual no espaço e carregam idades, funções e possibilidades de uso diferentes, e dialoga com Massey (2008), porque as experiências digitais acontecem dentro do espaço social e participam das relações, das trajetórias e das desigualdades que constituem o lugar.</w:t>
+        <w:t>Desse diálogo e das leituras de território da seção anterior resulta a definição que adotamos. Habitar o digital designa, nesta pesquisa, as maneiras pelas quais as tecnologias digitais atravessam os espaços, as relações e as práticas cotidianas de um território, produzindo possibilidades desiguais de acesso, participação e apropriação. No município, a expressão nomeia uma tensão que muda de uma localidade para outra. Em Pipa, ela aparece na coexistência de uma elevada densidade tecnológica nos circuitos econômicos e turísticos com uma disponibilidade muito mais limitada de tecnologias nos espaços pedagógicos da escola; nas localidades rurais e em Sibaúma, as condições de acesso e de uso ainda precisam ser documentadas. A formulação dialoga com Santos (2006), porque os objetos técnicos se distribuem de forma desigual no espaço e carregam idades, funções e possibilidades de uso diferentes, e dialoga com Massey (2008), porque as experiências digitais acontecem dentro do espaço social e participam das relações, das trajetórias e das desigualdades que constituem o lugar.</w:t>
       </w:r>
     </w:p>
     <w:p>
@@ -4009,7 +4024,7 @@
         <w:rPr>
           <w:lang w:val="pt-BR"/>
         </w:rPr>
-        <w:t xml:space="preserve">Santos (2006, p. 163) observa que, com a difusão do meio técnico-científico-informacional, “distinguem-se zonas servidas pelos meios de conhecimento e áreas desprovidas dessa vantagem”, e em Pipa essa distinção atravessa o próprio distrito. Em texto anterior, o autor dá nome a uma tensão que reencontramos em Pipa, a “dissonância entre os usos econômicos e os usos sociais dos mesmos recursos” (SANTOS, 1999, p. 20-21). Massey, por sua vez, impede que a distância entre a escola e os circuitos turísticos seja lida como atraso, ao criticar a operação que “transforma a geografia em história, o espaço em tempo” e “reduz coexistências simultâneas a um lugar na fila da história” (MASSEY, 2008, p. 24). Escola e polo turístico são contemporâneos, separados por relações que a análise precisará explicar.</w:t>
+        <w:t>Santos (2006, p. 163) observa que, com a difusão do meio técnico-científico-informacional, “distinguem-se zonas servidas pelos meios de conhecimento e áreas desprovidas dessa vantagem”, e em Tibau do Sul essa distinção atravessa o próprio município. Em texto anterior, o autor dá nome a uma tensão que reencontramos em Pipa, a “dissonância entre os usos econômicos e os usos sociais dos mesmos recursos” (SANTOS, 1999, p. 20-21). Massey, por sua vez, impede que a distância entre a escola e os circuitos turísticos seja lida como atraso, ao criticar a operação que “transforma a geografia em história, o espaço em tempo” e “reduz coexistências simultâneas a um lugar na fila da história” (MASSEY, 2008, p. 24). Escola e polo turístico são contemporâneos, separados por relações que a análise precisará explicar.</w:t>
       </w:r>
     </w:p>
     <w:p>
@@ -4025,7 +4040,7 @@
         <w:rPr>
           <w:lang w:val="pt-BR"/>
         </w:rPr>
-        <w:t xml:space="preserve">Por essa razão, habitar o digital é, nesta tese, mais do que acesso à internet ou posse de equipamentos. Valente já advertia, no fim dos anos 1990, que “implantar computadores nas escolas sem o devido preparo de professores e da comunidade escolar não trará os benefícios que esperamos” (VALENTE, 1999, p. 83). A expressão orienta duas perguntas, uma voltada ao território e outra à escola. Como se habita o digital quando a tecnologia está intensamente presente em certos circuitos do distrito e pouco presente nos espaços destinados à educação? Que formas de participação, uso, apropriação e experiência digital se tornam possíveis, ou permanecem restritas, para as crianças nessas condições? A formulação será confrontada com os dados e poderá ser aprofundada, revista ou tensionada ao longo da investigação, e a segunda pergunta conduz aos direitos das crianças no ambiente digital.</w:t>
+        <w:t>Por essa razão, habitar o digital é, nesta tese, mais do que acesso à internet ou posse de equipamentos. Valente já advertia, no fim dos anos 1990, que “implantar computadores nas escolas sem o devido preparo de professores e da comunidade escolar não trará os benefícios que esperamos” (VALENTE, 1999, p. 83). A expressão orienta duas perguntas, uma voltada ao território e outra à escola. Como se habita o digital quando a tecnologia está intensamente presente em certos circuitos do município e pouco presente nos espaços destinados à educação, e de que modo isso varia entre as localidades? Que formas de participação, uso, apropriação e experiência digital se tornam possíveis, ou permanecem restritas, para as crianças nessas condições? A formulação será confrontada com os dados e poderá ser aprofundada, revista ou tensionada ao longo da investigação, e a segunda pergunta conduz aos direitos das crianças no ambiente digital.</w:t>
       </w:r>
     </w:p>
     <w:p>
@@ -4108,7 +4123,7 @@
         <w:rPr>
           <w:lang w:val="pt-BR"/>
         </w:rPr>
-        <w:t xml:space="preserve">Em diálogo com esses documentos, organizamos a análise em três dimensões. A provisão diz respeito às condições necessárias para que as crianças tenham acesso significativo à educação digital, como equipamentos, conectividade, tempo e profissionais formados. A proteção envolve a segurança, a privacidade, o cuidado e o enfrentamento dos riscos presentes nos ambientes digitais, e ganha peso quando se considera, com Silveira (2017), que o mercado de dados pessoais se expande justamente sobre o terreno da privacidade. A participação refere-se às possibilidades de as crianças acessarem informação, produzirem, criarem, comunicarem-se, expressarem opiniões e tomarem parte da cultura digital como sujeitos. Freire lembra que não há respeito aos educandos “se não se levam em consideração as condições em que eles vêm existindo, se não se reconhece a importância dos ‘conhecimentos de experiência feitos’ com que chegam à escola” (FREIRE, 2019, p. 62), e a participação começa por esses saberes. Com essas dimensões, buscaremos compreender como as diferentes formas de encenação da PNED na Escola Municipal Domitila Castelo da Silva podem ampliar, limitar ou reorganizar as possibilidades de as crianças de Pipa habitarem o digital.</w:t>
+        <w:t>Em diálogo com esses documentos, organizamos a análise em três dimensões. A provisão diz respeito às condições necessárias para que as crianças tenham acesso significativo à educação digital, como equipamentos, conectividade, tempo e profissionais formados. A proteção envolve a segurança, a privacidade, o cuidado e o enfrentamento dos riscos presentes nos ambientes digitais, e ganha peso quando se considera, com Silveira (2017), que o mercado de dados pessoais se expande justamente sobre o terreno da privacidade. A participação refere-se às possibilidades de as crianças acessarem informação, produzirem, criarem, comunicarem-se, expressarem opiniões e tomarem parte da cultura digital como sujeitos. Freire lembra que não há respeito aos educandos “se não se levam em consideração as condições em que eles vêm existindo, se não se reconhece a importância dos ‘conhecimentos de experiência feitos’ com que chegam à escola” (FREIRE, 2019, p. 62), e a participação começa por esses saberes. Com essas dimensões, buscaremos compreender como as diferentes formas de encenação da PNED na Escola Municipal Domitila Castelo da Silva podem ampliar, limitar ou reorganizar as possibilidades de as crianças atendidas pela escola habitarem o digital.</w:t>
       </w:r>
     </w:p>
     <w:p>
@@ -4160,7 +4175,7 @@
         <w:rPr>
           <w:lang w:val="pt-BR"/>
         </w:rPr>
-        <w:t xml:space="preserve">A pesquisa adota abordagem qualitativa, de caráter interpretativo, por trabalhar com os sentidos, as experiências, os valores, as crenças e as interpretações que os sujeitos produzem num contexto social determinado (MINAYO, 2009). Organiza-se como estudo de caso, cuja unidade central é a encenação da PNED no contexto da prática da Escola Municipal Domitila Castelo da Silva, em Pipa. Yin (2001) recomenda esse desenho para investigar um fenômeno contemporâneo em seu contexto real quando os limites entre um e outro não estão claramente definidos, situação que corresponde à de uma política cuja forma depende das condições da escola e do território que a recebem. A Secretaria Municipal de Educação participa da investigação como dimensão complementar do contexto externo, sem constituir um segundo caso.</w:t>
+        <w:t>A pesquisa adota abordagem qualitativa, de caráter interpretativo, por trabalhar com os sentidos, as experiências, os valores, as crenças e as interpretações que os sujeitos produzem num contexto social determinado (MINAYO, 2009). Organiza-se como estudo de caso único com unidades incorporadas, desenho que Yin (2001) descreve para os casos em que se examinam subunidades dentro de um mesmo caso [indicar a página na edição usada]. O caso é a encenação da PNED na rede municipal de Tibau do Sul, e as unidades de análise são a Secretaria Municipal de Educação, onde a política é traduzida para o município, e a Escola Municipal Domitila Castelo da Silva, em Pipa, onde ela chega ao contexto da prática. O desenho tem a forma de um funil: a análise parte da rede e do território municipal e se estreita até a escola, a única instituição de ensino em que os profissionais serão ouvidos. Yin (2001) recomenda o estudo de caso para investigar um fenômeno contemporâneo em seu contexto real quando os limites entre um e outro não estão claramente definidos, situação que corresponde à de uma política cuja forma depende das condições da rede, da escola e do território que a recebem.</w:t>
       </w:r>
     </w:p>
     <w:p>
@@ -4176,7 +4191,7 @@
         <w:rPr>
           <w:lang w:val="pt-BR"/>
         </w:rPr>
-        <w:t xml:space="preserve">O cotidiano escolar será conhecido por meio dos relatos dos profissionais, dos documentos institucionais, dos registros produzidos pela escola, do registro iconográfico e das informações sobre as condições materiais e institucionais. A pesquisa não realizará observação direta de sala de aula, e essa delimitação estará explícita na análise, para que o que foi narrado, registrado ou documentado não seja tomado pelo que foi observado. Ball, Maguire e Braun (2016, p. 49) adotaram a mesma delimitação no estudo que deu origem à teoria da atuação: “a prática de sala de aula não era foco do estudo [...] nós temos de confiar nos relatos dos professores nessas questões”. A pesquisa será submetida ao Comitê de Ética em Pesquisa como emenda ao protocolo já aprovado, e o trabalho de campo começará somente depois da aprovação dessa emenda, com a assinatura do Termo de Consentimento Livre e Esclarecido, e seguirá as Resoluções nº 466/2012 e nº 510/2016 do Conselho Nacional de Saúde, esta última específica para as Ciências Humanas e Sociais (BRASIL, 2012, 2016). Os nomes dos participantes serão substituídos por pseudônimos, escolhidos por cada um ao assinar o termo, em todas as transcrições, relatórios e publicações.</w:t>
+        <w:t>O cotidiano escolar será conhecido por meio dos relatos dos profissionais, dos documentos institucionais, dos registros produzidos pela escola, do registro iconográfico e das informações sobre as condições materiais e institucionais. A pesquisa não realizará observação direta de sala de aula, e essa delimitação estará explícita na análise, para que o que foi narrado, registrado ou documentado não seja tomado pelo que foi observado. Ball, Maguire e Braun (2016, p. 49) adotaram a mesma delimitação no estudo que deu origem à teoria da atuação: “a prática de sala de aula não era foco do estudo [...] nós temos de confiar nos relatos dos professores nessas questões”. A pesquisa será submetida ao Comitê de Ética em Pesquisa como emenda ao protocolo já aprovado, que incluirá a Secretaria Municipal de Educação como instituição coparticipante e os documentos municipais entre as fontes, e o trabalho de campo começará somente depois da aprovação dessa emenda, com a assinatura do Termo de Consentimento Livre e Esclarecido, e seguirá as Resoluções nº 466/2012 e nº 510/2016 do Conselho Nacional de Saúde, esta última específica para as Ciências Humanas e Sociais (BRASIL, 2012a, 2016). Os nomes dos participantes serão substituídos por pseudônimos, escolhidos por cada um ao assinar o termo, em todas as transcrições, relatórios e publicações.</w:t>
       </w:r>
     </w:p>
     <w:p>
@@ -4271,7 +4286,7 @@
         <w:rPr>
           <w:lang w:val="pt-BR"/>
         </w:rPr>
-        <w:t xml:space="preserve">Participará também um técnico da Secretaria Municipal de Educação, o coordenador de políticas públicas e programas educacionais do município, a quem cabe acompanhar os programas e as orientações que chegam às escolas da rede. Sua participação ajudará a compreender como a política é recebida e traduzida no âmbito municipal antes de chegar ao cotidiano da escola, aproximando o contexto externo do contexto da prática sem deslocar da escola o centro da investigação.</w:t>
+        <w:t>Na Secretaria Municipal de Educação, participará o técnico responsável pelo acompanhamento dos programas e das orientações que chegam às escolas, o coordenador de políticas públicas e programas educacionais do município. Ele será o único participante da Secretaria, e sua participação abre a investigação: permitirá compreender como a política é recebida e traduzida no âmbito municipal, que plano, formações e orientações foram produzidos para a rede e se esses materiais consideram as especificidades das localidades, antes de a análise chegar ao cotidiano da escola.</w:t>
       </w:r>
     </w:p>
     <w:p>
@@ -4306,7 +4321,7 @@
         <w:rPr>
           <w:lang w:val="pt-BR"/>
         </w:rPr>
-        <w:t xml:space="preserve">Os dados serão construídos em cinco movimentos articulados, cada um acrescentando uma fonte ao estudo. O confronto entre elas, feito no último, permite ler a encenação da política em mais de um plano.</w:t>
+        <w:t>Os dados serão construídos em cinco movimentos articulados, ordenados em funil, da rede municipal à escola, cada um acrescentando uma fonte ao estudo. O confronto entre elas, feito no último, permite ler a encenação da política em mais de uma escala.</w:t>
       </w:r>
     </w:p>
     <w:p>
@@ -4322,7 +4337,7 @@
         <w:rPr>
           <w:lang w:val="pt-BR"/>
         </w:rPr>
-        <w:t>10.1 PRIMEIRO MOVIMENTO: ANÁLISE DOCUMENTAL</w:t>
+        <w:t>10.1 PRIMEIRO MOVIMENTO: ANÁLISE DOCUMENTAL, DA REDE À ESCOLA</w:t>
       </w:r>
       <w:bookmarkEnd w:id="20"/>
     </w:p>
@@ -4339,7 +4354,7 @@
         <w:rPr>
           <w:lang w:val="pt-BR"/>
         </w:rPr>
-        <w:t xml:space="preserve">Os documentos que acompanham a PNED em sua chegada à escola compõem o primeiro conjunto de fontes. No plano nacional, serão analisados a Lei nº 14.533/2023, a Resolução CNE/CEB nº 2/2025 e os documentos curriculares que orientam a educação digital. No plano municipal e escolar, entram os documentos produzidos pela Secretaria Municipal de Educação sobre a política, os registros relativos à Política de Inovação Educação Conectada (PIEC), o Projeto Político-Pedagógico, os planos de aula, as atas de reuniões pedagógicas, os registros de formação e os demais registros institucionais relacionados à educação digital. A leitura será feita em diálogo com a ACP, para identificar discursos, expectativas, responsabilidades e orientações e acompanhar como eles se traduzem de um contexto da política para outro (MAINARDES, 2006). No Projeto Político-Pedagógico (PPP), por exemplo, procuraremos a concepção da escola sobre as tecnologias digitais, lida como tradução local da política, e os planos de aula permitirão confrontar as narrativas dos profissionais com o planejamento formal do ensino.</w:t>
+        <w:t>Os documentos que acompanham a PNED em sua chegada à rede e à escola compõem o primeiro conjunto de fontes, lido em três planos. No plano nacional, serão analisados a Lei nº 14.533/2023, a Resolução CNE/CEB nº 2/2025 e os documentos curriculares que orientam a educação digital. No plano municipal, entram o plano elaborado pela Secretaria para a rede, o currículo municipal e sua adequação à educação digital, os registros de formação, as orientações enviadas às escolas, os registros relativos à Política de Inovação Educação Conectada (PIEC) e o Plano Municipal de Educação, instituído pela Lei nº 517/2015 (TIBAU DO SUL, 2015) [conferir número, data e vigência no texto da lei]. Parte desses documentos já foi solicitada ao técnico da Secretaria, e o que não estiver disponível em transparência ativa será pedido com base na Lei de Acesso à Informação (BRASIL, 2011). No plano escolar, entram o Projeto Político-Pedagógico, os planos de aula, as atas de reuniões pedagógicas e os demais registros relacionados à educação digital, já solicitados à direção. A leitura será feita em diálogo com a ACP, para identificar discursos, expectativas, responsabilidades e orientações e acompanhar como eles se traduzem de um contexto da política para outro (MAINARDES, 2006). Nos documentos municipais, a matriz de leitura perguntará também se e como eles diferenciam as localidades do município, as escolas do campo e a escola da comunidade quilombola. No PPP, procuraremos a concepção da escola sobre as tecnologias digitais, lida como tradução local da política, e os planos de aula permitirão confrontar as narrativas dos profissionais com o planejamento formal do ensino.</w:t>
       </w:r>
     </w:p>
     <w:p>
@@ -4355,7 +4370,7 @@
         <w:rPr>
           <w:lang w:val="pt-BR"/>
         </w:rPr>
-        <w:t>10.2 SEGUNDO MOVIMENTO: REGISTRO ICONOGRÁFICO E LEITURA DO TERRITÓRIO</w:t>
+        <w:t>10.2 SEGUNDO MOVIMENTO: LEITURA DO TERRITÓRIO MUNICIPAL E REGISTRO ICONOGRÁFICO</w:t>
       </w:r>
       <w:bookmarkEnd w:id="21"/>
     </w:p>
@@ -4372,7 +4387,7 @@
         <w:rPr>
           <w:lang w:val="pt-BR"/>
         </w:rPr>
-        <w:t xml:space="preserve">O registro iconográfico parte de um conjunto de 38 imagens já reunidas a partir da escola e do acervo do Museu Digital de Pipa. As imagens serão analisadas como possibilidade de leitura das relações entre território, memória, materialidade, usos do espaço e coexistência de temporalidades, e cada uma informa sobre uma etapa material da produção do distrito e da escola. A noção de rugosidade (SANTOS, 2006) orientará a leitura das formas e dos objetos herdados de outros momentos que continuam a participar das condições atuais do lugar, e Massey (2008) ajudará a ler as imagens e o território como parte de uma espacialidade feita de trajetórias que coexistem e se encontram, sem fixá-los num passado congelado. Serão registradas também as condições de conectividade, os espaços destinados ao uso das tecnologias e os equipamentos disponíveis na escola. Cada imagem será tratada como evidência da configuração material visível no momento do registro, sem valor de prova sobre as práticas ou as intenções dos profissionais. Rostos identificáveis de crianças não serão expostos.</w:t>
+        <w:t>O território municipal será lido a partir dos dados do IBGE, como a população, sua distribuição entre área urbana e rural e a população quilombola, e dos microdados do Censo Escolar, escola por escola, com localização, etapas, matrículas, conectividade e equipamentos, para mostrar como a rede se distribui entre as localidades e em que condições cada uma recebe a política. Na escola de Pipa, o registro iconográfico parte de um conjunto de 38 imagens já reunidas a partir da escola e do acervo do Museu Digital de Pipa. As imagens serão analisadas como possibilidade de leitura das relações entre território, memória, materialidade, usos do espaço e coexistência de temporalidades, e cada uma informa sobre uma etapa material da produção da localidade e da escola. A noção de rugosidade (SANTOS, 2006) orientará a leitura das formas e dos objetos herdados de outros momentos que continuam a participar das condições atuais do lugar, e Massey (2008) ajudará a ler as imagens e o território como parte de uma espacialidade feita de trajetórias que coexistem e se encontram, sem fixá-los num passado congelado. Serão registradas também as condições de conectividade, os espaços destinados ao uso das tecnologias e os equipamentos disponíveis na escola. Cada imagem será tratada como evidência da configuração material visível no momento do registro, sem valor de prova sobre as práticas ou as intenções dos profissionais. Rostos identificáveis de crianças não serão expostos.</w:t>
       </w:r>
     </w:p>
     <w:p>
@@ -4424,7 +4439,7 @@
         <w:rPr>
           <w:lang w:val="pt-BR"/>
         </w:rPr>
-        <w:t>10.4 QUARTO MOVIMENTO: ENTREVISTAS SEMIESTRUTURADAS</w:t>
+        <w:t>10.4 QUARTO MOVIMENTO: ENTREVISTAS, DA SECRETARIA À ESCOLA</w:t>
       </w:r>
       <w:bookmarkEnd w:id="23"/>
     </w:p>
@@ -4441,7 +4456,7 @@
         <w:rPr>
           <w:lang w:val="pt-BR"/>
         </w:rPr>
-        <w:t xml:space="preserve">As entrevistas, individuais e semiestruturadas, terão duração aproximada de 60 a 90 minutos e serão realizadas em espaço reservado, gravadas com o consentimento dos participantes e depois transcritas. Com os profissionais da escola, tratarão de suas trajetórias, da compreensão que têm da PNED, das condições de trabalho e das relações profissionais, das possibilidades de tradução da política, das demandas institucionais e da educação digital e das experiências das crianças com as tecnologias. Com o técnico da Secretaria, o roteiro abordará a compreensão municipal da PNED, as orientações repassadas às escolas, as ações realizadas, os processos de formação, as formas de acompanhamento, as condições oferecidas às unidades escolares e as dificuldades e possibilidades percebidas na implementação.</w:t>
+        <w:t>As entrevistas, individuais e semiestruturadas, terão duração aproximada de 60 a 90 minutos e serão realizadas em espaço reservado, gravadas com o consentimento dos participantes e depois transcritas. A primeira será com o técnico da Secretaria, e seu roteiro abordará a compreensão municipal da PNED, o plano elaborado para a rede, as orientações repassadas às escolas, as ações realizadas, os processos de formação, as formas de acompanhamento, as condições oferecidas às unidades escolares, o modo como a Secretaria considera as especificidades das localidades, das escolas do campo e da escola quilombola e as dificuldades e possibilidades percebidas na implementação. Com os profissionais da escola, as entrevistas tratarão de suas trajetórias, da compreensão que têm da PNED e das orientações municipais, das condições de trabalho e das relações profissionais, das possibilidades de tradução da política, das demandas institucionais e da educação digital e das experiências das crianças com as tecnologias.</w:t>
       </w:r>
     </w:p>
     <w:p>
@@ -4638,7 +4653,7 @@
         <w:rPr>
           <w:lang w:val="pt-BR"/>
         </w:rPr>
-        <w:t xml:space="preserve">Partimos da compreensão de que a PNED chega à escola como um conjunto de orientações que precisa ser lido e interpretado por quem trabalha nela. Ao encontrar uma escola situada, com seus profissionais, sua história, suas condições materiais, suas relações institucionais e seu território, a política passa por processos de interpretação, tradução e recontextualização (BOWE; BALL; GOLD, 1992; MAINARDES, 2006; BALL; MAGUIRE; BRAUN, 2016). A hipótese interpretativa que orienta o estudo é a de que a forma assumida pela política no cotidiano escolar resulta da relação entre o que ela prescreve e as condições sob as quais os profissionais precisam atuar. Dessa relação podem surgir adesão, acomodação, adaptação, omissão seletiva, negociação, ressignificação e resistência, e esta última, embora seja uma possibilidade analítica particularmente importante, permanece como hipótese a ser examinada nos dados.</w:t>
+        <w:t>Partimos da compreensão de que a PNED chega à rede municipal e à escola como um conjunto de orientações que precisa ser lido e interpretado por quem trabalha nelas. Ao passar pela Secretaria Municipal de Educação, a política é traduzida para um território diverso, e ao encontrar uma escola situada, com seus profissionais, sua história, suas condições materiais, suas relações institucionais e seu território, passa por novos processos de interpretação, tradução e recontextualização (BOWE; BALL; GOLD, 1992; MAINARDES, 2006; BALL; MAGUIRE; BRAUN, 2016). A hipótese interpretativa que orienta o estudo é a de que a forma assumida pela política no cotidiano escolar resulta da relação entre o que ela prescreve, o que a rede municipal traduz e as condições sob as quais os profissionais precisam atuar. Dessa relação podem surgir adesão, acomodação, adaptação, omissão seletiva, negociação, ressignificação e resistência, e esta última, embora seja uma possibilidade analítica particularmente importante, permanece como hipótese a ser examinada nos dados.</w:t>
       </w:r>
     </w:p>
     <w:p>
@@ -4654,7 +4669,7 @@
         <w:rPr>
           <w:lang w:val="pt-BR"/>
         </w:rPr>
-        <w:t xml:space="preserve">Partimos também da compreensão de que as condições materiais fazem parte da política. A própria ACP reconhece, desde a sua formulação, que as políticas “são intervenções textuais, mas carregam também restrições e possibilidades materiais” (BOWE; BALL; GOLD, 1992, p. 21, tradução nossa). A existência ou a ausência de equipamentos, de conectividade, de espaços adequados, de formação e de tempo de planejamento participa daquilo que os profissionais conseguem fazer com o que a lei pede, e por isso a pergunta que move a pesquisa vai além da verificação da implementação. Ela indaga o que acontece com uma política de educação digital quando encontra uma escola com uma história, condições materiais e culturas profissionais determinadas, inserida num território específico. Nesse encontro a política adquire suas formas, e nele se pode perguntar quem consegue “habitar o digital”, em que condições e com quais possibilidades de participação.</w:t>
+        <w:t>Partimos também da compreensão de que as condições materiais fazem parte da política. A própria ACP reconhece, desde a sua formulação, que as políticas “são intervenções textuais, mas carregam também restrições e possibilidades materiais” (BOWE; BALL; GOLD, 1992, p. 21, tradução nossa). A existência ou a ausência de equipamentos, de conectividade, de espaços adequados, de formação e de tempo de planejamento participa daquilo que os profissionais conseguem fazer com o que a lei pede, e por isso a pergunta que move a pesquisa vai além da verificação da implementação. Ela indaga o que acontece com uma política de educação digital quando passa por uma rede municipal diversa e encontra uma escola com uma história, condições materiais e culturas profissionais determinadas, inserida num território específico. Nesse percurso a política adquire suas formas, e nele se pode perguntar quem consegue “habitar o digital”, em que condições e com quais possibilidades de participação.</w:t>
       </w:r>
     </w:p>
     <w:p>
@@ -4689,7 +4704,7 @@
         <w:rPr>
           <w:lang w:val="pt-BR"/>
         </w:rPr>
-        <w:t>A pesquisa pretende contribuir para três campos que se articulam. Para os estudos sobre políticas educacionais, oferece uma análise da PNED a partir do contexto da prática, atenta aos processos de atuação, tradução e recontextualização pelos quais a política ganha forma numa escola. Para os estudos sobre educação digital, propõe discutir a política para além da presença ou da ausência de equipamentos e de conectividade, examinando como sujeitos e territórios vivem e produzem formas diferentes de habitar o digital. Para o debate sobre os direitos das crianças no ambiente digital, analisa as implicações das condições encontradas na escola para as possibilidades de provisão, proteção e participação.</w:t>
+        <w:t>A pesquisa pretende contribuir para três campos que se articulam. Para os estudos sobre políticas educacionais, oferece uma análise da PNED a partir do contexto da prática, atenta aos processos de atuação, tradução e recontextualização pelos quais a política ganha forma numa rede municipal e numa de suas escolas. Para os estudos sobre educação digital, propõe discutir a política para além da presença ou da ausência de equipamentos e de conectividade, examinando como sujeitos e territórios vivem e produzem formas diferentes de habitar o digital. Para o debate sobre os direitos das crianças no ambiente digital, analisa as implicações das condições encontradas na rede e na escola para as possibilidades de provisão, proteção e participação.</w:t>
       </w:r>
     </w:p>
     <w:p>
@@ -4707,7 +4722,7 @@
         <w:rPr>
           <w:lang w:val="pt-BR"/>
         </w:rPr>
-        <w:t xml:space="preserve">A contribuição conceitual própria da tese está na formulação “habitar o digital”, construída no diálogo entre a tradição do habitar, as discussões contemporâneas sobre digitalidade e conectividade e as leituras de território, técnica, espaço e lugar de Santos e Massey. O que se aprender com ela em Pipa poderá voltar à teoria e ajudar a compreender outras escolas a que a mesma política chega em condições desiguais.</w:t>
+        <w:t>A contribuição conceitual própria da tese está na formulação “habitar o digital”, construída no diálogo entre a tradição do habitar, as discussões contemporâneas sobre digitalidade e conectividade e as leituras de território, técnica, espaço e lugar de Santos e Massey. O que se aprender com ela em Tibau do Sul poderá voltar à teoria e ajudar a compreender outras redes e escolas a que a mesma política chega em condições desiguais.</w:t>
       </w:r>
     </w:p>
     <w:p>
@@ -5125,7 +5140,81 @@
         <w:rPr>
           <w:lang w:val="pt-BR"/>
         </w:rPr>
-        <w:t>BRASIL. Conselho Nacional de Saúde. Resolução nº 466, de 12 de dezembro de 2012. Aprova diretrizes e normas regulamentadoras de pesquisas envolvendo seres humanos. Brasília, DF: CNS, 2012.</w:t>
+        <w:t xml:space="preserve">BRASIL. </w:t>
+      </w:r>
+      <w:r>
+        <w:rPr>
+          <w:b/>
+          <w:lang w:val="pt-BR"/>
+        </w:rPr>
+        <w:t>Lei nº 12.527, de 18 de novembro de 2011</w:t>
+      </w:r>
+      <w:r>
+        <w:rPr>
+          <w:lang w:val="pt-BR"/>
+        </w:rPr>
+        <w:t>. Regula o acesso a informações previsto no inciso XXXIII do art. 5º, no inciso II do § 3º do art. 37 e no § 2º do art. 216 da Constituição Federal. Brasília, DF: Presidência da República, 2011.</w:t>
+      </w:r>
+    </w:p>
+    <w:p>
+      <w:pPr>
+        <w:spacing w:after="0" w:line="240" w:lineRule="auto"/>
+        <w:jc w:val="left"/>
+        <w:rPr>
+          <w:lang w:val="pt-BR"/>
+        </w:rPr>
+      </w:pPr>
+    </w:p>
+    <w:p>
+      <w:pPr>
+        <w:spacing w:after="0" w:line="240" w:lineRule="auto"/>
+        <w:jc w:val="left"/>
+        <w:rPr>
+          <w:lang w:val="pt-BR"/>
+        </w:rPr>
+      </w:pPr>
+      <w:r>
+        <w:rPr>
+          <w:lang w:val="pt-BR"/>
+        </w:rPr>
+        <w:t>BRASIL. Conselho Nacional de Saúde. Resolução nº 466, de 12 de dezembro de 2012. Aprova diretrizes e normas regulamentadoras de pesquisas envolvendo seres humanos. Brasília, DF: CNS, 2012a.</w:t>
+      </w:r>
+    </w:p>
+    <w:p>
+      <w:pPr>
+        <w:spacing w:after="0" w:line="240" w:lineRule="auto"/>
+        <w:jc w:val="left"/>
+        <w:rPr>
+          <w:lang w:val="pt-BR"/>
+        </w:rPr>
+      </w:pPr>
+    </w:p>
+    <w:p>
+      <w:pPr>
+        <w:spacing w:after="0" w:line="240" w:lineRule="auto"/>
+        <w:jc w:val="left"/>
+        <w:rPr>
+          <w:lang w:val="pt-BR"/>
+        </w:rPr>
+      </w:pPr>
+      <w:r>
+        <w:rPr>
+          <w:lang w:val="pt-BR"/>
+        </w:rPr>
+        <w:t xml:space="preserve">BRASIL. Conselho Nacional de Educação. Câmara de Educação Básica. </w:t>
+      </w:r>
+      <w:r>
+        <w:rPr>
+          <w:b/>
+          <w:lang w:val="pt-BR"/>
+        </w:rPr>
+        <w:t>Resolução nº 8, de 20 de novembro de 2012</w:t>
+      </w:r>
+      <w:r>
+        <w:rPr>
+          <w:lang w:val="pt-BR"/>
+        </w:rPr>
+        <w:t>. Define Diretrizes Curriculares Nacionais para a Educação Escolar Quilombola na Educação Básica. Brasília, DF: CNE, 2012b.</w:t>
       </w:r>
     </w:p>
     <w:p>
@@ -5818,20 +5907,20 @@
         <w:rPr>
           <w:lang w:val="pt-BR"/>
         </w:rPr>
-        <w:t xml:space="preserve">MAINARDES, Jefferson. Abordagem do ciclo de políticas: uma contribuição para a análise de políticas educacionais. </w:t>
+        <w:t xml:space="preserve">IBGE. </w:t>
       </w:r>
       <w:r>
         <w:rPr>
           <w:b/>
           <w:lang w:val="pt-BR"/>
         </w:rPr>
-        <w:t>Educação &amp; Sociedade</w:t>
-      </w:r>
-      <w:r>
-        <w:rPr>
-          <w:lang w:val="pt-BR"/>
-        </w:rPr>
-        <w:t>, Campinas, v. 27, n. 94, p. 47-69, 2006.</w:t>
+        <w:t>Censo Demográfico 2010</w:t>
+      </w:r>
+      <w:r>
+        <w:rPr>
+          <w:lang w:val="pt-BR"/>
+        </w:rPr>
+        <w:t>: características da população e dos domicílios: resultados do universo. Rio de Janeiro: IBGE, 2011.</w:t>
       </w:r>
     </w:p>
     <w:p>
@@ -5855,34 +5944,20 @@
         <w:rPr>
           <w:lang w:val="pt-BR"/>
         </w:rPr>
-        <w:t xml:space="preserve">MASSEY, </w:t>
-      </w:r>
-      <w:proofErr w:type="spellStart"/>
-      <w:r>
-        <w:rPr>
-          <w:lang w:val="pt-BR"/>
-        </w:rPr>
-        <w:t>Doreen</w:t>
-      </w:r>
-      <w:proofErr w:type="spellEnd"/>
-      <w:r>
-        <w:rPr>
-          <w:lang w:val="pt-BR"/>
-        </w:rPr>
-        <w:t xml:space="preserve">. </w:t>
+        <w:t xml:space="preserve">IBGE. </w:t>
       </w:r>
       <w:r>
         <w:rPr>
           <w:b/>
           <w:lang w:val="pt-BR"/>
         </w:rPr>
-        <w:t>Pelo espaço</w:t>
-      </w:r>
-      <w:r>
-        <w:rPr>
-          <w:lang w:val="pt-BR"/>
-        </w:rPr>
-        <w:t xml:space="preserve">: uma nova política da espacialidade. Tradução de Hilda Pareto Maciel e Rogério Haesbaert. Rio de Janeiro: Bertrand Brasil, 2008.</w:t>
+        <w:t>Censo Demográfico 2022</w:t>
+      </w:r>
+      <w:r>
+        <w:rPr>
+          <w:lang w:val="pt-BR"/>
+        </w:rPr>
+        <w:t>: população e domicílios: primeiros resultados. Rio de Janeiro: IBGE, 2023.</w:t>
       </w:r>
     </w:p>
     <w:p>
@@ -5906,6 +5981,94 @@
         <w:rPr>
           <w:lang w:val="pt-BR"/>
         </w:rPr>
+        <w:t xml:space="preserve">MAINARDES, Jefferson. Abordagem do ciclo de políticas: uma contribuição para a análise de políticas educacionais. </w:t>
+      </w:r>
+      <w:r>
+        <w:rPr>
+          <w:b/>
+          <w:lang w:val="pt-BR"/>
+        </w:rPr>
+        <w:t>Educação &amp; Sociedade</w:t>
+      </w:r>
+      <w:r>
+        <w:rPr>
+          <w:lang w:val="pt-BR"/>
+        </w:rPr>
+        <w:t>, Campinas, v. 27, n. 94, p. 47-69, 2006.</w:t>
+      </w:r>
+    </w:p>
+    <w:p>
+      <w:pPr>
+        <w:spacing w:after="0" w:line="240" w:lineRule="auto"/>
+        <w:jc w:val="left"/>
+        <w:rPr>
+          <w:lang w:val="pt-BR"/>
+        </w:rPr>
+      </w:pPr>
+    </w:p>
+    <w:p>
+      <w:pPr>
+        <w:spacing w:after="0" w:line="240" w:lineRule="auto"/>
+        <w:jc w:val="left"/>
+        <w:rPr>
+          <w:lang w:val="pt-BR"/>
+        </w:rPr>
+      </w:pPr>
+      <w:r>
+        <w:rPr>
+          <w:lang w:val="pt-BR"/>
+        </w:rPr>
+        <w:t xml:space="preserve">MASSEY, </w:t>
+      </w:r>
+      <w:proofErr w:type="spellStart"/>
+      <w:r>
+        <w:rPr>
+          <w:lang w:val="pt-BR"/>
+        </w:rPr>
+        <w:t>Doreen</w:t>
+      </w:r>
+      <w:proofErr w:type="spellEnd"/>
+      <w:r>
+        <w:rPr>
+          <w:lang w:val="pt-BR"/>
+        </w:rPr>
+        <w:t xml:space="preserve">. </w:t>
+      </w:r>
+      <w:r>
+        <w:rPr>
+          <w:b/>
+          <w:lang w:val="pt-BR"/>
+        </w:rPr>
+        <w:t>Pelo espaço</w:t>
+      </w:r>
+      <w:r>
+        <w:rPr>
+          <w:lang w:val="pt-BR"/>
+        </w:rPr>
+        <w:t xml:space="preserve">: uma nova política da espacialidade. Tradução de Hilda Pareto Maciel e Rogério Haesbaert. Rio de Janeiro: Bertrand Brasil, 2008.</w:t>
+      </w:r>
+    </w:p>
+    <w:p>
+      <w:pPr>
+        <w:spacing w:after="0" w:line="240" w:lineRule="auto"/>
+        <w:jc w:val="left"/>
+        <w:rPr>
+          <w:lang w:val="pt-BR"/>
+        </w:rPr>
+      </w:pPr>
+    </w:p>
+    <w:p>
+      <w:pPr>
+        <w:spacing w:after="0" w:line="240" w:lineRule="auto"/>
+        <w:jc w:val="left"/>
+        <w:rPr>
+          <w:lang w:val="pt-BR"/>
+        </w:rPr>
+      </w:pPr>
+      <w:r>
+        <w:rPr>
+          <w:lang w:val="pt-BR"/>
+        </w:rPr>
         <w:lastRenderedPageBreak/>
         <w:t xml:space="preserve">MINAYO, Maria Cecília de Souza (org.). </w:t>
       </w:r>
@@ -6209,6 +6372,43 @@
           <w:lang w:val="pt-BR"/>
         </w:rPr>
         <w:t xml:space="preserve">: redes digitais, privacidade e venda de dados pessoais. São Paulo: Edições Sesc São Paulo, 2017. E-book.</w:t>
+      </w:r>
+    </w:p>
+    <w:p>
+      <w:pPr>
+        <w:spacing w:after="0" w:line="240" w:lineRule="auto"/>
+        <w:jc w:val="left"/>
+        <w:rPr>
+          <w:lang w:val="pt-BR"/>
+        </w:rPr>
+      </w:pPr>
+    </w:p>
+    <w:p>
+      <w:pPr>
+        <w:spacing w:after="0" w:line="240" w:lineRule="auto"/>
+        <w:jc w:val="left"/>
+        <w:rPr>
+          <w:lang w:val="pt-BR"/>
+        </w:rPr>
+      </w:pPr>
+      <w:r>
+        <w:rPr>
+          <w:lang w:val="pt-BR"/>
+        </w:rPr>
+        <w:t xml:space="preserve">TIBAU DO SUL. </w:t>
+      </w:r>
+      <w:r>
+        <w:rPr>
+          <w:b/>
+          <w:lang w:val="pt-BR"/>
+        </w:rPr>
+        <w:t>Lei nº 517, de 24 de junho de 2015</w:t>
+      </w:r>
+      <w:r>
+        <w:rPr>
+          <w:lang w:val="pt-BR"/>
+        </w:rPr>
+        <w:t>. Aprova o Plano Municipal de Educação. Tibau do Sul: Câmara Municipal, 2015. [conferir ementa e órgão de publicação]</w:t>
       </w:r>
     </w:p>
     <w:p>

</xml_diff>

<commit_message>
Incorpora ao projeto os dados conferidos sobre o município e Sibaúma
Área (IBGE, 2025), Portaria FCP nº 26/2005, estudos sobre Sibaúma,
Domitila urbana, alcance da Res. CNE/CEB 8/2012, vigência do PME e
documentos a pedir à Prefeitura; novas referências.

Co-Authored-By: Claude Opus 5.5 <noreply@anthropic.com>
Claude-Session: https://claude.ai/code/session_01HxStpW4pQoDfJdTDYr6zEC
</commit_message>
<xml_diff>
--- a/projeto_desenvolvido/PROJETO_DE_TESE_COMPLETO_ABNT.docx
+++ b/projeto_desenvolvido/PROJETO_DE_TESE_COMPLETO_ABNT.docx
@@ -3466,7 +3466,7 @@
         <w:rPr>
           <w:lang w:val="pt-BR"/>
         </w:rPr>
-        <w:t>Tibau do Sul entra nesta pesquisa como parte do contexto em que a política é encenada, e Pipa, como o lugar onde esse percurso chega à escola. O município tinha 16.929 habitantes no Censo de 2022 (IBGE, 2023) e 11.385 em 2010, quando cerca de 40% da população vivia em área rural (IBGE, 2011) [conferir na tabela do Censo 2010]. Pelo IBGE, é constituído apenas pelo distrito sede, mas o cotidiano se organiza em localidades com feições próprias: a sede, Pipa, Sibaúma, Piau e povoados como Umari, Bela Vista, Manimbu, Munim, Cabeceiras e Pernambuquinho [indicar a fonte da relação de localidades]. Sibaúma é certificada como comunidade remanescente de quilombo pela Fundação Cultural Palmares desde 2005 (Portaria nº 26/2005) [conferir no Diário Oficial da União e indicar a referência], e o Censo de 2022 registrou 903 pessoas quilombolas no município [conferir no Censo 2022]. Pipa, que na década de 1970 era uma comunidade agrícola e pesqueira e se tornou destino turístico internacional com a chegada dos surfistas, a partir de meados daquela década, e com a divulgação mais intensa iniciada nos anos 1990 (AIRES, 2012, p. 81-82), é hoje marcada pelo turismo, pela circulação de grupos sociais muito diferentes e por experiências desiguais de acesso, de uso e de participação na cultura digital. Essas diferenças acompanham a distinção, descrita por Santos (2006, p. 163), entre zonas servidas pelos meios de conhecimento e áreas que não dispõem deles, e atravessam o próprio município.</w:t>
+        <w:t>Tibau do Sul entra nesta pesquisa como parte do contexto em que a política é encenada, e Pipa, como o lugar onde esse percurso chega à escola. O município tem 102,68 km² (IBGE, 2025) e tinha 16.929 habitantes no Censo de 2022 (IBGE, 2023); em 2010 eram 11.385, e cerca de 40% deles viviam em área rural (IBGE, 2011) [conferir na tabela do Censo 2010]. Pelo IBGE, é constituído apenas pelo distrito sede, mas o cotidiano se organiza em localidades com feições próprias: a sede, Pipa, Sibaúma, Piau e povoados como Umari, Bela Vista, Manimbu, Munim, Cabeceiras e Pernambuquinho, segundo levantamento preliminar a ser confirmado na relação oficial de localidades da Prefeitura, no Plano Diretor ou na Lei Orgânica do município. Sibaúma foi certificada como comunidade remanescente de quilombo pela Fundação Cultural Palmares por meio da Portaria nº 26, de 6 de junho de 2005 (FUNDAÇÃO CULTURAL PALMARES, 2005), e o Censo de 2022 registrou 903 pessoas quilombolas no município [conferir no Censo 2022]. Pipa, que na década de 1970 era uma comunidade agrícola e pesqueira e se tornou destino turístico internacional com a chegada dos surfistas, a partir de meados daquela década, e com a divulgação mais intensa iniciada nos anos 1990 (AIRES, 2012, p. 81-82), é hoje marcada pelo turismo, pela circulação de grupos sociais muito diferentes e por experiências desiguais de acesso, de uso e de participação na cultura digital. Essas diferenças acompanham a distinção, descrita por Santos (2006, p. 163), entre zonas servidas pelos meios de conhecimento e áreas que não dispõem deles, e atravessam o próprio município.</w:t>
       </w:r>
     </w:p>
     <w:p>
@@ -3876,7 +3876,7 @@
         <w:rPr>
           <w:lang w:val="pt-BR"/>
         </w:rPr>
-        <w:t xml:space="preserve">A Escola Municipal Domitila Castelo da Silva está num território onde convivem temporalidades tecnológicas diferentes e recebe a PNED com uma infraestrutura, objetos técnicos, espaços, formas de organização e uma história determinados. Segundo informações preliminares, ainda a confirmar nos documentos da rede, os computadores de seu laboratório de informática foram adquiridos pela Prefeitura em 2022, pouco antes da promulgação da lei. A política nacional encontra, assim, equipamentos de uma iniciativa anterior a ela e lhes atribui uma nova função. Santos descreve esse movimento ao observar que, uma vez criada e usada na função que lhe foi designada, a forma “freqüentemente permanece aguardando o próximo movimento dinâmico da sociedade, quando terá toda a probabilidade de ser chamada a cumprir uma nova função” (SANTOS, 2012, p. 74-75). Nos capítulos já escritos da tese, chamamos essa situação de rugosidade tecnológica. Com Santos, perguntaremos que condições técnicas já existiam na escola quando a política chegou, quais permaneceram, que novos objetos foram incorporados e o que essas condições permitem ou limitam no trabalho dos profissionais e na experiência das crianças.</w:t>
+        <w:t>A Escola Municipal Domitila Castelo da Silva, localizada em Pipa e classificada como urbana no Censo Escolar [anexar a ficha do Catálogo de Escolas do INEP], está num território onde convivem temporalidades tecnológicas diferentes e recebe a PNED com uma infraestrutura, objetos técnicos, espaços, formas de organização e uma história determinados. Segundo informações preliminares, ainda a confirmar nos documentos da rede, os computadores de seu laboratório de informática foram adquiridos pela Prefeitura em 2022, pouco antes da promulgação da lei. A política nacional encontra, assim, equipamentos de uma iniciativa anterior a ela e lhes atribui uma nova função. Santos descreve esse movimento ao observar que, uma vez criada e usada na função que lhe foi designada, a forma “freqüentemente permanece aguardando o próximo movimento dinâmico da sociedade, quando terá toda a probabilidade de ser chamada a cumprir uma nova função” (SANTOS, 2012, p. 74-75). Nos capítulos já escritos da tese, chamamos essa situação de rugosidade tecnológica. Com Santos, perguntaremos que condições técnicas já existiam na escola quando a política chegou, quais permaneceram, que novos objetos foram incorporados e o que essas condições permitem ou limitam no trabalho dos profissionais e na experiência das crianças.</w:t>
       </w:r>
     </w:p>
     <w:p>
@@ -3908,7 +3908,7 @@
         <w:rPr>
           <w:lang w:val="pt-BR"/>
         </w:rPr>
-        <w:t>Com Santos e Massey, Tibau do Sul pode ser compreendido ao mesmo tempo como território produzido por tempos e relações diferentes e como conjunto de lugares onde se encontram trajetórias diversas, da sede às localidades rurais, de Sibaúma a Pipa. Essa leitura pede que a rede municipal seja olhada também pelo modo como distribui seus meios entre esses lugares. A presença de uma comunidade quilombola acrescenta a essa pergunta um marco normativo próprio, as Diretrizes Curriculares Nacionais para a Educação Escolar Quilombola, que orientam o trabalho das escolas situadas em comunidades quilombolas e das que recebem estudantes vindos desses territórios (BRASIL, 2012b) [conferir o alcance no texto da resolução]. Perguntaremos se os planos e as orientações da Secretaria para a educação digital consideram essas especificidades. Essa leitura, somada à discussão sobre o habitar, sustenta a formulação que a tese propõe para a relação entre o território e as tecnologias digitais.</w:t>
+        <w:t>Com Santos e Massey, Tibau do Sul pode ser compreendido ao mesmo tempo como território produzido por tempos e relações diferentes e como conjunto de lugares onde se encontram trajetórias diversas, da sede às localidades rurais, de Sibaúma a Pipa. Essa leitura pede que a rede municipal seja olhada também pelo modo como distribui seus meios entre esses lugares. Sibaúma já foi estudada pela emergência étnica em torno do coco de zambê (LINS, 2009), pelos conflitos fundiários ligados ao turismo no litoral (LINS; LOLOUM, 2012) e pela trajetória da Escola Municipal Padre Armando de Paiva (SILVA, 2011) [conferir o ano na folha de rosto: 2011 ou 2012]; nenhum desses estudos trata da educação digital. A presença de uma comunidade quilombola acrescenta à pergunta sobre a rede um marco normativo próprio, as Diretrizes Curriculares Nacionais para a Educação Escolar Quilombola, segundo as quais a Educação Escolar Quilombola se destina às populações quilombolas rurais e urbanas e deve ser ofertada pelas escolas situadas nessas comunidades e pelas escolas próximas que recebem parte significativa de seus estudantes (BRASIL, 2012b, art. 1º). Perguntaremos se os planos e as orientações da Secretaria para a educação digital consideram essas especificidades. Essa leitura, somada à discussão sobre o habitar, sustenta a formulação que a tese propõe para a relação entre o território e as tecnologias digitais.</w:t>
       </w:r>
     </w:p>
     <w:p>
@@ -4354,7 +4354,7 @@
         <w:rPr>
           <w:lang w:val="pt-BR"/>
         </w:rPr>
-        <w:t>Os documentos que acompanham a PNED em sua chegada à rede e à escola compõem o primeiro conjunto de fontes, lido em três planos. No plano nacional, serão analisados a Lei nº 14.533/2023, a Resolução CNE/CEB nº 2/2025 e os documentos curriculares que orientam a educação digital. No plano municipal, entram o plano elaborado pela Secretaria para a rede, o currículo municipal e sua adequação à educação digital, os registros de formação, as orientações enviadas às escolas, os registros relativos à Política de Inovação Educação Conectada (PIEC) e o Plano Municipal de Educação, instituído pela Lei nº 517/2015 (TIBAU DO SUL, 2015) [conferir número, data e vigência no texto da lei]. Parte desses documentos já foi solicitada ao técnico da Secretaria, e o que não estiver disponível em transparência ativa será pedido com base na Lei de Acesso à Informação (BRASIL, 2011). No plano escolar, entram o Projeto Político-Pedagógico, os planos de aula, as atas de reuniões pedagógicas e os demais registros relacionados à educação digital, já solicitados à direção. A leitura será feita em diálogo com a ACP, para identificar discursos, expectativas, responsabilidades e orientações e acompanhar como eles se traduzem de um contexto da política para outro (MAINARDES, 2006). Nos documentos municipais, a matriz de leitura perguntará também se e como eles diferenciam as localidades do município, as escolas do campo e a escola da comunidade quilombola. No PPP, procuraremos a concepção da escola sobre as tecnologias digitais, lida como tradução local da política, e os planos de aula permitirão confrontar as narrativas dos profissionais com o planejamento formal do ensino.</w:t>
+        <w:t>Os documentos que acompanham a PNED em sua chegada à rede e à escola compõem o primeiro conjunto de fontes, lido em três planos. No plano nacional, serão analisados a Lei nº 14.533/2023, a Resolução CNE/CEB nº 2/2025 e os documentos curriculares que orientam a educação digital. No plano municipal, entram o plano elaborado pela Secretaria para a rede, o currículo municipal e sua adequação à educação digital, os registros de formação, as orientações enviadas às escolas, os registros relativos à Política de Inovação Educação Conectada (PIEC) e o Plano Municipal de Educação, instituído pela Lei nº 517, de 24 de junho de 2015, com vigência decenal (TIBAU DO SUL, 2015) [conferir no texto da lei]. Como esse prazo terminou em 2025, será verificado junto à Secretaria se o plano foi prorrogado ou substituído. À Prefeitura serão pedidos o Plano Diretor, a Lei Orgânica e o mapa ou memorial descritivo oficial do município, para a relação das localidades e os limites entre área urbana e rural. Parte desses documentos já foi solicitada ao técnico da Secretaria, e o que não estiver disponível em transparência ativa será pedido com base na Lei de Acesso à Informação (BRASIL, 2011). No plano escolar, entram o Projeto Político-Pedagógico, os planos de aula, as atas de reuniões pedagógicas e os demais registros relacionados à educação digital, já solicitados à direção. A leitura será feita em diálogo com a ACP, para identificar discursos, expectativas, responsabilidades e orientações e acompanhar como eles se traduzem de um contexto da política para outro (MAINARDES, 2006). Nos documentos municipais, a matriz de leitura perguntará também se e como eles diferenciam as localidades do município, as escolas do campo e a escola da comunidade quilombola. No PPP, procuraremos a concepção da escola sobre as tecnologias digitais, lida como tradução local da política, e os planos de aula permitirão confrontar as narrativas dos profissionais com o planejamento formal do ensino.</w:t>
       </w:r>
     </w:p>
     <w:p>
@@ -5240,6 +5240,15 @@
         </w:rPr>
         <w:t>BRASIL. Conselho Nacional de Saúde. Resolução nº 510, de 7 de abril de 2016. Dispõe sobre as normas aplicáveis a pesquisas em Ciências Humanas e Sociais. Brasília, DF: CNS, 2016.</w:t>
       </w:r>
+    </w:p>
+    <w:p>
+      <w:pPr>
+        <w:spacing w:after="0" w:line="240" w:lineRule="auto"/>
+        <w:jc w:val="left"/>
+        <w:rPr>
+          <w:lang w:val="pt-BR"/>
+        </w:rPr>
+      </w:pPr>
     </w:p>
     <w:p>
       <w:pPr>
@@ -5782,108 +5791,20 @@
         <w:rPr>
           <w:lang w:val="pt-BR"/>
         </w:rPr>
-        <w:t xml:space="preserve">HARGREAVES, Andy. </w:t>
-      </w:r>
-      <w:proofErr w:type="spellStart"/>
+        <w:t xml:space="preserve">FUNDAÇÃO CULTURAL PALMARES. </w:t>
+      </w:r>
       <w:r>
         <w:rPr>
           <w:b/>
           <w:lang w:val="pt-BR"/>
         </w:rPr>
-        <w:t>Profesorado</w:t>
-      </w:r>
-      <w:proofErr w:type="spellEnd"/>
-      <w:r>
-        <w:rPr>
-          <w:b/>
-          <w:lang w:val="pt-BR"/>
-        </w:rPr>
-        <w:t xml:space="preserve">, cultura y </w:t>
-      </w:r>
-      <w:proofErr w:type="spellStart"/>
-      <w:r>
-        <w:rPr>
-          <w:b/>
-          <w:lang w:val="pt-BR"/>
-        </w:rPr>
-        <w:t>postmodernidad</w:t>
-      </w:r>
-      <w:proofErr w:type="spellEnd"/>
-      <w:r>
-        <w:rPr>
-          <w:lang w:val="pt-BR"/>
-        </w:rPr>
-        <w:t xml:space="preserve">: </w:t>
-      </w:r>
-      <w:proofErr w:type="spellStart"/>
-      <w:r>
-        <w:rPr>
-          <w:lang w:val="pt-BR"/>
-        </w:rPr>
-        <w:t>cambian</w:t>
-      </w:r>
-      <w:proofErr w:type="spellEnd"/>
-      <w:r>
-        <w:rPr>
-          <w:lang w:val="pt-BR"/>
-        </w:rPr>
-        <w:t xml:space="preserve"> </w:t>
-      </w:r>
-      <w:proofErr w:type="spellStart"/>
-      <w:r>
-        <w:rPr>
-          <w:lang w:val="pt-BR"/>
-        </w:rPr>
-        <w:t>los</w:t>
-      </w:r>
-      <w:proofErr w:type="spellEnd"/>
-      <w:r>
-        <w:rPr>
-          <w:lang w:val="pt-BR"/>
-        </w:rPr>
-        <w:t xml:space="preserve"> </w:t>
-      </w:r>
-      <w:proofErr w:type="spellStart"/>
-      <w:r>
-        <w:rPr>
-          <w:lang w:val="pt-BR"/>
-        </w:rPr>
-        <w:t>tiempos</w:t>
-      </w:r>
-      <w:proofErr w:type="spellEnd"/>
-      <w:r>
-        <w:rPr>
-          <w:lang w:val="pt-BR"/>
-        </w:rPr>
-        <w:t xml:space="preserve">, cambia </w:t>
-      </w:r>
-      <w:proofErr w:type="spellStart"/>
-      <w:r>
-        <w:rPr>
-          <w:lang w:val="pt-BR"/>
-        </w:rPr>
-        <w:t>el</w:t>
-      </w:r>
-      <w:proofErr w:type="spellEnd"/>
-      <w:r>
-        <w:rPr>
-          <w:lang w:val="pt-BR"/>
-        </w:rPr>
-        <w:t xml:space="preserve"> </w:t>
-      </w:r>
-      <w:proofErr w:type="spellStart"/>
-      <w:r>
-        <w:rPr>
-          <w:lang w:val="pt-BR"/>
-        </w:rPr>
-        <w:t>profesorado</w:t>
-      </w:r>
-      <w:proofErr w:type="spellEnd"/>
-      <w:r>
-        <w:rPr>
-          <w:lang w:val="pt-BR"/>
-        </w:rPr>
-        <w:t>. 5. ed. Madrid: Morata, 2005.</w:t>
+        <w:t>Portaria nº 26, de 6 de junho de 2005</w:t>
+      </w:r>
+      <w:r>
+        <w:rPr>
+          <w:lang w:val="pt-BR"/>
+        </w:rPr>
+        <w:t>. Diário Oficial da União: seção 1, Brasília, DF, 8 jun. 2005. [conferir seção, página e ementa no DOU]</w:t>
       </w:r>
     </w:p>
     <w:p>
@@ -5907,20 +5828,108 @@
         <w:rPr>
           <w:lang w:val="pt-BR"/>
         </w:rPr>
-        <w:t xml:space="preserve">IBGE. </w:t>
-      </w:r>
+        <w:t xml:space="preserve">HARGREAVES, Andy. </w:t>
+      </w:r>
+      <w:proofErr w:type="spellStart"/>
       <w:r>
         <w:rPr>
           <w:b/>
           <w:lang w:val="pt-BR"/>
         </w:rPr>
-        <w:t>Censo Demográfico 2010</w:t>
-      </w:r>
-      <w:r>
-        <w:rPr>
-          <w:lang w:val="pt-BR"/>
-        </w:rPr>
-        <w:t>: características da população e dos domicílios: resultados do universo. Rio de Janeiro: IBGE, 2011.</w:t>
+        <w:t>Profesorado</w:t>
+      </w:r>
+      <w:proofErr w:type="spellEnd"/>
+      <w:r>
+        <w:rPr>
+          <w:b/>
+          <w:lang w:val="pt-BR"/>
+        </w:rPr>
+        <w:t xml:space="preserve">, cultura y </w:t>
+      </w:r>
+      <w:proofErr w:type="spellStart"/>
+      <w:r>
+        <w:rPr>
+          <w:b/>
+          <w:lang w:val="pt-BR"/>
+        </w:rPr>
+        <w:t>postmodernidad</w:t>
+      </w:r>
+      <w:proofErr w:type="spellEnd"/>
+      <w:r>
+        <w:rPr>
+          <w:lang w:val="pt-BR"/>
+        </w:rPr>
+        <w:t xml:space="preserve">: </w:t>
+      </w:r>
+      <w:proofErr w:type="spellStart"/>
+      <w:r>
+        <w:rPr>
+          <w:lang w:val="pt-BR"/>
+        </w:rPr>
+        <w:t>cambian</w:t>
+      </w:r>
+      <w:proofErr w:type="spellEnd"/>
+      <w:r>
+        <w:rPr>
+          <w:lang w:val="pt-BR"/>
+        </w:rPr>
+        <w:t xml:space="preserve"> </w:t>
+      </w:r>
+      <w:proofErr w:type="spellStart"/>
+      <w:r>
+        <w:rPr>
+          <w:lang w:val="pt-BR"/>
+        </w:rPr>
+        <w:t>los</w:t>
+      </w:r>
+      <w:proofErr w:type="spellEnd"/>
+      <w:r>
+        <w:rPr>
+          <w:lang w:val="pt-BR"/>
+        </w:rPr>
+        <w:t xml:space="preserve"> </w:t>
+      </w:r>
+      <w:proofErr w:type="spellStart"/>
+      <w:r>
+        <w:rPr>
+          <w:lang w:val="pt-BR"/>
+        </w:rPr>
+        <w:t>tiempos</w:t>
+      </w:r>
+      <w:proofErr w:type="spellEnd"/>
+      <w:r>
+        <w:rPr>
+          <w:lang w:val="pt-BR"/>
+        </w:rPr>
+        <w:t xml:space="preserve">, cambia </w:t>
+      </w:r>
+      <w:proofErr w:type="spellStart"/>
+      <w:r>
+        <w:rPr>
+          <w:lang w:val="pt-BR"/>
+        </w:rPr>
+        <w:t>el</w:t>
+      </w:r>
+      <w:proofErr w:type="spellEnd"/>
+      <w:r>
+        <w:rPr>
+          <w:lang w:val="pt-BR"/>
+        </w:rPr>
+        <w:t xml:space="preserve"> </w:t>
+      </w:r>
+      <w:proofErr w:type="spellStart"/>
+      <w:r>
+        <w:rPr>
+          <w:lang w:val="pt-BR"/>
+        </w:rPr>
+        <w:t>profesorado</w:t>
+      </w:r>
+      <w:proofErr w:type="spellEnd"/>
+      <w:r>
+        <w:rPr>
+          <w:lang w:val="pt-BR"/>
+        </w:rPr>
+        <w:t>. 5. ed. Madrid: Morata, 2005.</w:t>
       </w:r>
     </w:p>
     <w:p>
@@ -5951,13 +5960,13 @@
           <w:b/>
           <w:lang w:val="pt-BR"/>
         </w:rPr>
-        <w:t>Censo Demográfico 2022</w:t>
-      </w:r>
-      <w:r>
-        <w:rPr>
-          <w:lang w:val="pt-BR"/>
-        </w:rPr>
-        <w:t>: população e domicílios: primeiros resultados. Rio de Janeiro: IBGE, 2023.</w:t>
+        <w:t>Censo Demográfico 2010</w:t>
+      </w:r>
+      <w:r>
+        <w:rPr>
+          <w:lang w:val="pt-BR"/>
+        </w:rPr>
+        <w:t>: características da população e dos domicílios: resultados do universo. Rio de Janeiro: IBGE, 2011.</w:t>
       </w:r>
     </w:p>
     <w:p>
@@ -5981,20 +5990,20 @@
         <w:rPr>
           <w:lang w:val="pt-BR"/>
         </w:rPr>
-        <w:t xml:space="preserve">MAINARDES, Jefferson. Abordagem do ciclo de políticas: uma contribuição para a análise de políticas educacionais. </w:t>
+        <w:t xml:space="preserve">IBGE. </w:t>
       </w:r>
       <w:r>
         <w:rPr>
           <w:b/>
           <w:lang w:val="pt-BR"/>
         </w:rPr>
-        <w:t>Educação &amp; Sociedade</w:t>
-      </w:r>
-      <w:r>
-        <w:rPr>
-          <w:lang w:val="pt-BR"/>
-        </w:rPr>
-        <w:t>, Campinas, v. 27, n. 94, p. 47-69, 2006.</w:t>
+        <w:t>Censo Demográfico 2022</w:t>
+      </w:r>
+      <w:r>
+        <w:rPr>
+          <w:lang w:val="pt-BR"/>
+        </w:rPr>
+        <w:t>: população e domicílios: primeiros resultados. Rio de Janeiro: IBGE, 2023.</w:t>
       </w:r>
     </w:p>
     <w:p>
@@ -6018,34 +6027,20 @@
         <w:rPr>
           <w:lang w:val="pt-BR"/>
         </w:rPr>
-        <w:t xml:space="preserve">MASSEY, </w:t>
-      </w:r>
-      <w:proofErr w:type="spellStart"/>
-      <w:r>
-        <w:rPr>
-          <w:lang w:val="pt-BR"/>
-        </w:rPr>
-        <w:t>Doreen</w:t>
-      </w:r>
-      <w:proofErr w:type="spellEnd"/>
-      <w:r>
-        <w:rPr>
-          <w:lang w:val="pt-BR"/>
-        </w:rPr>
-        <w:t xml:space="preserve">. </w:t>
+        <w:t xml:space="preserve">IBGE. </w:t>
       </w:r>
       <w:r>
         <w:rPr>
           <w:b/>
           <w:lang w:val="pt-BR"/>
         </w:rPr>
-        <w:t>Pelo espaço</w:t>
-      </w:r>
-      <w:r>
-        <w:rPr>
-          <w:lang w:val="pt-BR"/>
-        </w:rPr>
-        <w:t xml:space="preserve">: uma nova política da espacialidade. Tradução de Hilda Pareto Maciel e Rogério Haesbaert. Rio de Janeiro: Bertrand Brasil, 2008.</w:t>
+        <w:t>Cidades@: Tibau do Sul</w:t>
+      </w:r>
+      <w:r>
+        <w:rPr>
+          <w:lang w:val="pt-BR"/>
+        </w:rPr>
+        <w:t>. Rio de Janeiro: IBGE, 2025. Disponível em: https://cidades.ibge.gov.br/brasil/rn/tibau-do-sul. Acesso em: [indicar a data de acesso].</w:t>
       </w:r>
     </w:p>
     <w:p>
@@ -6069,6 +6064,168 @@
         <w:rPr>
           <w:lang w:val="pt-BR"/>
         </w:rPr>
+        <w:t xml:space="preserve">LINS, Cyro H. de Almeida. </w:t>
+      </w:r>
+      <w:r>
+        <w:rPr>
+          <w:b/>
+          <w:lang w:val="pt-BR"/>
+        </w:rPr>
+        <w:t>O zambê é nossa cultura</w:t>
+      </w:r>
+      <w:r>
+        <w:rPr>
+          <w:lang w:val="pt-BR"/>
+        </w:rPr>
+        <w:t>: o coco de zambê e a emergência étnica em Sibaúma, Tibau do Sul-RN. 2009. Dissertação (Mestrado em Antropologia Social) – Universidade Federal do Rio Grande do Norte, Natal, 2009. [conferir o nome completo do autor]</w:t>
+      </w:r>
+    </w:p>
+    <w:p>
+      <w:pPr>
+        <w:spacing w:after="0" w:line="240" w:lineRule="auto"/>
+        <w:jc w:val="left"/>
+        <w:rPr>
+          <w:lang w:val="pt-BR"/>
+        </w:rPr>
+      </w:pPr>
+    </w:p>
+    <w:p>
+      <w:pPr>
+        <w:spacing w:after="0" w:line="240" w:lineRule="auto"/>
+        <w:jc w:val="left"/>
+        <w:rPr>
+          <w:lang w:val="pt-BR"/>
+        </w:rPr>
+      </w:pPr>
+      <w:r>
+        <w:rPr>
+          <w:lang w:val="pt-BR"/>
+        </w:rPr>
+        <w:t xml:space="preserve">LINS, Cyro H. de Almeida; LOLOUM, Tristan. Um quilombo à beira-mar: histórias de expropriação fundiária no litoral turístico potiguar. </w:t>
+      </w:r>
+      <w:r>
+        <w:rPr>
+          <w:b/>
+          <w:lang w:val="pt-BR"/>
+        </w:rPr>
+        <w:t>Vivência: Revista de Antropologia</w:t>
+      </w:r>
+      <w:r>
+        <w:rPr>
+          <w:lang w:val="pt-BR"/>
+        </w:rPr>
+        <w:t>, Natal, n. 39, p. 141-164, 2012.</w:t>
+      </w:r>
+    </w:p>
+    <w:p>
+      <w:pPr>
+        <w:spacing w:after="0" w:line="240" w:lineRule="auto"/>
+        <w:jc w:val="left"/>
+        <w:rPr>
+          <w:lang w:val="pt-BR"/>
+        </w:rPr>
+      </w:pPr>
+    </w:p>
+    <w:p>
+      <w:pPr>
+        <w:spacing w:after="0" w:line="240" w:lineRule="auto"/>
+        <w:jc w:val="left"/>
+        <w:rPr>
+          <w:lang w:val="pt-BR"/>
+        </w:rPr>
+      </w:pPr>
+      <w:r>
+        <w:rPr>
+          <w:lang w:val="pt-BR"/>
+        </w:rPr>
+        <w:t xml:space="preserve">MAINARDES, Jefferson. Abordagem do ciclo de políticas: uma contribuição para a análise de políticas educacionais. </w:t>
+      </w:r>
+      <w:r>
+        <w:rPr>
+          <w:b/>
+          <w:lang w:val="pt-BR"/>
+        </w:rPr>
+        <w:t>Educação &amp; Sociedade</w:t>
+      </w:r>
+      <w:r>
+        <w:rPr>
+          <w:lang w:val="pt-BR"/>
+        </w:rPr>
+        <w:t>, Campinas, v. 27, n. 94, p. 47-69, 2006.</w:t>
+      </w:r>
+    </w:p>
+    <w:p>
+      <w:pPr>
+        <w:spacing w:after="0" w:line="240" w:lineRule="auto"/>
+        <w:jc w:val="left"/>
+        <w:rPr>
+          <w:lang w:val="pt-BR"/>
+        </w:rPr>
+      </w:pPr>
+    </w:p>
+    <w:p>
+      <w:pPr>
+        <w:spacing w:after="0" w:line="240" w:lineRule="auto"/>
+        <w:jc w:val="left"/>
+        <w:rPr>
+          <w:lang w:val="pt-BR"/>
+        </w:rPr>
+      </w:pPr>
+      <w:r>
+        <w:rPr>
+          <w:lang w:val="pt-BR"/>
+        </w:rPr>
+        <w:t xml:space="preserve">MASSEY, </w:t>
+      </w:r>
+      <w:proofErr w:type="spellStart"/>
+      <w:r>
+        <w:rPr>
+          <w:lang w:val="pt-BR"/>
+        </w:rPr>
+        <w:t>Doreen</w:t>
+      </w:r>
+      <w:proofErr w:type="spellEnd"/>
+      <w:r>
+        <w:rPr>
+          <w:lang w:val="pt-BR"/>
+        </w:rPr>
+        <w:t xml:space="preserve">. </w:t>
+      </w:r>
+      <w:r>
+        <w:rPr>
+          <w:b/>
+          <w:lang w:val="pt-BR"/>
+        </w:rPr>
+        <w:t>Pelo espaço</w:t>
+      </w:r>
+      <w:r>
+        <w:rPr>
+          <w:lang w:val="pt-BR"/>
+        </w:rPr>
+        <w:t xml:space="preserve">: uma nova política da espacialidade. Tradução de Hilda Pareto Maciel e Rogério Haesbaert. Rio de Janeiro: Bertrand Brasil, 2008.</w:t>
+      </w:r>
+    </w:p>
+    <w:p>
+      <w:pPr>
+        <w:spacing w:after="0" w:line="240" w:lineRule="auto"/>
+        <w:jc w:val="left"/>
+        <w:rPr>
+          <w:lang w:val="pt-BR"/>
+        </w:rPr>
+      </w:pPr>
+    </w:p>
+    <w:p>
+      <w:pPr>
+        <w:spacing w:after="0" w:line="240" w:lineRule="auto"/>
+        <w:jc w:val="left"/>
+        <w:rPr>
+          <w:lang w:val="pt-BR"/>
+        </w:rPr>
+      </w:pPr>
+      <w:r>
+        <w:rPr>
+          <w:lang w:val="pt-BR"/>
+        </w:rPr>
         <w:lastRenderedPageBreak/>
         <w:t xml:space="preserve">MINAYO, Maria Cecília de Souza (org.). </w:t>
       </w:r>
@@ -6333,6 +6490,43 @@
           <w:lang w:val="pt-BR"/>
         </w:rPr>
         <w:t xml:space="preserve">: vivências na educação contemporânea. São Leopoldo: Casa Leiria, 2021. p. 15-34.</w:t>
+      </w:r>
+    </w:p>
+    <w:p>
+      <w:pPr>
+        <w:spacing w:after="0" w:line="240" w:lineRule="auto"/>
+        <w:jc w:val="left"/>
+        <w:rPr>
+          <w:lang w:val="pt-BR"/>
+        </w:rPr>
+      </w:pPr>
+    </w:p>
+    <w:p>
+      <w:pPr>
+        <w:spacing w:after="0" w:line="240" w:lineRule="auto"/>
+        <w:jc w:val="left"/>
+        <w:rPr>
+          <w:lang w:val="pt-BR"/>
+        </w:rPr>
+      </w:pPr>
+      <w:r>
+        <w:rPr>
+          <w:lang w:val="pt-BR"/>
+        </w:rPr>
+        <w:t xml:space="preserve">SILVA, Terezinha Martins da. </w:t>
+      </w:r>
+      <w:r>
+        <w:rPr>
+          <w:b/>
+          <w:lang w:val="pt-BR"/>
+        </w:rPr>
+        <w:t>A educação escolar na comunidade negra de Sibaúma</w:t>
+      </w:r>
+      <w:r>
+        <w:rPr>
+          <w:lang w:val="pt-BR"/>
+        </w:rPr>
+        <w:t>: a trajetória educacional da Escola Municipal Armando de Paiva. 2011. Dissertação (Mestrado em Educação) – Universidade Federal do Rio Grande do Norte, Natal, 2011. [conferir ano e orientação na folha de rosto]</w:t>
       </w:r>
     </w:p>
     <w:p>

</xml_diff>

<commit_message>
Amplia o capítulo 6 com Silva (2011), Ferreira (2022) e Alves (2018)
Sibaúma e sua escola (história, deslocamentos, computadores de
2007-2009 sem manutenção), Vicência Castelo, fases do turismo em
Pipa, fonte da relação de localidades e mapa do século XVII em
domínio público como nova Figura 1 (figuras renumeradas e índice do
Apêndice F atualizado); ano da dissertação de Silva confirmado no
projeto; contagem de figuras na metodologia.

Co-Authored-By: Claude Opus 5.5 <noreply@anthropic.com>
Claude-Session: https://claude.ai/code/session_01HxStpW4pQoDfJdTDYr6zEC
</commit_message>
<xml_diff>
--- a/projeto_desenvolvido/PROJETO_DE_TESE_COMPLETO_ABNT.docx
+++ b/projeto_desenvolvido/PROJETO_DE_TESE_COMPLETO_ABNT.docx
@@ -3908,7 +3908,7 @@
         <w:rPr>
           <w:lang w:val="pt-BR"/>
         </w:rPr>
-        <w:t>Com Santos e Massey, Tibau do Sul pode ser compreendido ao mesmo tempo como território produzido por tempos e relações diferentes e como conjunto de lugares onde se encontram trajetórias diversas, da sede às localidades rurais, de Sibaúma a Pipa. Essa leitura pede que a rede municipal seja olhada também pelo modo como distribui seus meios entre esses lugares. Sibaúma já foi estudada pela emergência étnica em torno do coco de zambê (LINS, 2009), pelos conflitos fundiários ligados ao turismo no litoral (LINS; LOLOUM, 2012) e pela trajetória da Escola Municipal Padre Armando de Paiva (SILVA, 2011) [conferir o ano na folha de rosto: 2011 ou 2012]; nenhum desses estudos trata da educação digital. A presença de uma comunidade quilombola acrescenta à pergunta sobre a rede um marco normativo próprio, as Diretrizes Curriculares Nacionais para a Educação Escolar Quilombola, segundo as quais a Educação Escolar Quilombola se destina às populações quilombolas rurais e urbanas e deve ser ofertada pelas escolas situadas nessas comunidades e pelas escolas próximas que recebem parte significativa de seus estudantes (BRASIL, 2012b, art. 1º). Perguntaremos se os planos e as orientações da Secretaria para a educação digital consideram essas especificidades. Essa leitura, somada à discussão sobre o habitar, sustenta a formulação que a tese propõe para a relação entre o território e as tecnologias digitais.</w:t>
+        <w:t>Com Santos e Massey, Tibau do Sul pode ser compreendido ao mesmo tempo como território produzido por tempos e relações diferentes e como conjunto de lugares onde se encontram trajetórias diversas, da sede às localidades rurais, de Sibaúma a Pipa. Essa leitura pede que a rede municipal seja olhada também pelo modo como distribui seus meios entre esses lugares. Sibaúma já foi estudada pela emergência étnica em torno do coco de zambê (LINS, 2009), pelos conflitos fundiários ligados ao turismo no litoral (LINS; LOLOUM, 2012) e pela trajetória da Escola Municipal Padre Armando de Paiva (SILVA, 2011); nenhum desses estudos trata da educação digital. A presença de uma comunidade quilombola acrescenta à pergunta sobre a rede um marco normativo próprio, as Diretrizes Curriculares Nacionais para a Educação Escolar Quilombola, segundo as quais a Educação Escolar Quilombola se destina às populações quilombolas rurais e urbanas e deve ser ofertada pelas escolas situadas nessas comunidades e pelas escolas próximas que recebem parte significativa de seus estudantes (BRASIL, 2012b, art. 1º). Perguntaremos se os planos e as orientações da Secretaria para a educação digital consideram essas especificidades. Essa leitura, somada à discussão sobre o habitar, sustenta a formulação que a tese propõe para a relação entre o território e as tecnologias digitais.</w:t>
       </w:r>
     </w:p>
     <w:p>
@@ -6526,7 +6526,7 @@
         <w:rPr>
           <w:lang w:val="pt-BR"/>
         </w:rPr>
-        <w:t>: a trajetória educacional da Escola Municipal Armando de Paiva. 2011. Dissertação (Mestrado em Educação) – Universidade Federal do Rio Grande do Norte, Natal, 2011. [conferir ano e orientação na folha de rosto]</w:t>
+        <w:t>: a trajetória educacional da Escola Municipal Armando de Paiva. 2011. Dissertação (Mestrado em Educação) – Universidade Federal do Rio Grande do Norte, Natal, 2011.</w:t>
       </w:r>
     </w:p>
     <w:p>

</xml_diff>